<commit_message>
paper: close Route C external review blockers
</commit_message>
<xml_diff>
--- a/docs/paper/manuscript-draft.docx
+++ b/docs/paper/manuscript-draft.docx
@@ -158,7 +158,7 @@
         <w:rPr>
           <w:rFonts w:ascii="Calibri" w:hAnsi="Calibri" w:eastAsia="Calibri" w:cs="Calibri" w:hint="eastAsia"/>
         </w:rPr>
-        <w:t xml:space="preserve">recompression at each freshness boundary can dominate update cost; auxiliary</w:t>
+        <w:t xml:space="preserve">recompression at each freshness boundary requires base-wide work; auxiliary</w:t>
       </w:r>
       <w:r>
         <w:rPr>
@@ -288,103 +288,115 @@
         <w:rPr>
           <w:rFonts w:ascii="Calibri" w:hAnsi="Calibri" w:eastAsia="Calibri" w:cs="Calibri" w:hint="eastAsia"/>
         </w:rPr>
-        <w:t xml:space="preserve">Our evaluation protocol compares three fixed maintenance mechanisms under the</w:t>
-      </w:r>
-      <w:r>
-        <w:rPr>
-          <w:rFonts w:ascii="Calibri" w:hAnsi="Calibri" w:eastAsia="Calibri" w:cs="Calibri" w:hint="eastAsia"/>
-        </w:rPr>
-        <w:t xml:space="preserve"> </w:t>
-      </w:r>
-      <w:r>
-        <w:rPr>
-          <w:rFonts w:ascii="Calibri" w:hAnsi="Calibri" w:eastAsia="Calibri" w:cs="Calibri" w:hint="eastAsia"/>
-        </w:rPr>
-        <w:t xml:space="preserve">same versioned event streams, query schedules, public parameters, and initial</w:t>
-      </w:r>
-      <w:r>
-        <w:rPr>
-          <w:rFonts w:ascii="Calibri" w:hAnsi="Calibri" w:eastAsia="Calibri" w:cs="Calibri" w:hint="eastAsia"/>
-        </w:rPr>
-        <w:t xml:space="preserve"> </w:t>
-      </w:r>
-      <w:r>
-        <w:rPr>
-          <w:rFonts w:ascii="Calibri" w:hAnsi="Calibri" w:eastAsia="Calibri" w:cs="Calibri" w:hint="eastAsia"/>
-        </w:rPr>
-        <w:t xml:space="preserve">states. It separates directly measured state-transition costs, exact typed</w:t>
-      </w:r>
-      <w:r>
-        <w:rPr>
-          <w:rFonts w:ascii="Calibri" w:hAnsi="Calibri" w:eastAsia="Calibri" w:cs="Calibri" w:hint="eastAsia"/>
-        </w:rPr>
-        <w:t xml:space="preserve"> </w:t>
-      </w:r>
-      <w:r>
-        <w:rPr>
-          <w:rFonts w:ascii="Calibri" w:hAnsi="Calibri" w:eastAsia="Calibri" w:cs="Calibri" w:hint="eastAsia"/>
-        </w:rPr>
-        <w:t xml:space="preserve">operation counts, type-derived serialized-byte bounds, a narrowly registered</w:t>
-      </w:r>
-      <w:r>
-        <w:rPr>
-          <w:rFonts w:ascii="Calibri" w:hAnsi="Calibri" w:eastAsia="Calibri" w:cs="Calibri" w:hint="eastAsia"/>
-        </w:rPr>
-        <w:t xml:space="preserve"> </w:t>
-      </w:r>
-      <w:r>
-        <w:rPr>
-          <w:rFonts w:ascii="Calibri" w:hAnsi="Calibri" w:eastAsia="Calibri" w:cs="Calibri" w:hint="eastAsia"/>
-        </w:rPr>
-        <w:t xml:space="preserve">query-linearity projection, and native OpenFHE observations. The frozen matrix</w:t>
-      </w:r>
-      <w:r>
-        <w:rPr>
-          <w:rFonts w:ascii="Calibri" w:hAnsi="Calibri" w:eastAsia="Calibri" w:cs="Calibri" w:hint="eastAsia"/>
-        </w:rPr>
-        <w:t xml:space="preserve"> </w:t>
-      </w:r>
-      <w:r>
-        <w:rPr>
-          <w:rFonts w:ascii="Calibri" w:hAnsi="Calibri" w:eastAsia="Calibri" w:cs="Calibri" w:hint="eastAsia"/>
-        </w:rPr>
-        <w:t xml:space="preserve">contains six synthetic shards, four ordered-event shards derived from one SNAP</w:t>
-      </w:r>
-      <w:r>
-        <w:rPr>
-          <w:rFonts w:ascii="Calibri" w:hAnsi="Calibri" w:eastAsia="Calibri" w:cs="Calibri" w:hint="eastAsia"/>
-        </w:rPr>
-        <w:t xml:space="preserve"> </w:t>
-      </w:r>
-      <w:r>
-        <w:rPr>
-          <w:rFonts w:ascii="Calibri" w:hAnsi="Calibri" w:eastAsia="Calibri" w:cs="Calibri" w:hint="eastAsia"/>
-        </w:rPr>
-        <w:t xml:space="preserve">source object, and six native OpenFHE cases. Independent replay and terminal</w:t>
-      </w:r>
-      <w:r>
-        <w:rPr>
-          <w:rFonts w:ascii="Calibri" w:hAnsi="Calibri" w:eastAsia="Calibri" w:cs="Calibri" w:hint="eastAsia"/>
-        </w:rPr>
-        <w:t xml:space="preserve"> </w:t>
-      </w:r>
-      <w:r>
-        <w:rPr>
-          <w:rFonts w:ascii="Calibri" w:hAnsi="Calibri" w:eastAsia="Calibri" w:cs="Calibri" w:hint="eastAsia"/>
-        </w:rPr>
-        <w:t xml:space="preserve">admission must accept exactly the resulting 17 pre-aggregate artifacts before</w:t>
-      </w:r>
-      <w:r>
-        <w:rPr>
-          <w:rFonts w:ascii="Calibri" w:hAnsi="Calibri" w:eastAsia="Calibri" w:cs="Calibri" w:hint="eastAsia"/>
-        </w:rPr>
-        <w:t xml:space="preserve"> </w:t>
-      </w:r>
-      <w:r>
-        <w:rPr>
-          <w:rFonts w:ascii="Calibri" w:hAnsi="Calibri" w:eastAsia="Calibri" w:cs="Calibri" w:hint="eastAsia"/>
-        </w:rPr>
-        <w:t xml:space="preserve">analysis can release any empirical sentence.</w:t>
+        <w:t xml:space="preserve">Our frozen evaluation protocol was specified to compare three fixed maintenance</w:t>
+      </w:r>
+      <w:r>
+        <w:rPr>
+          <w:rFonts w:ascii="Calibri" w:hAnsi="Calibri" w:eastAsia="Calibri" w:cs="Calibri" w:hint="eastAsia"/>
+        </w:rPr>
+        <w:t xml:space="preserve"> </w:t>
+      </w:r>
+      <w:r>
+        <w:rPr>
+          <w:rFonts w:ascii="Calibri" w:hAnsi="Calibri" w:eastAsia="Calibri" w:cs="Calibri" w:hint="eastAsia"/>
+        </w:rPr>
+        <w:t xml:space="preserve">mechanisms under the same versioned event streams, query schedules, public</w:t>
+      </w:r>
+      <w:r>
+        <w:rPr>
+          <w:rFonts w:ascii="Calibri" w:hAnsi="Calibri" w:eastAsia="Calibri" w:cs="Calibri" w:hint="eastAsia"/>
+        </w:rPr>
+        <w:t xml:space="preserve"> </w:t>
+      </w:r>
+      <w:r>
+        <w:rPr>
+          <w:rFonts w:ascii="Calibri" w:hAnsi="Calibri" w:eastAsia="Calibri" w:cs="Calibri" w:hint="eastAsia"/>
+        </w:rPr>
+        <w:t xml:space="preserve">parameters, and initial states. An admitted execution would have separated</w:t>
+      </w:r>
+      <w:r>
+        <w:rPr>
+          <w:rFonts w:ascii="Calibri" w:hAnsi="Calibri" w:eastAsia="Calibri" w:cs="Calibri" w:hint="eastAsia"/>
+        </w:rPr>
+        <w:t xml:space="preserve"> </w:t>
+      </w:r>
+      <w:r>
+        <w:rPr>
+          <w:rFonts w:ascii="Calibri" w:hAnsi="Calibri" w:eastAsia="Calibri" w:cs="Calibri" w:hint="eastAsia"/>
+        </w:rPr>
+        <w:t xml:space="preserve">state-transition costs, exact typed operation counts, type-derived</w:t>
+      </w:r>
+      <w:r>
+        <w:rPr>
+          <w:rFonts w:ascii="Calibri" w:hAnsi="Calibri" w:eastAsia="Calibri" w:cs="Calibri" w:hint="eastAsia"/>
+        </w:rPr>
+        <w:t xml:space="preserve"> </w:t>
+      </w:r>
+      <w:r>
+        <w:rPr>
+          <w:rFonts w:ascii="Calibri" w:hAnsi="Calibri" w:eastAsia="Calibri" w:cs="Calibri" w:hint="eastAsia"/>
+        </w:rPr>
+        <w:t xml:space="preserve">serialized-byte bounds, a narrowly registered query-linearity projection, and</w:t>
+      </w:r>
+      <w:r>
+        <w:rPr>
+          <w:rFonts w:ascii="Calibri" w:hAnsi="Calibri" w:eastAsia="Calibri" w:cs="Calibri" w:hint="eastAsia"/>
+        </w:rPr>
+        <w:t xml:space="preserve"> </w:t>
+      </w:r>
+      <w:r>
+        <w:rPr>
+          <w:rFonts w:ascii="Calibri" w:hAnsi="Calibri" w:eastAsia="Calibri" w:cs="Calibri" w:hint="eastAsia"/>
+        </w:rPr>
+        <w:t xml:space="preserve">native OpenFHE observations. The frozen matrix specified six synthetic shards,</w:t>
+      </w:r>
+      <w:r>
+        <w:rPr>
+          <w:rFonts w:ascii="Calibri" w:hAnsi="Calibri" w:eastAsia="Calibri" w:cs="Calibri" w:hint="eastAsia"/>
+        </w:rPr>
+        <w:t xml:space="preserve"> </w:t>
+      </w:r>
+      <w:r>
+        <w:rPr>
+          <w:rFonts w:ascii="Calibri" w:hAnsi="Calibri" w:eastAsia="Calibri" w:cs="Calibri" w:hint="eastAsia"/>
+        </w:rPr>
+        <w:t xml:space="preserve">four ordered-event shards derived from one SNAP source object, and six native</w:t>
+      </w:r>
+      <w:r>
+        <w:rPr>
+          <w:rFonts w:ascii="Calibri" w:hAnsi="Calibri" w:eastAsia="Calibri" w:cs="Calibri" w:hint="eastAsia"/>
+        </w:rPr>
+        <w:t xml:space="preserve"> </w:t>
+      </w:r>
+      <w:r>
+        <w:rPr>
+          <w:rFonts w:ascii="Calibri" w:hAnsi="Calibri" w:eastAsia="Calibri" w:cs="Calibri" w:hint="eastAsia"/>
+        </w:rPr>
+        <w:t xml:space="preserve">OpenFHE cases. Independent replay and terminal admission would have had to</w:t>
+      </w:r>
+      <w:r>
+        <w:rPr>
+          <w:rFonts w:ascii="Calibri" w:hAnsi="Calibri" w:eastAsia="Calibri" w:cs="Calibri" w:hint="eastAsia"/>
+        </w:rPr>
+        <w:t xml:space="preserve"> </w:t>
+      </w:r>
+      <w:r>
+        <w:rPr>
+          <w:rFonts w:ascii="Calibri" w:hAnsi="Calibri" w:eastAsia="Calibri" w:cs="Calibri" w:hint="eastAsia"/>
+        </w:rPr>
+        <w:t xml:space="preserve">accept exactly the resulting 17 pre-aggregate artifacts before analysis could</w:t>
+      </w:r>
+      <w:r>
+        <w:rPr>
+          <w:rFonts w:ascii="Calibri" w:hAnsi="Calibri" w:eastAsia="Calibri" w:cs="Calibri" w:hint="eastAsia"/>
+        </w:rPr>
+        <w:t xml:space="preserve"> </w:t>
+      </w:r>
+      <w:r>
+        <w:rPr>
+          <w:rFonts w:ascii="Calibri" w:hAnsi="Calibri" w:eastAsia="Calibri" w:cs="Calibri" w:hint="eastAsia"/>
+        </w:rPr>
+        <w:t xml:space="preserve">release any empirical sentence.</w:t>
       </w:r>
     </w:p>
     <w:p>
@@ -822,7 +834,7 @@
         <w:rPr>
           <w:rFonts w:ascii="Calibri" w:hAnsi="Calibri" w:eastAsia="Calibri" w:cs="Calibri" w:hint="eastAsia"/>
         </w:rPr>
-        <w:t xml:space="preserve">ciphertexts and masking work can reverse the apparent ranking.</w:t>
+        <w:t xml:space="preserve">ciphertexts and masking work can confound a comparison.</w:t>
       </w:r>
     </w:p>
     <w:p>
@@ -1892,7 +1904,20 @@
         <w:rPr>
           <w:rFonts w:ascii="Calibri" w:hAnsi="Calibri" w:eastAsia="Calibri" w:cs="Calibri" w:hint="eastAsia"/>
         </w:rPr>
-        <w:t xml:space="preserve">The closest methods are not interchangeable experimental baselines:</w:t>
+        <w:t xml:space="preserve">The closest methods are not interchangeable experimental baselines.</w:t>
+      </w:r>
+    </w:p>
+    <w:p>
+      <w:pPr>
+        <w:pStyle w:val="BodyText"/>
+      </w:pPr>
+      <w:r>
+        <w:rPr>
+          <w:rFonts w:ascii="Calibri" w:hAnsi="Calibri" w:eastAsia="Calibri" w:cs="Calibri" w:hint="eastAsia"/>
+          <w:b/>
+          <w:bCs/>
+        </w:rPr>
+        <w:t xml:space="preserve">Table 1. Closest method families and the boundary of this work.</w:t>
       </w:r>
     </w:p>
     <w:tbl>
@@ -2587,7 +2612,7 @@
                 <w:rFonts w:ascii="Calibri" w:hAnsi="Calibri" w:eastAsia="Calibri" w:cs="Calibri" w:hint="eastAsia"/>
                 <w:sz w:val="16"/>
               </w:rPr>
-              <w:t xml:space="preserve">Not established by the public abstract</w:t>
+              <w:t xml:space="preserve">Not established by the public descriptions</w:t>
             </w:r>
           </w:p>
         </w:tc>
@@ -2613,7 +2638,7 @@
                 <w:rFonts w:ascii="Calibri" w:hAnsi="Calibri" w:eastAsia="Calibri" w:cs="Calibri" w:hint="eastAsia"/>
                 <w:sz w:val="16"/>
               </w:rPr>
-              <w:t xml:space="preserve">Establishes an encrypted-index hardware co-design boundary; as of 2026-08-30, no public full text, DOI, or public software repository was located.</w:t>
+              <w:t xml:space="preserve">Establishes an encrypted-index hardware co-design boundary; as of 2026-08-30, an official program abstract and a BUAA institutional summary were public, but no public full text, DOI, or public software repository was located.</w:t>
             </w:r>
           </w:p>
         </w:tc>
@@ -4137,55 +4162,253 @@
         <w:rPr>
           <w:rFonts w:ascii="Calibri" w:hAnsi="Calibri" w:eastAsia="Calibri" w:cs="Calibri" w:hint="eastAsia"/>
         </w:rPr>
-        <w:t xml:space="preserve">The system has Client A, which owns the mutable matrix; Client B, which owns the</w:t>
-      </w:r>
-      <w:r>
-        <w:rPr>
-          <w:rFonts w:ascii="Calibri" w:hAnsi="Calibri" w:eastAsia="Calibri" w:cs="Calibri" w:hint="eastAsia"/>
-        </w:rPr>
-        <w:t xml:space="preserve"> </w:t>
-      </w:r>
-      <w:r>
-        <w:rPr>
-          <w:rFonts w:ascii="Calibri" w:hAnsi="Calibri" w:eastAsia="Calibri" w:cs="Calibri" w:hint="eastAsia"/>
-        </w:rPr>
-        <w:t xml:space="preserve">query and secret key and receives the result; and a semi-honest Cloud evaluator.</w:t>
-      </w:r>
-      <w:r>
-        <w:rPr>
-          <w:rFonts w:ascii="Calibri" w:hAnsi="Calibri" w:eastAsia="Calibri" w:cs="Calibri" w:hint="eastAsia"/>
-        </w:rPr>
-        <w:t xml:space="preserve"> </w:t>
-      </w:r>
-      <w:r>
-        <w:rPr>
-          <w:rFonts w:ascii="Calibri" w:hAnsi="Calibri" w:eastAsia="Calibri" w:cs="Calibri" w:hint="eastAsia"/>
-        </w:rPr>
-        <w:t xml:space="preserve">At most one party is corrupted and the Cloud does not collude with either client.</w:t>
-      </w:r>
-      <w:r>
-        <w:rPr>
-          <w:rFonts w:ascii="Calibri" w:hAnsi="Calibri" w:eastAsia="Calibri" w:cs="Calibri" w:hint="eastAsia"/>
-        </w:rPr>
-        <w:t xml:space="preserve"> </w:t>
-      </w:r>
-      <w:r>
-        <w:rPr>
-          <w:rFonts w:ascii="Calibri" w:hAnsi="Calibri" w:eastAsia="Calibri" w:cs="Calibri" w:hint="eastAsia"/>
-        </w:rPr>
-        <w:t xml:space="preserve">The model excludes malicious behavior, adaptive corruption, availability,</w:t>
-      </w:r>
-      <w:r>
-        <w:rPr>
-          <w:rFonts w:ascii="Calibri" w:hAnsi="Calibri" w:eastAsia="Calibri" w:cs="Calibri" w:hint="eastAsia"/>
-        </w:rPr>
-        <w:t xml:space="preserve"> </w:t>
-      </w:r>
-      <w:r>
-        <w:rPr>
-          <w:rFonts w:ascii="Calibri" w:hAnsi="Calibri" w:eastAsia="Calibri" w:cs="Calibri" w:hint="eastAsia"/>
-        </w:rPr>
-        <w:t xml:space="preserve">side-channel, traffic-analysis, and collusion claims.</w:t>
+        <w:t xml:space="preserve">The system has Client A, which owns the mutable matrix, updates, CSSC metadata,</w:t>
+      </w:r>
+      <w:r>
+        <w:rPr>
+          <w:rFonts w:ascii="Calibri" w:hAnsi="Calibri" w:eastAsia="Calibri" w:cs="Calibri" w:hint="eastAsia"/>
+        </w:rPr>
+        <w:t xml:space="preserve"> </w:t>
+      </w:r>
+      <w:r>
+        <w:rPr>
+          <w:rFonts w:ascii="Calibri" w:hAnsi="Calibri" w:eastAsia="Calibri" w:cs="Calibri" w:hint="eastAsia"/>
+        </w:rPr>
+        <w:t xml:space="preserve">component</w:t>
+      </w:r>
+      <w:r>
+        <w:rPr>
+          <w:rFonts w:ascii="Calibri" w:hAnsi="Calibri" w:eastAsia="Calibri" w:cs="Calibri" w:hint="eastAsia"/>
+        </w:rPr>
+        <w:t xml:space="preserve"> </w:t>
+      </w:r>
+      <w:r>
+        <w:rPr>
+          <w:rStyle w:val="VerbatimChar"/>
+          <w:rFonts w:ascii="Calibri" w:hAnsi="Calibri" w:eastAsia="Calibri" w:cs="Calibri" w:hint="eastAsia"/>
+        </w:rPr>
+        <w:t xml:space="preserve">ColumnIndex</w:t>
+      </w:r>
+      <w:r>
+        <w:rPr>
+          <w:rFonts w:ascii="Calibri" w:hAnsi="Calibri" w:eastAsia="Calibri" w:cs="Calibri" w:hint="eastAsia"/>
+        </w:rPr>
+        <w:t xml:space="preserve"> </w:t>
+      </w:r>
+      <w:r>
+        <w:rPr>
+          <w:rFonts w:ascii="Calibri" w:hAnsi="Calibri" w:eastAsia="Calibri" w:cs="Calibri" w:hint="eastAsia"/>
+        </w:rPr>
+        <w:t xml:space="preserve">arrays and</w:t>
+      </w:r>
+      <w:r>
+        <w:rPr>
+          <w:rFonts w:ascii="Calibri" w:hAnsi="Calibri" w:eastAsia="Calibri" w:cs="Calibri" w:hint="eastAsia"/>
+        </w:rPr>
+        <w:t xml:space="preserve"> </w:t>
+      </w:r>
+      <w:r>
+        <w:rPr>
+          <w:rStyle w:val="VerbatimChar"/>
+          <w:rFonts w:ascii="Calibri" w:hAnsi="Calibri" w:eastAsia="Calibri" w:cs="Calibri" w:hint="eastAsia"/>
+        </w:rPr>
+        <w:t xml:space="preserve">RowMap</w:t>
+      </w:r>
+      <w:r>
+        <w:rPr>
+          <w:rFonts w:ascii="Calibri" w:hAnsi="Calibri" w:eastAsia="Calibri" w:cs="Calibri" w:hint="eastAsia"/>
+        </w:rPr>
+        <w:t xml:space="preserve">s, the complete</w:t>
+      </w:r>
+      <w:r>
+        <w:rPr>
+          <w:rFonts w:ascii="Calibri" w:hAnsi="Calibri" w:eastAsia="Calibri" w:cs="Calibri" w:hint="eastAsia"/>
+        </w:rPr>
+        <w:t xml:space="preserve"> </w:t>
+      </w:r>
+      <w:r>
+        <w:rPr>
+          <w:rStyle w:val="VerbatimChar"/>
+          <w:rFonts w:ascii="Calibri" w:hAnsi="Calibri" w:eastAsia="Calibri" w:cs="Calibri" w:hint="eastAsia"/>
+        </w:rPr>
+        <w:t xml:space="preserve">OutputPlan</w:t>
+      </w:r>
+      <w:r>
+        <w:rPr>
+          <w:rFonts w:ascii="Calibri" w:hAnsi="Calibri" w:eastAsia="Calibri" w:cs="Calibri" w:hint="eastAsia"/>
+        </w:rPr>
+        <w:t xml:space="preserve">, and the</w:t>
+      </w:r>
+      <w:r>
+        <w:rPr>
+          <w:rFonts w:ascii="Calibri" w:hAnsi="Calibri" w:eastAsia="Calibri" w:cs="Calibri" w:hint="eastAsia"/>
+        </w:rPr>
+        <w:t xml:space="preserve"> </w:t>
+      </w:r>
+      <w:r>
+        <w:rPr>
+          <w:rFonts w:ascii="Calibri" w:hAnsi="Calibri" w:eastAsia="Calibri" w:cs="Calibri" w:hint="eastAsia"/>
+        </w:rPr>
+        <w:t xml:space="preserve">F1-M reservation/sampling ledger; Client B, which owns the query and secret key</w:t>
+      </w:r>
+      <w:r>
+        <w:rPr>
+          <w:rFonts w:ascii="Calibri" w:hAnsi="Calibri" w:eastAsia="Calibri" w:cs="Calibri" w:hint="eastAsia"/>
+        </w:rPr>
+        <w:t xml:space="preserve"> </w:t>
+      </w:r>
+      <w:r>
+        <w:rPr>
+          <w:rFonts w:ascii="Calibri" w:hAnsi="Calibri" w:eastAsia="Calibri" w:cs="Calibri" w:hint="eastAsia"/>
+        </w:rPr>
+        <w:t xml:space="preserve">and receives the result; and a semi-honest Cloud evaluator. Client A and Client</w:t>
+      </w:r>
+      <w:r>
+        <w:rPr>
+          <w:rFonts w:ascii="Calibri" w:hAnsi="Calibri" w:eastAsia="Calibri" w:cs="Calibri" w:hint="eastAsia"/>
+        </w:rPr>
+        <w:t xml:space="preserve"> </w:t>
+      </w:r>
+      <w:r>
+        <w:rPr>
+          <w:rFonts w:ascii="Calibri" w:hAnsi="Calibri" w:eastAsia="Calibri" w:cs="Calibri" w:hint="eastAsia"/>
+        </w:rPr>
+        <w:t xml:space="preserve">B are both authorized to read the complete</w:t>
+      </w:r>
+      <w:r>
+        <w:rPr>
+          <w:rFonts w:ascii="Calibri" w:hAnsi="Calibri" w:eastAsia="Calibri" w:cs="Calibri" w:hint="eastAsia"/>
+        </w:rPr>
+        <w:t xml:space="preserve"> </w:t>
+      </w:r>
+      <w:r>
+        <w:rPr>
+          <w:rStyle w:val="VerbatimChar"/>
+          <w:rFonts w:ascii="Calibri" w:hAnsi="Calibri" w:eastAsia="Calibri" w:cs="Calibri" w:hint="eastAsia"/>
+        </w:rPr>
+        <w:t xml:space="preserve">RowMap</w:t>
+      </w:r>
+      <w:r>
+        <w:rPr>
+          <w:rFonts w:ascii="Calibri" w:hAnsi="Calibri" w:eastAsia="Calibri" w:cs="Calibri" w:hint="eastAsia"/>
+        </w:rPr>
+        <w:t xml:space="preserve">-sensitive</w:t>
+      </w:r>
+      <w:r>
+        <w:rPr>
+          <w:rFonts w:ascii="Calibri" w:hAnsi="Calibri" w:eastAsia="Calibri" w:cs="Calibri" w:hint="eastAsia"/>
+        </w:rPr>
+        <w:t xml:space="preserve"> </w:t>
+      </w:r>
+      <w:r>
+        <w:rPr>
+          <w:rStyle w:val="VerbatimChar"/>
+          <w:rFonts w:ascii="Calibri" w:hAnsi="Calibri" w:eastAsia="Calibri" w:cs="Calibri" w:hint="eastAsia"/>
+        </w:rPr>
+        <w:t xml:space="preserve">OutputPlan</w:t>
+      </w:r>
+      <w:r>
+        <w:rPr>
+          <w:rFonts w:ascii="Calibri" w:hAnsi="Calibri" w:eastAsia="Calibri" w:cs="Calibri" w:hint="eastAsia"/>
+        </w:rPr>
+        <w:t xml:space="preserve">;</w:t>
+      </w:r>
+      <w:r>
+        <w:rPr>
+          <w:rFonts w:ascii="Calibri" w:hAnsi="Calibri" w:eastAsia="Calibri" w:cs="Calibri" w:hint="eastAsia"/>
+        </w:rPr>
+        <w:t xml:space="preserve"> </w:t>
+      </w:r>
+      <w:r>
+        <w:rPr>
+          <w:rStyle w:val="VerbatimChar"/>
+          <w:rFonts w:ascii="Calibri" w:hAnsi="Calibri" w:eastAsia="Calibri" w:cs="Calibri" w:hint="eastAsia"/>
+        </w:rPr>
+        <w:t xml:space="preserve">private</w:t>
+      </w:r>
+      <w:r>
+        <w:rPr>
+          <w:rFonts w:ascii="Calibri" w:hAnsi="Calibri" w:eastAsia="Calibri" w:cs="Calibri" w:hint="eastAsia"/>
+        </w:rPr>
+        <w:t xml:space="preserve"> </w:t>
+      </w:r>
+      <w:r>
+        <w:rPr>
+          <w:rFonts w:ascii="Calibri" w:hAnsi="Calibri" w:eastAsia="Calibri" w:cs="Calibri" w:hint="eastAsia"/>
+        </w:rPr>
+        <w:t xml:space="preserve">means private from the Cloud, not private between the two clients.</w:t>
+      </w:r>
+      <w:r>
+        <w:rPr>
+          <w:rFonts w:ascii="Calibri" w:hAnsi="Calibri" w:eastAsia="Calibri" w:cs="Calibri" w:hint="eastAsia"/>
+        </w:rPr>
+        <w:t xml:space="preserve"> </w:t>
+      </w:r>
+      <w:r>
+        <w:rPr>
+          <w:rFonts w:ascii="Calibri" w:hAnsi="Calibri" w:eastAsia="Calibri" w:cs="Calibri" w:hint="eastAsia"/>
+        </w:rPr>
+        <w:t xml:space="preserve">Client A sends the versioned column metadata and complete plan to Client B,</w:t>
+      </w:r>
+      <w:r>
+        <w:rPr>
+          <w:rFonts w:ascii="Calibri" w:hAnsi="Calibri" w:eastAsia="Calibri" w:cs="Calibri" w:hint="eastAsia"/>
+        </w:rPr>
+        <w:t xml:space="preserve"> </w:t>
+      </w:r>
+      <w:r>
+        <w:rPr>
+          <w:rFonts w:ascii="Calibri" w:hAnsi="Calibri" w:eastAsia="Calibri" w:cs="Calibri" w:hint="eastAsia"/>
+        </w:rPr>
+        <w:t xml:space="preserve">samples and encrypts F1-M operands under Client B’s public key, and never sends</w:t>
+      </w:r>
+      <w:r>
+        <w:rPr>
+          <w:rFonts w:ascii="Calibri" w:hAnsi="Calibri" w:eastAsia="Calibri" w:cs="Calibri" w:hint="eastAsia"/>
+        </w:rPr>
+        <w:t xml:space="preserve"> </w:t>
+      </w:r>
+      <w:r>
+        <w:rPr>
+          <w:rFonts w:ascii="Calibri" w:hAnsi="Calibri" w:eastAsia="Calibri" w:cs="Calibri" w:hint="eastAsia"/>
+        </w:rPr>
+        <w:t xml:space="preserve">the individual mask plaintexts to Client B. At most one party is corrupted and</w:t>
+      </w:r>
+      <w:r>
+        <w:rPr>
+          <w:rFonts w:ascii="Calibri" w:hAnsi="Calibri" w:eastAsia="Calibri" w:cs="Calibri" w:hint="eastAsia"/>
+        </w:rPr>
+        <w:t xml:space="preserve"> </w:t>
+      </w:r>
+      <w:r>
+        <w:rPr>
+          <w:rFonts w:ascii="Calibri" w:hAnsi="Calibri" w:eastAsia="Calibri" w:cs="Calibri" w:hint="eastAsia"/>
+        </w:rPr>
+        <w:t xml:space="preserve">the Cloud does not collude with either client. The model excludes malicious</w:t>
+      </w:r>
+      <w:r>
+        <w:rPr>
+          <w:rFonts w:ascii="Calibri" w:hAnsi="Calibri" w:eastAsia="Calibri" w:cs="Calibri" w:hint="eastAsia"/>
+        </w:rPr>
+        <w:t xml:space="preserve"> </w:t>
+      </w:r>
+      <w:r>
+        <w:rPr>
+          <w:rFonts w:ascii="Calibri" w:hAnsi="Calibri" w:eastAsia="Calibri" w:cs="Calibri" w:hint="eastAsia"/>
+        </w:rPr>
+        <w:t xml:space="preserve">behavior, adaptive corruption, availability, side-channel, traffic-analysis,</w:t>
+      </w:r>
+      <w:r>
+        <w:rPr>
+          <w:rFonts w:ascii="Calibri" w:hAnsi="Calibri" w:eastAsia="Calibri" w:cs="Calibri" w:hint="eastAsia"/>
+        </w:rPr>
+        <w:t xml:space="preserve"> </w:t>
+      </w:r>
+      <w:r>
+        <w:rPr>
+          <w:rFonts w:ascii="Calibri" w:hAnsi="Calibri" w:eastAsia="Calibri" w:cs="Calibri" w:hint="eastAsia"/>
+        </w:rPr>
+        <w:t xml:space="preserve">and collusion claims.</w:t>
       </w:r>
     </w:p>
     <w:p>
@@ -4206,9 +4429,16 @@
       </w:r>
       <w:r>
         <w:rPr>
-          <w:rFonts w:ascii="Calibri" w:hAnsi="Calibri" w:eastAsia="Calibri" w:cs="Calibri" w:hint="eastAsia"/>
-        </w:rPr>
-        <w:t xml:space="preserve">RowMaps, complete reconstruction plan, and final result. The Cloud is authorized</w:t>
+          <w:rStyle w:val="VerbatimChar"/>
+          <w:rFonts w:ascii="Calibri" w:hAnsi="Calibri" w:eastAsia="Calibri" w:cs="Calibri" w:hint="eastAsia"/>
+        </w:rPr>
+        <w:t xml:space="preserve">RowMap</w:t>
+      </w:r>
+      <w:r>
+        <w:rPr>
+          <w:rFonts w:ascii="Calibri" w:hAnsi="Calibri" w:eastAsia="Calibri" w:cs="Calibri" w:hint="eastAsia"/>
+        </w:rPr>
+        <w:t xml:space="preserve">s, complete reconstruction plan, and final result. The Cloud is authorized</w:t>
       </w:r>
       <w:r>
         <w:rPr>
@@ -4328,43 +4558,79 @@
         <w:rPr>
           <w:rFonts w:ascii="Calibri" w:hAnsi="Calibri" w:eastAsia="Calibri" w:cs="Calibri" w:hint="eastAsia"/>
         </w:rPr>
-        <w:t xml:space="preserve">Figure 1 shows the protocol boundary. Client A owns publication and constructs</w:t>
-      </w:r>
-      <w:r>
-        <w:rPr>
-          <w:rFonts w:ascii="Calibri" w:hAnsi="Calibri" w:eastAsia="Calibri" w:cs="Calibri" w:hint="eastAsia"/>
-        </w:rPr>
-        <w:t xml:space="preserve"> </w:t>
-      </w:r>
-      <w:r>
-        <w:rPr>
-          <w:rFonts w:ascii="Calibri" w:hAnsi="Calibri" w:eastAsia="Calibri" w:cs="Calibri" w:hint="eastAsia"/>
-        </w:rPr>
-        <w:t xml:space="preserve">the version commit; the Cloud receives only the typed public program; Client B</w:t>
-      </w:r>
-      <w:r>
-        <w:rPr>
-          <w:rFonts w:ascii="Calibri" w:hAnsi="Calibri" w:eastAsia="Calibri" w:cs="Calibri" w:hint="eastAsia"/>
-        </w:rPr>
-        <w:t xml:space="preserve"> </w:t>
-      </w:r>
-      <w:r>
-        <w:rPr>
-          <w:rFonts w:ascii="Calibri" w:hAnsi="Calibri" w:eastAsia="Calibri" w:cs="Calibri" w:hint="eastAsia"/>
-        </w:rPr>
-        <w:t xml:space="preserve">uses the matching private plan to recover logical coordinates. The diagram is</w:t>
-      </w:r>
-      <w:r>
-        <w:rPr>
-          <w:rFonts w:ascii="Calibri" w:hAnsi="Calibri" w:eastAsia="Calibri" w:cs="Calibri" w:hint="eastAsia"/>
-        </w:rPr>
-        <w:t xml:space="preserve"> </w:t>
-      </w:r>
-      <w:r>
-        <w:rPr>
-          <w:rFonts w:ascii="Calibri" w:hAnsi="Calibri" w:eastAsia="Calibri" w:cs="Calibri" w:hint="eastAsia"/>
-        </w:rPr>
-        <w:t xml:space="preserve">an interface summary, not a claim that the listed metadata is</w:t>
+        <w:t xml:space="preserve">Figure 1 shows the protocol boundary. Client A owns matrix publication, the</w:t>
+      </w:r>
+      <w:r>
+        <w:rPr>
+          <w:rFonts w:ascii="Calibri" w:hAnsi="Calibri" w:eastAsia="Calibri" w:cs="Calibri" w:hint="eastAsia"/>
+        </w:rPr>
+        <w:t xml:space="preserve"> </w:t>
+      </w:r>
+      <w:r>
+        <w:rPr>
+          <w:rFonts w:ascii="Calibri" w:hAnsi="Calibri" w:eastAsia="Calibri" w:cs="Calibri" w:hint="eastAsia"/>
+        </w:rPr>
+        <w:t xml:space="preserve">complete plan and private metadata, constructs the version commit, and prepares</w:t>
+      </w:r>
+      <w:r>
+        <w:rPr>
+          <w:rFonts w:ascii="Calibri" w:hAnsi="Calibri" w:eastAsia="Calibri" w:cs="Calibri" w:hint="eastAsia"/>
+        </w:rPr>
+        <w:t xml:space="preserve"> </w:t>
+      </w:r>
+      <w:r>
+        <w:rPr>
+          <w:rFonts w:ascii="Calibri" w:hAnsi="Calibri" w:eastAsia="Calibri" w:cs="Calibri" w:hint="eastAsia"/>
+        </w:rPr>
+        <w:t xml:space="preserve">the encrypted F1-M operands. Client B owns the query and key set, uses the</w:t>
+      </w:r>
+      <w:r>
+        <w:rPr>
+          <w:rFonts w:ascii="Calibri" w:hAnsi="Calibri" w:eastAsia="Calibri" w:cs="Calibri" w:hint="eastAsia"/>
+        </w:rPr>
+        <w:t xml:space="preserve"> </w:t>
+      </w:r>
+      <w:r>
+        <w:rPr>
+          <w:rFonts w:ascii="Calibri" w:hAnsi="Calibri" w:eastAsia="Calibri" w:cs="Calibri" w:hint="eastAsia"/>
+        </w:rPr>
+        <w:t xml:space="preserve">version-matched column metadata to gather and encrypt query values, and uses its</w:t>
+      </w:r>
+      <w:r>
+        <w:rPr>
+          <w:rFonts w:ascii="Calibri" w:hAnsi="Calibri" w:eastAsia="Calibri" w:cs="Calibri" w:hint="eastAsia"/>
+        </w:rPr>
+        <w:t xml:space="preserve"> </w:t>
+      </w:r>
+      <w:r>
+        <w:rPr>
+          <w:rFonts w:ascii="Calibri" w:hAnsi="Calibri" w:eastAsia="Calibri" w:cs="Calibri" w:hint="eastAsia"/>
+        </w:rPr>
+        <w:t xml:space="preserve">copy of the complete plan to recover logical coordinates. The Cloud receives</w:t>
+      </w:r>
+      <w:r>
+        <w:rPr>
+          <w:rFonts w:ascii="Calibri" w:hAnsi="Calibri" w:eastAsia="Calibri" w:cs="Calibri" w:hint="eastAsia"/>
+        </w:rPr>
+        <w:t xml:space="preserve"> </w:t>
+      </w:r>
+      <w:r>
+        <w:rPr>
+          <w:rFonts w:ascii="Calibri" w:hAnsi="Calibri" w:eastAsia="Calibri" w:cs="Calibri" w:hint="eastAsia"/>
+        </w:rPr>
+        <w:t xml:space="preserve">only the typed public program, encrypted operands, and permitted identifiers.</w:t>
+      </w:r>
+      <w:r>
+        <w:rPr>
+          <w:rFonts w:ascii="Calibri" w:hAnsi="Calibri" w:eastAsia="Calibri" w:cs="Calibri" w:hint="eastAsia"/>
+        </w:rPr>
+        <w:t xml:space="preserve"> </w:t>
+      </w:r>
+      <w:r>
+        <w:rPr>
+          <w:rFonts w:ascii="Calibri" w:hAnsi="Calibri" w:eastAsia="Calibri" w:cs="Calibri" w:hint="eastAsia"/>
+        </w:rPr>
+        <w:t xml:space="preserve">The diagram is an interface summary, not a claim that the listed metadata is</w:t>
       </w:r>
       <w:r>
         <w:rPr>
@@ -4393,7 +4659,7 @@
           <wp:inline>
             <wp:extent cx="5334000" cy="2895599"/>
             <wp:effectExtent b="0" l="0" r="0" t="0"/>
-            <wp:docPr descr="Version-bound protocol flow connecting matrix updates, query reorganization, public Cloud execution, and private Client B reconstruction." title="Figure 1" id="18" name="Picture"/>
+            <wp:docPr descr="Version-bound protocol flow: Client A owns matrix publication, metadata, the complete plan, and encrypted masks; Client B owns the query and key set, encrypts the gathered query, and reconstructs; the Cloud executes only the public program and encrypted operands." title="Figure 1" id="18" name="Picture"/>
             <a:graphic>
               <a:graphicData uri="http://schemas.openxmlformats.org/drawingml/2006/picture">
                 <pic:pic>
@@ -5490,7 +5756,7 @@
               <m:sSup>
                 <m:e>
                   <m:r>
-                    <m:t>A</m:t>
+                    <m:t>s</m:t>
                   </m:r>
                 </m:e>
                 <m:sup>
@@ -5872,9 +6138,30 @@
         <w:t xml:space="preserve"> </w:t>
       </w:r>
       <m:oMath>
-        <m:r>
-          <m:t>A</m:t>
-        </m:r>
+        <m:sSup>
+          <m:e>
+            <m:r>
+              <m:t>s</m:t>
+            </m:r>
+          </m:e>
+          <m:sup>
+            <m:r>
+              <m:rPr>
+                <m:sty m:val="p"/>
+              </m:rPr>
+              <m:t>(</m:t>
+            </m:r>
+            <m:r>
+              <m:t>v</m:t>
+            </m:r>
+            <m:r>
+              <m:rPr>
+                <m:sty m:val="p"/>
+              </m:rPr>
+              <m:t>)</m:t>
+            </m:r>
+          </m:sup>
+        </m:sSup>
       </m:oMath>
       <w:r>
         <w:rPr>
@@ -5886,7 +6173,57 @@
         <w:rPr>
           <w:rFonts w:ascii="Calibri" w:hAnsi="Calibri" w:eastAsia="Calibri" w:cs="Calibri" w:hint="eastAsia"/>
         </w:rPr>
-        <w:t xml:space="preserve">is the logical matrix,</w:t>
+        <w:t xml:space="preserve">is the canonical logical-state identity binding the logical</w:t>
+      </w:r>
+      <w:r>
+        <w:rPr>
+          <w:rFonts w:ascii="Calibri" w:hAnsi="Calibri" w:eastAsia="Calibri" w:cs="Calibri" w:hint="eastAsia"/>
+        </w:rPr>
+        <w:t xml:space="preserve"> </w:t>
+      </w:r>
+      <w:r>
+        <w:rPr>
+          <w:rFonts w:ascii="Calibri" w:hAnsi="Calibri" w:eastAsia="Calibri" w:cs="Calibri" w:hint="eastAsia"/>
+        </w:rPr>
+        <w:t xml:space="preserve">matrix</w:t>
+      </w:r>
+      <w:r>
+        <w:rPr>
+          <w:rFonts w:ascii="Calibri" w:hAnsi="Calibri" w:eastAsia="Calibri" w:cs="Calibri" w:hint="eastAsia"/>
+        </w:rPr>
+        <w:t xml:space="preserve"> </w:t>
+      </w:r>
+      <m:oMath>
+        <m:sSup>
+          <m:e>
+            <m:r>
+              <m:t>A</m:t>
+            </m:r>
+          </m:e>
+          <m:sup>
+            <m:r>
+              <m:rPr>
+                <m:sty m:val="p"/>
+              </m:rPr>
+              <m:t>(</m:t>
+            </m:r>
+            <m:r>
+              <m:t>v</m:t>
+            </m:r>
+            <m:r>
+              <m:rPr>
+                <m:sty m:val="p"/>
+              </m:rPr>
+              <m:t>)</m:t>
+            </m:r>
+          </m:sup>
+        </m:sSup>
+      </m:oMath>
+      <w:r>
+        <w:rPr>
+          <w:rFonts w:ascii="Calibri" w:hAnsi="Calibri" w:eastAsia="Calibri" w:cs="Calibri" w:hint="eastAsia"/>
+        </w:rPr>
+        <w:t xml:space="preserve">,</w:t>
       </w:r>
       <w:r>
         <w:rPr>
@@ -6744,7 +7081,19 @@
         <w:rPr>
           <w:rFonts w:ascii="Calibri" w:hAnsi="Calibri" w:eastAsia="Calibri" w:cs="Calibri" w:hint="eastAsia"/>
         </w:rPr>
-        <w:t xml:space="preserve">be component</w:t>
+        <w:t xml:space="preserve">be the physical-output-row by global-logical-column matrix</w:t>
+      </w:r>
+      <w:r>
+        <w:rPr>
+          <w:rFonts w:ascii="Calibri" w:hAnsi="Calibri" w:eastAsia="Calibri" w:cs="Calibri" w:hint="eastAsia"/>
+        </w:rPr>
+        <w:t xml:space="preserve"> </w:t>
+      </w:r>
+      <w:r>
+        <w:rPr>
+          <w:rFonts w:ascii="Calibri" w:hAnsi="Calibri" w:eastAsia="Calibri" w:cs="Calibri" w:hint="eastAsia"/>
+        </w:rPr>
+        <w:t xml:space="preserve">represented by component</w:t>
       </w:r>
       <w:r>
         <w:rPr>
@@ -6761,13 +7110,7 @@
         <w:rPr>
           <w:rFonts w:ascii="Calibri" w:hAnsi="Calibri" w:eastAsia="Calibri" w:cs="Calibri" w:hint="eastAsia"/>
         </w:rPr>
-        <w:t xml:space="preserve"> </w:t>
-      </w:r>
-      <w:r>
-        <w:rPr>
-          <w:rFonts w:ascii="Calibri" w:hAnsi="Calibri" w:eastAsia="Calibri" w:cs="Calibri" w:hint="eastAsia"/>
-        </w:rPr>
-        <w:t xml:space="preserve">in its local physical coordinates and</w:t>
+        <w:t xml:space="preserve">, and let</w:t>
       </w:r>
       <w:r>
         <w:rPr>
@@ -6799,19 +7142,31 @@
         <w:rPr>
           <w:rFonts w:ascii="Calibri" w:hAnsi="Calibri" w:eastAsia="Calibri" w:cs="Calibri" w:hint="eastAsia"/>
         </w:rPr>
-        <w:t xml:space="preserve">its embedding into the logical matrix domain. The admitted decomposition is</w:t>
-      </w:r>
-      <w:r>
-        <w:rPr>
-          <w:rFonts w:ascii="Calibri" w:hAnsi="Calibri" w:eastAsia="Calibri" w:cs="Calibri" w:hint="eastAsia"/>
-        </w:rPr>
-        <w:t xml:space="preserve"> </w:t>
-      </w:r>
-      <w:r>
-        <w:rPr>
-          <w:rFonts w:ascii="Calibri" w:hAnsi="Calibri" w:eastAsia="Calibri" w:cs="Calibri" w:hint="eastAsia"/>
-        </w:rPr>
-        <w:t xml:space="preserve">complete when</w:t>
+        <w:t xml:space="preserve">embed its declared physical output</w:t>
+      </w:r>
+      <w:r>
+        <w:rPr>
+          <w:rFonts w:ascii="Calibri" w:hAnsi="Calibri" w:eastAsia="Calibri" w:cs="Calibri" w:hint="eastAsia"/>
+        </w:rPr>
+        <w:t xml:space="preserve"> </w:t>
+      </w:r>
+      <w:r>
+        <w:rPr>
+          <w:rFonts w:ascii="Calibri" w:hAnsi="Calibri" w:eastAsia="Calibri" w:cs="Calibri" w:hint="eastAsia"/>
+        </w:rPr>
+        <w:t xml:space="preserve">rows into the logical matrix domain. The admitted decomposition is complete</w:t>
+      </w:r>
+      <w:r>
+        <w:rPr>
+          <w:rFonts w:ascii="Calibri" w:hAnsi="Calibri" w:eastAsia="Calibri" w:cs="Calibri" w:hint="eastAsia"/>
+        </w:rPr>
+        <w:t xml:space="preserve"> </w:t>
+      </w:r>
+      <w:r>
+        <w:rPr>
+          <w:rFonts w:ascii="Calibri" w:hAnsi="Calibri" w:eastAsia="Calibri" w:cs="Calibri" w:hint="eastAsia"/>
+        </w:rPr>
+        <w:t xml:space="preserve">when</w:t>
       </w:r>
     </w:p>
     <w:p>
@@ -8554,7 +8909,60 @@
         <w:rPr>
           <w:rFonts w:ascii="Calibri" w:hAnsi="Calibri" w:eastAsia="Calibri" w:cs="Calibri" w:hint="eastAsia"/>
         </w:rPr>
-        <w:t xml:space="preserve">, partition its auxiliary entries in canonical order into</w:t>
+        <w:t xml:space="preserve">, partition its auxiliary post-multiplication lane values</w:t>
+      </w:r>
+      <w:r>
+        <w:rPr>
+          <w:rFonts w:ascii="Calibri" w:hAnsi="Calibri" w:eastAsia="Calibri" w:cs="Calibri" w:hint="eastAsia"/>
+        </w:rPr>
+        <w:t xml:space="preserve"> </w:t>
+      </w:r>
+      <m:oMath>
+        <m:sSub>
+          <m:e>
+            <m:r>
+              <m:t>a</m:t>
+            </m:r>
+          </m:e>
+          <m:sub>
+            <m:r>
+              <m:t>r</m:t>
+            </m:r>
+            <m:r>
+              <m:rPr>
+                <m:sty m:val="p"/>
+              </m:rPr>
+              <m:t>,</m:t>
+            </m:r>
+            <m:r>
+              <m:t>c</m:t>
+            </m:r>
+          </m:sub>
+        </m:sSub>
+        <m:sSub>
+          <m:e>
+            <m:r>
+              <m:t>x</m:t>
+            </m:r>
+          </m:e>
+          <m:sub>
+            <m:r>
+              <m:t>c</m:t>
+            </m:r>
+          </m:sub>
+        </m:sSub>
+      </m:oMath>
+      <w:r>
+        <w:rPr>
+          <w:rFonts w:ascii="Calibri" w:hAnsi="Calibri" w:eastAsia="Calibri" w:cs="Calibri" w:hint="eastAsia"/>
+        </w:rPr>
+        <w:t xml:space="preserve"> </w:t>
+      </w:r>
+      <w:r>
+        <w:rPr>
+          <w:rFonts w:ascii="Calibri" w:hAnsi="Calibri" w:eastAsia="Calibri" w:cs="Calibri" w:hint="eastAsia"/>
+        </w:rPr>
+        <w:t xml:space="preserve">in canonical entry order into</w:t>
       </w:r>
       <w:r>
         <w:rPr>
@@ -8707,19 +9115,128 @@
         <w:rPr>
           <w:rFonts w:ascii="Calibri" w:hAnsi="Calibri" w:eastAsia="Calibri" w:cs="Calibri" w:hint="eastAsia"/>
         </w:rPr>
-        <w:t xml:space="preserve">lanes and pad only the</w:t>
-      </w:r>
-      <w:r>
-        <w:rPr>
-          <w:rFonts w:ascii="Calibri" w:hAnsi="Calibri" w:eastAsia="Calibri" w:cs="Calibri" w:hint="eastAsia"/>
-        </w:rPr>
-        <w:t xml:space="preserve"> </w:t>
-      </w:r>
-      <w:r>
-        <w:rPr>
-          <w:rFonts w:ascii="Calibri" w:hAnsi="Calibri" w:eastAsia="Calibri" w:cs="Calibri" w:hint="eastAsia"/>
-        </w:rPr>
-        <w:t xml:space="preserve">final unused suffix with zeros. The seven-stage public reduction places</w:t>
+        <w:t xml:space="preserve">lanes, so every populated</w:t>
+      </w:r>
+      <w:r>
+        <w:rPr>
+          <w:rFonts w:ascii="Calibri" w:hAnsi="Calibri" w:eastAsia="Calibri" w:cs="Calibri" w:hint="eastAsia"/>
+        </w:rPr>
+        <w:t xml:space="preserve"> </w:t>
+      </w:r>
+      <m:oMath>
+        <m:sSub>
+          <m:e>
+            <m:r>
+              <m:t>S</m:t>
+            </m:r>
+          </m:e>
+          <m:sub>
+            <m:r>
+              <m:t>r</m:t>
+            </m:r>
+            <m:r>
+              <m:rPr>
+                <m:sty m:val="p"/>
+              </m:rPr>
+              <m:t>,</m:t>
+            </m:r>
+            <m:r>
+              <m:t>j</m:t>
+            </m:r>
+          </m:sub>
+        </m:sSub>
+        <m:r>
+          <m:rPr>
+            <m:sty m:val="p"/>
+          </m:rPr>
+          <m:t>[</m:t>
+        </m:r>
+        <m:r>
+          <m:t>ℓ</m:t>
+        </m:r>
+        <m:r>
+          <m:rPr>
+            <m:sty m:val="p"/>
+          </m:rPr>
+          <m:t>]</m:t>
+        </m:r>
+      </m:oMath>
+      <w:r>
+        <w:rPr>
+          <w:rFonts w:ascii="Calibri" w:hAnsi="Calibri" w:eastAsia="Calibri" w:cs="Calibri" w:hint="eastAsia"/>
+        </w:rPr>
+        <w:t xml:space="preserve"> </w:t>
+      </w:r>
+      <w:r>
+        <w:rPr>
+          <w:rFonts w:ascii="Calibri" w:hAnsi="Calibri" w:eastAsia="Calibri" w:cs="Calibri" w:hint="eastAsia"/>
+        </w:rPr>
+        <w:t xml:space="preserve">is one such</w:t>
+      </w:r>
+      <w:r>
+        <w:rPr>
+          <w:rFonts w:ascii="Calibri" w:hAnsi="Calibri" w:eastAsia="Calibri" w:cs="Calibri" w:hint="eastAsia"/>
+        </w:rPr>
+        <w:t xml:space="preserve"> </w:t>
+      </w:r>
+      <m:oMath>
+        <m:sSub>
+          <m:e>
+            <m:r>
+              <m:t>a</m:t>
+            </m:r>
+          </m:e>
+          <m:sub>
+            <m:r>
+              <m:t>r</m:t>
+            </m:r>
+            <m:r>
+              <m:rPr>
+                <m:sty m:val="p"/>
+              </m:rPr>
+              <m:t>,</m:t>
+            </m:r>
+            <m:r>
+              <m:t>c</m:t>
+            </m:r>
+          </m:sub>
+        </m:sSub>
+        <m:sSub>
+          <m:e>
+            <m:r>
+              <m:t>x</m:t>
+            </m:r>
+          </m:e>
+          <m:sub>
+            <m:r>
+              <m:t>c</m:t>
+            </m:r>
+          </m:sub>
+        </m:sSub>
+      </m:oMath>
+      <w:r>
+        <w:rPr>
+          <w:rFonts w:ascii="Calibri" w:hAnsi="Calibri" w:eastAsia="Calibri" w:cs="Calibri" w:hint="eastAsia"/>
+        </w:rPr>
+        <w:t xml:space="preserve"> </w:t>
+      </w:r>
+      <w:r>
+        <w:rPr>
+          <w:rFonts w:ascii="Calibri" w:hAnsi="Calibri" w:eastAsia="Calibri" w:cs="Calibri" w:hint="eastAsia"/>
+        </w:rPr>
+        <w:t xml:space="preserve">value, and pad only the final unused</w:t>
+      </w:r>
+      <w:r>
+        <w:rPr>
+          <w:rFonts w:ascii="Calibri" w:hAnsi="Calibri" w:eastAsia="Calibri" w:cs="Calibri" w:hint="eastAsia"/>
+        </w:rPr>
+        <w:t xml:space="preserve"> </w:t>
+      </w:r>
+      <w:r>
+        <w:rPr>
+          <w:rFonts w:ascii="Calibri" w:hAnsi="Calibri" w:eastAsia="Calibri" w:cs="Calibri" w:hint="eastAsia"/>
+        </w:rPr>
+        <w:t xml:space="preserve">suffix with zeros. The seven-stage public reduction places</w:t>
       </w:r>
     </w:p>
     <w:p>
@@ -9434,26 +9951,32 @@
         <w:rPr>
           <w:rFonts w:ascii="Calibri" w:hAnsi="Calibri" w:eastAsia="Calibri" w:cs="Calibri" w:hint="eastAsia"/>
         </w:rPr>
-        <w:t xml:space="preserve">Its GitHub Actions artifact-wrapper SHA-256 digest is</w:t>
-      </w:r>
-      <w:r>
-        <w:rPr>
-          <w:rFonts w:ascii="Calibri" w:hAnsi="Calibri" w:eastAsia="Calibri" w:cs="Calibri" w:hint="eastAsia"/>
-        </w:rPr>
-        <w:t xml:space="preserve"> </w:t>
+        <w:t xml:space="preserve">Its GitHub Actions artifact-wrapper SHA-256 digest is recorded in the</w:t>
+      </w:r>
+      <w:r>
+        <w:rPr>
+          <w:rFonts w:ascii="Calibri" w:hAnsi="Calibri" w:eastAsia="Calibri" w:cs="Calibri" w:hint="eastAsia"/>
+        </w:rPr>
+        <w:t xml:space="preserve"> </w:t>
+      </w:r>
+      <w:r>
+        <w:rPr>
+          <w:rFonts w:ascii="Calibri" w:hAnsi="Calibri" w:eastAsia="Calibri" w:cs="Calibri" w:hint="eastAsia"/>
+        </w:rPr>
+        <w:t xml:space="preserve">version-bound claim-ledger supplement (</w:t>
       </w:r>
       <w:r>
         <w:rPr>
           <w:rStyle w:val="VerbatimChar"/>
           <w:rFonts w:ascii="Calibri" w:hAnsi="Calibri" w:eastAsia="Calibri" w:cs="Calibri" w:hint="eastAsia"/>
         </w:rPr>
-        <w:t xml:space="preserve">c5f44b0c9475a66d49b48332e335cb58811cf4eec579ebff631123c4e4711afe</w:t>
-      </w:r>
-      <w:r>
-        <w:rPr>
-          <w:rFonts w:ascii="Calibri" w:hAnsi="Calibri" w:eastAsia="Calibri" w:cs="Calibri" w:hint="eastAsia"/>
-        </w:rPr>
-        <w:t xml:space="preserve">.</w:t>
+        <w:t xml:space="preserve">c5f44b0c…4711afe</w:t>
+      </w:r>
+      <w:r>
+        <w:rPr>
+          <w:rFonts w:ascii="Calibri" w:hAnsi="Calibri" w:eastAsia="Calibri" w:cs="Calibri" w:hint="eastAsia"/>
+        </w:rPr>
+        <w:t xml:space="preserve">).</w:t>
       </w:r>
     </w:p>
     <w:p>
@@ -9501,7 +10024,7 @@
           <w:b/>
           <w:bCs/>
         </w:rPr>
-        <w:t xml:space="preserve">Table 1. Definition-level obligations and their Route C disposition.</w:t>
+        <w:t xml:space="preserve">Table 2. Definition-level obligations and their Route C disposition.</w:t>
       </w:r>
     </w:p>
     <w:tbl>
@@ -10541,31 +11064,67 @@
         <w:rPr>
           <w:rFonts w:ascii="Calibri" w:hAnsi="Calibri" w:eastAsia="Calibri" w:cs="Calibri" w:hint="eastAsia"/>
         </w:rPr>
-        <w:t xml:space="preserve">The experiment is frozen before any formal artifact is inspected. It does not</w:t>
-      </w:r>
-      <w:r>
-        <w:rPr>
-          <w:rFonts w:ascii="Calibri" w:hAnsi="Calibri" w:eastAsia="Calibri" w:cs="Calibri" w:hint="eastAsia"/>
-        </w:rPr>
-        <w:t xml:space="preserve"> </w:t>
-      </w:r>
-      <w:r>
-        <w:rPr>
-          <w:rFonts w:ascii="Calibri" w:hAnsi="Calibri" w:eastAsia="Calibri" w:cs="Calibri" w:hint="eastAsia"/>
-        </w:rPr>
-        <w:t xml:space="preserve">train a selector, choose a winner on a tuning prefix, or use a held-out oracle.</w:t>
-      </w:r>
-      <w:r>
-        <w:rPr>
-          <w:rFonts w:ascii="Calibri" w:hAnsi="Calibri" w:eastAsia="Calibri" w:cs="Calibri" w:hint="eastAsia"/>
-        </w:rPr>
-        <w:t xml:space="preserve"> </w:t>
-      </w:r>
-      <w:r>
-        <w:rPr>
-          <w:rFonts w:ascii="Calibri" w:hAnsi="Calibri" w:eastAsia="Calibri" w:cs="Calibri" w:hint="eastAsia"/>
-        </w:rPr>
-        <w:t xml:space="preserve">Every strategy owns an independent persistent state and consumes the same</w:t>
+        <w:t xml:space="preserve">Sections 6.1–6.6 preserve the frozen counterfactual execution and reporting</w:t>
+      </w:r>
+      <w:r>
+        <w:rPr>
+          <w:rFonts w:ascii="Calibri" w:hAnsi="Calibri" w:eastAsia="Calibri" w:cs="Calibri" w:hint="eastAsia"/>
+        </w:rPr>
+        <w:t xml:space="preserve"> </w:t>
+      </w:r>
+      <w:r>
+        <w:rPr>
+          <w:rFonts w:ascii="Calibri" w:hAnsi="Calibri" w:eastAsia="Calibri" w:cs="Calibri" w:hint="eastAsia"/>
+        </w:rPr>
+        <w:t xml:space="preserve">protocol. Because qualification failed, none of the acquisitions, formal cells,</w:t>
+      </w:r>
+      <w:r>
+        <w:rPr>
+          <w:rFonts w:ascii="Calibri" w:hAnsi="Calibri" w:eastAsia="Calibri" w:cs="Calibri" w:hint="eastAsia"/>
+        </w:rPr>
+        <w:t xml:space="preserve"> </w:t>
+      </w:r>
+      <w:r>
+        <w:rPr>
+          <w:rFonts w:ascii="Calibri" w:hAnsi="Calibri" w:eastAsia="Calibri" w:cs="Calibri" w:hint="eastAsia"/>
+        </w:rPr>
+        <w:t xml:space="preserve">native cases, measurements, or reports specified below occurred. The protocol</w:t>
+      </w:r>
+      <w:r>
+        <w:rPr>
+          <w:rFonts w:ascii="Calibri" w:hAnsi="Calibri" w:eastAsia="Calibri" w:cs="Calibri" w:hint="eastAsia"/>
+        </w:rPr>
+        <w:t xml:space="preserve"> </w:t>
+      </w:r>
+      <w:r>
+        <w:rPr>
+          <w:rFonts w:ascii="Calibri" w:hAnsi="Calibri" w:eastAsia="Calibri" w:cs="Calibri" w:hint="eastAsia"/>
+        </w:rPr>
+        <w:t xml:space="preserve">was frozen before any formal artifact could be inspected. It specified no</w:t>
+      </w:r>
+      <w:r>
+        <w:rPr>
+          <w:rFonts w:ascii="Calibri" w:hAnsi="Calibri" w:eastAsia="Calibri" w:cs="Calibri" w:hint="eastAsia"/>
+        </w:rPr>
+        <w:t xml:space="preserve"> </w:t>
+      </w:r>
+      <w:r>
+        <w:rPr>
+          <w:rFonts w:ascii="Calibri" w:hAnsi="Calibri" w:eastAsia="Calibri" w:cs="Calibri" w:hint="eastAsia"/>
+        </w:rPr>
+        <w:t xml:space="preserve">trained selector, winner chosen on a tuning prefix, or held-out oracle. Every</w:t>
+      </w:r>
+      <w:r>
+        <w:rPr>
+          <w:rFonts w:ascii="Calibri" w:hAnsi="Calibri" w:eastAsia="Calibri" w:cs="Calibri" w:hint="eastAsia"/>
+        </w:rPr>
+        <w:t xml:space="preserve"> </w:t>
+      </w:r>
+      <w:r>
+        <w:rPr>
+          <w:rFonts w:ascii="Calibri" w:hAnsi="Calibri" w:eastAsia="Calibri" w:cs="Calibri" w:hint="eastAsia"/>
+        </w:rPr>
+        <w:t xml:space="preserve">strategy would have owned an independent persistent state and consumed the same</w:t>
       </w:r>
       <w:r>
         <w:rPr>
@@ -10589,19 +11148,19 @@
         <w:rPr>
           <w:rFonts w:ascii="Calibri" w:hAnsi="Calibri" w:eastAsia="Calibri" w:cs="Calibri" w:hint="eastAsia"/>
         </w:rPr>
-        <w:t xml:space="preserve">and public parameters. The intervention is therefore the maintenance mechanism,</w:t>
-      </w:r>
-      <w:r>
-        <w:rPr>
-          <w:rFonts w:ascii="Calibri" w:hAnsi="Calibri" w:eastAsia="Calibri" w:cs="Calibri" w:hint="eastAsia"/>
-        </w:rPr>
-        <w:t xml:space="preserve"> </w:t>
-      </w:r>
-      <w:r>
-        <w:rPr>
-          <w:rFonts w:ascii="Calibri" w:hAnsi="Calibri" w:eastAsia="Calibri" w:cs="Calibri" w:hint="eastAsia"/>
-        </w:rPr>
-        <w:t xml:space="preserve">not the workload history.</w:t>
+        <w:t xml:space="preserve">and public parameters. The intended intervention was therefore the maintenance</w:t>
+      </w:r>
+      <w:r>
+        <w:rPr>
+          <w:rFonts w:ascii="Calibri" w:hAnsi="Calibri" w:eastAsia="Calibri" w:cs="Calibri" w:hint="eastAsia"/>
+        </w:rPr>
+        <w:t xml:space="preserve"> </w:t>
+      </w:r>
+      <w:r>
+        <w:rPr>
+          <w:rFonts w:ascii="Calibri" w:hAnsi="Calibri" w:eastAsia="Calibri" w:cs="Calibri" w:hint="eastAsia"/>
+        </w:rPr>
+        <w:t xml:space="preserve">mechanism, not the workload history.</w:t>
       </w:r>
     </w:p>
     <w:bookmarkStart w:id="31" w:name="fixed-strategies"/>
@@ -10624,7 +11183,7 @@
         <w:rPr>
           <w:rFonts w:ascii="Calibri" w:hAnsi="Calibri" w:eastAsia="Calibri" w:cs="Calibri" w:hint="eastAsia"/>
         </w:rPr>
-        <w:t xml:space="preserve">The three strategy identities are:</w:t>
+        <w:t xml:space="preserve">The three strategy identities were:</w:t>
       </w:r>
     </w:p>
     <w:p>
@@ -10646,7 +11205,7 @@
         <w:rPr>
           <w:rFonts w:ascii="Calibri" w:hAnsi="Calibri" w:eastAsia="Calibri" w:cs="Calibri" w:hint="eastAsia"/>
         </w:rPr>
-        <w:t xml:space="preserve">, which reconstructs and republishes a complete</w:t>
+        <w:t xml:space="preserve">, which would have reconstructed and republished a complete</w:t>
       </w:r>
       <w:r>
         <w:rPr>
@@ -10680,7 +11239,7 @@
         <w:rPr>
           <w:rFonts w:ascii="Calibri" w:hAnsi="Calibri" w:eastAsia="Calibri" w:cs="Calibri" w:hint="eastAsia"/>
         </w:rPr>
-        <w:t xml:space="preserve">, which reuses the lowest-ordinal tombstone, then natural</w:t>
+        <w:t xml:space="preserve">, which would have reused the lowest-ordinal tombstone, then natural</w:t>
       </w:r>
       <w:r>
         <w:rPr>
@@ -10726,31 +11285,31 @@
         <w:rPr>
           <w:rFonts w:ascii="Calibri" w:hAnsi="Calibri" w:eastAsia="Calibri" w:cs="Calibri" w:hint="eastAsia"/>
         </w:rPr>
-        <w:t xml:space="preserve">, which keeps a CSSC base</w:t>
-      </w:r>
-      <w:r>
-        <w:rPr>
-          <w:rFonts w:ascii="Calibri" w:hAnsi="Calibri" w:eastAsia="Calibri" w:cs="Calibri" w:hint="eastAsia"/>
-        </w:rPr>
-        <w:t xml:space="preserve"> </w:t>
-      </w:r>
-      <w:r>
-        <w:rPr>
-          <w:rFonts w:ascii="Calibri" w:hAnsi="Calibri" w:eastAsia="Calibri" w:cs="Calibri" w:hint="eastAsia"/>
-        </w:rPr>
-        <w:t xml:space="preserve">and appends overflow into cloud-executable, row-owned 128-lane segments. It</w:t>
-      </w:r>
-      <w:r>
-        <w:rPr>
-          <w:rFonts w:ascii="Calibri" w:hAnsi="Calibri" w:eastAsia="Calibri" w:cs="Calibri" w:hint="eastAsia"/>
-        </w:rPr>
-        <w:t xml:space="preserve"> </w:t>
-      </w:r>
-      <w:r>
-        <w:rPr>
-          <w:rFonts w:ascii="Calibri" w:hAnsi="Calibri" w:eastAsia="Calibri" w:cs="Calibri" w:hint="eastAsia"/>
-        </w:rPr>
-        <w:t xml:space="preserve">never folds online in the registered experiment.</w:t>
+        <w:t xml:space="preserve">, which would have kept a</w:t>
+      </w:r>
+      <w:r>
+        <w:rPr>
+          <w:rFonts w:ascii="Calibri" w:hAnsi="Calibri" w:eastAsia="Calibri" w:cs="Calibri" w:hint="eastAsia"/>
+        </w:rPr>
+        <w:t xml:space="preserve"> </w:t>
+      </w:r>
+      <w:r>
+        <w:rPr>
+          <w:rFonts w:ascii="Calibri" w:hAnsi="Calibri" w:eastAsia="Calibri" w:cs="Calibri" w:hint="eastAsia"/>
+        </w:rPr>
+        <w:t xml:space="preserve">CSSC base and appended overflow into cloud-executable, row-owned 128-lane</w:t>
+      </w:r>
+      <w:r>
+        <w:rPr>
+          <w:rFonts w:ascii="Calibri" w:hAnsi="Calibri" w:eastAsia="Calibri" w:cs="Calibri" w:hint="eastAsia"/>
+        </w:rPr>
+        <w:t xml:space="preserve"> </w:t>
+      </w:r>
+      <w:r>
+        <w:rPr>
+          <w:rFonts w:ascii="Calibri" w:hAnsi="Calibri" w:eastAsia="Calibri" w:cs="Calibri" w:hint="eastAsia"/>
+        </w:rPr>
+        <w:t xml:space="preserve">segments. It was not to fold online in the registered experiment.</w:t>
       </w:r>
     </w:p>
     <w:p>
@@ -10761,31 +11320,43 @@
         <w:rPr>
           <w:rFonts w:ascii="Calibri" w:hAnsi="Calibri" w:eastAsia="Calibri" w:cs="Calibri" w:hint="eastAsia"/>
         </w:rPr>
-        <w:t xml:space="preserve">These candidates are mechanisms to compare, not actions of an online policy.</w:t>
-      </w:r>
-      <w:r>
-        <w:rPr>
-          <w:rFonts w:ascii="Calibri" w:hAnsi="Calibri" w:eastAsia="Calibri" w:cs="Calibri" w:hint="eastAsia"/>
-        </w:rPr>
-        <w:t xml:space="preserve"> </w:t>
-      </w:r>
-      <w:r>
-        <w:rPr>
-          <w:rFonts w:ascii="Calibri" w:hAnsi="Calibri" w:eastAsia="Calibri" w:cs="Calibri" w:hint="eastAsia"/>
-        </w:rPr>
-        <w:t xml:space="preserve">A slower strategy, a crossing cost curve, or the absence of a global winner is</w:t>
-      </w:r>
-      <w:r>
-        <w:rPr>
-          <w:rFonts w:ascii="Calibri" w:hAnsi="Calibri" w:eastAsia="Calibri" w:cs="Calibri" w:hint="eastAsia"/>
-        </w:rPr>
-        <w:t xml:space="preserve"> </w:t>
-      </w:r>
-      <w:r>
-        <w:rPr>
-          <w:rFonts w:ascii="Calibri" w:hAnsi="Calibri" w:eastAsia="Calibri" w:cs="Calibri" w:hint="eastAsia"/>
-        </w:rPr>
-        <w:t xml:space="preserve">a reportable outcome rather than a failed experiment.</w:t>
+        <w:t xml:space="preserve">These candidates were mechanisms specified for comparison, not actions of an</w:t>
+      </w:r>
+      <w:r>
+        <w:rPr>
+          <w:rFonts w:ascii="Calibri" w:hAnsi="Calibri" w:eastAsia="Calibri" w:cs="Calibri" w:hint="eastAsia"/>
+        </w:rPr>
+        <w:t xml:space="preserve"> </w:t>
+      </w:r>
+      <w:r>
+        <w:rPr>
+          <w:rFonts w:ascii="Calibri" w:hAnsi="Calibri" w:eastAsia="Calibri" w:cs="Calibri" w:hint="eastAsia"/>
+        </w:rPr>
+        <w:t xml:space="preserve">online policy. A slower strategy, a crossing cost curve, or the absence of a</w:t>
+      </w:r>
+      <w:r>
+        <w:rPr>
+          <w:rFonts w:ascii="Calibri" w:hAnsi="Calibri" w:eastAsia="Calibri" w:cs="Calibri" w:hint="eastAsia"/>
+        </w:rPr>
+        <w:t xml:space="preserve"> </w:t>
+      </w:r>
+      <w:r>
+        <w:rPr>
+          <w:rFonts w:ascii="Calibri" w:hAnsi="Calibri" w:eastAsia="Calibri" w:cs="Calibri" w:hint="eastAsia"/>
+        </w:rPr>
+        <w:t xml:space="preserve">global winner would have been a reportable outcome rather than a failed</w:t>
+      </w:r>
+      <w:r>
+        <w:rPr>
+          <w:rFonts w:ascii="Calibri" w:hAnsi="Calibri" w:eastAsia="Calibri" w:cs="Calibri" w:hint="eastAsia"/>
+        </w:rPr>
+        <w:t xml:space="preserve"> </w:t>
+      </w:r>
+      <w:r>
+        <w:rPr>
+          <w:rFonts w:ascii="Calibri" w:hAnsi="Calibri" w:eastAsia="Calibri" w:cs="Calibri" w:hint="eastAsia"/>
+        </w:rPr>
+        <w:t xml:space="preserve">experiment.</w:t>
       </w:r>
     </w:p>
     <w:bookmarkEnd w:id="31"/>
@@ -10809,31 +11380,43 @@
         <w:rPr>
           <w:rFonts w:ascii="Calibri" w:hAnsi="Calibri" w:eastAsia="Calibri" w:cs="Calibri" w:hint="eastAsia"/>
         </w:rPr>
-        <w:t xml:space="preserve">The synthetic suite uses a mixed insert/delete/modify workload at two frozen</w:t>
-      </w:r>
-      <w:r>
-        <w:rPr>
-          <w:rFonts w:ascii="Calibri" w:hAnsi="Calibri" w:eastAsia="Calibri" w:cs="Calibri" w:hint="eastAsia"/>
-        </w:rPr>
-        <w:t xml:space="preserve"> </w:t>
-      </w:r>
-      <w:r>
-        <w:rPr>
-          <w:rFonts w:ascii="Calibri" w:hAnsi="Calibri" w:eastAsia="Calibri" w:cs="Calibri" w:hint="eastAsia"/>
-        </w:rPr>
-        <w:t xml:space="preserve">scales: S has 256 rows, 8,193 columns, and 512 accepted updates; M has 1,024</w:t>
-      </w:r>
-      <w:r>
-        <w:rPr>
-          <w:rFonts w:ascii="Calibri" w:hAnsi="Calibri" w:eastAsia="Calibri" w:cs="Calibri" w:hint="eastAsia"/>
-        </w:rPr>
-        <w:t xml:space="preserve"> </w:t>
-      </w:r>
-      <w:r>
-        <w:rPr>
-          <w:rFonts w:ascii="Calibri" w:hAnsi="Calibri" w:eastAsia="Calibri" w:cs="Calibri" w:hint="eastAsia"/>
-        </w:rPr>
-        <w:t xml:space="preserve">rows, 8,193 columns, and 2,048 accepted updates. The formal seeds are</w:t>
+        <w:t xml:space="preserve">The synthetic suite was specified to use a mixed insert/delete/modify workload</w:t>
+      </w:r>
+      <w:r>
+        <w:rPr>
+          <w:rFonts w:ascii="Calibri" w:hAnsi="Calibri" w:eastAsia="Calibri" w:cs="Calibri" w:hint="eastAsia"/>
+        </w:rPr>
+        <w:t xml:space="preserve"> </w:t>
+      </w:r>
+      <w:r>
+        <w:rPr>
+          <w:rFonts w:ascii="Calibri" w:hAnsi="Calibri" w:eastAsia="Calibri" w:cs="Calibri" w:hint="eastAsia"/>
+        </w:rPr>
+        <w:t xml:space="preserve">at two frozen scales: S would have had 256 rows, 8,193 columns, and 512 accepted</w:t>
+      </w:r>
+      <w:r>
+        <w:rPr>
+          <w:rFonts w:ascii="Calibri" w:hAnsi="Calibri" w:eastAsia="Calibri" w:cs="Calibri" w:hint="eastAsia"/>
+        </w:rPr>
+        <w:t xml:space="preserve"> </w:t>
+      </w:r>
+      <w:r>
+        <w:rPr>
+          <w:rFonts w:ascii="Calibri" w:hAnsi="Calibri" w:eastAsia="Calibri" w:cs="Calibri" w:hint="eastAsia"/>
+        </w:rPr>
+        <w:t xml:space="preserve">updates; M would have had 1,024 rows, 8,193 columns, and 2,048 accepted updates.</w:t>
+      </w:r>
+      <w:r>
+        <w:rPr>
+          <w:rFonts w:ascii="Calibri" w:hAnsi="Calibri" w:eastAsia="Calibri" w:cs="Calibri" w:hint="eastAsia"/>
+        </w:rPr>
+        <w:t xml:space="preserve"> </w:t>
+      </w:r>
+      <w:r>
+        <w:rPr>
+          <w:rFonts w:ascii="Calibri" w:hAnsi="Calibri" w:eastAsia="Calibri" w:cs="Calibri" w:hint="eastAsia"/>
+        </w:rPr>
+        <w:t xml:space="preserve">The formal seeds were</w:t>
       </w:r>
       <w:r>
         <w:rPr>
@@ -10890,19 +11473,19 @@
         <w:rPr>
           <w:rFonts w:ascii="Calibri" w:hAnsi="Calibri" w:eastAsia="Calibri" w:cs="Calibri" w:hint="eastAsia"/>
         </w:rPr>
-        <w:t xml:space="preserve">, giving six scale–seed shards. Every</w:t>
-      </w:r>
-      <w:r>
-        <w:rPr>
-          <w:rFonts w:ascii="Calibri" w:hAnsi="Calibri" w:eastAsia="Calibri" w:cs="Calibri" w:hint="eastAsia"/>
-        </w:rPr>
-        <w:t xml:space="preserve"> </w:t>
-      </w:r>
-      <w:r>
-        <w:rPr>
-          <w:rFonts w:ascii="Calibri" w:hAnsi="Calibri" w:eastAsia="Calibri" w:cs="Calibri" w:hint="eastAsia"/>
-        </w:rPr>
-        <w:t xml:space="preserve">shard evaluates all three strategies at</w:t>
+        <w:t xml:space="preserve">, defining six</w:t>
+      </w:r>
+      <w:r>
+        <w:rPr>
+          <w:rFonts w:ascii="Calibri" w:hAnsi="Calibri" w:eastAsia="Calibri" w:cs="Calibri" w:hint="eastAsia"/>
+        </w:rPr>
+        <w:t xml:space="preserve"> </w:t>
+      </w:r>
+      <w:r>
+        <w:rPr>
+          <w:rFonts w:ascii="Calibri" w:hAnsi="Calibri" w:eastAsia="Calibri" w:cs="Calibri" w:hint="eastAsia"/>
+        </w:rPr>
+        <w:t xml:space="preserve">scale–seed shards. Every shard would have evaluated all three strategies at</w:t>
       </w:r>
       <w:r>
         <w:rPr>
@@ -11388,7 +11971,19 @@
         <w:rPr>
           <w:rFonts w:ascii="Calibri" w:hAnsi="Calibri" w:eastAsia="Calibri" w:cs="Calibri" w:hint="eastAsia"/>
         </w:rPr>
-        <w:t xml:space="preserve">cells execute directly. The</w:t>
+        <w:t xml:space="preserve">cells were specified for direct execution.</w:t>
+      </w:r>
+      <w:r>
+        <w:rPr>
+          <w:rFonts w:ascii="Calibri" w:hAnsi="Calibri" w:eastAsia="Calibri" w:cs="Calibri" w:hint="eastAsia"/>
+        </w:rPr>
+        <w:t xml:space="preserve"> </w:t>
+      </w:r>
+      <w:r>
+        <w:rPr>
+          <w:rFonts w:ascii="Calibri" w:hAnsi="Calibri" w:eastAsia="Calibri" w:cs="Calibri" w:hint="eastAsia"/>
+        </w:rPr>
+        <w:t xml:space="preserve">The</w:t>
       </w:r>
       <w:r>
         <w:rPr>
@@ -11420,19 +12015,19 @@
         <w:rPr>
           <w:rFonts w:ascii="Calibri" w:hAnsi="Calibri" w:eastAsia="Calibri" w:cs="Calibri" w:hint="eastAsia"/>
         </w:rPr>
-        <w:t xml:space="preserve">cell is not timed; it is an exact registered transformation of the same</w:t>
-      </w:r>
-      <w:r>
-        <w:rPr>
-          <w:rFonts w:ascii="Calibri" w:hAnsi="Calibri" w:eastAsia="Calibri" w:cs="Calibri" w:hint="eastAsia"/>
-        </w:rPr>
-        <w:t xml:space="preserve"> </w:t>
-      </w:r>
-      <w:r>
-        <w:rPr>
-          <w:rFonts w:ascii="Calibri" w:hAnsi="Calibri" w:eastAsia="Calibri" w:cs="Calibri" w:hint="eastAsia"/>
-        </w:rPr>
-        <w:t xml:space="preserve">strategy and shard’s</w:t>
+        <w:t xml:space="preserve">cell would not have been timed; it was registered as an exact</w:t>
+      </w:r>
+      <w:r>
+        <w:rPr>
+          <w:rFonts w:ascii="Calibri" w:hAnsi="Calibri" w:eastAsia="Calibri" w:cs="Calibri" w:hint="eastAsia"/>
+        </w:rPr>
+        <w:t xml:space="preserve"> </w:t>
+      </w:r>
+      <w:r>
+        <w:rPr>
+          <w:rFonts w:ascii="Calibri" w:hAnsi="Calibri" w:eastAsia="Calibri" w:cs="Calibri" w:hint="eastAsia"/>
+        </w:rPr>
+        <w:t xml:space="preserve">transformation of the same strategy and shard’s</w:t>
       </w:r>
       <w:r>
         <w:rPr>
@@ -11464,19 +12059,31 @@
         <w:rPr>
           <w:rFonts w:ascii="Calibri" w:hAnsi="Calibri" w:eastAsia="Calibri" w:cs="Calibri" w:hint="eastAsia"/>
         </w:rPr>
-        <w:t xml:space="preserve">query-linear count and byte fields. Any event,</w:t>
-      </w:r>
-      <w:r>
-        <w:rPr>
-          <w:rFonts w:ascii="Calibri" w:hAnsi="Calibri" w:eastAsia="Calibri" w:cs="Calibri" w:hint="eastAsia"/>
-        </w:rPr>
-        <w:t xml:space="preserve"> </w:t>
-      </w:r>
-      <w:r>
-        <w:rPr>
-          <w:rFonts w:ascii="Calibri" w:hAnsi="Calibri" w:eastAsia="Calibri" w:cs="Calibri" w:hint="eastAsia"/>
-        </w:rPr>
-        <w:t xml:space="preserve">window, state, or non-whitelisted-field mismatch rejects the entire shard.</w:t>
+        <w:t xml:space="preserve">query-linear count and</w:t>
+      </w:r>
+      <w:r>
+        <w:rPr>
+          <w:rFonts w:ascii="Calibri" w:hAnsi="Calibri" w:eastAsia="Calibri" w:cs="Calibri" w:hint="eastAsia"/>
+        </w:rPr>
+        <w:t xml:space="preserve"> </w:t>
+      </w:r>
+      <w:r>
+        <w:rPr>
+          <w:rFonts w:ascii="Calibri" w:hAnsi="Calibri" w:eastAsia="Calibri" w:cs="Calibri" w:hint="eastAsia"/>
+        </w:rPr>
+        <w:t xml:space="preserve">byte fields. Any event, window, state, or non-whitelisted-field mismatch would</w:t>
+      </w:r>
+      <w:r>
+        <w:rPr>
+          <w:rFonts w:ascii="Calibri" w:hAnsi="Calibri" w:eastAsia="Calibri" w:cs="Calibri" w:hint="eastAsia"/>
+        </w:rPr>
+        <w:t xml:space="preserve"> </w:t>
+      </w:r>
+      <w:r>
+        <w:rPr>
+          <w:rFonts w:ascii="Calibri" w:hAnsi="Calibri" w:eastAsia="Calibri" w:cs="Calibri" w:hint="eastAsia"/>
+        </w:rPr>
+        <w:t xml:space="preserve">have rejected the entire shard.</w:t>
       </w:r>
     </w:p>
     <w:bookmarkEnd w:id="32"/>
@@ -11500,7 +12107,19 @@
         <w:rPr>
           <w:rFonts w:ascii="Calibri" w:hAnsi="Calibri" w:eastAsia="Calibri" w:cs="Calibri" w:hint="eastAsia"/>
         </w:rPr>
-        <w:t xml:space="preserve">The sole external object is the SNAP Stack Overflow answer-to-question stream</w:t>
+        <w:t xml:space="preserve">The sole external object would have been the SNAP Stack Overflow</w:t>
+      </w:r>
+      <w:r>
+        <w:rPr>
+          <w:rFonts w:ascii="Calibri" w:hAnsi="Calibri" w:eastAsia="Calibri" w:cs="Calibri" w:hint="eastAsia"/>
+        </w:rPr>
+        <w:t xml:space="preserve"> </w:t>
+      </w:r>
+      <w:r>
+        <w:rPr>
+          <w:rFonts w:ascii="Calibri" w:hAnsi="Calibri" w:eastAsia="Calibri" w:cs="Calibri" w:hint="eastAsia"/>
+        </w:rPr>
+        <w:t xml:space="preserve">answer-to-question stream</w:t>
       </w:r>
       <w:r>
         <w:rPr>
@@ -11577,43 +12196,43 @@
         <w:rPr>
           <w:rFonts w:ascii="Calibri" w:hAnsi="Calibri" w:eastAsia="Calibri" w:cs="Calibri" w:hint="eastAsia"/>
         </w:rPr>
-        <w:t xml:space="preserve">Acquisition records the final URL, response headers, exact compressed length,</w:t>
-      </w:r>
-      <w:r>
-        <w:rPr>
-          <w:rFonts w:ascii="Calibri" w:hAnsi="Calibri" w:eastAsia="Calibri" w:cs="Calibri" w:hint="eastAsia"/>
-        </w:rPr>
-        <w:t xml:space="preserve"> </w:t>
-      </w:r>
-      <w:r>
-        <w:rPr>
-          <w:rFonts w:ascii="Calibri" w:hAnsi="Calibri" w:eastAsia="Calibri" w:cs="Calibri" w:hint="eastAsia"/>
-        </w:rPr>
-        <w:t xml:space="preserve">and SHA-256 digest. An independent guard downloads the object again and</w:t>
-      </w:r>
-      <w:r>
-        <w:rPr>
-          <w:rFonts w:ascii="Calibri" w:hAnsi="Calibri" w:eastAsia="Calibri" w:cs="Calibri" w:hint="eastAsia"/>
-        </w:rPr>
-        <w:t xml:space="preserve"> </w:t>
-      </w:r>
-      <w:r>
-        <w:rPr>
-          <w:rFonts w:ascii="Calibri" w:hAnsi="Calibri" w:eastAsia="Calibri" w:cs="Calibri" w:hint="eastAsia"/>
-        </w:rPr>
-        <w:t xml:space="preserve">requires identical response-body bytes; the admitted artifact omits the raw</w:t>
-      </w:r>
-      <w:r>
-        <w:rPr>
-          <w:rFonts w:ascii="Calibri" w:hAnsi="Calibri" w:eastAsia="Calibri" w:cs="Calibri" w:hint="eastAsia"/>
-        </w:rPr>
-        <w:t xml:space="preserve"> </w:t>
-      </w:r>
-      <w:r>
-        <w:rPr>
-          <w:rFonts w:ascii="Calibri" w:hAnsi="Calibri" w:eastAsia="Calibri" w:cs="Calibri" w:hint="eastAsia"/>
-        </w:rPr>
-        <w:t xml:space="preserve">compressed object.</w:t>
+        <w:t xml:space="preserve">The acquisition job was specified to record the final URL, response headers,</w:t>
+      </w:r>
+      <w:r>
+        <w:rPr>
+          <w:rFonts w:ascii="Calibri" w:hAnsi="Calibri" w:eastAsia="Calibri" w:cs="Calibri" w:hint="eastAsia"/>
+        </w:rPr>
+        <w:t xml:space="preserve"> </w:t>
+      </w:r>
+      <w:r>
+        <w:rPr>
+          <w:rFonts w:ascii="Calibri" w:hAnsi="Calibri" w:eastAsia="Calibri" w:cs="Calibri" w:hint="eastAsia"/>
+        </w:rPr>
+        <w:t xml:space="preserve">exact compressed length, and SHA-256 digest. An independent guard would have</w:t>
+      </w:r>
+      <w:r>
+        <w:rPr>
+          <w:rFonts w:ascii="Calibri" w:hAnsi="Calibri" w:eastAsia="Calibri" w:cs="Calibri" w:hint="eastAsia"/>
+        </w:rPr>
+        <w:t xml:space="preserve"> </w:t>
+      </w:r>
+      <w:r>
+        <w:rPr>
+          <w:rFonts w:ascii="Calibri" w:hAnsi="Calibri" w:eastAsia="Calibri" w:cs="Calibri" w:hint="eastAsia"/>
+        </w:rPr>
+        <w:t xml:space="preserve">downloaded the object again and required identical response-body bytes; an</w:t>
+      </w:r>
+      <w:r>
+        <w:rPr>
+          <w:rFonts w:ascii="Calibri" w:hAnsi="Calibri" w:eastAsia="Calibri" w:cs="Calibri" w:hint="eastAsia"/>
+        </w:rPr>
+        <w:t xml:space="preserve"> </w:t>
+      </w:r>
+      <w:r>
+        <w:rPr>
+          <w:rFonts w:ascii="Calibri" w:hAnsi="Calibri" w:eastAsia="Calibri" w:cs="Calibri" w:hint="eastAsia"/>
+        </w:rPr>
+        <w:t xml:space="preserve">admitted artifact would have omitted the raw compressed object.</w:t>
       </w:r>
     </w:p>
     <w:p>
@@ -11624,43 +12243,55 @@
         <w:rPr>
           <w:rFonts w:ascii="Calibri" w:hAnsi="Calibri" w:eastAsia="Calibri" w:cs="Calibri" w:hint="eastAsia"/>
         </w:rPr>
-        <w:t xml:space="preserve">The first 1,000,000 eligible records freeze the row/column mapping. Source-ID</w:t>
-      </w:r>
-      <w:r>
-        <w:rPr>
-          <w:rFonts w:ascii="Calibri" w:hAnsi="Calibri" w:eastAsia="Calibri" w:cs="Calibri" w:hint="eastAsia"/>
-        </w:rPr>
-        <w:t xml:space="preserve"> </w:t>
-      </w:r>
-      <w:r>
-        <w:rPr>
-          <w:rFonts w:ascii="Calibri" w:hAnsi="Calibri" w:eastAsia="Calibri" w:cs="Calibri" w:hint="eastAsia"/>
-        </w:rPr>
-        <w:t xml:space="preserve">hashing defines two deterministic partitions, each with 1,024 rows and 8,193</w:t>
-      </w:r>
-      <w:r>
-        <w:rPr>
-          <w:rFonts w:ascii="Calibri" w:hAnsi="Calibri" w:eastAsia="Calibri" w:cs="Calibri" w:hint="eastAsia"/>
-        </w:rPr>
-        <w:t xml:space="preserve"> </w:t>
-      </w:r>
-      <w:r>
-        <w:rPr>
-          <w:rFonts w:ascii="Calibri" w:hAnsi="Calibri" w:eastAsia="Calibri" w:cs="Calibri" w:hint="eastAsia"/>
-        </w:rPr>
-        <w:t xml:space="preserve">columns. After the mapping prefix, each partition consumes 4,096 accepted</w:t>
-      </w:r>
-      <w:r>
-        <w:rPr>
-          <w:rFonts w:ascii="Calibri" w:hAnsi="Calibri" w:eastAsia="Calibri" w:cs="Calibri" w:hint="eastAsia"/>
-        </w:rPr>
-        <w:t xml:space="preserve"> </w:t>
-      </w:r>
-      <w:r>
-        <w:rPr>
-          <w:rFonts w:ascii="Calibri" w:hAnsi="Calibri" w:eastAsia="Calibri" w:cs="Calibri" w:hint="eastAsia"/>
-        </w:rPr>
-        <w:t xml:space="preserve">records under two semantics. T1 is cumulative occurrence,</w:t>
+        <w:t xml:space="preserve">The first 1,000,000 eligible records were specified to freeze the row/column</w:t>
+      </w:r>
+      <w:r>
+        <w:rPr>
+          <w:rFonts w:ascii="Calibri" w:hAnsi="Calibri" w:eastAsia="Calibri" w:cs="Calibri" w:hint="eastAsia"/>
+        </w:rPr>
+        <w:t xml:space="preserve"> </w:t>
+      </w:r>
+      <w:r>
+        <w:rPr>
+          <w:rFonts w:ascii="Calibri" w:hAnsi="Calibri" w:eastAsia="Calibri" w:cs="Calibri" w:hint="eastAsia"/>
+        </w:rPr>
+        <w:t xml:space="preserve">mapping. Source-ID hashing would have defined two deterministic partitions,</w:t>
+      </w:r>
+      <w:r>
+        <w:rPr>
+          <w:rFonts w:ascii="Calibri" w:hAnsi="Calibri" w:eastAsia="Calibri" w:cs="Calibri" w:hint="eastAsia"/>
+        </w:rPr>
+        <w:t xml:space="preserve"> </w:t>
+      </w:r>
+      <w:r>
+        <w:rPr>
+          <w:rFonts w:ascii="Calibri" w:hAnsi="Calibri" w:eastAsia="Calibri" w:cs="Calibri" w:hint="eastAsia"/>
+        </w:rPr>
+        <w:t xml:space="preserve">each with 1,024 rows and 8,193 columns. After the mapping prefix, each partition</w:t>
+      </w:r>
+      <w:r>
+        <w:rPr>
+          <w:rFonts w:ascii="Calibri" w:hAnsi="Calibri" w:eastAsia="Calibri" w:cs="Calibri" w:hint="eastAsia"/>
+        </w:rPr>
+        <w:t xml:space="preserve"> </w:t>
+      </w:r>
+      <w:r>
+        <w:rPr>
+          <w:rFonts w:ascii="Calibri" w:hAnsi="Calibri" w:eastAsia="Calibri" w:cs="Calibri" w:hint="eastAsia"/>
+        </w:rPr>
+        <w:t xml:space="preserve">would have consumed 4,096 accepted records under two semantics. T1 was defined</w:t>
+      </w:r>
+      <w:r>
+        <w:rPr>
+          <w:rFonts w:ascii="Calibri" w:hAnsi="Calibri" w:eastAsia="Calibri" w:cs="Calibri" w:hint="eastAsia"/>
+        </w:rPr>
+        <w:t xml:space="preserve"> </w:t>
+      </w:r>
+      <w:r>
+        <w:rPr>
+          <w:rFonts w:ascii="Calibri" w:hAnsi="Calibri" w:eastAsia="Calibri" w:cs="Calibri" w:hint="eastAsia"/>
+        </w:rPr>
+        <w:t xml:space="preserve">as cumulative occurrence,</w:t>
       </w:r>
     </w:p>
     <w:p>
@@ -11782,7 +12413,7 @@
         <w:rPr>
           <w:rFonts w:ascii="Calibri" w:hAnsi="Calibri" w:eastAsia="Calibri" w:cs="Calibri" w:hint="eastAsia"/>
         </w:rPr>
-        <w:t xml:space="preserve">whereas T2 retains the most recent</w:t>
+        <w:t xml:space="preserve">whereas T2 would have retained the most recent</w:t>
       </w:r>
       <w:r>
         <w:rPr>
@@ -11814,43 +12445,43 @@
         <w:rPr>
           <w:rFonts w:ascii="Calibri" w:hAnsi="Calibri" w:eastAsia="Calibri" w:cs="Calibri" w:hint="eastAsia"/>
         </w:rPr>
-        <w:t xml:space="preserve">accepted events and performs expiry</w:t>
-      </w:r>
-      <w:r>
-        <w:rPr>
-          <w:rFonts w:ascii="Calibri" w:hAnsi="Calibri" w:eastAsia="Calibri" w:cs="Calibri" w:hint="eastAsia"/>
-        </w:rPr>
-        <w:t xml:space="preserve"> </w:t>
-      </w:r>
-      <w:r>
-        <w:rPr>
-          <w:rFonts w:ascii="Calibri" w:hAnsi="Calibri" w:eastAsia="Calibri" w:cs="Calibri" w:hint="eastAsia"/>
-        </w:rPr>
-        <w:t xml:space="preserve">before admission in one indivisible atomic group. The synthetic logical clock</w:t>
-      </w:r>
-      <w:r>
-        <w:rPr>
-          <w:rFonts w:ascii="Calibri" w:hAnsi="Calibri" w:eastAsia="Calibri" w:cs="Calibri" w:hint="eastAsia"/>
-        </w:rPr>
-        <w:t xml:space="preserve"> </w:t>
-      </w:r>
-      <w:r>
-        <w:rPr>
-          <w:rFonts w:ascii="Calibri" w:hAnsi="Calibri" w:eastAsia="Calibri" w:cs="Calibri" w:hint="eastAsia"/>
-        </w:rPr>
-        <w:t xml:space="preserve">advances by one second per 128 accepted records. Both partitions and both</w:t>
-      </w:r>
-      <w:r>
-        <w:rPr>
-          <w:rFonts w:ascii="Calibri" w:hAnsi="Calibri" w:eastAsia="Calibri" w:cs="Calibri" w:hint="eastAsia"/>
-        </w:rPr>
-        <w:t xml:space="preserve"> </w:t>
-      </w:r>
-      <w:r>
-        <w:rPr>
-          <w:rFonts w:ascii="Calibri" w:hAnsi="Calibri" w:eastAsia="Calibri" w:cs="Calibri" w:hint="eastAsia"/>
-        </w:rPr>
-        <w:t xml:space="preserve">semantics run all three strategies at</w:t>
+        <w:t xml:space="preserve">accepted events and</w:t>
+      </w:r>
+      <w:r>
+        <w:rPr>
+          <w:rFonts w:ascii="Calibri" w:hAnsi="Calibri" w:eastAsia="Calibri" w:cs="Calibri" w:hint="eastAsia"/>
+        </w:rPr>
+        <w:t xml:space="preserve"> </w:t>
+      </w:r>
+      <w:r>
+        <w:rPr>
+          <w:rFonts w:ascii="Calibri" w:hAnsi="Calibri" w:eastAsia="Calibri" w:cs="Calibri" w:hint="eastAsia"/>
+        </w:rPr>
+        <w:t xml:space="preserve">performed expiry before admission in one indivisible atomic group. The synthetic</w:t>
+      </w:r>
+      <w:r>
+        <w:rPr>
+          <w:rFonts w:ascii="Calibri" w:hAnsi="Calibri" w:eastAsia="Calibri" w:cs="Calibri" w:hint="eastAsia"/>
+        </w:rPr>
+        <w:t xml:space="preserve"> </w:t>
+      </w:r>
+      <w:r>
+        <w:rPr>
+          <w:rFonts w:ascii="Calibri" w:hAnsi="Calibri" w:eastAsia="Calibri" w:cs="Calibri" w:hint="eastAsia"/>
+        </w:rPr>
+        <w:t xml:space="preserve">logical clock would have advanced by one second per 128 accepted records. Both</w:t>
+      </w:r>
+      <w:r>
+        <w:rPr>
+          <w:rFonts w:ascii="Calibri" w:hAnsi="Calibri" w:eastAsia="Calibri" w:cs="Calibri" w:hint="eastAsia"/>
+        </w:rPr>
+        <w:t xml:space="preserve"> </w:t>
+      </w:r>
+      <w:r>
+        <w:rPr>
+          <w:rFonts w:ascii="Calibri" w:hAnsi="Calibri" w:eastAsia="Calibri" w:cs="Calibri" w:hint="eastAsia"/>
+        </w:rPr>
+        <w:t xml:space="preserve">partitions and both semantics were specified to run all three strategies at</w:t>
       </w:r>
       <w:r>
         <w:rPr>
@@ -11897,19 +12528,19 @@
         <w:rPr>
           <w:rFonts w:ascii="Calibri" w:hAnsi="Calibri" w:eastAsia="Calibri" w:cs="Calibri" w:hint="eastAsia"/>
         </w:rPr>
-        <w:t xml:space="preserve">, yielding four</w:t>
-      </w:r>
-      <w:r>
-        <w:rPr>
-          <w:rFonts w:ascii="Calibri" w:hAnsi="Calibri" w:eastAsia="Calibri" w:cs="Calibri" w:hint="eastAsia"/>
-        </w:rPr>
-        <w:t xml:space="preserve"> </w:t>
-      </w:r>
-      <w:r>
-        <w:rPr>
-          <w:rFonts w:ascii="Calibri" w:hAnsi="Calibri" w:eastAsia="Calibri" w:cs="Calibri" w:hint="eastAsia"/>
-        </w:rPr>
-        <w:t xml:space="preserve">ordered-event shards. They support conclusions about deterministic interactions</w:t>
+        <w:t xml:space="preserve">, yielding four ordered-event shards. If admitted, those</w:t>
+      </w:r>
+      <w:r>
+        <w:rPr>
+          <w:rFonts w:ascii="Calibri" w:hAnsi="Calibri" w:eastAsia="Calibri" w:cs="Calibri" w:hint="eastAsia"/>
+        </w:rPr>
+        <w:t xml:space="preserve"> </w:t>
+      </w:r>
+      <w:r>
+        <w:rPr>
+          <w:rFonts w:ascii="Calibri" w:hAnsi="Calibri" w:eastAsia="Calibri" w:cs="Calibri" w:hint="eastAsia"/>
+        </w:rPr>
+        <w:t xml:space="preserve">shards could only have supported conclusions about deterministic interactions</w:t>
       </w:r>
       <w:r>
         <w:rPr>
@@ -11945,19 +12576,19 @@
         <w:rPr>
           <w:rFonts w:ascii="Calibri" w:hAnsi="Calibri" w:eastAsia="Calibri" w:cs="Calibri" w:hint="eastAsia"/>
         </w:rPr>
-        <w:t xml:space="preserve">The native matrix contains three strategies at the S and M scales, hence six</w:t>
-      </w:r>
-      <w:r>
-        <w:rPr>
-          <w:rFonts w:ascii="Calibri" w:hAnsi="Calibri" w:eastAsia="Calibri" w:cs="Calibri" w:hint="eastAsia"/>
-        </w:rPr>
-        <w:t xml:space="preserve"> </w:t>
-      </w:r>
-      <w:r>
-        <w:rPr>
-          <w:rFonts w:ascii="Calibri" w:hAnsi="Calibri" w:eastAsia="Calibri" w:cs="Calibri" w:hint="eastAsia"/>
-        </w:rPr>
-        <w:t xml:space="preserve">cases. Every case uses seed</w:t>
+        <w:t xml:space="preserve">The native matrix was specified to contain three strategies at the S and M</w:t>
+      </w:r>
+      <w:r>
+        <w:rPr>
+          <w:rFonts w:ascii="Calibri" w:hAnsi="Calibri" w:eastAsia="Calibri" w:cs="Calibri" w:hint="eastAsia"/>
+        </w:rPr>
+        <w:t xml:space="preserve"> </w:t>
+      </w:r>
+      <w:r>
+        <w:rPr>
+          <w:rFonts w:ascii="Calibri" w:hAnsi="Calibri" w:eastAsia="Calibri" w:cs="Calibri" w:hint="eastAsia"/>
+        </w:rPr>
+        <w:t xml:space="preserve">scales, hence six cases. Every case would have used seed</w:t>
       </w:r>
       <w:r>
         <w:rPr>
@@ -12002,31 +12633,31 @@
         <w:rPr>
           <w:rFonts w:ascii="Calibri" w:hAnsi="Calibri" w:eastAsia="Calibri" w:cs="Calibri" w:hint="eastAsia"/>
         </w:rPr>
-        <w:t xml:space="preserve">, the terminal accepted-event</w:t>
-      </w:r>
-      <w:r>
-        <w:rPr>
-          <w:rFonts w:ascii="Calibri" w:hAnsi="Calibri" w:eastAsia="Calibri" w:cs="Calibri" w:hint="eastAsia"/>
-        </w:rPr>
-        <w:t xml:space="preserve"> </w:t>
-      </w:r>
-      <w:r>
-        <w:rPr>
-          <w:rFonts w:ascii="Calibri" w:hAnsi="Calibri" w:eastAsia="Calibri" w:cs="Calibri" w:hint="eastAsia"/>
-        </w:rPr>
-        <w:t xml:space="preserve">prefix (512 for S and 2,048 for M), and the query after the last complete event</w:t>
-      </w:r>
-      <w:r>
-        <w:rPr>
-          <w:rFonts w:ascii="Calibri" w:hAnsi="Calibri" w:eastAsia="Calibri" w:cs="Calibri" w:hint="eastAsia"/>
-        </w:rPr>
-        <w:t xml:space="preserve"> </w:t>
-      </w:r>
-      <w:r>
-        <w:rPr>
-          <w:rFonts w:ascii="Calibri" w:hAnsi="Calibri" w:eastAsia="Calibri" w:cs="Calibri" w:hint="eastAsia"/>
-        </w:rPr>
-        <w:t xml:space="preserve">group. Version, component inventory, query vector,</w:t>
+        <w:t xml:space="preserve">,</w:t>
+      </w:r>
+      <w:r>
+        <w:rPr>
+          <w:rFonts w:ascii="Calibri" w:hAnsi="Calibri" w:eastAsia="Calibri" w:cs="Calibri" w:hint="eastAsia"/>
+        </w:rPr>
+        <w:t xml:space="preserve"> </w:t>
+      </w:r>
+      <w:r>
+        <w:rPr>
+          <w:rFonts w:ascii="Calibri" w:hAnsi="Calibri" w:eastAsia="Calibri" w:cs="Calibri" w:hint="eastAsia"/>
+        </w:rPr>
+        <w:t xml:space="preserve">the terminal accepted-event prefix (512 for S and 2,048 for M), and the query</w:t>
+      </w:r>
+      <w:r>
+        <w:rPr>
+          <w:rFonts w:ascii="Calibri" w:hAnsi="Calibri" w:eastAsia="Calibri" w:cs="Calibri" w:hint="eastAsia"/>
+        </w:rPr>
+        <w:t xml:space="preserve"> </w:t>
+      </w:r>
+      <w:r>
+        <w:rPr>
+          <w:rFonts w:ascii="Calibri" w:hAnsi="Calibri" w:eastAsia="Calibri" w:cs="Calibri" w:hint="eastAsia"/>
+        </w:rPr>
+        <w:t xml:space="preserve">after the last complete event group. Version, component inventory, query vector,</w:t>
       </w:r>
       <w:r>
         <w:rPr>
@@ -12045,19 +12676,19 @@
         <w:rPr>
           <w:rFonts w:ascii="Calibri" w:hAnsi="Calibri" w:eastAsia="Calibri" w:cs="Calibri" w:hint="eastAsia"/>
         </w:rPr>
-        <w:t xml:space="preserve">, typed execution</w:t>
-      </w:r>
-      <w:r>
-        <w:rPr>
-          <w:rFonts w:ascii="Calibri" w:hAnsi="Calibri" w:eastAsia="Calibri" w:cs="Calibri" w:hint="eastAsia"/>
-        </w:rPr>
-        <w:t xml:space="preserve"> </w:t>
-      </w:r>
-      <w:r>
-        <w:rPr>
-          <w:rFonts w:ascii="Calibri" w:hAnsi="Calibri" w:eastAsia="Calibri" w:cs="Calibri" w:hint="eastAsia"/>
-        </w:rPr>
-        <w:t xml:space="preserve">plan, and canonical input bytes are fixed together.</w:t>
+        <w:t xml:space="preserve">, typed execution plan, and canonical input bytes were frozen</w:t>
+      </w:r>
+      <w:r>
+        <w:rPr>
+          <w:rFonts w:ascii="Calibri" w:hAnsi="Calibri" w:eastAsia="Calibri" w:cs="Calibri" w:hint="eastAsia"/>
+        </w:rPr>
+        <w:t xml:space="preserve"> </w:t>
+      </w:r>
+      <w:r>
+        <w:rPr>
+          <w:rFonts w:ascii="Calibri" w:hAnsi="Calibri" w:eastAsia="Calibri" w:cs="Calibri" w:hint="eastAsia"/>
+        </w:rPr>
+        <w:t xml:space="preserve">together.</w:t>
       </w:r>
     </w:p>
     <w:p>
@@ -12068,19 +12699,19 @@
         <w:rPr>
           <w:rFonts w:ascii="Calibri" w:hAnsi="Calibri" w:eastAsia="Calibri" w:cs="Calibri" w:hint="eastAsia"/>
         </w:rPr>
-        <w:t xml:space="preserve">Each case performs one discarded warm-up, three fresh-key producer evaluations,</w:t>
-      </w:r>
-      <w:r>
-        <w:rPr>
-          <w:rFonts w:ascii="Calibri" w:hAnsi="Calibri" w:eastAsia="Calibri" w:cs="Calibri" w:hint="eastAsia"/>
-        </w:rPr>
-        <w:t xml:space="preserve"> </w:t>
-      </w:r>
-      <w:r>
-        <w:rPr>
-          <w:rFonts w:ascii="Calibri" w:hAnsi="Calibri" w:eastAsia="Calibri" w:cs="Calibri" w:hint="eastAsia"/>
-        </w:rPr>
-        <w:t xml:space="preserve">and three exact package replays:</w:t>
+        <w:t xml:space="preserve">Each case was specified to perform one discarded warm-up, three fresh-key</w:t>
+      </w:r>
+      <w:r>
+        <w:rPr>
+          <w:rFonts w:ascii="Calibri" w:hAnsi="Calibri" w:eastAsia="Calibri" w:cs="Calibri" w:hint="eastAsia"/>
+        </w:rPr>
+        <w:t xml:space="preserve"> </w:t>
+      </w:r>
+      <w:r>
+        <w:rPr>
+          <w:rFonts w:ascii="Calibri" w:hAnsi="Calibri" w:eastAsia="Calibri" w:cs="Calibri" w:hint="eastAsia"/>
+        </w:rPr>
+        <w:t xml:space="preserve">producer evaluations, and three exact package replays:</w:t>
       </w:r>
     </w:p>
     <w:p>
@@ -12154,31 +12785,43 @@
         <w:rPr>
           <w:rFonts w:ascii="Calibri" w:hAnsi="Calibri" w:eastAsia="Calibri" w:cs="Calibri" w:hint="eastAsia"/>
         </w:rPr>
-        <w:t xml:space="preserve">native evaluations in total. The three recorded producers are technical</w:t>
-      </w:r>
-      <w:r>
-        <w:rPr>
-          <w:rFonts w:ascii="Calibri" w:hAnsi="Calibri" w:eastAsia="Calibri" w:cs="Calibri" w:hint="eastAsia"/>
-        </w:rPr>
-        <w:t xml:space="preserve"> </w:t>
-      </w:r>
-      <w:r>
-        <w:rPr>
-          <w:rFonts w:ascii="Calibri" w:hAnsi="Calibri" w:eastAsia="Calibri" w:cs="Calibri" w:hint="eastAsia"/>
-        </w:rPr>
-        <w:t xml:space="preserve">repetitions, not independent population samples. We report their raw values,</w:t>
-      </w:r>
-      <w:r>
-        <w:rPr>
-          <w:rFonts w:ascii="Calibri" w:hAnsi="Calibri" w:eastAsia="Calibri" w:cs="Calibri" w:hint="eastAsia"/>
-        </w:rPr>
-        <w:t xml:space="preserve"> </w:t>
-      </w:r>
-      <w:r>
-        <w:rPr>
-          <w:rFonts w:ascii="Calibri" w:hAnsi="Calibri" w:eastAsia="Calibri" w:cs="Calibri" w:hint="eastAsia"/>
-        </w:rPr>
-        <w:t xml:space="preserve">median, and range, separately for production and replay. Replay deserializes the</w:t>
+        <w:t xml:space="preserve">native evaluations in total. The three producer repetitions specified for</w:t>
+      </w:r>
+      <w:r>
+        <w:rPr>
+          <w:rFonts w:ascii="Calibri" w:hAnsi="Calibri" w:eastAsia="Calibri" w:cs="Calibri" w:hint="eastAsia"/>
+        </w:rPr>
+        <w:t xml:space="preserve"> </w:t>
+      </w:r>
+      <w:r>
+        <w:rPr>
+          <w:rFonts w:ascii="Calibri" w:hAnsi="Calibri" w:eastAsia="Calibri" w:cs="Calibri" w:hint="eastAsia"/>
+        </w:rPr>
+        <w:t xml:space="preserve">recording were technical repetitions, not independent population samples. An</w:t>
+      </w:r>
+      <w:r>
+        <w:rPr>
+          <w:rFonts w:ascii="Calibri" w:hAnsi="Calibri" w:eastAsia="Calibri" w:cs="Calibri" w:hint="eastAsia"/>
+        </w:rPr>
+        <w:t xml:space="preserve"> </w:t>
+      </w:r>
+      <w:r>
+        <w:rPr>
+          <w:rFonts w:ascii="Calibri" w:hAnsi="Calibri" w:eastAsia="Calibri" w:cs="Calibri" w:hint="eastAsia"/>
+        </w:rPr>
+        <w:t xml:space="preserve">admitted execution would have reported their raw values, median, and range,</w:t>
+      </w:r>
+      <w:r>
+        <w:rPr>
+          <w:rFonts w:ascii="Calibri" w:hAnsi="Calibri" w:eastAsia="Calibri" w:cs="Calibri" w:hint="eastAsia"/>
+        </w:rPr>
+        <w:t xml:space="preserve"> </w:t>
+      </w:r>
+      <w:r>
+        <w:rPr>
+          <w:rFonts w:ascii="Calibri" w:hAnsi="Calibri" w:eastAsia="Calibri" w:cs="Calibri" w:hint="eastAsia"/>
+        </w:rPr>
+        <w:t xml:space="preserve">separately for production and replay. Replay was specified to deserialize the</w:t>
       </w:r>
       <w:r>
         <w:rPr>
@@ -12202,43 +12845,43 @@
         <w:rPr>
           <w:rFonts w:ascii="Calibri" w:hAnsi="Calibri" w:eastAsia="Calibri" w:cs="Calibri" w:hint="eastAsia"/>
         </w:rPr>
-        <w:t xml:space="preserve">ciphertexts. Its lifecycle receipt must show zero context generation, zero key</w:t>
-      </w:r>
-      <w:r>
-        <w:rPr>
-          <w:rFonts w:ascii="Calibri" w:hAnsi="Calibri" w:eastAsia="Calibri" w:cs="Calibri" w:hint="eastAsia"/>
-        </w:rPr>
-        <w:t xml:space="preserve"> </w:t>
-      </w:r>
-      <w:r>
-        <w:rPr>
-          <w:rFonts w:ascii="Calibri" w:hAnsi="Calibri" w:eastAsia="Calibri" w:cs="Calibri" w:hint="eastAsia"/>
-        </w:rPr>
-        <w:t xml:space="preserve">generation, zero evaluation-key generation, and zero encryption, while its</w:t>
-      </w:r>
-      <w:r>
-        <w:rPr>
-          <w:rFonts w:ascii="Calibri" w:hAnsi="Calibri" w:eastAsia="Calibri" w:cs="Calibri" w:hint="eastAsia"/>
-        </w:rPr>
-        <w:t xml:space="preserve"> </w:t>
-      </w:r>
-      <w:r>
-        <w:rPr>
-          <w:rFonts w:ascii="Calibri" w:hAnsi="Calibri" w:eastAsia="Calibri" w:cs="Calibri" w:hint="eastAsia"/>
-        </w:rPr>
-        <w:t xml:space="preserve">cloud-program operation inventory must equal that of the corresponding</w:t>
-      </w:r>
-      <w:r>
-        <w:rPr>
-          <w:rFonts w:ascii="Calibri" w:hAnsi="Calibri" w:eastAsia="Calibri" w:cs="Calibri" w:hint="eastAsia"/>
-        </w:rPr>
-        <w:t xml:space="preserve"> </w:t>
-      </w:r>
-      <w:r>
-        <w:rPr>
-          <w:rFonts w:ascii="Calibri" w:hAnsi="Calibri" w:eastAsia="Calibri" w:cs="Calibri" w:hint="eastAsia"/>
-        </w:rPr>
-        <w:t xml:space="preserve">producer package.</w:t>
+        <w:t xml:space="preserve">ciphertexts. Its lifecycle receipt would have had to show zero context</w:t>
+      </w:r>
+      <w:r>
+        <w:rPr>
+          <w:rFonts w:ascii="Calibri" w:hAnsi="Calibri" w:eastAsia="Calibri" w:cs="Calibri" w:hint="eastAsia"/>
+        </w:rPr>
+        <w:t xml:space="preserve"> </w:t>
+      </w:r>
+      <w:r>
+        <w:rPr>
+          <w:rFonts w:ascii="Calibri" w:hAnsi="Calibri" w:eastAsia="Calibri" w:cs="Calibri" w:hint="eastAsia"/>
+        </w:rPr>
+        <w:t xml:space="preserve">generation, zero key generation, zero evaluation-key generation, and zero</w:t>
+      </w:r>
+      <w:r>
+        <w:rPr>
+          <w:rFonts w:ascii="Calibri" w:hAnsi="Calibri" w:eastAsia="Calibri" w:cs="Calibri" w:hint="eastAsia"/>
+        </w:rPr>
+        <w:t xml:space="preserve"> </w:t>
+      </w:r>
+      <w:r>
+        <w:rPr>
+          <w:rFonts w:ascii="Calibri" w:hAnsi="Calibri" w:eastAsia="Calibri" w:cs="Calibri" w:hint="eastAsia"/>
+        </w:rPr>
+        <w:t xml:space="preserve">encryption, while its cloud-program operation inventory would have had to equal</w:t>
+      </w:r>
+      <w:r>
+        <w:rPr>
+          <w:rFonts w:ascii="Calibri" w:hAnsi="Calibri" w:eastAsia="Calibri" w:cs="Calibri" w:hint="eastAsia"/>
+        </w:rPr>
+        <w:t xml:space="preserve"> </w:t>
+      </w:r>
+      <w:r>
+        <w:rPr>
+          <w:rFonts w:ascii="Calibri" w:hAnsi="Calibri" w:eastAsia="Calibri" w:cs="Calibri" w:hint="eastAsia"/>
+        </w:rPr>
+        <w:t xml:space="preserve">that of the corresponding producer package.</w:t>
       </w:r>
     </w:p>
     <w:bookmarkEnd w:id="34"/>
@@ -12325,7 +12968,7 @@
         <w:rPr>
           <w:rFonts w:ascii="Calibri" w:hAnsi="Calibri" w:eastAsia="Calibri" w:cs="Calibri" w:hint="eastAsia"/>
         </w:rPr>
-        <w:t xml:space="preserve">result remains a typed vector rather than a synthetic score:</w:t>
+        <w:t xml:space="preserve">result was specified as a typed vector rather than a synthetic score:</w:t>
       </w:r>
     </w:p>
     <w:p>
@@ -12725,7 +13368,7 @@
         <w:rPr>
           <w:rFonts w:ascii="Calibri" w:hAnsi="Calibri" w:eastAsia="Calibri" w:cs="Calibri" w:hint="eastAsia"/>
         </w:rPr>
-        <w:t xml:space="preserve">Synthetic and ordered-event cells directly measure state-transition,</w:t>
+        <w:t xml:space="preserve">Synthetic and ordered-event cells were specified to measure state-transition,</w:t>
       </w:r>
       <w:r>
         <w:rPr>
@@ -12749,31 +13392,31 @@
         <w:rPr>
           <w:rFonts w:ascii="Calibri" w:hAnsi="Calibri" w:eastAsia="Calibri" w:cs="Calibri" w:hint="eastAsia"/>
         </w:rPr>
-        <w:t xml:space="preserve">they exactly count events, windows, queries, typed operations, and object</w:t>
-      </w:r>
-      <w:r>
-        <w:rPr>
-          <w:rFonts w:ascii="Calibri" w:hAnsi="Calibri" w:eastAsia="Calibri" w:cs="Calibri" w:hint="eastAsia"/>
-        </w:rPr>
-        <w:t xml:space="preserve"> </w:t>
-      </w:r>
-      <w:r>
-        <w:rPr>
-          <w:rFonts w:ascii="Calibri" w:hAnsi="Calibri" w:eastAsia="Calibri" w:cs="Calibri" w:hint="eastAsia"/>
-        </w:rPr>
-        <w:t xml:space="preserve">multiplicities. Their cryptographic-object bytes are conservative type-derived</w:t>
-      </w:r>
-      <w:r>
-        <w:rPr>
-          <w:rFonts w:ascii="Calibri" w:hAnsi="Calibri" w:eastAsia="Calibri" w:cs="Calibri" w:hint="eastAsia"/>
-        </w:rPr>
-        <w:t xml:space="preserve"> </w:t>
-      </w:r>
-      <w:r>
-        <w:rPr>
-          <w:rFonts w:ascii="Calibri" w:hAnsi="Calibri" w:eastAsia="Calibri" w:cs="Calibri" w:hint="eastAsia"/>
-        </w:rPr>
-        <w:t xml:space="preserve">bounds,</w:t>
+        <w:t xml:space="preserve">they would have exactly counted events, windows, queries, typed operations, and</w:t>
+      </w:r>
+      <w:r>
+        <w:rPr>
+          <w:rFonts w:ascii="Calibri" w:hAnsi="Calibri" w:eastAsia="Calibri" w:cs="Calibri" w:hint="eastAsia"/>
+        </w:rPr>
+        <w:t xml:space="preserve"> </w:t>
+      </w:r>
+      <w:r>
+        <w:rPr>
+          <w:rFonts w:ascii="Calibri" w:hAnsi="Calibri" w:eastAsia="Calibri" w:cs="Calibri" w:hint="eastAsia"/>
+        </w:rPr>
+        <w:t xml:space="preserve">object multiplicities. Their cryptographic-object bytes were specified as</w:t>
+      </w:r>
+      <w:r>
+        <w:rPr>
+          <w:rFonts w:ascii="Calibri" w:hAnsi="Calibri" w:eastAsia="Calibri" w:cs="Calibri" w:hint="eastAsia"/>
+        </w:rPr>
+        <w:t xml:space="preserve"> </w:t>
+      </w:r>
+      <w:r>
+        <w:rPr>
+          <w:rFonts w:ascii="Calibri" w:hAnsi="Calibri" w:eastAsia="Calibri" w:cs="Calibri" w:hint="eastAsia"/>
+        </w:rPr>
+        <w:t xml:space="preserve">conservative type-derived bounds,</w:t>
       </w:r>
     </w:p>
     <w:p>
@@ -12968,7 +13611,19 @@
         <w:rPr>
           <w:rFonts w:ascii="Calibri" w:hAnsi="Calibri" w:eastAsia="Calibri" w:cs="Calibri" w:hint="eastAsia"/>
         </w:rPr>
-        <w:t xml:space="preserve">is the Stage-1 maximum for type</w:t>
+        <w:t xml:space="preserve">is the registration-time,</w:t>
+      </w:r>
+      <w:r>
+        <w:rPr>
+          <w:rFonts w:ascii="Calibri" w:hAnsi="Calibri" w:eastAsia="Calibri" w:cs="Calibri" w:hint="eastAsia"/>
+        </w:rPr>
+        <w:t xml:space="preserve"> </w:t>
+      </w:r>
+      <w:r>
+        <w:rPr>
+          <w:rFonts w:ascii="Calibri" w:hAnsi="Calibri" w:eastAsia="Calibri" w:cs="Calibri" w:hint="eastAsia"/>
+        </w:rPr>
+        <w:t xml:space="preserve">pre-execution Stage-1 maximum serialized size frozen for type</w:t>
       </w:r>
       <w:r>
         <w:rPr>
@@ -12985,55 +13640,67 @@
         <w:rPr>
           <w:rFonts w:ascii="Calibri" w:hAnsi="Calibri" w:eastAsia="Calibri" w:cs="Calibri" w:hint="eastAsia"/>
         </w:rPr>
-        <w:t xml:space="preserve">. Canonical metadata bytes are measured separately. Native cases instead</w:t>
-      </w:r>
-      <w:r>
-        <w:rPr>
-          <w:rFonts w:ascii="Calibri" w:hAnsi="Calibri" w:eastAsia="Calibri" w:cs="Calibri" w:hint="eastAsia"/>
-        </w:rPr>
-        <w:t xml:space="preserve"> </w:t>
-      </w:r>
-      <w:r>
-        <w:rPr>
-          <w:rFonts w:ascii="Calibri" w:hAnsi="Calibri" w:eastAsia="Calibri" w:cs="Calibri" w:hint="eastAsia"/>
-        </w:rPr>
-        <w:t xml:space="preserve">report observed serialized-object bytes, typed-operation inventories, process</w:t>
-      </w:r>
-      <w:r>
-        <w:rPr>
-          <w:rFonts w:ascii="Calibri" w:hAnsi="Calibri" w:eastAsia="Calibri" w:cs="Calibri" w:hint="eastAsia"/>
-        </w:rPr>
-        <w:t xml:space="preserve"> </w:t>
-      </w:r>
-      <w:r>
-        <w:rPr>
-          <w:rFonts w:ascii="Calibri" w:hAnsi="Calibri" w:eastAsia="Calibri" w:cs="Calibri" w:hint="eastAsia"/>
-        </w:rPr>
-        <w:t xml:space="preserve">time, RSS, and scratch. Simulator counts are never converted into OpenFHE</w:t>
-      </w:r>
-      <w:r>
-        <w:rPr>
-          <w:rFonts w:ascii="Calibri" w:hAnsi="Calibri" w:eastAsia="Calibri" w:cs="Calibri" w:hint="eastAsia"/>
-        </w:rPr>
-        <w:t xml:space="preserve"> </w:t>
-      </w:r>
-      <w:r>
-        <w:rPr>
-          <w:rFonts w:ascii="Calibri" w:hAnsi="Calibri" w:eastAsia="Calibri" w:cs="Calibri" w:hint="eastAsia"/>
-        </w:rPr>
-        <w:t xml:space="preserve">latency, and evidence-replay overhead is never presented as strategy execution</w:t>
-      </w:r>
-      <w:r>
-        <w:rPr>
-          <w:rFonts w:ascii="Calibri" w:hAnsi="Calibri" w:eastAsia="Calibri" w:cs="Calibri" w:hint="eastAsia"/>
-        </w:rPr>
-        <w:t xml:space="preserve"> </w:t>
-      </w:r>
-      <w:r>
-        <w:rPr>
-          <w:rFonts w:ascii="Calibri" w:hAnsi="Calibri" w:eastAsia="Calibri" w:cs="Calibri" w:hint="eastAsia"/>
-        </w:rPr>
-        <w:t xml:space="preserve">cost.</w:t>
+        <w:t xml:space="preserve">. Canonical</w:t>
+      </w:r>
+      <w:r>
+        <w:rPr>
+          <w:rFonts w:ascii="Calibri" w:hAnsi="Calibri" w:eastAsia="Calibri" w:cs="Calibri" w:hint="eastAsia"/>
+        </w:rPr>
+        <w:t xml:space="preserve"> </w:t>
+      </w:r>
+      <w:r>
+        <w:rPr>
+          <w:rFonts w:ascii="Calibri" w:hAnsi="Calibri" w:eastAsia="Calibri" w:cs="Calibri" w:hint="eastAsia"/>
+        </w:rPr>
+        <w:t xml:space="preserve">metadata bytes would have been measured separately. Native cases instead were</w:t>
+      </w:r>
+      <w:r>
+        <w:rPr>
+          <w:rFonts w:ascii="Calibri" w:hAnsi="Calibri" w:eastAsia="Calibri" w:cs="Calibri" w:hint="eastAsia"/>
+        </w:rPr>
+        <w:t xml:space="preserve"> </w:t>
+      </w:r>
+      <w:r>
+        <w:rPr>
+          <w:rFonts w:ascii="Calibri" w:hAnsi="Calibri" w:eastAsia="Calibri" w:cs="Calibri" w:hint="eastAsia"/>
+        </w:rPr>
+        <w:t xml:space="preserve">specified to report observed serialized-object bytes, typed-operation</w:t>
+      </w:r>
+      <w:r>
+        <w:rPr>
+          <w:rFonts w:ascii="Calibri" w:hAnsi="Calibri" w:eastAsia="Calibri" w:cs="Calibri" w:hint="eastAsia"/>
+        </w:rPr>
+        <w:t xml:space="preserve"> </w:t>
+      </w:r>
+      <w:r>
+        <w:rPr>
+          <w:rFonts w:ascii="Calibri" w:hAnsi="Calibri" w:eastAsia="Calibri" w:cs="Calibri" w:hint="eastAsia"/>
+        </w:rPr>
+        <w:t xml:space="preserve">inventories, process time, RSS, and scratch. Simulator counts were never to be</w:t>
+      </w:r>
+      <w:r>
+        <w:rPr>
+          <w:rFonts w:ascii="Calibri" w:hAnsi="Calibri" w:eastAsia="Calibri" w:cs="Calibri" w:hint="eastAsia"/>
+        </w:rPr>
+        <w:t xml:space="preserve"> </w:t>
+      </w:r>
+      <w:r>
+        <w:rPr>
+          <w:rFonts w:ascii="Calibri" w:hAnsi="Calibri" w:eastAsia="Calibri" w:cs="Calibri" w:hint="eastAsia"/>
+        </w:rPr>
+        <w:t xml:space="preserve">converted into OpenFHE latency, and evidence-replay overhead was never to be</w:t>
+      </w:r>
+      <w:r>
+        <w:rPr>
+          <w:rFonts w:ascii="Calibri" w:hAnsi="Calibri" w:eastAsia="Calibri" w:cs="Calibri" w:hint="eastAsia"/>
+        </w:rPr>
+        <w:t xml:space="preserve"> </w:t>
+      </w:r>
+      <w:r>
+        <w:rPr>
+          <w:rFonts w:ascii="Calibri" w:hAnsi="Calibri" w:eastAsia="Calibri" w:cs="Calibri" w:hint="eastAsia"/>
+        </w:rPr>
+        <w:t xml:space="preserve">presented as strategy execution cost.</w:t>
       </w:r>
     </w:p>
     <w:p>
@@ -13281,19 +13948,19 @@
         <w:rPr>
           <w:rFonts w:ascii="Calibri" w:hAnsi="Calibri" w:eastAsia="Calibri" w:cs="Calibri" w:hint="eastAsia"/>
         </w:rPr>
-        <w:t xml:space="preserve">Wall time, RSS, scratch, and native latency are unavailable for this projected</w:t>
-      </w:r>
-      <w:r>
-        <w:rPr>
-          <w:rFonts w:ascii="Calibri" w:hAnsi="Calibri" w:eastAsia="Calibri" w:cs="Calibri" w:hint="eastAsia"/>
-        </w:rPr>
-        <w:t xml:space="preserve"> </w:t>
-      </w:r>
-      <w:r>
-        <w:rPr>
-          <w:rFonts w:ascii="Calibri" w:hAnsi="Calibri" w:eastAsia="Calibri" w:cs="Calibri" w:hint="eastAsia"/>
-        </w:rPr>
-        <w:t xml:space="preserve">cell. Protocol-byte transfer time at bandwidth</w:t>
+        <w:t xml:space="preserve">Wall time, RSS, scratch, and native latency would have been unavailable for this</w:t>
+      </w:r>
+      <w:r>
+        <w:rPr>
+          <w:rFonts w:ascii="Calibri" w:hAnsi="Calibri" w:eastAsia="Calibri" w:cs="Calibri" w:hint="eastAsia"/>
+        </w:rPr>
+        <w:t xml:space="preserve"> </w:t>
+      </w:r>
+      <w:r>
+        <w:rPr>
+          <w:rFonts w:ascii="Calibri" w:hAnsi="Calibri" w:eastAsia="Calibri" w:cs="Calibri" w:hint="eastAsia"/>
+        </w:rPr>
+        <w:t xml:space="preserve">projected cell. Protocol-byte transfer time at bandwidth</w:t>
       </w:r>
       <w:r>
         <w:rPr>
@@ -13316,19 +13983,19 @@
         <w:rPr>
           <w:rFonts w:ascii="Calibri" w:hAnsi="Calibri" w:eastAsia="Calibri" w:cs="Calibri" w:hint="eastAsia"/>
         </w:rPr>
-        <w:t xml:space="preserve">Mbps is reported only as the</w:t>
-      </w:r>
-      <w:r>
-        <w:rPr>
-          <w:rFonts w:ascii="Calibri" w:hAnsi="Calibri" w:eastAsia="Calibri" w:cs="Calibri" w:hint="eastAsia"/>
-        </w:rPr>
-        <w:t xml:space="preserve"> </w:t>
-      </w:r>
-      <w:r>
-        <w:rPr>
-          <w:rFonts w:ascii="Calibri" w:hAnsi="Calibri" w:eastAsia="Calibri" w:cs="Calibri" w:hint="eastAsia"/>
-        </w:rPr>
-        <w:t xml:space="preserve">transparent conversion</w:t>
+        <w:t xml:space="preserve">Mbps was specified</w:t>
+      </w:r>
+      <w:r>
+        <w:rPr>
+          <w:rFonts w:ascii="Calibri" w:hAnsi="Calibri" w:eastAsia="Calibri" w:cs="Calibri" w:hint="eastAsia"/>
+        </w:rPr>
+        <w:t xml:space="preserve"> </w:t>
+      </w:r>
+      <w:r>
+        <w:rPr>
+          <w:rFonts w:ascii="Calibri" w:hAnsi="Calibri" w:eastAsia="Calibri" w:cs="Calibri" w:hint="eastAsia"/>
+        </w:rPr>
+        <w:t xml:space="preserve">only as the transparent conversion</w:t>
       </w:r>
     </w:p>
     <w:p>
@@ -13450,19 +14117,19 @@
         <w:rPr>
           <w:rFonts w:ascii="Calibri" w:hAnsi="Calibri" w:eastAsia="Calibri" w:cs="Calibri" w:hint="eastAsia"/>
         </w:rPr>
-        <w:t xml:space="preserve">HTTP/TLS, artifact wrappers, filesystems, and private replay transport remain</w:t>
-      </w:r>
-      <w:r>
-        <w:rPr>
-          <w:rFonts w:ascii="Calibri" w:hAnsi="Calibri" w:eastAsia="Calibri" w:cs="Calibri" w:hint="eastAsia"/>
-        </w:rPr>
-        <w:t xml:space="preserve"> </w:t>
-      </w:r>
-      <w:r>
-        <w:rPr>
-          <w:rFonts w:ascii="Calibri" w:hAnsi="Calibri" w:eastAsia="Calibri" w:cs="Calibri" w:hint="eastAsia"/>
-        </w:rPr>
-        <w:t xml:space="preserve">separate evidence-pipeline costs.</w:t>
+        <w:t xml:space="preserve">HTTP/TLS, artifact wrappers, filesystems, and private replay transport were to</w:t>
+      </w:r>
+      <w:r>
+        <w:rPr>
+          <w:rFonts w:ascii="Calibri" w:hAnsi="Calibri" w:eastAsia="Calibri" w:cs="Calibri" w:hint="eastAsia"/>
+        </w:rPr>
+        <w:t xml:space="preserve"> </w:t>
+      </w:r>
+      <w:r>
+        <w:rPr>
+          <w:rFonts w:ascii="Calibri" w:hAnsi="Calibri" w:eastAsia="Calibri" w:cs="Calibri" w:hint="eastAsia"/>
+        </w:rPr>
+        <w:t xml:space="preserve">remain separate evidence-pipeline costs.</w:t>
       </w:r>
     </w:p>
     <w:p>
@@ -13719,19 +14386,31 @@
         <w:rPr>
           <w:rFonts w:ascii="Calibri" w:hAnsi="Calibri" w:eastAsia="Calibri" w:cs="Calibri" w:hint="eastAsia"/>
         </w:rPr>
-        <w:t xml:space="preserve">repetitions, we report all raw points and mechanism-level decompositions. We do</w:t>
-      </w:r>
-      <w:r>
-        <w:rPr>
-          <w:rFonts w:ascii="Calibri" w:hAnsi="Calibri" w:eastAsia="Calibri" w:cs="Calibri" w:hint="eastAsia"/>
-        </w:rPr>
-        <w:t xml:space="preserve"> </w:t>
-      </w:r>
-      <w:r>
-        <w:rPr>
-          <w:rFonts w:ascii="Calibri" w:hAnsi="Calibri" w:eastAsia="Calibri" w:cs="Calibri" w:hint="eastAsia"/>
-        </w:rPr>
-        <w:t xml:space="preserve">not fit scaling exponents, attach population</w:t>
+        <w:t xml:space="preserve">repetitions, an admitted execution would have reported all raw points and</w:t>
+      </w:r>
+      <w:r>
+        <w:rPr>
+          <w:rFonts w:ascii="Calibri" w:hAnsi="Calibri" w:eastAsia="Calibri" w:cs="Calibri" w:hint="eastAsia"/>
+        </w:rPr>
+        <w:t xml:space="preserve"> </w:t>
+      </w:r>
+      <w:r>
+        <w:rPr>
+          <w:rFonts w:ascii="Calibri" w:hAnsi="Calibri" w:eastAsia="Calibri" w:cs="Calibri" w:hint="eastAsia"/>
+        </w:rPr>
+        <w:t xml:space="preserve">mechanism-level decompositions. It would not have fitted scaling exponents,</w:t>
+      </w:r>
+      <w:r>
+        <w:rPr>
+          <w:rFonts w:ascii="Calibri" w:hAnsi="Calibri" w:eastAsia="Calibri" w:cs="Calibri" w:hint="eastAsia"/>
+        </w:rPr>
+        <w:t xml:space="preserve"> </w:t>
+      </w:r>
+      <w:r>
+        <w:rPr>
+          <w:rFonts w:ascii="Calibri" w:hAnsi="Calibri" w:eastAsia="Calibri" w:cs="Calibri" w:hint="eastAsia"/>
+        </w:rPr>
+        <w:t xml:space="preserve">attached population</w:t>
       </w:r>
       <w:r>
         <w:rPr>
@@ -13754,19 +14433,19 @@
         <w:rPr>
           <w:rFonts w:ascii="Calibri" w:hAnsi="Calibri" w:eastAsia="Calibri" w:cs="Calibri" w:hint="eastAsia"/>
         </w:rPr>
-        <w:t xml:space="preserve">values or confidence intervals,</w:t>
-      </w:r>
-      <w:r>
-        <w:rPr>
-          <w:rFonts w:ascii="Calibri" w:hAnsi="Calibri" w:eastAsia="Calibri" w:cs="Calibri" w:hint="eastAsia"/>
-        </w:rPr>
-        <w:t xml:space="preserve"> </w:t>
-      </w:r>
-      <w:r>
-        <w:rPr>
-          <w:rFonts w:ascii="Calibri" w:hAnsi="Calibri" w:eastAsia="Calibri" w:cs="Calibri" w:hint="eastAsia"/>
-        </w:rPr>
-        <w:t xml:space="preserve">or claim a global winner or Pareto frontier.</w:t>
+        <w:t xml:space="preserve">values or confidence intervals, or claimed a global</w:t>
+      </w:r>
+      <w:r>
+        <w:rPr>
+          <w:rFonts w:ascii="Calibri" w:hAnsi="Calibri" w:eastAsia="Calibri" w:cs="Calibri" w:hint="eastAsia"/>
+        </w:rPr>
+        <w:t xml:space="preserve"> </w:t>
+      </w:r>
+      <w:r>
+        <w:rPr>
+          <w:rFonts w:ascii="Calibri" w:hAnsi="Calibri" w:eastAsia="Calibri" w:cs="Calibri" w:hint="eastAsia"/>
+        </w:rPr>
+        <w:t xml:space="preserve">winner or Pareto frontier.</w:t>
       </w:r>
     </w:p>
     <w:bookmarkEnd w:id="35"/>
@@ -13790,31 +14469,31 @@
         <w:rPr>
           <w:rFonts w:ascii="Calibri" w:hAnsi="Calibri" w:eastAsia="Calibri" w:cs="Calibri" w:hint="eastAsia"/>
         </w:rPr>
-        <w:t xml:space="preserve">Before formal execution, one six-job qualification must complete within the</w:t>
-      </w:r>
-      <w:r>
-        <w:rPr>
-          <w:rFonts w:ascii="Calibri" w:hAnsi="Calibri" w:eastAsia="Calibri" w:cs="Calibri" w:hint="eastAsia"/>
-        </w:rPr>
-        <w:t xml:space="preserve"> </w:t>
-      </w:r>
-      <w:r>
-        <w:rPr>
-          <w:rFonts w:ascii="Calibri" w:hAnsi="Calibri" w:eastAsia="Calibri" w:cs="Calibri" w:hint="eastAsia"/>
-        </w:rPr>
-        <w:t xml:space="preserve">frozen 45-minute computational path and 55-minute total path, satisfy the</w:t>
-      </w:r>
-      <w:r>
-        <w:rPr>
-          <w:rFonts w:ascii="Calibri" w:hAnsi="Calibri" w:eastAsia="Calibri" w:cs="Calibri" w:hint="eastAsia"/>
-        </w:rPr>
-        <w:t xml:space="preserve"> </w:t>
-      </w:r>
-      <w:r>
-        <w:rPr>
-          <w:rFonts w:ascii="Calibri" w:hAnsi="Calibri" w:eastAsia="Calibri" w:cs="Calibri" w:hint="eastAsia"/>
-        </w:rPr>
-        <w:t xml:space="preserve">necessary</w:t>
+        <w:t xml:space="preserve">Before formal execution, one six-job qualification was required to complete</w:t>
+      </w:r>
+      <w:r>
+        <w:rPr>
+          <w:rFonts w:ascii="Calibri" w:hAnsi="Calibri" w:eastAsia="Calibri" w:cs="Calibri" w:hint="eastAsia"/>
+        </w:rPr>
+        <w:t xml:space="preserve"> </w:t>
+      </w:r>
+      <w:r>
+        <w:rPr>
+          <w:rFonts w:ascii="Calibri" w:hAnsi="Calibri" w:eastAsia="Calibri" w:cs="Calibri" w:hint="eastAsia"/>
+        </w:rPr>
+        <w:t xml:space="preserve">within the frozen 45-minute computational path and 55-minute total path, satisfy</w:t>
+      </w:r>
+      <w:r>
+        <w:rPr>
+          <w:rFonts w:ascii="Calibri" w:hAnsi="Calibri" w:eastAsia="Calibri" w:cs="Calibri" w:hint="eastAsia"/>
+        </w:rPr>
+        <w:t xml:space="preserve"> </w:t>
+      </w:r>
+      <w:r>
+        <w:rPr>
+          <w:rFonts w:ascii="Calibri" w:hAnsi="Calibri" w:eastAsia="Calibri" w:cs="Calibri" w:hint="eastAsia"/>
+        </w:rPr>
+        <w:t xml:space="preserve">the necessary</w:t>
       </w:r>
       <w:r>
         <w:rPr>
@@ -13879,19 +14558,125 @@
         <w:rPr>
           <w:rFonts w:ascii="Calibri" w:hAnsi="Calibri" w:eastAsia="Calibri" w:cs="Calibri" w:hint="eastAsia"/>
         </w:rPr>
-        <w:t xml:space="preserve">external-controller reread. Qualification artifacts are permanently</w:t>
-      </w:r>
-      <w:r>
-        <w:rPr>
-          <w:rFonts w:ascii="Calibri" w:hAnsi="Calibri" w:eastAsia="Calibri" w:cs="Calibri" w:hint="eastAsia"/>
-        </w:rPr>
-        <w:t xml:space="preserve"> </w:t>
-      </w:r>
-      <w:r>
-        <w:rPr>
-          <w:rFonts w:ascii="Calibri" w:hAnsi="Calibri" w:eastAsia="Calibri" w:cs="Calibri" w:hint="eastAsia"/>
-        </w:rPr>
-        <w:t xml:space="preserve">non-evidence and cannot enter the formal result set.</w:t>
+        <w:t xml:space="preserve">external-controller reread. Here</w:t>
+      </w:r>
+      <w:r>
+        <w:rPr>
+          <w:rFonts w:ascii="Calibri" w:hAnsi="Calibri" w:eastAsia="Calibri" w:cs="Calibri" w:hint="eastAsia"/>
+        </w:rPr>
+        <w:t xml:space="preserve"> </w:t>
+      </w:r>
+      <m:oMath>
+        <m:sSub>
+          <m:e>
+            <m:r>
+              <m:t>C</m:t>
+            </m:r>
+          </m:e>
+          <m:sub>
+            <m:r>
+              <m:t>q</m:t>
+            </m:r>
+          </m:sub>
+        </m:sSub>
+      </m:oMath>
+      <w:r>
+        <w:rPr>
+          <w:rFonts w:ascii="Calibri" w:hAnsi="Calibri" w:eastAsia="Calibri" w:cs="Calibri" w:hint="eastAsia"/>
+        </w:rPr>
+        <w:t xml:space="preserve"> </w:t>
+      </w:r>
+      <w:r>
+        <w:rPr>
+          <w:rFonts w:ascii="Calibri" w:hAnsi="Calibri" w:eastAsia="Calibri" w:cs="Calibri" w:hint="eastAsia"/>
+        </w:rPr>
+        <w:t xml:space="preserve">is the registered per-case native-runtime</w:t>
+      </w:r>
+      <w:r>
+        <w:rPr>
+          <w:rFonts w:ascii="Calibri" w:hAnsi="Calibri" w:eastAsia="Calibri" w:cs="Calibri" w:hint="eastAsia"/>
+        </w:rPr>
+        <w:t xml:space="preserve"> </w:t>
+      </w:r>
+      <w:r>
+        <w:rPr>
+          <w:rFonts w:ascii="Calibri" w:hAnsi="Calibri" w:eastAsia="Calibri" w:cs="Calibri" w:hint="eastAsia"/>
+        </w:rPr>
+        <w:t xml:space="preserve">estimate: the sum of provider-API</w:t>
+      </w:r>
+      <w:r>
+        <w:rPr>
+          <w:rFonts w:ascii="Calibri" w:hAnsi="Calibri" w:eastAsia="Calibri" w:cs="Calibri" w:hint="eastAsia"/>
+        </w:rPr>
+        <w:t xml:space="preserve"> </w:t>
+      </w:r>
+      <w:r>
+        <w:rPr>
+          <w:rStyle w:val="VerbatimChar"/>
+          <w:rFonts w:ascii="Calibri" w:hAnsi="Calibri" w:eastAsia="Calibri" w:cs="Calibri" w:hint="eastAsia"/>
+        </w:rPr>
+        <w:t xml:space="preserve">startedAt</w:t>
+      </w:r>
+      <w:r>
+        <w:rPr>
+          <w:rFonts w:ascii="Calibri" w:hAnsi="Calibri" w:eastAsia="Calibri" w:cs="Calibri" w:hint="eastAsia"/>
+        </w:rPr>
+        <w:t xml:space="preserve">–</w:t>
+      </w:r>
+      <w:r>
+        <w:rPr>
+          <w:rStyle w:val="VerbatimChar"/>
+          <w:rFonts w:ascii="Calibri" w:hAnsi="Calibri" w:eastAsia="Calibri" w:cs="Calibri" w:hint="eastAsia"/>
+        </w:rPr>
+        <w:t xml:space="preserve">completedAt</w:t>
+      </w:r>
+      <w:r>
+        <w:rPr>
+          <w:rFonts w:ascii="Calibri" w:hAnsi="Calibri" w:eastAsia="Calibri" w:cs="Calibri" w:hint="eastAsia"/>
+        </w:rPr>
+        <w:t xml:space="preserve"> </w:t>
+      </w:r>
+      <w:r>
+        <w:rPr>
+          <w:rFonts w:ascii="Calibri" w:hAnsi="Calibri" w:eastAsia="Calibri" w:cs="Calibri" w:hint="eastAsia"/>
+        </w:rPr>
+        <w:t xml:space="preserve">durations for the</w:t>
+      </w:r>
+      <w:r>
+        <w:rPr>
+          <w:rFonts w:ascii="Calibri" w:hAnsi="Calibri" w:eastAsia="Calibri" w:cs="Calibri" w:hint="eastAsia"/>
+        </w:rPr>
+        <w:t xml:space="preserve"> </w:t>
+      </w:r>
+      <w:r>
+        <w:rPr>
+          <w:rFonts w:ascii="Calibri" w:hAnsi="Calibri" w:eastAsia="Calibri" w:cs="Calibri" w:hint="eastAsia"/>
+        </w:rPr>
+        <w:t xml:space="preserve">qualification’s native producer job, native replay/guard job, and entire</w:t>
+      </w:r>
+      <w:r>
+        <w:rPr>
+          <w:rFonts w:ascii="Calibri" w:hAnsi="Calibri" w:eastAsia="Calibri" w:cs="Calibri" w:hint="eastAsia"/>
+        </w:rPr>
+        <w:t xml:space="preserve"> </w:t>
+      </w:r>
+      <w:r>
+        <w:rPr>
+          <w:rFonts w:ascii="Calibri" w:hAnsi="Calibri" w:eastAsia="Calibri" w:cs="Calibri" w:hint="eastAsia"/>
+        </w:rPr>
+        <w:t xml:space="preserve">combined-guard job. Qualification artifacts were permanently non-evidence and</w:t>
+      </w:r>
+      <w:r>
+        <w:rPr>
+          <w:rFonts w:ascii="Calibri" w:hAnsi="Calibri" w:eastAsia="Calibri" w:cs="Calibri" w:hint="eastAsia"/>
+        </w:rPr>
+        <w:t xml:space="preserve"> </w:t>
+      </w:r>
+      <w:r>
+        <w:rPr>
+          <w:rFonts w:ascii="Calibri" w:hAnsi="Calibri" w:eastAsia="Calibri" w:cs="Calibri" w:hint="eastAsia"/>
+        </w:rPr>
+        <w:t xml:space="preserve">could not enter the formal result set.</w:t>
       </w:r>
     </w:p>
     <w:p>
@@ -13902,7 +14687,7 @@
         <w:rPr>
           <w:rFonts w:ascii="Calibri" w:hAnsi="Calibri" w:eastAsia="Calibri" w:cs="Calibri" w:hint="eastAsia"/>
         </w:rPr>
-        <w:t xml:space="preserve">The formal campaign is serial and admits exactly</w:t>
+        <w:t xml:space="preserve">The formal campaign was specified as serial and would have admitted exactly</w:t>
       </w:r>
     </w:p>
     <w:p>
@@ -14004,19 +14789,31 @@
         <w:rPr>
           <w:rFonts w:ascii="Calibri" w:hAnsi="Calibri" w:eastAsia="Calibri" w:cs="Calibri" w:hint="eastAsia"/>
         </w:rPr>
-        <w:t xml:space="preserve">pre-aggregate artifacts. Before launching each unit, the controller reserves</w:t>
-      </w:r>
-      <w:r>
-        <w:rPr>
-          <w:rFonts w:ascii="Calibri" w:hAnsi="Calibri" w:eastAsia="Calibri" w:cs="Calibri" w:hint="eastAsia"/>
-        </w:rPr>
-        <w:t xml:space="preserve"> </w:t>
-      </w:r>
-      <w:r>
-        <w:rPr>
-          <w:rFonts w:ascii="Calibri" w:hAnsi="Calibri" w:eastAsia="Calibri" w:cs="Calibri" w:hint="eastAsia"/>
-        </w:rPr>
-        <w:t xml:space="preserve">its full remaining worst-case budget. The preregistered 12-hour figure is an</w:t>
+        <w:t xml:space="preserve">pre-aggregate artifacts. Before launching each unit, the controller would have</w:t>
+      </w:r>
+      <w:r>
+        <w:rPr>
+          <w:rFonts w:ascii="Calibri" w:hAnsi="Calibri" w:eastAsia="Calibri" w:cs="Calibri" w:hint="eastAsia"/>
+        </w:rPr>
+        <w:t xml:space="preserve"> </w:t>
+      </w:r>
+      <w:r>
+        <w:rPr>
+          <w:rFonts w:ascii="Calibri" w:hAnsi="Calibri" w:eastAsia="Calibri" w:cs="Calibri" w:hint="eastAsia"/>
+        </w:rPr>
+        <w:t xml:space="preserve">reserved its full remaining worst-case budget. The preregistered 12-hour figure</w:t>
+      </w:r>
+      <w:r>
+        <w:rPr>
+          <w:rFonts w:ascii="Calibri" w:hAnsi="Calibri" w:eastAsia="Calibri" w:cs="Calibri" w:hint="eastAsia"/>
+        </w:rPr>
+        <w:t xml:space="preserve"> </w:t>
+      </w:r>
+      <w:r>
+        <w:rPr>
+          <w:rFonts w:ascii="Calibri" w:hAnsi="Calibri" w:eastAsia="Calibri" w:cs="Calibri" w:hint="eastAsia"/>
+        </w:rPr>
+        <w:t xml:space="preserve">was an</w:t>
       </w:r>
       <w:r>
         <w:rPr>
@@ -14052,43 +14849,43 @@
         <w:rPr>
           <w:rFonts w:ascii="Calibri" w:hAnsi="Calibri" w:eastAsia="Calibri" w:cs="Calibri" w:hint="eastAsia"/>
         </w:rPr>
-        <w:t xml:space="preserve">is allowed, and only for a provider failure rather than a data-dependent or</w:t>
-      </w:r>
-      <w:r>
-        <w:rPr>
-          <w:rFonts w:ascii="Calibri" w:hAnsi="Calibri" w:eastAsia="Calibri" w:cs="Calibri" w:hint="eastAsia"/>
-        </w:rPr>
-        <w:t xml:space="preserve"> </w:t>
-      </w:r>
-      <w:r>
-        <w:rPr>
-          <w:rFonts w:ascii="Calibri" w:hAnsi="Calibri" w:eastAsia="Calibri" w:cs="Calibri" w:hint="eastAsia"/>
-        </w:rPr>
-        <w:t xml:space="preserve">scientific outcome. Terminal admission rejects missing, extra, duplicated,</w:t>
-      </w:r>
-      <w:r>
-        <w:rPr>
-          <w:rFonts w:ascii="Calibri" w:hAnsi="Calibri" w:eastAsia="Calibri" w:cs="Calibri" w:hint="eastAsia"/>
-        </w:rPr>
-        <w:t xml:space="preserve"> </w:t>
-      </w:r>
-      <w:r>
-        <w:rPr>
-          <w:rFonts w:ascii="Calibri" w:hAnsi="Calibri" w:eastAsia="Calibri" w:cs="Calibri" w:hint="eastAsia"/>
-        </w:rPr>
-        <w:t xml:space="preserve">wrong-attempt, or wrong-kind objects before aggregation and compatible detached</w:t>
-      </w:r>
-      <w:r>
-        <w:rPr>
-          <w:rFonts w:ascii="Calibri" w:hAnsi="Calibri" w:eastAsia="Calibri" w:cs="Calibri" w:hint="eastAsia"/>
-        </w:rPr>
-        <w:t xml:space="preserve"> </w:t>
-      </w:r>
-      <w:r>
-        <w:rPr>
-          <w:rFonts w:ascii="Calibri" w:hAnsi="Calibri" w:eastAsia="Calibri" w:cs="Calibri" w:hint="eastAsia"/>
-        </w:rPr>
-        <w:t xml:space="preserve">analysis.</w:t>
+        <w:t xml:space="preserve">would have been allowed, and only for a provider failure rather than a</w:t>
+      </w:r>
+      <w:r>
+        <w:rPr>
+          <w:rFonts w:ascii="Calibri" w:hAnsi="Calibri" w:eastAsia="Calibri" w:cs="Calibri" w:hint="eastAsia"/>
+        </w:rPr>
+        <w:t xml:space="preserve"> </w:t>
+      </w:r>
+      <w:r>
+        <w:rPr>
+          <w:rFonts w:ascii="Calibri" w:hAnsi="Calibri" w:eastAsia="Calibri" w:cs="Calibri" w:hint="eastAsia"/>
+        </w:rPr>
+        <w:t xml:space="preserve">data-dependent or scientific outcome. Terminal admission would have rejected</w:t>
+      </w:r>
+      <w:r>
+        <w:rPr>
+          <w:rFonts w:ascii="Calibri" w:hAnsi="Calibri" w:eastAsia="Calibri" w:cs="Calibri" w:hint="eastAsia"/>
+        </w:rPr>
+        <w:t xml:space="preserve"> </w:t>
+      </w:r>
+      <w:r>
+        <w:rPr>
+          <w:rFonts w:ascii="Calibri" w:hAnsi="Calibri" w:eastAsia="Calibri" w:cs="Calibri" w:hint="eastAsia"/>
+        </w:rPr>
+        <w:t xml:space="preserve">missing, extra, duplicated, wrong-attempt, or wrong-kind objects before</w:t>
+      </w:r>
+      <w:r>
+        <w:rPr>
+          <w:rFonts w:ascii="Calibri" w:hAnsi="Calibri" w:eastAsia="Calibri" w:cs="Calibri" w:hint="eastAsia"/>
+        </w:rPr>
+        <w:t xml:space="preserve"> </w:t>
+      </w:r>
+      <w:r>
+        <w:rPr>
+          <w:rFonts w:ascii="Calibri" w:hAnsi="Calibri" w:eastAsia="Calibri" w:cs="Calibri" w:hint="eastAsia"/>
+        </w:rPr>
+        <w:t xml:space="preserve">aggregation and compatible detached analysis.</w:t>
       </w:r>
     </w:p>
     <w:bookmarkEnd w:id="36"/>
@@ -14411,7 +15208,7 @@
           <w:b/>
           <w:bCs/>
         </w:rPr>
-        <w:t xml:space="preserve">Table 2. What each evidence layer proves and does not prove.</w:t>
+        <w:t xml:space="preserve">Table 3. What each evidence layer proves and does not prove.</w:t>
       </w:r>
     </w:p>
     <w:tbl>
@@ -15022,6 +15819,792 @@
         </w:tc>
       </w:tr>
     </w:tbl>
+    <w:p>
+      <w:pPr>
+        <w:pStyle w:val="BodyText"/>
+      </w:pPr>
+      <w:r>
+        <w:rPr>
+          <w:rFonts w:ascii="Calibri" w:hAnsi="Calibri" w:eastAsia="Calibri" w:cs="Calibri" w:hint="eastAsia"/>
+          <w:b/>
+          <w:bCs/>
+        </w:rPr>
+        <w:t xml:space="preserve">Table 4. Compact standalone provenance for the Route C stopping outcome.</w:t>
+      </w:r>
+    </w:p>
+    <w:tbl>
+      <w:tblPr>
+        <w:tblStyle w:val="Table"/>
+        <w:tblW w:type="dxa" w:w="9360"/>
+        <w:jc w:val="left"/>
+        <w:tblLayout w:type="fixed"/>
+        <w:tblLook w:firstRow="1" w:lastRow="0" w:firstColumn="0" w:lastColumn="0" w:noHBand="0" w:noVBand="0" w:val="0020"/>
+        <w:tblInd w:w="120" w:type="dxa"/>
+        <w:tblBorders>
+          <w:top w:val="single" w:sz="4" w:space="0" w:color="CBD3DC"/>
+          <w:left w:val="single" w:sz="4" w:space="0" w:color="CBD3DC"/>
+          <w:bottom w:val="single" w:sz="4" w:space="0" w:color="CBD3DC"/>
+          <w:right w:val="single" w:sz="4" w:space="0" w:color="CBD3DC"/>
+          <w:insideH w:val="single" w:sz="4" w:space="0" w:color="CBD3DC"/>
+          <w:insideV w:val="single" w:sz="4" w:space="0" w:color="CBD3DC"/>
+        </w:tblBorders>
+      </w:tblPr>
+      <w:tblGrid>
+        <w:gridCol w:w="2050"/>
+        <w:gridCol w:w="3110"/>
+        <w:gridCol w:w="4200"/>
+      </w:tblGrid>
+      <w:tr>
+        <w:trPr>
+          <w:tblHeader w:val="1"/>
+          <w:cantSplit w:val="1"/>
+        </w:trPr>
+        <w:tc>
+          <w:tcPr>
+            <w:tcW w:w="2050" w:type="dxa"/>
+            <w:tcMar>
+              <w:top w:w="80" w:type="dxa"/>
+              <w:start w:w="120" w:type="dxa"/>
+              <w:bottom w:w="80" w:type="dxa"/>
+              <w:end w:w="120" w:type="dxa"/>
+            </w:tcMar>
+            <w:vAlign w:val="center"/>
+            <w:shd w:fill="F4F6F9"/>
+          </w:tcPr>
+          <w:p>
+            <w:pPr>
+              <w:pStyle w:val="Compact"/>
+              <w:spacing w:before="0" w:after="60" w:line="259" w:lineRule="auto"/>
+              <w:jc w:val="left"/>
+            </w:pPr>
+            <w:r>
+              <w:rPr>
+                <w:rFonts w:ascii="Calibri" w:hAnsi="Calibri" w:eastAsia="Calibri" w:cs="Calibri" w:hint="eastAsia"/>
+                <w:b/>
+                <w:sz w:val="18"/>
+              </w:rPr>
+              <w:t xml:space="preserve">Object or gate</w:t>
+            </w:r>
+          </w:p>
+        </w:tc>
+        <w:tc>
+          <w:tcPr>
+            <w:tcW w:w="3110" w:type="dxa"/>
+            <w:tcMar>
+              <w:top w:w="80" w:type="dxa"/>
+              <w:start w:w="120" w:type="dxa"/>
+              <w:bottom w:w="80" w:type="dxa"/>
+              <w:end w:w="120" w:type="dxa"/>
+            </w:tcMar>
+            <w:vAlign w:val="center"/>
+            <w:shd w:fill="F4F6F9"/>
+          </w:tcPr>
+          <w:p>
+            <w:pPr>
+              <w:pStyle w:val="Compact"/>
+              <w:spacing w:before="0" w:after="60" w:line="259" w:lineRule="auto"/>
+              <w:jc w:val="left"/>
+            </w:pPr>
+            <w:r>
+              <w:rPr>
+                <w:rFonts w:ascii="Calibri" w:hAnsi="Calibri" w:eastAsia="Calibri" w:cs="Calibri" w:hint="eastAsia"/>
+                <w:b/>
+                <w:sz w:val="18"/>
+              </w:rPr>
+              <w:t xml:space="preserve">Exact identity</w:t>
+            </w:r>
+          </w:p>
+        </w:tc>
+        <w:tc>
+          <w:tcPr>
+            <w:tcW w:w="4200" w:type="dxa"/>
+            <w:tcMar>
+              <w:top w:w="80" w:type="dxa"/>
+              <w:start w:w="120" w:type="dxa"/>
+              <w:bottom w:w="80" w:type="dxa"/>
+              <w:end w:w="120" w:type="dxa"/>
+            </w:tcMar>
+            <w:vAlign w:val="center"/>
+            <w:shd w:fill="F4F6F9"/>
+          </w:tcPr>
+          <w:p>
+            <w:pPr>
+              <w:pStyle w:val="Compact"/>
+              <w:spacing w:before="0" w:after="60" w:line="259" w:lineRule="auto"/>
+              <w:jc w:val="left"/>
+            </w:pPr>
+            <w:r>
+              <w:rPr>
+                <w:rFonts w:ascii="Calibri" w:hAnsi="Calibri" w:eastAsia="Calibri" w:cs="Calibri" w:hint="eastAsia"/>
+                <w:b/>
+                <w:sz w:val="18"/>
+              </w:rPr>
+              <w:t xml:space="preserve">Terminal disposition</w:t>
+            </w:r>
+          </w:p>
+        </w:tc>
+      </w:tr>
+      <w:tr>
+        <w:trPr>
+          <w:cantSplit w:val="1"/>
+        </w:trPr>
+        <w:tc>
+          <w:tcPr>
+            <w:tcW w:w="2050" w:type="dxa"/>
+            <w:tcMar>
+              <w:top w:w="80" w:type="dxa"/>
+              <w:start w:w="120" w:type="dxa"/>
+              <w:bottom w:w="80" w:type="dxa"/>
+              <w:end w:w="120" w:type="dxa"/>
+            </w:tcMar>
+            <w:vAlign w:val="center"/>
+          </w:tcPr>
+          <w:p>
+            <w:pPr>
+              <w:pStyle w:val="Compact"/>
+              <w:spacing w:before="0" w:after="60" w:line="259" w:lineRule="auto"/>
+              <w:jc w:val="left"/>
+            </w:pPr>
+            <w:r>
+              <w:rPr>
+                <w:rFonts w:ascii="Calibri" w:hAnsi="Calibri" w:eastAsia="Calibri" w:cs="Calibri" w:hint="eastAsia"/>
+                <w:sz w:val="18"/>
+              </w:rPr>
+              <w:t xml:space="preserve">Experiment source</w:t>
+            </w:r>
+          </w:p>
+        </w:tc>
+        <w:tc>
+          <w:tcPr>
+            <w:tcW w:w="3110" w:type="dxa"/>
+            <w:tcMar>
+              <w:top w:w="80" w:type="dxa"/>
+              <w:start w:w="120" w:type="dxa"/>
+              <w:bottom w:w="80" w:type="dxa"/>
+              <w:end w:w="120" w:type="dxa"/>
+            </w:tcMar>
+            <w:vAlign w:val="center"/>
+          </w:tcPr>
+          <w:p>
+            <w:pPr>
+              <w:pStyle w:val="Compact"/>
+              <w:spacing w:before="0" w:after="60" w:line="259" w:lineRule="auto"/>
+              <w:jc w:val="left"/>
+            </w:pPr>
+            <w:r>
+              <w:rPr>
+                <w:rFonts w:ascii="Calibri" w:hAnsi="Calibri" w:eastAsia="Calibri" w:cs="Calibri" w:hint="eastAsia"/>
+                <w:sz w:val="18"/>
+              </w:rPr>
+              <w:t xml:space="preserve">S1</w:t>
+            </w:r>
+            <w:r>
+              <w:rPr>
+                <w:rFonts w:ascii="Calibri" w:hAnsi="Calibri" w:eastAsia="Calibri" w:cs="Calibri" w:hint="eastAsia"/>
+                <w:sz w:val="18"/>
+              </w:rPr>
+              <w:t xml:space="preserve"> </w:t>
+            </w:r>
+            <w:r>
+              <w:rPr>
+                <w:rStyle w:val="VerbatimChar"/>
+                <w:rFonts w:ascii="Calibri" w:hAnsi="Calibri" w:eastAsia="Calibri" w:cs="Calibri" w:hint="eastAsia"/>
+                <w:sz w:val="18"/>
+              </w:rPr>
+              <w:t xml:space="preserve">ee58627bb5752c6ac1ee2c5132c6574f9cb66552</w:t>
+            </w:r>
+          </w:p>
+        </w:tc>
+        <w:tc>
+          <w:tcPr>
+            <w:tcW w:w="4200" w:type="dxa"/>
+            <w:tcMar>
+              <w:top w:w="80" w:type="dxa"/>
+              <w:start w:w="120" w:type="dxa"/>
+              <w:bottom w:w="80" w:type="dxa"/>
+              <w:end w:w="120" w:type="dxa"/>
+            </w:tcMar>
+            <w:vAlign w:val="center"/>
+          </w:tcPr>
+          <w:p>
+            <w:pPr>
+              <w:pStyle w:val="Compact"/>
+              <w:spacing w:before="0" w:after="60" w:line="259" w:lineRule="auto"/>
+              <w:jc w:val="left"/>
+            </w:pPr>
+            <w:r>
+              <w:rPr>
+                <w:rFonts w:ascii="Calibri" w:hAnsi="Calibri" w:eastAsia="Calibri" w:cs="Calibri" w:hint="eastAsia"/>
+                <w:sz w:val="18"/>
+              </w:rPr>
+              <w:t xml:space="preserve">CI run</w:t>
+            </w:r>
+            <w:r>
+              <w:rPr>
+                <w:rFonts w:ascii="Calibri" w:hAnsi="Calibri" w:eastAsia="Calibri" w:cs="Calibri" w:hint="eastAsia"/>
+                <w:sz w:val="18"/>
+              </w:rPr>
+              <w:t xml:space="preserve"> </w:t>
+            </w:r>
+            <w:r>
+              <w:rPr>
+                <w:rStyle w:val="VerbatimChar"/>
+                <w:rFonts w:ascii="Calibri" w:hAnsi="Calibri" w:eastAsia="Calibri" w:cs="Calibri" w:hint="eastAsia"/>
+                <w:sz w:val="18"/>
+              </w:rPr>
+              <w:t xml:space="preserve">33258436732</w:t>
+            </w:r>
+            <w:r>
+              <w:rPr>
+                <w:rFonts w:ascii="Calibri" w:hAnsi="Calibri" w:eastAsia="Calibri" w:cs="Calibri" w:hint="eastAsia"/>
+                <w:sz w:val="18"/>
+              </w:rPr>
+              <w:t xml:space="preserve"> </w:t>
+            </w:r>
+            <w:r>
+              <w:rPr>
+                <w:rFonts w:ascii="Calibri" w:hAnsi="Calibri" w:eastAsia="Calibri" w:cs="Calibri" w:hint="eastAsia"/>
+                <w:sz w:val="18"/>
+              </w:rPr>
+              <w:t xml:space="preserve">passed: 2,403 tests and 2 expected runner-dependent skips</w:t>
+            </w:r>
+          </w:p>
+        </w:tc>
+      </w:tr>
+      <w:tr>
+        <w:trPr>
+          <w:cantSplit w:val="1"/>
+        </w:trPr>
+        <w:tc>
+          <w:tcPr>
+            <w:tcW w:w="2050" w:type="dxa"/>
+            <w:tcMar>
+              <w:top w:w="80" w:type="dxa"/>
+              <w:start w:w="120" w:type="dxa"/>
+              <w:bottom w:w="80" w:type="dxa"/>
+              <w:end w:w="120" w:type="dxa"/>
+            </w:tcMar>
+            <w:vAlign w:val="center"/>
+          </w:tcPr>
+          <w:p>
+            <w:pPr>
+              <w:pStyle w:val="Compact"/>
+              <w:spacing w:before="0" w:after="60" w:line="259" w:lineRule="auto"/>
+              <w:jc w:val="left"/>
+            </w:pPr>
+            <w:r>
+              <w:rPr>
+                <w:rFonts w:ascii="Calibri" w:hAnsi="Calibri" w:eastAsia="Calibri" w:cs="Calibri" w:hint="eastAsia"/>
+                <w:sz w:val="18"/>
+              </w:rPr>
+              <w:t xml:space="preserve">Real-runner preparation</w:t>
+            </w:r>
+          </w:p>
+        </w:tc>
+        <w:tc>
+          <w:tcPr>
+            <w:tcW w:w="3110" w:type="dxa"/>
+            <w:tcMar>
+              <w:top w:w="80" w:type="dxa"/>
+              <w:start w:w="120" w:type="dxa"/>
+              <w:bottom w:w="80" w:type="dxa"/>
+              <w:end w:w="120" w:type="dxa"/>
+            </w:tcMar>
+            <w:vAlign w:val="center"/>
+          </w:tcPr>
+          <w:p>
+            <w:pPr>
+              <w:pStyle w:val="Compact"/>
+              <w:spacing w:before="0" w:after="60" w:line="259" w:lineRule="auto"/>
+              <w:jc w:val="left"/>
+            </w:pPr>
+            <w:r>
+              <w:rPr>
+                <w:rFonts w:ascii="Calibri" w:hAnsi="Calibri" w:eastAsia="Calibri" w:cs="Calibri" w:hint="eastAsia"/>
+                <w:sz w:val="18"/>
+              </w:rPr>
+              <w:t xml:space="preserve">PRE-S1 run</w:t>
+            </w:r>
+            <w:r>
+              <w:rPr>
+                <w:rFonts w:ascii="Calibri" w:hAnsi="Calibri" w:eastAsia="Calibri" w:cs="Calibri" w:hint="eastAsia"/>
+                <w:sz w:val="18"/>
+              </w:rPr>
+              <w:t xml:space="preserve"> </w:t>
+            </w:r>
+            <w:r>
+              <w:rPr>
+                <w:rStyle w:val="VerbatimChar"/>
+                <w:rFonts w:ascii="Calibri" w:hAnsi="Calibri" w:eastAsia="Calibri" w:cs="Calibri" w:hint="eastAsia"/>
+                <w:sz w:val="18"/>
+              </w:rPr>
+              <w:t xml:space="preserve">33259569284</w:t>
+            </w:r>
+          </w:p>
+        </w:tc>
+        <w:tc>
+          <w:tcPr>
+            <w:tcW w:w="4200" w:type="dxa"/>
+            <w:tcMar>
+              <w:top w:w="80" w:type="dxa"/>
+              <w:start w:w="120" w:type="dxa"/>
+              <w:bottom w:w="80" w:type="dxa"/>
+              <w:end w:w="120" w:type="dxa"/>
+            </w:tcMar>
+            <w:vAlign w:val="center"/>
+          </w:tcPr>
+          <w:p>
+            <w:pPr>
+              <w:pStyle w:val="Compact"/>
+              <w:spacing w:before="0" w:after="60" w:line="259" w:lineRule="auto"/>
+              <w:jc w:val="left"/>
+            </w:pPr>
+            <w:r>
+              <w:rPr>
+                <w:rFonts w:ascii="Calibri" w:hAnsi="Calibri" w:eastAsia="Calibri" w:cs="Calibri" w:hint="eastAsia"/>
+                <w:sz w:val="18"/>
+              </w:rPr>
+              <w:t xml:space="preserve">Passed: 583 tests and pinned OpenFHE 1.5.1 ordinary/strong smokes</w:t>
+            </w:r>
+          </w:p>
+        </w:tc>
+      </w:tr>
+      <w:tr>
+        <w:trPr>
+          <w:cantSplit w:val="1"/>
+        </w:trPr>
+        <w:tc>
+          <w:tcPr>
+            <w:tcW w:w="2050" w:type="dxa"/>
+            <w:tcMar>
+              <w:top w:w="80" w:type="dxa"/>
+              <w:start w:w="120" w:type="dxa"/>
+              <w:bottom w:w="80" w:type="dxa"/>
+              <w:end w:w="120" w:type="dxa"/>
+            </w:tcMar>
+            <w:vAlign w:val="center"/>
+          </w:tcPr>
+          <w:p>
+            <w:pPr>
+              <w:pStyle w:val="Compact"/>
+              <w:spacing w:before="0" w:after="60" w:line="259" w:lineRule="auto"/>
+              <w:jc w:val="left"/>
+            </w:pPr>
+            <w:r>
+              <w:rPr>
+                <w:rFonts w:ascii="Calibri" w:hAnsi="Calibri" w:eastAsia="Calibri" w:cs="Calibri" w:hint="eastAsia"/>
+                <w:sz w:val="18"/>
+              </w:rPr>
+              <w:t xml:space="preserve">Evidence freeze</w:t>
+            </w:r>
+          </w:p>
+        </w:tc>
+        <w:tc>
+          <w:tcPr>
+            <w:tcW w:w="3110" w:type="dxa"/>
+            <w:tcMar>
+              <w:top w:w="80" w:type="dxa"/>
+              <w:start w:w="120" w:type="dxa"/>
+              <w:bottom w:w="80" w:type="dxa"/>
+              <w:end w:w="120" w:type="dxa"/>
+            </w:tcMar>
+            <w:vAlign w:val="center"/>
+          </w:tcPr>
+          <w:p>
+            <w:pPr>
+              <w:pStyle w:val="Compact"/>
+              <w:spacing w:before="0" w:after="60" w:line="259" w:lineRule="auto"/>
+              <w:jc w:val="left"/>
+            </w:pPr>
+            <w:r>
+              <w:rPr>
+                <w:rFonts w:ascii="Calibri" w:hAnsi="Calibri" w:eastAsia="Calibri" w:cs="Calibri" w:hint="eastAsia"/>
+                <w:sz w:val="18"/>
+              </w:rPr>
+              <w:t xml:space="preserve">Registration run</w:t>
+            </w:r>
+            <w:r>
+              <w:rPr>
+                <w:rFonts w:ascii="Calibri" w:hAnsi="Calibri" w:eastAsia="Calibri" w:cs="Calibri" w:hint="eastAsia"/>
+                <w:sz w:val="18"/>
+              </w:rPr>
+              <w:t xml:space="preserve"> </w:t>
+            </w:r>
+            <w:r>
+              <w:rPr>
+                <w:rStyle w:val="VerbatimChar"/>
+                <w:rFonts w:ascii="Calibri" w:hAnsi="Calibri" w:eastAsia="Calibri" w:cs="Calibri" w:hint="eastAsia"/>
+                <w:sz w:val="18"/>
+              </w:rPr>
+              <w:t xml:space="preserve">33259894587</w:t>
+            </w:r>
+            <w:r>
+              <w:rPr>
+                <w:rFonts w:ascii="Calibri" w:hAnsi="Calibri" w:eastAsia="Calibri" w:cs="Calibri" w:hint="eastAsia"/>
+                <w:sz w:val="18"/>
+              </w:rPr>
+              <w:t xml:space="preserve">; S2</w:t>
+            </w:r>
+            <w:r>
+              <w:rPr>
+                <w:rFonts w:ascii="Calibri" w:hAnsi="Calibri" w:eastAsia="Calibri" w:cs="Calibri" w:hint="eastAsia"/>
+                <w:sz w:val="18"/>
+              </w:rPr>
+              <w:t xml:space="preserve"> </w:t>
+            </w:r>
+            <w:r>
+              <w:rPr>
+                <w:rStyle w:val="VerbatimChar"/>
+                <w:rFonts w:ascii="Calibri" w:hAnsi="Calibri" w:eastAsia="Calibri" w:cs="Calibri" w:hint="eastAsia"/>
+                <w:sz w:val="18"/>
+              </w:rPr>
+              <w:t xml:space="preserve">c7ff6820d9323f1850c1c5c57fd9070db88db120</w:t>
+            </w:r>
+          </w:p>
+        </w:tc>
+        <w:tc>
+          <w:tcPr>
+            <w:tcW w:w="4200" w:type="dxa"/>
+            <w:tcMar>
+              <w:top w:w="80" w:type="dxa"/>
+              <w:start w:w="120" w:type="dxa"/>
+              <w:bottom w:w="80" w:type="dxa"/>
+              <w:end w:w="120" w:type="dxa"/>
+            </w:tcMar>
+            <w:vAlign w:val="center"/>
+          </w:tcPr>
+          <w:p>
+            <w:pPr>
+              <w:pStyle w:val="Compact"/>
+              <w:spacing w:before="0" w:after="60" w:line="259" w:lineRule="auto"/>
+              <w:jc w:val="left"/>
+            </w:pPr>
+            <w:r>
+              <w:rPr>
+                <w:rFonts w:ascii="Calibri" w:hAnsi="Calibri" w:eastAsia="Calibri" w:cs="Calibri" w:hint="eastAsia"/>
+                <w:sz w:val="18"/>
+              </w:rPr>
+              <w:t xml:space="preserve">Descriptive authority false; S2 CI run</w:t>
+            </w:r>
+            <w:r>
+              <w:rPr>
+                <w:rFonts w:ascii="Calibri" w:hAnsi="Calibri" w:eastAsia="Calibri" w:cs="Calibri" w:hint="eastAsia"/>
+                <w:sz w:val="18"/>
+              </w:rPr>
+              <w:t xml:space="preserve"> </w:t>
+            </w:r>
+            <w:r>
+              <w:rPr>
+                <w:rStyle w:val="VerbatimChar"/>
+                <w:rFonts w:ascii="Calibri" w:hAnsi="Calibri" w:eastAsia="Calibri" w:cs="Calibri" w:hint="eastAsia"/>
+                <w:sz w:val="18"/>
+              </w:rPr>
+              <w:t xml:space="preserve">33260167517</w:t>
+            </w:r>
+            <w:r>
+              <w:rPr>
+                <w:rFonts w:ascii="Calibri" w:hAnsi="Calibri" w:eastAsia="Calibri" w:cs="Calibri" w:hint="eastAsia"/>
+                <w:sz w:val="18"/>
+              </w:rPr>
+              <w:t xml:space="preserve"> </w:t>
+            </w:r>
+            <w:r>
+              <w:rPr>
+                <w:rFonts w:ascii="Calibri" w:hAnsi="Calibri" w:eastAsia="Calibri" w:cs="Calibri" w:hint="eastAsia"/>
+                <w:sz w:val="18"/>
+              </w:rPr>
+              <w:t xml:space="preserve">passed</w:t>
+            </w:r>
+          </w:p>
+        </w:tc>
+      </w:tr>
+      <w:tr>
+        <w:trPr>
+          <w:cantSplit w:val="1"/>
+        </w:trPr>
+        <w:tc>
+          <w:tcPr>
+            <w:tcW w:w="2050" w:type="dxa"/>
+            <w:tcMar>
+              <w:top w:w="80" w:type="dxa"/>
+              <w:start w:w="120" w:type="dxa"/>
+              <w:bottom w:w="80" w:type="dxa"/>
+              <w:end w:w="120" w:type="dxa"/>
+            </w:tcMar>
+            <w:vAlign w:val="center"/>
+          </w:tcPr>
+          <w:p>
+            <w:pPr>
+              <w:pStyle w:val="Compact"/>
+              <w:spacing w:before="0" w:after="60" w:line="259" w:lineRule="auto"/>
+              <w:jc w:val="left"/>
+            </w:pPr>
+            <w:r>
+              <w:rPr>
+                <w:rFonts w:ascii="Calibri" w:hAnsi="Calibri" w:eastAsia="Calibri" w:cs="Calibri" w:hint="eastAsia"/>
+                <w:sz w:val="18"/>
+              </w:rPr>
+              <w:t xml:space="preserve">One-shot qualification</w:t>
+            </w:r>
+          </w:p>
+        </w:tc>
+        <w:tc>
+          <w:tcPr>
+            <w:tcW w:w="3110" w:type="dxa"/>
+            <w:tcMar>
+              <w:top w:w="80" w:type="dxa"/>
+              <w:start w:w="120" w:type="dxa"/>
+              <w:bottom w:w="80" w:type="dxa"/>
+              <w:end w:w="120" w:type="dxa"/>
+            </w:tcMar>
+            <w:vAlign w:val="center"/>
+          </w:tcPr>
+          <w:p>
+            <w:pPr>
+              <w:pStyle w:val="Compact"/>
+              <w:spacing w:before="0" w:after="60" w:line="259" w:lineRule="auto"/>
+              <w:jc w:val="left"/>
+            </w:pPr>
+            <w:r>
+              <w:rPr>
+                <w:rFonts w:ascii="Calibri" w:hAnsi="Calibri" w:eastAsia="Calibri" w:cs="Calibri" w:hint="eastAsia"/>
+                <w:sz w:val="18"/>
+              </w:rPr>
+              <w:t xml:space="preserve">Run</w:t>
+            </w:r>
+            <w:r>
+              <w:rPr>
+                <w:rFonts w:ascii="Calibri" w:hAnsi="Calibri" w:eastAsia="Calibri" w:cs="Calibri" w:hint="eastAsia"/>
+                <w:sz w:val="18"/>
+              </w:rPr>
+              <w:t xml:space="preserve"> </w:t>
+            </w:r>
+            <w:r>
+              <w:rPr>
+                <w:rStyle w:val="VerbatimChar"/>
+                <w:rFonts w:ascii="Calibri" w:hAnsi="Calibri" w:eastAsia="Calibri" w:cs="Calibri" w:hint="eastAsia"/>
+                <w:sz w:val="18"/>
+              </w:rPr>
+              <w:t xml:space="preserve">33261434612</w:t>
+            </w:r>
+          </w:p>
+        </w:tc>
+        <w:tc>
+          <w:tcPr>
+            <w:tcW w:w="4200" w:type="dxa"/>
+            <w:tcMar>
+              <w:top w:w="80" w:type="dxa"/>
+              <w:start w:w="120" w:type="dxa"/>
+              <w:bottom w:w="80" w:type="dxa"/>
+              <w:end w:w="120" w:type="dxa"/>
+            </w:tcMar>
+            <w:vAlign w:val="center"/>
+          </w:tcPr>
+          <w:p>
+            <w:pPr>
+              <w:pStyle w:val="Compact"/>
+              <w:spacing w:before="0" w:after="60" w:line="259" w:lineRule="auto"/>
+              <w:jc w:val="left"/>
+            </w:pPr>
+            <w:r>
+              <w:rPr>
+                <w:rStyle w:val="VerbatimChar"/>
+                <w:rFonts w:ascii="Calibri" w:hAnsi="Calibri" w:eastAsia="Calibri" w:cs="Calibri" w:hint="eastAsia"/>
+                <w:sz w:val="18"/>
+              </w:rPr>
+              <w:t xml:space="preserve">cancelled</w:t>
+            </w:r>
+            <w:r>
+              <w:rPr>
+                <w:rFonts w:ascii="Calibri" w:hAnsi="Calibri" w:eastAsia="Calibri" w:cs="Calibri" w:hint="eastAsia"/>
+                <w:sz w:val="18"/>
+              </w:rPr>
+              <w:t xml:space="preserve">; q1 completed, q2 stopped at the frozen gate, q3–q6 did not run, and q5 never started</w:t>
+            </w:r>
+          </w:p>
+        </w:tc>
+      </w:tr>
+      <w:tr>
+        <w:trPr>
+          <w:cantSplit w:val="1"/>
+        </w:trPr>
+        <w:tc>
+          <w:tcPr>
+            <w:tcW w:w="2050" w:type="dxa"/>
+            <w:tcMar>
+              <w:top w:w="80" w:type="dxa"/>
+              <w:start w:w="120" w:type="dxa"/>
+              <w:bottom w:w="80" w:type="dxa"/>
+              <w:end w:w="120" w:type="dxa"/>
+            </w:tcMar>
+            <w:vAlign w:val="center"/>
+          </w:tcPr>
+          <w:p>
+            <w:pPr>
+              <w:pStyle w:val="Compact"/>
+              <w:spacing w:before="0" w:after="60" w:line="259" w:lineRule="auto"/>
+              <w:jc w:val="left"/>
+            </w:pPr>
+            <w:r>
+              <w:rPr>
+                <w:rFonts w:ascii="Calibri" w:hAnsi="Calibri" w:eastAsia="Calibri" w:cs="Calibri" w:hint="eastAsia"/>
+                <w:sz w:val="18"/>
+              </w:rPr>
+              <w:t xml:space="preserve">Sole provider object</w:t>
+            </w:r>
+          </w:p>
+        </w:tc>
+        <w:tc>
+          <w:tcPr>
+            <w:tcW w:w="3110" w:type="dxa"/>
+            <w:tcMar>
+              <w:top w:w="80" w:type="dxa"/>
+              <w:start w:w="120" w:type="dxa"/>
+              <w:bottom w:w="80" w:type="dxa"/>
+              <w:end w:w="120" w:type="dxa"/>
+            </w:tcMar>
+            <w:vAlign w:val="center"/>
+          </w:tcPr>
+          <w:p>
+            <w:pPr>
+              <w:pStyle w:val="Compact"/>
+              <w:spacing w:before="0" w:after="60" w:line="259" w:lineRule="auto"/>
+              <w:jc w:val="left"/>
+            </w:pPr>
+            <w:r>
+              <w:rPr>
+                <w:rFonts w:ascii="Calibri" w:hAnsi="Calibri" w:eastAsia="Calibri" w:cs="Calibri" w:hint="eastAsia"/>
+                <w:sz w:val="18"/>
+              </w:rPr>
+              <w:t xml:space="preserve">Artifact ID</w:t>
+            </w:r>
+            <w:r>
+              <w:rPr>
+                <w:rFonts w:ascii="Calibri" w:hAnsi="Calibri" w:eastAsia="Calibri" w:cs="Calibri" w:hint="eastAsia"/>
+                <w:sz w:val="18"/>
+              </w:rPr>
+              <w:t xml:space="preserve"> </w:t>
+            </w:r>
+            <w:r>
+              <w:rPr>
+                <w:rStyle w:val="VerbatimChar"/>
+                <w:rFonts w:ascii="Calibri" w:hAnsi="Calibri" w:eastAsia="Calibri" w:cs="Calibri" w:hint="eastAsia"/>
+                <w:sz w:val="18"/>
+              </w:rPr>
+              <w:t xml:space="preserve">9717884587</w:t>
+            </w:r>
+            <w:r>
+              <w:rPr>
+                <w:rFonts w:ascii="Calibri" w:hAnsi="Calibri" w:eastAsia="Calibri" w:cs="Calibri" w:hint="eastAsia"/>
+                <w:sz w:val="18"/>
+              </w:rPr>
+              <w:t xml:space="preserve">, digest</w:t>
+            </w:r>
+            <w:r>
+              <w:rPr>
+                <w:rFonts w:ascii="Calibri" w:hAnsi="Calibri" w:eastAsia="Calibri" w:cs="Calibri" w:hint="eastAsia"/>
+                <w:sz w:val="18"/>
+              </w:rPr>
+              <w:t xml:space="preserve"> </w:t>
+            </w:r>
+            <w:r>
+              <w:rPr>
+                <w:rStyle w:val="VerbatimChar"/>
+                <w:rFonts w:ascii="Calibri" w:hAnsi="Calibri" w:eastAsia="Calibri" w:cs="Calibri" w:hint="eastAsia"/>
+                <w:sz w:val="18"/>
+              </w:rPr>
+              <w:t xml:space="preserve">sha256:51cbfc2a…2c008</w:t>
+            </w:r>
+          </w:p>
+        </w:tc>
+        <w:tc>
+          <w:tcPr>
+            <w:tcW w:w="4200" w:type="dxa"/>
+            <w:tcMar>
+              <w:top w:w="80" w:type="dxa"/>
+              <w:start w:w="120" w:type="dxa"/>
+              <w:bottom w:w="80" w:type="dxa"/>
+              <w:end w:w="120" w:type="dxa"/>
+            </w:tcMar>
+            <w:vAlign w:val="center"/>
+          </w:tcPr>
+          <w:p>
+            <w:pPr>
+              <w:pStyle w:val="Compact"/>
+              <w:spacing w:before="0" w:after="60" w:line="259" w:lineRule="auto"/>
+              <w:jc w:val="left"/>
+            </w:pPr>
+            <w:r>
+              <w:rPr>
+                <w:rFonts w:ascii="Calibri" w:hAnsi="Calibri" w:eastAsia="Calibri" w:cs="Calibri" w:hint="eastAsia"/>
+                <w:sz w:val="18"/>
+              </w:rPr>
+              <w:t xml:space="preserve">One-day q1 handoff; permanently non-evidence; no formal artifact exists</w:t>
+            </w:r>
+          </w:p>
+        </w:tc>
+      </w:tr>
+    </w:tbl>
+    <w:p>
+      <w:pPr>
+        <w:pStyle w:val="BodyText"/>
+      </w:pPr>
+      <w:r>
+        <w:rPr>
+          <w:rFonts w:ascii="Calibri" w:hAnsi="Calibri" w:eastAsia="Calibri" w:cs="Calibri" w:hint="eastAsia"/>
+        </w:rPr>
+        <w:t xml:space="preserve">The version-bound</w:t>
+      </w:r>
+      <w:r>
+        <w:rPr>
+          <w:rFonts w:ascii="Calibri" w:hAnsi="Calibri" w:eastAsia="Calibri" w:cs="Calibri" w:hint="eastAsia"/>
+        </w:rPr>
+        <w:t xml:space="preserve"> </w:t>
+      </w:r>
+      <w:r>
+        <w:rPr>
+          <w:rStyle w:val="VerbatimChar"/>
+          <w:rFonts w:ascii="Calibri" w:hAnsi="Calibri" w:eastAsia="Calibri" w:cs="Calibri" w:hint="eastAsia"/>
+        </w:rPr>
+        <w:t xml:space="preserve">claim-ledger-draft.md</w:t>
+      </w:r>
+      <w:r>
+        <w:rPr>
+          <w:rFonts w:ascii="Calibri" w:hAnsi="Calibri" w:eastAsia="Calibri" w:cs="Calibri" w:hint="eastAsia"/>
+        </w:rPr>
+        <w:t xml:space="preserve"> </w:t>
+      </w:r>
+      <w:r>
+        <w:rPr>
+          <w:rFonts w:ascii="Calibri" w:hAnsi="Calibri" w:eastAsia="Calibri" w:cs="Calibri" w:hint="eastAsia"/>
+        </w:rPr>
+        <w:t xml:space="preserve">supplement records the full provider</w:t>
+      </w:r>
+      <w:r>
+        <w:rPr>
+          <w:rFonts w:ascii="Calibri" w:hAnsi="Calibri" w:eastAsia="Calibri" w:cs="Calibri" w:hint="eastAsia"/>
+        </w:rPr>
+        <w:t xml:space="preserve"> </w:t>
+      </w:r>
+      <w:r>
+        <w:rPr>
+          <w:rFonts w:ascii="Calibri" w:hAnsi="Calibri" w:eastAsia="Calibri" w:cs="Calibri" w:hint="eastAsia"/>
+        </w:rPr>
+        <w:t xml:space="preserve">digest, exact authority states, and the closed claim mapping. It is part of the</w:t>
+      </w:r>
+      <w:r>
+        <w:rPr>
+          <w:rFonts w:ascii="Calibri" w:hAnsi="Calibri" w:eastAsia="Calibri" w:cs="Calibri" w:hint="eastAsia"/>
+        </w:rPr>
+        <w:t xml:space="preserve"> </w:t>
+      </w:r>
+      <w:r>
+        <w:rPr>
+          <w:rFonts w:ascii="Calibri" w:hAnsi="Calibri" w:eastAsia="Calibri" w:cs="Calibri" w:hint="eastAsia"/>
+        </w:rPr>
+        <w:t xml:space="preserve">circulation packet rather than an alternative source of empirical results.</w:t>
+      </w:r>
+    </w:p>
     <w:bookmarkEnd w:id="41"/>
     <w:bookmarkStart w:id="42" w:name="synthetic-and-ordered-event-costs"/>
     <w:p>

</xml_diff>

<commit_message>
paper: record follow-up terminal no-go
</commit_message>
<xml_diff>
--- a/docs/paper/manuscript-draft.docx
+++ b/docs/paper/manuscript-draft.docx
@@ -2,7 +2,7 @@
 <file path=word/document.xml><?xml version="1.0" encoding="utf-8"?>
 <w:document xmlns:w="http://schemas.openxmlformats.org/wordprocessingml/2006/main" xmlns:m="http://schemas.openxmlformats.org/officeDocument/2006/math" xmlns:r="http://schemas.openxmlformats.org/officeDocument/2006/relationships" xmlns:o="urn:schemas-microsoft-com:office:office" xmlns:v="urn:schemas-microsoft-com:vml" xmlns:w10="urn:schemas-microsoft-com:office:word" xmlns:a="http://schemas.openxmlformats.org/drawingml/2006/main" xmlns:pic="http://schemas.openxmlformats.org/drawingml/2006/picture" xmlns:wp="http://schemas.openxmlformats.org/drawingml/2006/wordprocessingDrawing">
   <w:body>
-    <w:bookmarkStart w:id="105" w:name="X8c1a715672b91a2a57821cca8d271555e82f7d1"/>
+    <w:bookmarkStart w:id="106" w:name="X8c1a715672b91a2a57821cca8d271555e82f7d1"/>
     <w:p>
       <w:pPr>
         <w:pStyle w:val="RouteCKicker"/>
@@ -51,55 +51,55 @@
         <w:rPr>
           <w:rFonts w:ascii="Calibri" w:hAnsi="Calibri" w:eastAsia="Calibri" w:cs="Calibri" w:hint="eastAsia"/>
         </w:rPr>
-        <w:t xml:space="preserve">Route C methods/boundary working draft. The frozen</w:t>
-      </w:r>
-      <w:r>
-        <w:rPr>
-          <w:rFonts w:ascii="Calibri" w:hAnsi="Calibri" w:eastAsia="Calibri" w:cs="Calibri" w:hint="eastAsia"/>
-        </w:rPr>
-        <w:t xml:space="preserve"> </w:t>
-      </w:r>
-      <w:r>
-        <w:rPr>
-          <w:rFonts w:ascii="Calibri" w:hAnsi="Calibri" w:eastAsia="Calibri" w:cs="Calibri" w:hint="eastAsia"/>
-        </w:rPr>
-        <w:t xml:space="preserve">engineering lineage is complete, but the one-shot qualification selected the</w:t>
-      </w:r>
-      <w:r>
-        <w:rPr>
-          <w:rFonts w:ascii="Calibri" w:hAnsi="Calibri" w:eastAsia="Calibri" w:cs="Calibri" w:hint="eastAsia"/>
-        </w:rPr>
-        <w:t xml:space="preserve"> </w:t>
-      </w:r>
-      <w:r>
-        <w:rPr>
-          <w:rFonts w:ascii="Calibri" w:hAnsi="Calibri" w:eastAsia="Calibri" w:cs="Calibri" w:hint="eastAsia"/>
-        </w:rPr>
-        <w:t xml:space="preserve">preregistered stop route. No comparative performance, complete-reference,</w:t>
-      </w:r>
-      <w:r>
-        <w:rPr>
-          <w:rFonts w:ascii="Calibri" w:hAnsi="Calibri" w:eastAsia="Calibri" w:cs="Calibri" w:hint="eastAsia"/>
-        </w:rPr>
-        <w:t xml:space="preserve"> </w:t>
-      </w:r>
-      <w:r>
-        <w:rPr>
-          <w:rFonts w:ascii="Calibri" w:hAnsi="Calibri" w:eastAsia="Calibri" w:cs="Calibri" w:hint="eastAsia"/>
-        </w:rPr>
-        <w:t xml:space="preserve">security, or end-to-end claim is released. Evidence status last synchronized:</w:t>
-      </w:r>
-      <w:r>
-        <w:rPr>
-          <w:rFonts w:ascii="Calibri" w:hAnsi="Calibri" w:eastAsia="Calibri" w:cs="Calibri" w:hint="eastAsia"/>
-        </w:rPr>
-        <w:t xml:space="preserve"> </w:t>
-      </w:r>
-      <w:r>
-        <w:rPr>
-          <w:rFonts w:ascii="Calibri" w:hAnsi="Calibri" w:eastAsia="Calibri" w:cs="Calibri" w:hint="eastAsia"/>
-        </w:rPr>
-        <w:t xml:space="preserve">2026-08-30.</w:t>
+        <w:t xml:space="preserve">Route C methods/boundary working draft. The primary</w:t>
+      </w:r>
+      <w:r>
+        <w:rPr>
+          <w:rFonts w:ascii="Calibri" w:hAnsi="Calibri" w:eastAsia="Calibri" w:cs="Calibri" w:hint="eastAsia"/>
+        </w:rPr>
+        <w:t xml:space="preserve"> </w:t>
+      </w:r>
+      <w:r>
+        <w:rPr>
+          <w:rFonts w:ascii="Calibri" w:hAnsi="Calibri" w:eastAsia="Calibri" w:cs="Calibri" w:hint="eastAsia"/>
+        </w:rPr>
+        <w:t xml:space="preserve">one-shot qualification and a later, separately preregistered follow-up both</w:t>
+      </w:r>
+      <w:r>
+        <w:rPr>
+          <w:rFonts w:ascii="Calibri" w:hAnsi="Calibri" w:eastAsia="Calibri" w:cs="Calibri" w:hint="eastAsia"/>
+        </w:rPr>
+        <w:t xml:space="preserve"> </w:t>
+      </w:r>
+      <w:r>
+        <w:rPr>
+          <w:rFonts w:ascii="Calibri" w:hAnsi="Calibri" w:eastAsia="Calibri" w:cs="Calibri" w:hint="eastAsia"/>
+        </w:rPr>
+        <w:t xml:space="preserve">selected their frozen stop routes. No comparative performance,</w:t>
+      </w:r>
+      <w:r>
+        <w:rPr>
+          <w:rFonts w:ascii="Calibri" w:hAnsi="Calibri" w:eastAsia="Calibri" w:cs="Calibri" w:hint="eastAsia"/>
+        </w:rPr>
+        <w:t xml:space="preserve"> </w:t>
+      </w:r>
+      <w:r>
+        <w:rPr>
+          <w:rFonts w:ascii="Calibri" w:hAnsi="Calibri" w:eastAsia="Calibri" w:cs="Calibri" w:hint="eastAsia"/>
+        </w:rPr>
+        <w:t xml:space="preserve">complete-reference, security, or end-to-end claim is released. Evidence</w:t>
+      </w:r>
+      <w:r>
+        <w:rPr>
+          <w:rFonts w:ascii="Calibri" w:hAnsi="Calibri" w:eastAsia="Calibri" w:cs="Calibri" w:hint="eastAsia"/>
+        </w:rPr>
+        <w:t xml:space="preserve"> </w:t>
+      </w:r>
+      <w:r>
+        <w:rPr>
+          <w:rFonts w:ascii="Calibri" w:hAnsi="Calibri" w:eastAsia="Calibri" w:cs="Calibri" w:hint="eastAsia"/>
+        </w:rPr>
+        <w:t xml:space="preserve">status last synchronized: 2026-08-31.</w:t>
       </w:r>
     </w:p>
     <w:bookmarkStart w:id="9" w:name="abstract"/>
@@ -407,91 +407,151 @@
         <w:rPr>
           <w:rFonts w:ascii="Calibri" w:hAnsi="Calibri" w:eastAsia="Calibri" w:cs="Calibri" w:hint="eastAsia"/>
         </w:rPr>
-        <w:t xml:space="preserve">The sole preregistered, permanently non-admissible qualification did not reach</w:t>
-      </w:r>
-      <w:r>
-        <w:rPr>
-          <w:rFonts w:ascii="Calibri" w:hAnsi="Calibri" w:eastAsia="Calibri" w:cs="Calibri" w:hint="eastAsia"/>
-        </w:rPr>
-        <w:t xml:space="preserve"> </w:t>
-      </w:r>
-      <w:r>
-        <w:rPr>
-          <w:rFonts w:ascii="Calibri" w:hAnsi="Calibri" w:eastAsia="Calibri" w:cs="Calibri" w:hint="eastAsia"/>
-        </w:rPr>
-        <w:t xml:space="preserve">its combined guard within the frozen computational deadline. The external</w:t>
-      </w:r>
-      <w:r>
-        <w:rPr>
-          <w:rFonts w:ascii="Calibri" w:hAnsi="Calibri" w:eastAsia="Calibri" w:cs="Calibri" w:hint="eastAsia"/>
-        </w:rPr>
-        <w:t xml:space="preserve"> </w:t>
-      </w:r>
-      <w:r>
-        <w:rPr>
-          <w:rFonts w:ascii="Calibri" w:hAnsi="Calibri" w:eastAsia="Calibri" w:cs="Calibri" w:hint="eastAsia"/>
-        </w:rPr>
-        <w:t xml:space="preserve">controller cancelled only that exact run, no formal-dispatch capability was</w:t>
-      </w:r>
-      <w:r>
-        <w:rPr>
-          <w:rFonts w:ascii="Calibri" w:hAnsi="Calibri" w:eastAsia="Calibri" w:cs="Calibri" w:hint="eastAsia"/>
-        </w:rPr>
-        <w:t xml:space="preserve"> </w:t>
-      </w:r>
-      <w:r>
-        <w:rPr>
-          <w:rFonts w:ascii="Calibri" w:hAnsi="Calibri" w:eastAsia="Calibri" w:cs="Calibri" w:hint="eastAsia"/>
-        </w:rPr>
-        <w:t xml:space="preserve">created, and the acquisition and 16-unit formal campaign were therefore not</w:t>
-      </w:r>
-      <w:r>
-        <w:rPr>
-          <w:rFonts w:ascii="Calibri" w:hAnsi="Calibri" w:eastAsia="Calibri" w:cs="Calibri" w:hint="eastAsia"/>
-        </w:rPr>
-        <w:t xml:space="preserve"> </w:t>
-      </w:r>
-      <w:r>
-        <w:rPr>
-          <w:rFonts w:ascii="Calibri" w:hAnsi="Calibri" w:eastAsia="Calibri" w:cs="Calibri" w:hint="eastAsia"/>
-        </w:rPr>
-        <w:t xml:space="preserve">started. We report the protocol, its definition-level functional obligations,</w:t>
-      </w:r>
-      <w:r>
-        <w:rPr>
-          <w:rFonts w:ascii="Calibri" w:hAnsi="Calibri" w:eastAsia="Calibri" w:cs="Calibri" w:hint="eastAsia"/>
-        </w:rPr>
-        <w:t xml:space="preserve"> </w:t>
-      </w:r>
-      <w:r>
-        <w:rPr>
-          <w:rFonts w:ascii="Calibri" w:hAnsi="Calibri" w:eastAsia="Calibri" w:cs="Calibri" w:hint="eastAsia"/>
-        </w:rPr>
-        <w:t xml:space="preserve">the source/evidence separation, and this fail-closed evaluation boundary. We do</w:t>
-      </w:r>
-      <w:r>
-        <w:rPr>
-          <w:rFonts w:ascii="Calibri" w:hAnsi="Calibri" w:eastAsia="Calibri" w:cs="Calibri" w:hint="eastAsia"/>
-        </w:rPr>
-        <w:t xml:space="preserve"> </w:t>
-      </w:r>
-      <w:r>
-        <w:rPr>
-          <w:rFonts w:ascii="Calibri" w:hAnsi="Calibri" w:eastAsia="Calibri" w:cs="Calibri" w:hint="eastAsia"/>
-        </w:rPr>
-        <w:t xml:space="preserve">not convert partial qualification execution into strategy-cost or native-</w:t>
-      </w:r>
-      <w:r>
-        <w:rPr>
-          <w:rFonts w:ascii="Calibri" w:hAnsi="Calibri" w:eastAsia="Calibri" w:cs="Calibri" w:hint="eastAsia"/>
-        </w:rPr>
-        <w:t xml:space="preserve"> </w:t>
-      </w:r>
-      <w:r>
-        <w:rPr>
-          <w:rFonts w:ascii="Calibri" w:hAnsi="Calibri" w:eastAsia="Calibri" w:cs="Calibri" w:hint="eastAsia"/>
-        </w:rPr>
-        <w:t xml:space="preserve">OpenFHE performance evidence.</w:t>
+        <w:t xml:space="preserve">The primary preregistered, permanently non-admissible qualification did not</w:t>
+      </w:r>
+      <w:r>
+        <w:rPr>
+          <w:rFonts w:ascii="Calibri" w:hAnsi="Calibri" w:eastAsia="Calibri" w:cs="Calibri" w:hint="eastAsia"/>
+        </w:rPr>
+        <w:t xml:space="preserve"> </w:t>
+      </w:r>
+      <w:r>
+        <w:rPr>
+          <w:rFonts w:ascii="Calibri" w:hAnsi="Calibri" w:eastAsia="Calibri" w:cs="Calibri" w:hint="eastAsia"/>
+        </w:rPr>
+        <w:t xml:space="preserve">reach its combined guard within the frozen computational deadline. A later,</w:t>
+      </w:r>
+      <w:r>
+        <w:rPr>
+          <w:rFonts w:ascii="Calibri" w:hAnsi="Calibri" w:eastAsia="Calibri" w:cs="Calibri" w:hint="eastAsia"/>
+        </w:rPr>
+        <w:t xml:space="preserve"> </w:t>
+      </w:r>
+      <w:r>
+        <w:rPr>
+          <w:rFonts w:ascii="Calibri" w:hAnsi="Calibri" w:eastAsia="Calibri" w:cs="Calibri" w:hint="eastAsia"/>
+        </w:rPr>
+        <w:t xml:space="preserve">separately preregistered follow-up passed five exact-source authority-false</w:t>
+      </w:r>
+      <w:r>
+        <w:rPr>
+          <w:rFonts w:ascii="Calibri" w:hAnsi="Calibri" w:eastAsia="Calibri" w:cs="Calibri" w:hint="eastAsia"/>
+        </w:rPr>
+        <w:t xml:space="preserve"> </w:t>
+      </w:r>
+      <w:r>
+        <w:rPr>
+          <w:rFonts w:ascii="Calibri" w:hAnsi="Calibri" w:eastAsia="Calibri" w:cs="Calibri" w:hint="eastAsia"/>
+        </w:rPr>
+        <w:t xml:space="preserve">controls, but its sole provider run was cancelled during hosted-runner setup</w:t>
+      </w:r>
+      <w:r>
+        <w:rPr>
+          <w:rFonts w:ascii="Calibri" w:hAnsi="Calibri" w:eastAsia="Calibri" w:cs="Calibri" w:hint="eastAsia"/>
+        </w:rPr>
+        <w:t xml:space="preserve"> </w:t>
+      </w:r>
+      <w:r>
+        <w:rPr>
+          <w:rFonts w:ascii="Calibri" w:hAnsi="Calibri" w:eastAsia="Calibri" w:cs="Calibri" w:hint="eastAsia"/>
+        </w:rPr>
+        <w:t xml:space="preserve">after the external controller could not establish the watcher-admission</w:t>
+      </w:r>
+      <w:r>
+        <w:rPr>
+          <w:rFonts w:ascii="Calibri" w:hAnsi="Calibri" w:eastAsia="Calibri" w:cs="Calibri" w:hint="eastAsia"/>
+        </w:rPr>
+        <w:t xml:space="preserve"> </w:t>
+      </w:r>
+      <w:r>
+        <w:rPr>
+          <w:rFonts w:ascii="Calibri" w:hAnsi="Calibri" w:eastAsia="Calibri" w:cs="Calibri" w:hint="eastAsia"/>
+        </w:rPr>
+        <w:t xml:space="preserve">binding. No repository checkout, registered-seed step, scientific stage, or</w:t>
+      </w:r>
+      <w:r>
+        <w:rPr>
+          <w:rFonts w:ascii="Calibri" w:hAnsi="Calibri" w:eastAsia="Calibri" w:cs="Calibri" w:hint="eastAsia"/>
+        </w:rPr>
+        <w:t xml:space="preserve"> </w:t>
+      </w:r>
+      <w:r>
+        <w:rPr>
+          <w:rFonts w:ascii="Calibri" w:hAnsi="Calibri" w:eastAsia="Calibri" w:cs="Calibri" w:hint="eastAsia"/>
+        </w:rPr>
+        <w:t xml:space="preserve">artifact occurred. Under the frozen one-shot rules, both paths terminated</w:t>
+      </w:r>
+      <w:r>
+        <w:rPr>
+          <w:rFonts w:ascii="Calibri" w:hAnsi="Calibri" w:eastAsia="Calibri" w:cs="Calibri" w:hint="eastAsia"/>
+        </w:rPr>
+        <w:t xml:space="preserve"> </w:t>
+      </w:r>
+      <w:r>
+        <w:rPr>
+          <w:rFonts w:ascii="Calibri" w:hAnsi="Calibri" w:eastAsia="Calibri" w:cs="Calibri" w:hint="eastAsia"/>
+        </w:rPr>
+        <w:t xml:space="preserve">without a formal-dispatch capability; the acquisition and 16-unit formal</w:t>
+      </w:r>
+      <w:r>
+        <w:rPr>
+          <w:rFonts w:ascii="Calibri" w:hAnsi="Calibri" w:eastAsia="Calibri" w:cs="Calibri" w:hint="eastAsia"/>
+        </w:rPr>
+        <w:t xml:space="preserve"> </w:t>
+      </w:r>
+      <w:r>
+        <w:rPr>
+          <w:rFonts w:ascii="Calibri" w:hAnsi="Calibri" w:eastAsia="Calibri" w:cs="Calibri" w:hint="eastAsia"/>
+        </w:rPr>
+        <w:t xml:space="preserve">campaign were not started. We report the protocol, its definition-level</w:t>
+      </w:r>
+      <w:r>
+        <w:rPr>
+          <w:rFonts w:ascii="Calibri" w:hAnsi="Calibri" w:eastAsia="Calibri" w:cs="Calibri" w:hint="eastAsia"/>
+        </w:rPr>
+        <w:t xml:space="preserve"> </w:t>
+      </w:r>
+      <w:r>
+        <w:rPr>
+          <w:rFonts w:ascii="Calibri" w:hAnsi="Calibri" w:eastAsia="Calibri" w:cs="Calibri" w:hint="eastAsia"/>
+        </w:rPr>
+        <w:t xml:space="preserve">functional obligations, the source/evidence separation, and these fail-closed</w:t>
+      </w:r>
+      <w:r>
+        <w:rPr>
+          <w:rFonts w:ascii="Calibri" w:hAnsi="Calibri" w:eastAsia="Calibri" w:cs="Calibri" w:hint="eastAsia"/>
+        </w:rPr>
+        <w:t xml:space="preserve"> </w:t>
+      </w:r>
+      <w:r>
+        <w:rPr>
+          <w:rFonts w:ascii="Calibri" w:hAnsi="Calibri" w:eastAsia="Calibri" w:cs="Calibri" w:hint="eastAsia"/>
+        </w:rPr>
+        <w:t xml:space="preserve">evaluation boundaries. We do not convert partial qualification execution,</w:t>
+      </w:r>
+      <w:r>
+        <w:rPr>
+          <w:rFonts w:ascii="Calibri" w:hAnsi="Calibri" w:eastAsia="Calibri" w:cs="Calibri" w:hint="eastAsia"/>
+        </w:rPr>
+        <w:t xml:space="preserve"> </w:t>
+      </w:r>
+      <w:r>
+        <w:rPr>
+          <w:rFonts w:ascii="Calibri" w:hAnsi="Calibri" w:eastAsia="Calibri" w:cs="Calibri" w:hint="eastAsia"/>
+        </w:rPr>
+        <w:t xml:space="preserve">runner setup, or prerequisite controls into strategy-cost or native-OpenFHE</w:t>
+      </w:r>
+      <w:r>
+        <w:rPr>
+          <w:rFonts w:ascii="Calibri" w:hAnsi="Calibri" w:eastAsia="Calibri" w:cs="Calibri" w:hint="eastAsia"/>
+        </w:rPr>
+        <w:t xml:space="preserve"> </w:t>
+      </w:r>
+      <w:r>
+        <w:rPr>
+          <w:rFonts w:ascii="Calibri" w:hAnsi="Calibri" w:eastAsia="Calibri" w:cs="Calibri" w:hint="eastAsia"/>
+        </w:rPr>
+        <w:t xml:space="preserve">performance evidence.</w:t>
       </w:r>
     </w:p>
     <w:p>
@@ -10580,6 +10640,7 @@
     <w:p>
       <w:pPr>
         <w:pStyle w:val="BodyText"/>
+        <w:spacing w:before="160"/>
       </w:pPr>
       <w:r>
         <w:rPr>
@@ -10982,6 +11043,163 @@
           <w:rFonts w:ascii="Calibri" w:hAnsi="Calibri" w:eastAsia="Calibri" w:cs="Calibri" w:hint="eastAsia"/>
         </w:rPr>
         <w:t xml:space="preserve">evidence for a maintenance strategy.</w:t>
+      </w:r>
+    </w:p>
+    <w:p>
+      <w:pPr>
+        <w:pStyle w:val="BodyText"/>
+      </w:pPr>
+      <w:r>
+        <w:rPr>
+          <w:rFonts w:ascii="Calibri" w:hAnsi="Calibri" w:eastAsia="Calibri" w:cs="Calibri" w:hint="eastAsia"/>
+        </w:rPr>
+        <w:t xml:space="preserve">A later, separately preregistered follow-up repaired a pre-dispatch capability-</w:t>
+      </w:r>
+      <w:r>
+        <w:rPr>
+          <w:rFonts w:ascii="Calibri" w:hAnsi="Calibri" w:eastAsia="Calibri" w:cs="Calibri" w:hint="eastAsia"/>
+        </w:rPr>
+        <w:t xml:space="preserve"> </w:t>
+      </w:r>
+      <w:r>
+        <w:rPr>
+          <w:rFonts w:ascii="Calibri" w:hAnsi="Calibri" w:eastAsia="Calibri" w:cs="Calibri" w:hint="eastAsia"/>
+        </w:rPr>
+        <w:t xml:space="preserve">lease defect without changing the estimand, resource thresholds, or scientific</w:t>
+      </w:r>
+      <w:r>
+        <w:rPr>
+          <w:rFonts w:ascii="Calibri" w:hAnsi="Calibri" w:eastAsia="Calibri" w:cs="Calibri" w:hint="eastAsia"/>
+        </w:rPr>
+        <w:t xml:space="preserve"> </w:t>
+      </w:r>
+      <w:r>
+        <w:rPr>
+          <w:rFonts w:ascii="Calibri" w:hAnsi="Calibri" w:eastAsia="Calibri" w:cs="Calibri" w:hint="eastAsia"/>
+        </w:rPr>
+        <w:t xml:space="preserve">matrix. Its replacement experiment source S1 was</w:t>
+      </w:r>
+      <w:r>
+        <w:rPr>
+          <w:rFonts w:ascii="Calibri" w:hAnsi="Calibri" w:eastAsia="Calibri" w:cs="Calibri" w:hint="eastAsia"/>
+        </w:rPr>
+        <w:t xml:space="preserve"> </w:t>
+      </w:r>
+      <w:r>
+        <w:rPr>
+          <w:rStyle w:val="VerbatimChar"/>
+          <w:rFonts w:ascii="Calibri" w:hAnsi="Calibri" w:eastAsia="Calibri" w:cs="Calibri" w:hint="eastAsia"/>
+        </w:rPr>
+        <w:t xml:space="preserve">f8d89d6f98f289dc2e0c3414f7b4ed59b5d30f52</w:t>
+      </w:r>
+      <w:r>
+        <w:rPr>
+          <w:rFonts w:ascii="Calibri" w:hAnsi="Calibri" w:eastAsia="Calibri" w:cs="Calibri" w:hint="eastAsia"/>
+        </w:rPr>
+        <w:t xml:space="preserve">, and its direct-child, data-only S2</w:t>
+      </w:r>
+      <w:r>
+        <w:rPr>
+          <w:rFonts w:ascii="Calibri" w:hAnsi="Calibri" w:eastAsia="Calibri" w:cs="Calibri" w:hint="eastAsia"/>
+        </w:rPr>
+        <w:t xml:space="preserve"> </w:t>
+      </w:r>
+      <w:r>
+        <w:rPr>
+          <w:rFonts w:ascii="Calibri" w:hAnsi="Calibri" w:eastAsia="Calibri" w:cs="Calibri" w:hint="eastAsia"/>
+        </w:rPr>
+        <w:t xml:space="preserve">was</w:t>
+      </w:r>
+      <w:r>
+        <w:rPr>
+          <w:rFonts w:ascii="Calibri" w:hAnsi="Calibri" w:eastAsia="Calibri" w:cs="Calibri" w:hint="eastAsia"/>
+        </w:rPr>
+        <w:t xml:space="preserve"> </w:t>
+      </w:r>
+      <w:r>
+        <w:rPr>
+          <w:rStyle w:val="VerbatimChar"/>
+          <w:rFonts w:ascii="Calibri" w:hAnsi="Calibri" w:eastAsia="Calibri" w:cs="Calibri" w:hint="eastAsia"/>
+        </w:rPr>
+        <w:t xml:space="preserve">e1e488f177dc8a469c6132a29537b041fbf1430b</w:t>
+      </w:r>
+      <w:r>
+        <w:rPr>
+          <w:rFonts w:ascii="Calibri" w:hAnsi="Calibri" w:eastAsia="Calibri" w:cs="Calibri" w:hint="eastAsia"/>
+        </w:rPr>
+        <w:t xml:space="preserve">. Exact-head CI, PRE-S1,</w:t>
+      </w:r>
+      <w:r>
+        <w:rPr>
+          <w:rFonts w:ascii="Calibri" w:hAnsi="Calibri" w:eastAsia="Calibri" w:cs="Calibri" w:hint="eastAsia"/>
+        </w:rPr>
+        <w:t xml:space="preserve"> </w:t>
+      </w:r>
+      <w:r>
+        <w:rPr>
+          <w:rFonts w:ascii="Calibri" w:hAnsi="Calibri" w:eastAsia="Calibri" w:cs="Calibri" w:hint="eastAsia"/>
+        </w:rPr>
+        <w:t xml:space="preserve">descriptive registration, source-anchor, and independent-review controls all</w:t>
+      </w:r>
+      <w:r>
+        <w:rPr>
+          <w:rFonts w:ascii="Calibri" w:hAnsi="Calibri" w:eastAsia="Calibri" w:cs="Calibri" w:hint="eastAsia"/>
+        </w:rPr>
+        <w:t xml:space="preserve"> </w:t>
+      </w:r>
+      <w:r>
+        <w:rPr>
+          <w:rFonts w:ascii="Calibri" w:hAnsi="Calibri" w:eastAsia="Calibri" w:cs="Calibri" w:hint="eastAsia"/>
+        </w:rPr>
+        <w:t xml:space="preserve">passed at exact S2 with authority false. The sole subsequent qualification run</w:t>
+      </w:r>
+      <w:r>
+        <w:rPr>
+          <w:rFonts w:ascii="Calibri" w:hAnsi="Calibri" w:eastAsia="Calibri" w:cs="Calibri" w:hint="eastAsia"/>
+        </w:rPr>
+        <w:t xml:space="preserve"> </w:t>
+      </w:r>
+      <w:r>
+        <w:rPr>
+          <w:rFonts w:ascii="Calibri" w:hAnsi="Calibri" w:eastAsia="Calibri" w:cs="Calibri" w:hint="eastAsia"/>
+        </w:rPr>
+        <w:t xml:space="preserve">was cancelled before checkout or seed admission when the controller could not</w:t>
+      </w:r>
+      <w:r>
+        <w:rPr>
+          <w:rFonts w:ascii="Calibri" w:hAnsi="Calibri" w:eastAsia="Calibri" w:cs="Calibri" w:hint="eastAsia"/>
+        </w:rPr>
+        <w:t xml:space="preserve"> </w:t>
+      </w:r>
+      <w:r>
+        <w:rPr>
+          <w:rFonts w:ascii="Calibri" w:hAnsi="Calibri" w:eastAsia="Calibri" w:cs="Calibri" w:hint="eastAsia"/>
+        </w:rPr>
+        <w:t xml:space="preserve">install its watcher-admission binding. It produced zero artifacts and no</w:t>
+      </w:r>
+      <w:r>
+        <w:rPr>
+          <w:rFonts w:ascii="Calibri" w:hAnsi="Calibri" w:eastAsia="Calibri" w:cs="Calibri" w:hint="eastAsia"/>
+        </w:rPr>
+        <w:t xml:space="preserve"> </w:t>
+      </w:r>
+      <w:r>
+        <w:rPr>
+          <w:rFonts w:ascii="Calibri" w:hAnsi="Calibri" w:eastAsia="Calibri" w:cs="Calibri" w:hint="eastAsia"/>
+        </w:rPr>
+        <w:t xml:space="preserve">scientific observation. The frozen one-shot rule therefore closed the follow-up</w:t>
+      </w:r>
+      <w:r>
+        <w:rPr>
+          <w:rFonts w:ascii="Calibri" w:hAnsi="Calibri" w:eastAsia="Calibri" w:cs="Calibri" w:hint="eastAsia"/>
+        </w:rPr>
+        <w:t xml:space="preserve"> </w:t>
+      </w:r>
+      <w:r>
+        <w:rPr>
+          <w:rFonts w:ascii="Calibri" w:hAnsi="Calibri" w:eastAsia="Calibri" w:cs="Calibri" w:hint="eastAsia"/>
+        </w:rPr>
+        <w:t xml:space="preserve">as terminal NO-GO and barred a repaired-lineage rerun.</w:t>
       </w:r>
     </w:p>
     <w:p>
@@ -11076,31 +11294,43 @@
         <w:rPr>
           <w:rFonts w:ascii="Calibri" w:hAnsi="Calibri" w:eastAsia="Calibri" w:cs="Calibri" w:hint="eastAsia"/>
         </w:rPr>
-        <w:t xml:space="preserve">protocol. Because qualification failed, none of the acquisitions, formal cells,</w:t>
-      </w:r>
-      <w:r>
-        <w:rPr>
-          <w:rFonts w:ascii="Calibri" w:hAnsi="Calibri" w:eastAsia="Calibri" w:cs="Calibri" w:hint="eastAsia"/>
-        </w:rPr>
-        <w:t xml:space="preserve"> </w:t>
-      </w:r>
-      <w:r>
-        <w:rPr>
-          <w:rFonts w:ascii="Calibri" w:hAnsi="Calibri" w:eastAsia="Calibri" w:cs="Calibri" w:hint="eastAsia"/>
-        </w:rPr>
-        <w:t xml:space="preserve">native cases, measurements, or reports specified below occurred. The protocol</w:t>
-      </w:r>
-      <w:r>
-        <w:rPr>
-          <w:rFonts w:ascii="Calibri" w:hAnsi="Calibri" w:eastAsia="Calibri" w:cs="Calibri" w:hint="eastAsia"/>
-        </w:rPr>
-        <w:t xml:space="preserve"> </w:t>
-      </w:r>
-      <w:r>
-        <w:rPr>
-          <w:rFonts w:ascii="Calibri" w:hAnsi="Calibri" w:eastAsia="Calibri" w:cs="Calibri" w:hint="eastAsia"/>
-        </w:rPr>
-        <w:t xml:space="preserve">was frozen before any formal artifact could be inspected. It specified no</w:t>
+        <w:t xml:space="preserve">protocol. Because neither qualification path produced a GO, none of the</w:t>
+      </w:r>
+      <w:r>
+        <w:rPr>
+          <w:rFonts w:ascii="Calibri" w:hAnsi="Calibri" w:eastAsia="Calibri" w:cs="Calibri" w:hint="eastAsia"/>
+        </w:rPr>
+        <w:t xml:space="preserve"> </w:t>
+      </w:r>
+      <w:r>
+        <w:rPr>
+          <w:rFonts w:ascii="Calibri" w:hAnsi="Calibri" w:eastAsia="Calibri" w:cs="Calibri" w:hint="eastAsia"/>
+        </w:rPr>
+        <w:t xml:space="preserve">acquisitions, formal cells, native cases, measurements, or reports specified</w:t>
+      </w:r>
+      <w:r>
+        <w:rPr>
+          <w:rFonts w:ascii="Calibri" w:hAnsi="Calibri" w:eastAsia="Calibri" w:cs="Calibri" w:hint="eastAsia"/>
+        </w:rPr>
+        <w:t xml:space="preserve"> </w:t>
+      </w:r>
+      <w:r>
+        <w:rPr>
+          <w:rFonts w:ascii="Calibri" w:hAnsi="Calibri" w:eastAsia="Calibri" w:cs="Calibri" w:hint="eastAsia"/>
+        </w:rPr>
+        <w:t xml:space="preserve">below occurred. The protocol was frozen before any formal artifact could be</w:t>
+      </w:r>
+      <w:r>
+        <w:rPr>
+          <w:rFonts w:ascii="Calibri" w:hAnsi="Calibri" w:eastAsia="Calibri" w:cs="Calibri" w:hint="eastAsia"/>
+        </w:rPr>
+        <w:t xml:space="preserve"> </w:t>
+      </w:r>
+      <w:r>
+        <w:rPr>
+          <w:rFonts w:ascii="Calibri" w:hAnsi="Calibri" w:eastAsia="Calibri" w:cs="Calibri" w:hint="eastAsia"/>
+        </w:rPr>
+        <w:t xml:space="preserve">inspected. It specified no</w:t>
       </w:r>
       <w:r>
         <w:rPr>
@@ -14890,7 +15120,7 @@
     </w:p>
     <w:bookmarkEnd w:id="36"/>
     <w:bookmarkEnd w:id="37"/>
-    <w:bookmarkStart w:id="45" w:name="evidence-outcome"/>
+    <w:bookmarkStart w:id="46" w:name="evidence-outcome"/>
     <w:p>
       <w:pPr>
         <w:pStyle w:val="Heading1"/>
@@ -15195,7 +15425,7 @@
         <w:rPr>
           <w:rFonts w:ascii="Calibri" w:hAnsi="Calibri" w:eastAsia="Calibri" w:cs="Calibri" w:hint="eastAsia"/>
         </w:rPr>
-        <w:t xml:space="preserve">Figure 2. Exact source freeze, one-shot qualification stop, and the resulting Route C evidence boundary.</w:t>
+        <w:t xml:space="preserve">Figure 2. Primary exact-source freeze, one-shot qualification stop, and the resulting Route C evidence boundary; the later follow-up is recorded separately in Section 7.5.</w:t>
       </w:r>
     </w:p>
     <w:p>
@@ -15735,6 +15965,246 @@
                 <w:rFonts w:ascii="Calibri" w:hAnsi="Calibri" w:eastAsia="Calibri" w:cs="Calibri" w:hint="eastAsia"/>
                 <w:sz w:val="18"/>
               </w:rPr>
+              <w:t xml:space="preserve">Follow-up controls</w:t>
+            </w:r>
+          </w:p>
+        </w:tc>
+        <w:tc>
+          <w:tcPr>
+            <w:tcW w:w="2200" w:type="dxa"/>
+            <w:tcMar>
+              <w:top w:w="80" w:type="dxa"/>
+              <w:start w:w="120" w:type="dxa"/>
+              <w:bottom w:w="80" w:type="dxa"/>
+              <w:end w:w="120" w:type="dxa"/>
+            </w:tcMar>
+            <w:vAlign w:val="center"/>
+          </w:tcPr>
+          <w:p>
+            <w:pPr>
+              <w:pStyle w:val="Compact"/>
+              <w:spacing w:before="0" w:after="60" w:line="259" w:lineRule="auto"/>
+              <w:jc w:val="left"/>
+            </w:pPr>
+            <w:r>
+              <w:rPr>
+                <w:rFonts w:ascii="Calibri" w:hAnsi="Calibri" w:eastAsia="Calibri" w:cs="Calibri" w:hint="eastAsia"/>
+                <w:sz w:val="18"/>
+              </w:rPr>
+              <w:t xml:space="preserve">Five fresh controls passed at follow-up S2</w:t>
+            </w:r>
+            <w:r>
+              <w:rPr>
+                <w:rFonts w:ascii="Calibri" w:hAnsi="Calibri" w:eastAsia="Calibri" w:cs="Calibri" w:hint="eastAsia"/>
+                <w:sz w:val="18"/>
+              </w:rPr>
+              <w:t xml:space="preserve"> </w:t>
+            </w:r>
+            <w:r>
+              <w:rPr>
+                <w:rStyle w:val="VerbatimChar"/>
+                <w:rFonts w:ascii="Calibri" w:hAnsi="Calibri" w:eastAsia="Calibri" w:cs="Calibri" w:hint="eastAsia"/>
+                <w:sz w:val="18"/>
+              </w:rPr>
+              <w:t xml:space="preserve">e1e488f…</w:t>
+            </w:r>
+            <w:r>
+              <w:rPr>
+                <w:rFonts w:ascii="Calibri" w:hAnsi="Calibri" w:eastAsia="Calibri" w:cs="Calibri" w:hint="eastAsia"/>
+                <w:sz w:val="18"/>
+              </w:rPr>
+              <w:t xml:space="preserve">, all authority false</w:t>
+            </w:r>
+          </w:p>
+        </w:tc>
+        <w:tc>
+          <w:tcPr>
+            <w:tcW w:w="2800" w:type="dxa"/>
+            <w:tcMar>
+              <w:top w:w="80" w:type="dxa"/>
+              <w:start w:w="120" w:type="dxa"/>
+              <w:bottom w:w="80" w:type="dxa"/>
+              <w:end w:w="120" w:type="dxa"/>
+            </w:tcMar>
+            <w:vAlign w:val="center"/>
+          </w:tcPr>
+          <w:p>
+            <w:pPr>
+              <w:pStyle w:val="Compact"/>
+              <w:spacing w:before="0" w:after="60" w:line="259" w:lineRule="auto"/>
+              <w:jc w:val="left"/>
+            </w:pPr>
+            <w:r>
+              <w:rPr>
+                <w:rFonts w:ascii="Calibri" w:hAnsi="Calibri" w:eastAsia="Calibri" w:cs="Calibri" w:hint="eastAsia"/>
+                <w:sz w:val="18"/>
+              </w:rPr>
+              <w:t xml:space="preserve">Exact follow-up source/anchor identity and prerequisite closure</w:t>
+            </w:r>
+          </w:p>
+        </w:tc>
+        <w:tc>
+          <w:tcPr>
+            <w:tcW w:w="2760" w:type="dxa"/>
+            <w:tcMar>
+              <w:top w:w="80" w:type="dxa"/>
+              <w:start w:w="120" w:type="dxa"/>
+              <w:bottom w:w="80" w:type="dxa"/>
+              <w:end w:w="120" w:type="dxa"/>
+            </w:tcMar>
+            <w:vAlign w:val="center"/>
+          </w:tcPr>
+          <w:p>
+            <w:pPr>
+              <w:pStyle w:val="Compact"/>
+              <w:spacing w:before="0" w:after="60" w:line="259" w:lineRule="auto"/>
+              <w:jc w:val="left"/>
+            </w:pPr>
+            <w:r>
+              <w:rPr>
+                <w:rFonts w:ascii="Calibri" w:hAnsi="Calibri" w:eastAsia="Calibri" w:cs="Calibri" w:hint="eastAsia"/>
+                <w:sz w:val="18"/>
+              </w:rPr>
+              <w:t xml:space="preserve">Qualification GO, formal authority, or scientific execution</w:t>
+            </w:r>
+          </w:p>
+        </w:tc>
+      </w:tr>
+      <w:tr>
+        <w:trPr>
+          <w:cantSplit w:val="1"/>
+        </w:trPr>
+        <w:tc>
+          <w:tcPr>
+            <w:tcW w:w="1600" w:type="dxa"/>
+            <w:tcMar>
+              <w:top w:w="80" w:type="dxa"/>
+              <w:start w:w="120" w:type="dxa"/>
+              <w:bottom w:w="80" w:type="dxa"/>
+              <w:end w:w="120" w:type="dxa"/>
+            </w:tcMar>
+            <w:vAlign w:val="center"/>
+          </w:tcPr>
+          <w:p>
+            <w:pPr>
+              <w:pStyle w:val="Compact"/>
+              <w:spacing w:before="0" w:after="60" w:line="259" w:lineRule="auto"/>
+              <w:jc w:val="left"/>
+            </w:pPr>
+            <w:r>
+              <w:rPr>
+                <w:rFonts w:ascii="Calibri" w:hAnsi="Calibri" w:eastAsia="Calibri" w:cs="Calibri" w:hint="eastAsia"/>
+                <w:sz w:val="18"/>
+              </w:rPr>
+              <w:t xml:space="preserve">Follow-up qualification</w:t>
+            </w:r>
+          </w:p>
+        </w:tc>
+        <w:tc>
+          <w:tcPr>
+            <w:tcW w:w="2200" w:type="dxa"/>
+            <w:tcMar>
+              <w:top w:w="80" w:type="dxa"/>
+              <w:start w:w="120" w:type="dxa"/>
+              <w:bottom w:w="80" w:type="dxa"/>
+              <w:end w:w="120" w:type="dxa"/>
+            </w:tcMar>
+            <w:vAlign w:val="center"/>
+          </w:tcPr>
+          <w:p>
+            <w:pPr>
+              <w:pStyle w:val="Compact"/>
+              <w:spacing w:before="0" w:after="60" w:line="259" w:lineRule="auto"/>
+              <w:jc w:val="left"/>
+            </w:pPr>
+            <w:r>
+              <w:rPr>
+                <w:rFonts w:ascii="Calibri" w:hAnsi="Calibri" w:eastAsia="Calibri" w:cs="Calibri" w:hint="eastAsia"/>
+                <w:sz w:val="18"/>
+              </w:rPr>
+              <w:t xml:space="preserve">One exact run was cancelled during hosted-runner setup before checkout or seed admission; zero artifacts</w:t>
+            </w:r>
+          </w:p>
+        </w:tc>
+        <w:tc>
+          <w:tcPr>
+            <w:tcW w:w="2800" w:type="dxa"/>
+            <w:tcMar>
+              <w:top w:w="80" w:type="dxa"/>
+              <w:start w:w="120" w:type="dxa"/>
+              <w:bottom w:w="80" w:type="dxa"/>
+              <w:end w:w="120" w:type="dxa"/>
+            </w:tcMar>
+            <w:vAlign w:val="center"/>
+          </w:tcPr>
+          <w:p>
+            <w:pPr>
+              <w:pStyle w:val="Compact"/>
+              <w:spacing w:before="0" w:after="60" w:line="259" w:lineRule="auto"/>
+              <w:jc w:val="left"/>
+            </w:pPr>
+            <w:r>
+              <w:rPr>
+                <w:rFonts w:ascii="Calibri" w:hAnsi="Calibri" w:eastAsia="Calibri" w:cs="Calibri" w:hint="eastAsia"/>
+                <w:sz w:val="18"/>
+              </w:rPr>
+              <w:t xml:space="preserve">Terminal one-shot disposition and a control-plane failure chronology</w:t>
+            </w:r>
+          </w:p>
+        </w:tc>
+        <w:tc>
+          <w:tcPr>
+            <w:tcW w:w="2760" w:type="dxa"/>
+            <w:tcMar>
+              <w:top w:w="80" w:type="dxa"/>
+              <w:start w:w="120" w:type="dxa"/>
+              <w:bottom w:w="80" w:type="dxa"/>
+              <w:end w:w="120" w:type="dxa"/>
+            </w:tcMar>
+            <w:vAlign w:val="center"/>
+          </w:tcPr>
+          <w:p>
+            <w:pPr>
+              <w:pStyle w:val="Compact"/>
+              <w:spacing w:before="0" w:after="60" w:line="259" w:lineRule="auto"/>
+              <w:jc w:val="left"/>
+            </w:pPr>
+            <w:r>
+              <w:rPr>
+                <w:rFonts w:ascii="Calibri" w:hAnsi="Calibri" w:eastAsia="Calibri" w:cs="Calibri" w:hint="eastAsia"/>
+                <w:sz w:val="18"/>
+              </w:rPr>
+              <w:t xml:space="preserve">Strategy behavior, performance, a 45/55-minute timeout, or a precise watcher/CAS root cause</w:t>
+            </w:r>
+          </w:p>
+        </w:tc>
+      </w:tr>
+      <w:tr>
+        <w:trPr>
+          <w:cantSplit w:val="1"/>
+        </w:trPr>
+        <w:tc>
+          <w:tcPr>
+            <w:tcW w:w="1600" w:type="dxa"/>
+            <w:tcMar>
+              <w:top w:w="80" w:type="dxa"/>
+              <w:start w:w="120" w:type="dxa"/>
+              <w:bottom w:w="80" w:type="dxa"/>
+              <w:end w:w="120" w:type="dxa"/>
+            </w:tcMar>
+            <w:vAlign w:val="center"/>
+          </w:tcPr>
+          <w:p>
+            <w:pPr>
+              <w:pStyle w:val="Compact"/>
+              <w:spacing w:before="0" w:after="60" w:line="259" w:lineRule="auto"/>
+              <w:jc w:val="left"/>
+            </w:pPr>
+            <w:r>
+              <w:rPr>
+                <w:rFonts w:ascii="Calibri" w:hAnsi="Calibri" w:eastAsia="Calibri" w:cs="Calibri" w:hint="eastAsia"/>
+                <w:sz w:val="18"/>
+              </w:rPr>
               <w:t xml:space="preserve">Formal campaign</w:t>
             </w:r>
           </w:p>
@@ -15822,6 +16292,7 @@
     <w:p>
       <w:pPr>
         <w:pStyle w:val="BodyText"/>
+        <w:spacing w:before="160"/>
       </w:pPr>
       <w:r>
         <w:rPr>
@@ -16548,6 +17019,807 @@
     <w:p>
       <w:pPr>
         <w:pStyle w:val="BodyText"/>
+        <w:spacing w:before="160"/>
+      </w:pPr>
+      <w:r>
+        <w:rPr>
+          <w:rFonts w:ascii="Calibri" w:hAnsi="Calibri" w:eastAsia="Calibri" w:cs="Calibri" w:hint="eastAsia"/>
+          <w:b/>
+          <w:bCs/>
+        </w:rPr>
+        <w:t xml:space="preserve">Table 5. Separately preregistered follow-up chronology.</w:t>
+      </w:r>
+    </w:p>
+    <w:tbl>
+      <w:tblPr>
+        <w:tblStyle w:val="Table"/>
+        <w:tblW w:type="dxa" w:w="9360"/>
+        <w:jc w:val="left"/>
+        <w:tblLayout w:type="fixed"/>
+        <w:tblLook w:firstRow="1" w:lastRow="0" w:firstColumn="0" w:lastColumn="0" w:noHBand="0" w:noVBand="0" w:val="0020"/>
+        <w:tblInd w:w="120" w:type="dxa"/>
+        <w:tblBorders>
+          <w:top w:val="single" w:sz="4" w:space="0" w:color="CBD3DC"/>
+          <w:left w:val="single" w:sz="4" w:space="0" w:color="CBD3DC"/>
+          <w:bottom w:val="single" w:sz="4" w:space="0" w:color="CBD3DC"/>
+          <w:right w:val="single" w:sz="4" w:space="0" w:color="CBD3DC"/>
+          <w:insideH w:val="single" w:sz="4" w:space="0" w:color="CBD3DC"/>
+          <w:insideV w:val="single" w:sz="4" w:space="0" w:color="CBD3DC"/>
+        </w:tblBorders>
+      </w:tblPr>
+      <w:tblGrid>
+        <w:gridCol w:w="2050"/>
+        <w:gridCol w:w="3110"/>
+        <w:gridCol w:w="4200"/>
+      </w:tblGrid>
+      <w:tr>
+        <w:trPr>
+          <w:tblHeader w:val="1"/>
+          <w:cantSplit w:val="1"/>
+        </w:trPr>
+        <w:tc>
+          <w:tcPr>
+            <w:tcW w:w="2050" w:type="dxa"/>
+            <w:tcMar>
+              <w:top w:w="80" w:type="dxa"/>
+              <w:start w:w="120" w:type="dxa"/>
+              <w:bottom w:w="80" w:type="dxa"/>
+              <w:end w:w="120" w:type="dxa"/>
+            </w:tcMar>
+            <w:vAlign w:val="center"/>
+            <w:shd w:fill="F4F6F9"/>
+          </w:tcPr>
+          <w:p>
+            <w:pPr>
+              <w:pStyle w:val="Compact"/>
+              <w:spacing w:before="0" w:after="60" w:line="259" w:lineRule="auto"/>
+              <w:jc w:val="left"/>
+            </w:pPr>
+            <w:r>
+              <w:rPr>
+                <w:rFonts w:ascii="Calibri" w:hAnsi="Calibri" w:eastAsia="Calibri" w:cs="Calibri" w:hint="eastAsia"/>
+                <w:b/>
+                <w:sz w:val="18"/>
+              </w:rPr>
+              <w:t xml:space="preserve">Object or gate</w:t>
+            </w:r>
+          </w:p>
+        </w:tc>
+        <w:tc>
+          <w:tcPr>
+            <w:tcW w:w="3110" w:type="dxa"/>
+            <w:tcMar>
+              <w:top w:w="80" w:type="dxa"/>
+              <w:start w:w="120" w:type="dxa"/>
+              <w:bottom w:w="80" w:type="dxa"/>
+              <w:end w:w="120" w:type="dxa"/>
+            </w:tcMar>
+            <w:vAlign w:val="center"/>
+            <w:shd w:fill="F4F6F9"/>
+          </w:tcPr>
+          <w:p>
+            <w:pPr>
+              <w:pStyle w:val="Compact"/>
+              <w:spacing w:before="0" w:after="60" w:line="259" w:lineRule="auto"/>
+              <w:jc w:val="left"/>
+            </w:pPr>
+            <w:r>
+              <w:rPr>
+                <w:rFonts w:ascii="Calibri" w:hAnsi="Calibri" w:eastAsia="Calibri" w:cs="Calibri" w:hint="eastAsia"/>
+                <w:b/>
+                <w:sz w:val="18"/>
+              </w:rPr>
+              <w:t xml:space="preserve">Exact identity</w:t>
+            </w:r>
+          </w:p>
+        </w:tc>
+        <w:tc>
+          <w:tcPr>
+            <w:tcW w:w="4200" w:type="dxa"/>
+            <w:tcMar>
+              <w:top w:w="80" w:type="dxa"/>
+              <w:start w:w="120" w:type="dxa"/>
+              <w:bottom w:w="80" w:type="dxa"/>
+              <w:end w:w="120" w:type="dxa"/>
+            </w:tcMar>
+            <w:vAlign w:val="center"/>
+            <w:shd w:fill="F4F6F9"/>
+          </w:tcPr>
+          <w:p>
+            <w:pPr>
+              <w:pStyle w:val="Compact"/>
+              <w:spacing w:before="0" w:after="60" w:line="259" w:lineRule="auto"/>
+              <w:jc w:val="left"/>
+            </w:pPr>
+            <w:r>
+              <w:rPr>
+                <w:rFonts w:ascii="Calibri" w:hAnsi="Calibri" w:eastAsia="Calibri" w:cs="Calibri" w:hint="eastAsia"/>
+                <w:b/>
+                <w:sz w:val="18"/>
+              </w:rPr>
+              <w:t xml:space="preserve">Terminal disposition</w:t>
+            </w:r>
+          </w:p>
+        </w:tc>
+      </w:tr>
+      <w:tr>
+        <w:trPr>
+          <w:cantSplit w:val="1"/>
+        </w:trPr>
+        <w:tc>
+          <w:tcPr>
+            <w:tcW w:w="2050" w:type="dxa"/>
+            <w:tcMar>
+              <w:top w:w="80" w:type="dxa"/>
+              <w:start w:w="120" w:type="dxa"/>
+              <w:bottom w:w="80" w:type="dxa"/>
+              <w:end w:w="120" w:type="dxa"/>
+            </w:tcMar>
+            <w:vAlign w:val="center"/>
+          </w:tcPr>
+          <w:p>
+            <w:pPr>
+              <w:pStyle w:val="Compact"/>
+              <w:spacing w:before="0" w:after="60" w:line="259" w:lineRule="auto"/>
+              <w:jc w:val="left"/>
+            </w:pPr>
+            <w:r>
+              <w:rPr>
+                <w:rFonts w:ascii="Calibri" w:hAnsi="Calibri" w:eastAsia="Calibri" w:cs="Calibri" w:hint="eastAsia"/>
+                <w:sz w:val="18"/>
+              </w:rPr>
+              <w:t xml:space="preserve">Follow-up experiment source and evidence freeze</w:t>
+            </w:r>
+          </w:p>
+        </w:tc>
+        <w:tc>
+          <w:tcPr>
+            <w:tcW w:w="3110" w:type="dxa"/>
+            <w:tcMar>
+              <w:top w:w="80" w:type="dxa"/>
+              <w:start w:w="120" w:type="dxa"/>
+              <w:bottom w:w="80" w:type="dxa"/>
+              <w:end w:w="120" w:type="dxa"/>
+            </w:tcMar>
+            <w:vAlign w:val="center"/>
+          </w:tcPr>
+          <w:p>
+            <w:pPr>
+              <w:pStyle w:val="Compact"/>
+              <w:spacing w:before="0" w:after="60" w:line="259" w:lineRule="auto"/>
+              <w:jc w:val="left"/>
+            </w:pPr>
+            <w:r>
+              <w:rPr>
+                <w:rFonts w:ascii="Calibri" w:hAnsi="Calibri" w:eastAsia="Calibri" w:cs="Calibri" w:hint="eastAsia"/>
+                <w:sz w:val="18"/>
+              </w:rPr>
+              <w:t xml:space="preserve">S1</w:t>
+            </w:r>
+            <w:r>
+              <w:rPr>
+                <w:rFonts w:ascii="Calibri" w:hAnsi="Calibri" w:eastAsia="Calibri" w:cs="Calibri" w:hint="eastAsia"/>
+                <w:sz w:val="18"/>
+              </w:rPr>
+              <w:t xml:space="preserve"> </w:t>
+            </w:r>
+            <w:r>
+              <w:rPr>
+                <w:rStyle w:val="VerbatimChar"/>
+                <w:rFonts w:ascii="Calibri" w:hAnsi="Calibri" w:eastAsia="Calibri" w:cs="Calibri" w:hint="eastAsia"/>
+                <w:sz w:val="18"/>
+              </w:rPr>
+              <w:t xml:space="preserve">f8d89d6f98f289dc2e0c3414f7b4ed59b5d30f52</w:t>
+            </w:r>
+            <w:r>
+              <w:rPr>
+                <w:rFonts w:ascii="Calibri" w:hAnsi="Calibri" w:eastAsia="Calibri" w:cs="Calibri" w:hint="eastAsia"/>
+                <w:sz w:val="18"/>
+              </w:rPr>
+              <w:t xml:space="preserve">; S2</w:t>
+            </w:r>
+            <w:r>
+              <w:rPr>
+                <w:rFonts w:ascii="Calibri" w:hAnsi="Calibri" w:eastAsia="Calibri" w:cs="Calibri" w:hint="eastAsia"/>
+                <w:sz w:val="18"/>
+              </w:rPr>
+              <w:t xml:space="preserve"> </w:t>
+            </w:r>
+            <w:r>
+              <w:rPr>
+                <w:rStyle w:val="VerbatimChar"/>
+                <w:rFonts w:ascii="Calibri" w:hAnsi="Calibri" w:eastAsia="Calibri" w:cs="Calibri" w:hint="eastAsia"/>
+                <w:sz w:val="18"/>
+              </w:rPr>
+              <w:t xml:space="preserve">e1e488f177dc8a469c6132a29537b041fbf1430b</w:t>
+            </w:r>
+            <w:r>
+              <w:rPr>
+                <w:rFonts w:ascii="Calibri" w:hAnsi="Calibri" w:eastAsia="Calibri" w:cs="Calibri" w:hint="eastAsia"/>
+                <w:sz w:val="18"/>
+              </w:rPr>
+              <w:t xml:space="preserve">; compatibility receipt</w:t>
+            </w:r>
+            <w:r>
+              <w:rPr>
+                <w:rFonts w:ascii="Calibri" w:hAnsi="Calibri" w:eastAsia="Calibri" w:cs="Calibri" w:hint="eastAsia"/>
+                <w:sz w:val="18"/>
+              </w:rPr>
+              <w:t xml:space="preserve"> </w:t>
+            </w:r>
+            <w:r>
+              <w:rPr>
+                <w:rStyle w:val="VerbatimChar"/>
+                <w:rFonts w:ascii="Calibri" w:hAnsi="Calibri" w:eastAsia="Calibri" w:cs="Calibri" w:hint="eastAsia"/>
+                <w:sz w:val="18"/>
+              </w:rPr>
+              <w:t xml:space="preserve">c163974a…7e24</w:t>
+            </w:r>
+          </w:p>
+        </w:tc>
+        <w:tc>
+          <w:tcPr>
+            <w:tcW w:w="4200" w:type="dxa"/>
+            <w:tcMar>
+              <w:top w:w="80" w:type="dxa"/>
+              <w:start w:w="120" w:type="dxa"/>
+              <w:bottom w:w="80" w:type="dxa"/>
+              <w:end w:w="120" w:type="dxa"/>
+            </w:tcMar>
+            <w:vAlign w:val="center"/>
+          </w:tcPr>
+          <w:p>
+            <w:pPr>
+              <w:pStyle w:val="Compact"/>
+              <w:spacing w:before="0" w:after="60" w:line="259" w:lineRule="auto"/>
+              <w:jc w:val="left"/>
+            </w:pPr>
+            <w:r>
+              <w:rPr>
+                <w:rFonts w:ascii="Calibri" w:hAnsi="Calibri" w:eastAsia="Calibri" w:cs="Calibri" w:hint="eastAsia"/>
+                <w:sz w:val="18"/>
+              </w:rPr>
+              <w:t xml:space="preserve">Direct-child data-only transition; all authority fields false</w:t>
+            </w:r>
+          </w:p>
+        </w:tc>
+      </w:tr>
+      <w:tr>
+        <w:trPr>
+          <w:cantSplit w:val="1"/>
+        </w:trPr>
+        <w:tc>
+          <w:tcPr>
+            <w:tcW w:w="2050" w:type="dxa"/>
+            <w:tcMar>
+              <w:top w:w="80" w:type="dxa"/>
+              <w:start w:w="120" w:type="dxa"/>
+              <w:bottom w:w="80" w:type="dxa"/>
+              <w:end w:w="120" w:type="dxa"/>
+            </w:tcMar>
+            <w:vAlign w:val="center"/>
+          </w:tcPr>
+          <w:p>
+            <w:pPr>
+              <w:pStyle w:val="Compact"/>
+              <w:spacing w:before="0" w:after="60" w:line="259" w:lineRule="auto"/>
+              <w:jc w:val="left"/>
+            </w:pPr>
+            <w:r>
+              <w:rPr>
+                <w:rFonts w:ascii="Calibri" w:hAnsi="Calibri" w:eastAsia="Calibri" w:cs="Calibri" w:hint="eastAsia"/>
+                <w:sz w:val="18"/>
+              </w:rPr>
+              <w:t xml:space="preserve">Five fresh controls</w:t>
+            </w:r>
+          </w:p>
+        </w:tc>
+        <w:tc>
+          <w:tcPr>
+            <w:tcW w:w="3110" w:type="dxa"/>
+            <w:tcMar>
+              <w:top w:w="80" w:type="dxa"/>
+              <w:start w:w="120" w:type="dxa"/>
+              <w:bottom w:w="80" w:type="dxa"/>
+              <w:end w:w="120" w:type="dxa"/>
+            </w:tcMar>
+            <w:vAlign w:val="center"/>
+          </w:tcPr>
+          <w:p>
+            <w:pPr>
+              <w:pStyle w:val="Compact"/>
+              <w:spacing w:before="0" w:after="60" w:line="259" w:lineRule="auto"/>
+              <w:jc w:val="left"/>
+            </w:pPr>
+            <w:r>
+              <w:rPr>
+                <w:rFonts w:ascii="Calibri" w:hAnsi="Calibri" w:eastAsia="Calibri" w:cs="Calibri" w:hint="eastAsia"/>
+                <w:sz w:val="18"/>
+              </w:rPr>
+              <w:t xml:space="preserve">Runs</w:t>
+            </w:r>
+            <w:r>
+              <w:rPr>
+                <w:rFonts w:ascii="Calibri" w:hAnsi="Calibri" w:eastAsia="Calibri" w:cs="Calibri" w:hint="eastAsia"/>
+                <w:sz w:val="18"/>
+              </w:rPr>
+              <w:t xml:space="preserve"> </w:t>
+            </w:r>
+            <w:r>
+              <w:rPr>
+                <w:rStyle w:val="VerbatimChar"/>
+                <w:rFonts w:ascii="Calibri" w:hAnsi="Calibri" w:eastAsia="Calibri" w:cs="Calibri" w:hint="eastAsia"/>
+                <w:sz w:val="18"/>
+              </w:rPr>
+              <w:t xml:space="preserve">33347586537</w:t>
+            </w:r>
+            <w:r>
+              <w:rPr>
+                <w:rFonts w:ascii="Calibri" w:hAnsi="Calibri" w:eastAsia="Calibri" w:cs="Calibri" w:hint="eastAsia"/>
+                <w:sz w:val="18"/>
+              </w:rPr>
+              <w:t xml:space="preserve">,</w:t>
+            </w:r>
+            <w:r>
+              <w:rPr>
+                <w:rFonts w:ascii="Calibri" w:hAnsi="Calibri" w:eastAsia="Calibri" w:cs="Calibri" w:hint="eastAsia"/>
+                <w:sz w:val="18"/>
+              </w:rPr>
+              <w:t xml:space="preserve"> </w:t>
+            </w:r>
+            <w:r>
+              <w:rPr>
+                <w:rStyle w:val="VerbatimChar"/>
+                <w:rFonts w:ascii="Calibri" w:hAnsi="Calibri" w:eastAsia="Calibri" w:cs="Calibri" w:hint="eastAsia"/>
+                <w:sz w:val="18"/>
+              </w:rPr>
+              <w:t xml:space="preserve">33347586567</w:t>
+            </w:r>
+            <w:r>
+              <w:rPr>
+                <w:rFonts w:ascii="Calibri" w:hAnsi="Calibri" w:eastAsia="Calibri" w:cs="Calibri" w:hint="eastAsia"/>
+                <w:sz w:val="18"/>
+              </w:rPr>
+              <w:t xml:space="preserve">,</w:t>
+            </w:r>
+            <w:r>
+              <w:rPr>
+                <w:rFonts w:ascii="Calibri" w:hAnsi="Calibri" w:eastAsia="Calibri" w:cs="Calibri" w:hint="eastAsia"/>
+                <w:sz w:val="18"/>
+              </w:rPr>
+              <w:t xml:space="preserve"> </w:t>
+            </w:r>
+            <w:r>
+              <w:rPr>
+                <w:rStyle w:val="VerbatimChar"/>
+                <w:rFonts w:ascii="Calibri" w:hAnsi="Calibri" w:eastAsia="Calibri" w:cs="Calibri" w:hint="eastAsia"/>
+                <w:sz w:val="18"/>
+              </w:rPr>
+              <w:t xml:space="preserve">33347586568</w:t>
+            </w:r>
+            <w:r>
+              <w:rPr>
+                <w:rFonts w:ascii="Calibri" w:hAnsi="Calibri" w:eastAsia="Calibri" w:cs="Calibri" w:hint="eastAsia"/>
+                <w:sz w:val="18"/>
+              </w:rPr>
+              <w:t xml:space="preserve">,</w:t>
+            </w:r>
+            <w:r>
+              <w:rPr>
+                <w:rFonts w:ascii="Calibri" w:hAnsi="Calibri" w:eastAsia="Calibri" w:cs="Calibri" w:hint="eastAsia"/>
+                <w:sz w:val="18"/>
+              </w:rPr>
+              <w:t xml:space="preserve"> </w:t>
+            </w:r>
+            <w:r>
+              <w:rPr>
+                <w:rStyle w:val="VerbatimChar"/>
+                <w:rFonts w:ascii="Calibri" w:hAnsi="Calibri" w:eastAsia="Calibri" w:cs="Calibri" w:hint="eastAsia"/>
+                <w:sz w:val="18"/>
+              </w:rPr>
+              <w:t xml:space="preserve">33347586620</w:t>
+            </w:r>
+            <w:r>
+              <w:rPr>
+                <w:rFonts w:ascii="Calibri" w:hAnsi="Calibri" w:eastAsia="Calibri" w:cs="Calibri" w:hint="eastAsia"/>
+                <w:sz w:val="18"/>
+              </w:rPr>
+              <w:t xml:space="preserve">, and</w:t>
+            </w:r>
+            <w:r>
+              <w:rPr>
+                <w:rFonts w:ascii="Calibri" w:hAnsi="Calibri" w:eastAsia="Calibri" w:cs="Calibri" w:hint="eastAsia"/>
+                <w:sz w:val="18"/>
+              </w:rPr>
+              <w:t xml:space="preserve"> </w:t>
+            </w:r>
+            <w:r>
+              <w:rPr>
+                <w:rStyle w:val="VerbatimChar"/>
+                <w:rFonts w:ascii="Calibri" w:hAnsi="Calibri" w:eastAsia="Calibri" w:cs="Calibri" w:hint="eastAsia"/>
+                <w:sz w:val="18"/>
+              </w:rPr>
+              <w:t xml:space="preserve">33347586569</w:t>
+            </w:r>
+          </w:p>
+        </w:tc>
+        <w:tc>
+          <w:tcPr>
+            <w:tcW w:w="4200" w:type="dxa"/>
+            <w:tcMar>
+              <w:top w:w="80" w:type="dxa"/>
+              <w:start w:w="120" w:type="dxa"/>
+              <w:bottom w:w="80" w:type="dxa"/>
+              <w:end w:w="120" w:type="dxa"/>
+            </w:tcMar>
+            <w:vAlign w:val="center"/>
+          </w:tcPr>
+          <w:p>
+            <w:pPr>
+              <w:pStyle w:val="Compact"/>
+              <w:spacing w:before="0" w:after="60" w:line="259" w:lineRule="auto"/>
+              <w:jc w:val="left"/>
+            </w:pPr>
+            <w:r>
+              <w:rPr>
+                <w:rFonts w:ascii="Calibri" w:hAnsi="Calibri" w:eastAsia="Calibri" w:cs="Calibri" w:hint="eastAsia"/>
+                <w:sz w:val="18"/>
+              </w:rPr>
+              <w:t xml:space="preserve">All completed successfully on exact S2; prerequisite evidence only</w:t>
+            </w:r>
+          </w:p>
+        </w:tc>
+      </w:tr>
+      <w:tr>
+        <w:trPr>
+          <w:cantSplit w:val="1"/>
+        </w:trPr>
+        <w:tc>
+          <w:tcPr>
+            <w:tcW w:w="2050" w:type="dxa"/>
+            <w:tcMar>
+              <w:top w:w="80" w:type="dxa"/>
+              <w:start w:w="120" w:type="dxa"/>
+              <w:bottom w:w="80" w:type="dxa"/>
+              <w:end w:w="120" w:type="dxa"/>
+            </w:tcMar>
+            <w:vAlign w:val="center"/>
+          </w:tcPr>
+          <w:p>
+            <w:pPr>
+              <w:pStyle w:val="Compact"/>
+              <w:spacing w:before="0" w:after="60" w:line="259" w:lineRule="auto"/>
+              <w:jc w:val="left"/>
+            </w:pPr>
+            <w:r>
+              <w:rPr>
+                <w:rFonts w:ascii="Calibri" w:hAnsi="Calibri" w:eastAsia="Calibri" w:cs="Calibri" w:hint="eastAsia"/>
+                <w:sz w:val="18"/>
+              </w:rPr>
+              <w:t xml:space="preserve">Sole follow-up qualification</w:t>
+            </w:r>
+          </w:p>
+        </w:tc>
+        <w:tc>
+          <w:tcPr>
+            <w:tcW w:w="3110" w:type="dxa"/>
+            <w:tcMar>
+              <w:top w:w="80" w:type="dxa"/>
+              <w:start w:w="120" w:type="dxa"/>
+              <w:bottom w:w="80" w:type="dxa"/>
+              <w:end w:w="120" w:type="dxa"/>
+            </w:tcMar>
+            <w:vAlign w:val="center"/>
+          </w:tcPr>
+          <w:p>
+            <w:pPr>
+              <w:pStyle w:val="Compact"/>
+              <w:spacing w:before="0" w:after="60" w:line="259" w:lineRule="auto"/>
+              <w:jc w:val="left"/>
+            </w:pPr>
+            <w:r>
+              <w:rPr>
+                <w:rFonts w:ascii="Calibri" w:hAnsi="Calibri" w:eastAsia="Calibri" w:cs="Calibri" w:hint="eastAsia"/>
+                <w:sz w:val="18"/>
+              </w:rPr>
+              <w:t xml:space="preserve">Run</w:t>
+            </w:r>
+            <w:r>
+              <w:rPr>
+                <w:rFonts w:ascii="Calibri" w:hAnsi="Calibri" w:eastAsia="Calibri" w:cs="Calibri" w:hint="eastAsia"/>
+                <w:sz w:val="18"/>
+              </w:rPr>
+              <w:t xml:space="preserve"> </w:t>
+            </w:r>
+            <w:r>
+              <w:rPr>
+                <w:rStyle w:val="VerbatimChar"/>
+                <w:rFonts w:ascii="Calibri" w:hAnsi="Calibri" w:eastAsia="Calibri" w:cs="Calibri" w:hint="eastAsia"/>
+                <w:sz w:val="18"/>
+              </w:rPr>
+              <w:t xml:space="preserve">33348855548</w:t>
+            </w:r>
+          </w:p>
+        </w:tc>
+        <w:tc>
+          <w:tcPr>
+            <w:tcW w:w="4200" w:type="dxa"/>
+            <w:tcMar>
+              <w:top w:w="80" w:type="dxa"/>
+              <w:start w:w="120" w:type="dxa"/>
+              <w:bottom w:w="80" w:type="dxa"/>
+              <w:end w:w="120" w:type="dxa"/>
+            </w:tcMar>
+            <w:vAlign w:val="center"/>
+          </w:tcPr>
+          <w:p>
+            <w:pPr>
+              <w:pStyle w:val="Compact"/>
+              <w:spacing w:before="0" w:after="60" w:line="259" w:lineRule="auto"/>
+              <w:jc w:val="left"/>
+            </w:pPr>
+            <w:r>
+              <w:rPr>
+                <w:rStyle w:val="VerbatimChar"/>
+                <w:rFonts w:ascii="Calibri" w:hAnsi="Calibri" w:eastAsia="Calibri" w:cs="Calibri" w:hint="eastAsia"/>
+                <w:sz w:val="18"/>
+              </w:rPr>
+              <w:t xml:space="preserve">completed/cancelled</w:t>
+            </w:r>
+            <w:r>
+              <w:rPr>
+                <w:rFonts w:ascii="Calibri" w:hAnsi="Calibri" w:eastAsia="Calibri" w:cs="Calibri" w:hint="eastAsia"/>
+                <w:sz w:val="18"/>
+              </w:rPr>
+              <w:t xml:space="preserve">; only GitHub</w:t>
+            </w:r>
+            <w:r>
+              <w:rPr>
+                <w:rFonts w:ascii="Calibri" w:hAnsi="Calibri" w:eastAsia="Calibri" w:cs="Calibri" w:hint="eastAsia"/>
+                <w:sz w:val="18"/>
+              </w:rPr>
+              <w:t xml:space="preserve"> </w:t>
+            </w:r>
+            <w:r>
+              <w:rPr>
+                <w:rStyle w:val="VerbatimChar"/>
+                <w:rFonts w:ascii="Calibri" w:hAnsi="Calibri" w:eastAsia="Calibri" w:cs="Calibri" w:hint="eastAsia"/>
+                <w:sz w:val="18"/>
+              </w:rPr>
+              <w:t xml:space="preserve">Set up job</w:t>
+            </w:r>
+            <w:r>
+              <w:rPr>
+                <w:rFonts w:ascii="Calibri" w:hAnsi="Calibri" w:eastAsia="Calibri" w:cs="Calibri" w:hint="eastAsia"/>
+                <w:sz w:val="18"/>
+              </w:rPr>
+              <w:t xml:space="preserve"> </w:t>
+            </w:r>
+            <w:r>
+              <w:rPr>
+                <w:rFonts w:ascii="Calibri" w:hAnsi="Calibri" w:eastAsia="Calibri" w:cs="Calibri" w:hint="eastAsia"/>
+                <w:sz w:val="18"/>
+              </w:rPr>
+              <w:t xml:space="preserve">began; no checkout, registered seed, q1–q6 scientific stage, or artifact</w:t>
+            </w:r>
+          </w:p>
+        </w:tc>
+      </w:tr>
+      <w:tr>
+        <w:trPr>
+          <w:cantSplit w:val="1"/>
+        </w:trPr>
+        <w:tc>
+          <w:tcPr>
+            <w:tcW w:w="2050" w:type="dxa"/>
+            <w:tcMar>
+              <w:top w:w="80" w:type="dxa"/>
+              <w:start w:w="120" w:type="dxa"/>
+              <w:bottom w:w="80" w:type="dxa"/>
+              <w:end w:w="120" w:type="dxa"/>
+            </w:tcMar>
+            <w:vAlign w:val="center"/>
+          </w:tcPr>
+          <w:p>
+            <w:pPr>
+              <w:pStyle w:val="Compact"/>
+              <w:spacing w:before="0" w:after="60" w:line="259" w:lineRule="auto"/>
+              <w:jc w:val="left"/>
+            </w:pPr>
+            <w:r>
+              <w:rPr>
+                <w:rFonts w:ascii="Calibri" w:hAnsi="Calibri" w:eastAsia="Calibri" w:cs="Calibri" w:hint="eastAsia"/>
+                <w:sz w:val="18"/>
+              </w:rPr>
+              <w:t xml:space="preserve">Claim and evidence state</w:t>
+            </w:r>
+          </w:p>
+        </w:tc>
+        <w:tc>
+          <w:tcPr>
+            <w:tcW w:w="3110" w:type="dxa"/>
+            <w:tcMar>
+              <w:top w:w="80" w:type="dxa"/>
+              <w:start w:w="120" w:type="dxa"/>
+              <w:bottom w:w="80" w:type="dxa"/>
+              <w:end w:w="120" w:type="dxa"/>
+            </w:tcMar>
+            <w:vAlign w:val="center"/>
+          </w:tcPr>
+          <w:p>
+            <w:pPr>
+              <w:pStyle w:val="Compact"/>
+              <w:spacing w:before="0" w:after="60" w:line="259" w:lineRule="auto"/>
+              <w:jc w:val="left"/>
+            </w:pPr>
+            <w:r>
+              <w:rPr>
+                <w:rFonts w:ascii="Calibri" w:hAnsi="Calibri" w:eastAsia="Calibri" w:cs="Calibri" w:hint="eastAsia"/>
+                <w:sz w:val="18"/>
+              </w:rPr>
+              <w:t xml:space="preserve">Qualification claim ref remains at exact S2; artifact API</w:t>
+            </w:r>
+            <w:r>
+              <w:rPr>
+                <w:rFonts w:ascii="Calibri" w:hAnsi="Calibri" w:eastAsia="Calibri" w:cs="Calibri" w:hint="eastAsia"/>
+                <w:sz w:val="18"/>
+              </w:rPr>
+              <w:t xml:space="preserve"> </w:t>
+            </w:r>
+            <w:r>
+              <w:rPr>
+                <w:rStyle w:val="VerbatimChar"/>
+                <w:rFonts w:ascii="Calibri" w:hAnsi="Calibri" w:eastAsia="Calibri" w:cs="Calibri" w:hint="eastAsia"/>
+                <w:sz w:val="18"/>
+              </w:rPr>
+              <w:t xml:space="preserve">total_count=0</w:t>
+            </w:r>
+            <w:r>
+              <w:rPr>
+                <w:rFonts w:ascii="Calibri" w:hAnsi="Calibri" w:eastAsia="Calibri" w:cs="Calibri" w:hint="eastAsia"/>
+                <w:sz w:val="18"/>
+              </w:rPr>
+              <w:t xml:space="preserve">; evidence root empty</w:t>
+            </w:r>
+          </w:p>
+        </w:tc>
+        <w:tc>
+          <w:tcPr>
+            <w:tcW w:w="4200" w:type="dxa"/>
+            <w:tcMar>
+              <w:top w:w="80" w:type="dxa"/>
+              <w:start w:w="120" w:type="dxa"/>
+              <w:bottom w:w="80" w:type="dxa"/>
+              <w:end w:w="120" w:type="dxa"/>
+            </w:tcMar>
+            <w:vAlign w:val="center"/>
+          </w:tcPr>
+          <w:p>
+            <w:pPr>
+              <w:pStyle w:val="Compact"/>
+              <w:spacing w:before="0" w:after="60" w:line="259" w:lineRule="auto"/>
+              <w:jc w:val="left"/>
+            </w:pPr>
+            <w:r>
+              <w:rPr>
+                <w:rFonts w:ascii="Calibri" w:hAnsi="Calibri" w:eastAsia="Calibri" w:cs="Calibri" w:hint="eastAsia"/>
+                <w:sz w:val="18"/>
+              </w:rPr>
+              <w:t xml:space="preserve">Watch-binding candidate absent; no formal/campaign/terminal/analysis ref and no reportable result</w:t>
+            </w:r>
+          </w:p>
+        </w:tc>
+      </w:tr>
+      <w:tr>
+        <w:trPr>
+          <w:cantSplit w:val="1"/>
+        </w:trPr>
+        <w:tc>
+          <w:tcPr>
+            <w:tcW w:w="2050" w:type="dxa"/>
+            <w:tcMar>
+              <w:top w:w="80" w:type="dxa"/>
+              <w:start w:w="120" w:type="dxa"/>
+              <w:bottom w:w="80" w:type="dxa"/>
+              <w:end w:w="120" w:type="dxa"/>
+            </w:tcMar>
+            <w:vAlign w:val="center"/>
+          </w:tcPr>
+          <w:p>
+            <w:pPr>
+              <w:pStyle w:val="Compact"/>
+              <w:spacing w:before="0" w:after="60" w:line="259" w:lineRule="auto"/>
+              <w:jc w:val="left"/>
+            </w:pPr>
+            <w:r>
+              <w:rPr>
+                <w:rFonts w:ascii="Calibri" w:hAnsi="Calibri" w:eastAsia="Calibri" w:cs="Calibri" w:hint="eastAsia"/>
+                <w:sz w:val="18"/>
+              </w:rPr>
+              <w:t xml:space="preserve">Independent disposition</w:t>
+            </w:r>
+          </w:p>
+        </w:tc>
+        <w:tc>
+          <w:tcPr>
+            <w:tcW w:w="3110" w:type="dxa"/>
+            <w:tcMar>
+              <w:top w:w="80" w:type="dxa"/>
+              <w:start w:w="120" w:type="dxa"/>
+              <w:bottom w:w="80" w:type="dxa"/>
+              <w:end w:w="120" w:type="dxa"/>
+            </w:tcMar>
+            <w:vAlign w:val="center"/>
+          </w:tcPr>
+          <w:p>
+            <w:pPr>
+              <w:pStyle w:val="Compact"/>
+              <w:spacing w:before="0" w:after="60" w:line="259" w:lineRule="auto"/>
+              <w:jc w:val="left"/>
+            </w:pPr>
+            <w:r>
+              <w:rPr>
+                <w:rFonts w:ascii="Calibri" w:hAnsi="Calibri" w:eastAsia="Calibri" w:cs="Calibri" w:hint="eastAsia"/>
+                <w:sz w:val="18"/>
+              </w:rPr>
+              <w:t xml:space="preserve">Same exact packet received two adversarial read-only reviews</w:t>
+            </w:r>
+          </w:p>
+        </w:tc>
+        <w:tc>
+          <w:tcPr>
+            <w:tcW w:w="4200" w:type="dxa"/>
+            <w:tcMar>
+              <w:top w:w="80" w:type="dxa"/>
+              <w:start w:w="120" w:type="dxa"/>
+              <w:bottom w:w="80" w:type="dxa"/>
+              <w:end w:w="120" w:type="dxa"/>
+            </w:tcMar>
+            <w:vAlign w:val="center"/>
+          </w:tcPr>
+          <w:p>
+            <w:pPr>
+              <w:pStyle w:val="Compact"/>
+              <w:spacing w:before="0" w:after="60" w:line="259" w:lineRule="auto"/>
+              <w:jc w:val="left"/>
+            </w:pPr>
+            <w:r>
+              <w:rPr>
+                <w:rFonts w:ascii="Calibri" w:hAnsi="Calibri" w:eastAsia="Calibri" w:cs="Calibri" w:hint="eastAsia"/>
+                <w:sz w:val="18"/>
+              </w:rPr>
+              <w:t xml:space="preserve">Both returned</w:t>
+            </w:r>
+            <w:r>
+              <w:rPr>
+                <w:rFonts w:ascii="Calibri" w:hAnsi="Calibri" w:eastAsia="Calibri" w:cs="Calibri" w:hint="eastAsia"/>
+                <w:sz w:val="18"/>
+              </w:rPr>
+              <w:t xml:space="preserve"> </w:t>
+            </w:r>
+            <w:r>
+              <w:rPr>
+                <w:rStyle w:val="VerbatimChar"/>
+                <w:rFonts w:ascii="Calibri" w:hAnsi="Calibri" w:eastAsia="Calibri" w:cs="Calibri" w:hint="eastAsia"/>
+                <w:sz w:val="18"/>
+              </w:rPr>
+              <w:t xml:space="preserve">TERMINAL-NO-GO</w:t>
+            </w:r>
+            <w:r>
+              <w:rPr>
+                <w:rFonts w:ascii="Calibri" w:hAnsi="Calibri" w:eastAsia="Calibri" w:cs="Calibri" w:hint="eastAsia"/>
+                <w:sz w:val="18"/>
+              </w:rPr>
+              <w:t xml:space="preserve">; no second qualification or repaired-lineage continuation</w:t>
+            </w:r>
+          </w:p>
+        </w:tc>
+      </w:tr>
+    </w:tbl>
+    <w:p>
+      <w:pPr>
+        <w:pStyle w:val="BodyText"/>
+        <w:spacing w:before="160"/>
       </w:pPr>
       <w:r>
         <w:rPr>
@@ -16890,8 +18162,314 @@
       </w:r>
     </w:p>
     <w:bookmarkEnd w:id="44"/>
+    <w:bookmarkStart w:id="45" w:name="X1500b0de950b79c26d1689b0b644a3b16b3a427"/>
+    <w:p>
+      <w:pPr>
+        <w:pStyle w:val="Heading2"/>
+      </w:pPr>
+      <w:r>
+        <w:rPr>
+          <w:rFonts w:ascii="Calibri" w:hAnsi="Calibri" w:eastAsia="Calibri" w:cs="Calibri" w:hint="eastAsia"/>
+        </w:rPr>
+        <w:t xml:space="preserve">7.5 Separately preregistered follow-up disposition</w:t>
+      </w:r>
+    </w:p>
+    <w:p>
+      <w:pPr>
+        <w:pStyle w:val="FirstParagraph"/>
+      </w:pPr>
+      <w:r>
+        <w:rPr>
+          <w:rFonts w:ascii="Calibri" w:hAnsi="Calibri" w:eastAsia="Calibri" w:cs="Calibri" w:hint="eastAsia"/>
+        </w:rPr>
+        <w:t xml:space="preserve">The follow-up was designed after the primary stop to answer a narrower</w:t>
+      </w:r>
+      <w:r>
+        <w:rPr>
+          <w:rFonts w:ascii="Calibri" w:hAnsi="Calibri" w:eastAsia="Calibri" w:cs="Calibri" w:hint="eastAsia"/>
+        </w:rPr>
+        <w:t xml:space="preserve"> </w:t>
+      </w:r>
+      <w:r>
+        <w:rPr>
+          <w:rFonts w:ascii="Calibri" w:hAnsi="Calibri" w:eastAsia="Calibri" w:cs="Calibri" w:hint="eastAsia"/>
+        </w:rPr>
+        <w:t xml:space="preserve">feasibility question without relaxing the original scientific matrix. Before</w:t>
+      </w:r>
+      <w:r>
+        <w:rPr>
+          <w:rFonts w:ascii="Calibri" w:hAnsi="Calibri" w:eastAsia="Calibri" w:cs="Calibri" w:hint="eastAsia"/>
+        </w:rPr>
+        <w:t xml:space="preserve"> </w:t>
+      </w:r>
+      <w:r>
+        <w:rPr>
+          <w:rFonts w:ascii="Calibri" w:hAnsi="Calibri" w:eastAsia="Calibri" w:cs="Calibri" w:hint="eastAsia"/>
+        </w:rPr>
+        <w:t xml:space="preserve">its sole qualification, exact-S2 CI, PRE-S1, descriptive registration,</w:t>
+      </w:r>
+      <w:r>
+        <w:rPr>
+          <w:rFonts w:ascii="Calibri" w:hAnsi="Calibri" w:eastAsia="Calibri" w:cs="Calibri" w:hint="eastAsia"/>
+        </w:rPr>
+        <w:t xml:space="preserve"> </w:t>
+      </w:r>
+      <w:r>
+        <w:rPr>
+          <w:rFonts w:ascii="Calibri" w:hAnsi="Calibri" w:eastAsia="Calibri" w:cs="Calibri" w:hint="eastAsia"/>
+        </w:rPr>
+        <w:t xml:space="preserve">source-anchor, and independent-review controls all completed successfully. One</w:t>
+      </w:r>
+      <w:r>
+        <w:rPr>
+          <w:rFonts w:ascii="Calibri" w:hAnsi="Calibri" w:eastAsia="Calibri" w:cs="Calibri" w:hint="eastAsia"/>
+        </w:rPr>
+        <w:t xml:space="preserve"> </w:t>
+      </w:r>
+      <w:r>
+        <w:rPr>
+          <w:rFonts w:ascii="Calibri" w:hAnsi="Calibri" w:eastAsia="Calibri" w:cs="Calibri" w:hint="eastAsia"/>
+        </w:rPr>
+        <w:t xml:space="preserve">production controller call then consumed the nonserialized capability, created</w:t>
+      </w:r>
+      <w:r>
+        <w:rPr>
+          <w:rFonts w:ascii="Calibri" w:hAnsi="Calibri" w:eastAsia="Calibri" w:cs="Calibri" w:hint="eastAsia"/>
+        </w:rPr>
+        <w:t xml:space="preserve"> </w:t>
+      </w:r>
+      <w:r>
+        <w:rPr>
+          <w:rFonts w:ascii="Calibri" w:hAnsi="Calibri" w:eastAsia="Calibri" w:cs="Calibri" w:hint="eastAsia"/>
+        </w:rPr>
+        <w:t xml:space="preserve">the qualification claim, and dispatched exact-S2 run</w:t>
+      </w:r>
+      <w:r>
+        <w:rPr>
+          <w:rFonts w:ascii="Calibri" w:hAnsi="Calibri" w:eastAsia="Calibri" w:cs="Calibri" w:hint="eastAsia"/>
+        </w:rPr>
+        <w:t xml:space="preserve"> </w:t>
+      </w:r>
+      <w:r>
+        <w:rPr>
+          <w:rStyle w:val="VerbatimChar"/>
+          <w:rFonts w:ascii="Calibri" w:hAnsi="Calibri" w:eastAsia="Calibri" w:cs="Calibri" w:hint="eastAsia"/>
+        </w:rPr>
+        <w:t xml:space="preserve">33348855548</w:t>
+      </w:r>
+      <w:r>
+        <w:rPr>
+          <w:rFonts w:ascii="Calibri" w:hAnsi="Calibri" w:eastAsia="Calibri" w:cs="Calibri" w:hint="eastAsia"/>
+        </w:rPr>
+        <w:t xml:space="preserve">.</w:t>
+      </w:r>
+    </w:p>
+    <w:p>
+      <w:pPr>
+        <w:pStyle w:val="BodyText"/>
+      </w:pPr>
+      <w:r>
+        <w:rPr>
+          <w:rFonts w:ascii="Calibri" w:hAnsi="Calibri" w:eastAsia="Calibri" w:cs="Calibri" w:hint="eastAsia"/>
+        </w:rPr>
+        <w:t xml:space="preserve">The controller failed closed while establishing the watcher-admission binding</w:t>
+      </w:r>
+      <w:r>
+        <w:rPr>
+          <w:rFonts w:ascii="Calibri" w:hAnsi="Calibri" w:eastAsia="Calibri" w:cs="Calibri" w:hint="eastAsia"/>
+        </w:rPr>
+        <w:t xml:space="preserve"> </w:t>
+      </w:r>
+      <w:r>
+        <w:rPr>
+          <w:rFonts w:ascii="Calibri" w:hAnsi="Calibri" w:eastAsia="Calibri" w:cs="Calibri" w:hint="eastAsia"/>
+        </w:rPr>
+        <w:t xml:space="preserve">and cancelled the run. GitHub recorded only its internal</w:t>
+      </w:r>
+      <w:r>
+        <w:rPr>
+          <w:rFonts w:ascii="Calibri" w:hAnsi="Calibri" w:eastAsia="Calibri" w:cs="Calibri" w:hint="eastAsia"/>
+        </w:rPr>
+        <w:t xml:space="preserve"> </w:t>
+      </w:r>
+      <w:r>
+        <w:rPr>
+          <w:rStyle w:val="VerbatimChar"/>
+          <w:rFonts w:ascii="Calibri" w:hAnsi="Calibri" w:eastAsia="Calibri" w:cs="Calibri" w:hint="eastAsia"/>
+        </w:rPr>
+        <w:t xml:space="preserve">Set up job</w:t>
+      </w:r>
+      <w:r>
+        <w:rPr>
+          <w:rFonts w:ascii="Calibri" w:hAnsi="Calibri" w:eastAsia="Calibri" w:cs="Calibri" w:hint="eastAsia"/>
+        </w:rPr>
+        <w:t xml:space="preserve"> </w:t>
+      </w:r>
+      <w:r>
+        <w:rPr>
+          <w:rFonts w:ascii="Calibri" w:hAnsi="Calibri" w:eastAsia="Calibri" w:cs="Calibri" w:hint="eastAsia"/>
+        </w:rPr>
+        <w:t xml:space="preserve">step; no</w:t>
+      </w:r>
+      <w:r>
+        <w:rPr>
+          <w:rFonts w:ascii="Calibri" w:hAnsi="Calibri" w:eastAsia="Calibri" w:cs="Calibri" w:hint="eastAsia"/>
+        </w:rPr>
+        <w:t xml:space="preserve"> </w:t>
+      </w:r>
+      <w:r>
+        <w:rPr>
+          <w:rFonts w:ascii="Calibri" w:hAnsi="Calibri" w:eastAsia="Calibri" w:cs="Calibri" w:hint="eastAsia"/>
+        </w:rPr>
+        <w:t xml:space="preserve">repository checkout, identity check, seed normalization, registered-seed</w:t>
+      </w:r>
+      <w:r>
+        <w:rPr>
+          <w:rFonts w:ascii="Calibri" w:hAnsi="Calibri" w:eastAsia="Calibri" w:cs="Calibri" w:hint="eastAsia"/>
+        </w:rPr>
+        <w:t xml:space="preserve"> </w:t>
+      </w:r>
+      <w:r>
+        <w:rPr>
+          <w:rFonts w:ascii="Calibri" w:hAnsi="Calibri" w:eastAsia="Calibri" w:cs="Calibri" w:hint="eastAsia"/>
+        </w:rPr>
+        <w:t xml:space="preserve">computation, producer, replay, guard, or native stage ran. The other five jobs</w:t>
+      </w:r>
+      <w:r>
+        <w:rPr>
+          <w:rFonts w:ascii="Calibri" w:hAnsi="Calibri" w:eastAsia="Calibri" w:cs="Calibri" w:hint="eastAsia"/>
+        </w:rPr>
+        <w:t xml:space="preserve"> </w:t>
+      </w:r>
+      <w:r>
+        <w:rPr>
+          <w:rFonts w:ascii="Calibri" w:hAnsi="Calibri" w:eastAsia="Calibri" w:cs="Calibri" w:hint="eastAsia"/>
+        </w:rPr>
+        <w:t xml:space="preserve">had zero steps, the artifact inventory was empty, and the claim ref remained at</w:t>
+      </w:r>
+      <w:r>
+        <w:rPr>
+          <w:rFonts w:ascii="Calibri" w:hAnsi="Calibri" w:eastAsia="Calibri" w:cs="Calibri" w:hint="eastAsia"/>
+        </w:rPr>
+        <w:t xml:space="preserve"> </w:t>
+      </w:r>
+      <w:r>
+        <w:rPr>
+          <w:rFonts w:ascii="Calibri" w:hAnsi="Calibri" w:eastAsia="Calibri" w:cs="Calibri" w:hint="eastAsia"/>
+        </w:rPr>
+        <w:t xml:space="preserve">exact S2 rather than a watch-binding commit.</w:t>
+      </w:r>
+    </w:p>
+    <w:p>
+      <w:pPr>
+        <w:pStyle w:val="BodyText"/>
+      </w:pPr>
+      <w:r>
+        <w:rPr>
+          <w:rFonts w:ascii="Calibri" w:hAnsi="Calibri" w:eastAsia="Calibri" w:cs="Calibri" w:hint="eastAsia"/>
+        </w:rPr>
+        <w:t xml:space="preserve">The frozen attempt definition attaches to the sole authorized provider dispatch,</w:t>
+      </w:r>
+      <w:r>
+        <w:rPr>
+          <w:rFonts w:ascii="Calibri" w:hAnsi="Calibri" w:eastAsia="Calibri" w:cs="Calibri" w:hint="eastAsia"/>
+        </w:rPr>
+        <w:t xml:space="preserve"> </w:t>
+      </w:r>
+      <w:r>
+        <w:rPr>
+          <w:rFonts w:ascii="Calibri" w:hAnsi="Calibri" w:eastAsia="Calibri" w:cs="Calibri" w:hint="eastAsia"/>
+        </w:rPr>
+        <w:t xml:space="preserve">not to the first scientific step. The run’s terminal non-success therefore</w:t>
+      </w:r>
+      <w:r>
+        <w:rPr>
+          <w:rFonts w:ascii="Calibri" w:hAnsi="Calibri" w:eastAsia="Calibri" w:cs="Calibri" w:hint="eastAsia"/>
+        </w:rPr>
+        <w:t xml:space="preserve"> </w:t>
+      </w:r>
+      <w:r>
+        <w:rPr>
+          <w:rFonts w:ascii="Calibri" w:hAnsi="Calibri" w:eastAsia="Calibri" w:cs="Calibri" w:hint="eastAsia"/>
+        </w:rPr>
+        <w:t xml:space="preserve">exhausted the follow-up. Independent disposition reviews agreed that a direct</w:t>
+      </w:r>
+      <w:r>
+        <w:rPr>
+          <w:rFonts w:ascii="Calibri" w:hAnsi="Calibri" w:eastAsia="Calibri" w:cs="Calibri" w:hint="eastAsia"/>
+        </w:rPr>
+        <w:t xml:space="preserve"> </w:t>
+      </w:r>
+      <w:r>
+        <w:rPr>
+          <w:rFonts w:ascii="Calibri" w:hAnsi="Calibri" w:eastAsia="Calibri" w:cs="Calibri" w:hint="eastAsia"/>
+        </w:rPr>
+        <w:t xml:space="preserve">rerun or a repaired watcher followed by replacement S1/S2 would be an</w:t>
+      </w:r>
+      <w:r>
+        <w:rPr>
+          <w:rFonts w:ascii="Calibri" w:hAnsi="Calibri" w:eastAsia="Calibri" w:cs="Calibri" w:hint="eastAsia"/>
+        </w:rPr>
+        <w:t xml:space="preserve"> </w:t>
+      </w:r>
+      <w:r>
+        <w:rPr>
+          <w:rFonts w:ascii="Calibri" w:hAnsi="Calibri" w:eastAsia="Calibri" w:cs="Calibri" w:hint="eastAsia"/>
+        </w:rPr>
+        <w:t xml:space="preserve">impermissible outcome-informed second attempt. The exact failing substep remains</w:t>
+      </w:r>
+      <w:r>
+        <w:rPr>
+          <w:rFonts w:ascii="Calibri" w:hAnsi="Calibri" w:eastAsia="Calibri" w:cs="Calibri" w:hint="eastAsia"/>
+        </w:rPr>
+        <w:t xml:space="preserve"> </w:t>
+      </w:r>
+      <w:r>
+        <w:rPr>
+          <w:rFonts w:ascii="Calibri" w:hAnsi="Calibri" w:eastAsia="Calibri" w:cs="Calibri" w:hint="eastAsia"/>
+        </w:rPr>
+        <w:t xml:space="preserve">unknown because the controller did not persist its nested exception chain; the</w:t>
+      </w:r>
+      <w:r>
+        <w:rPr>
+          <w:rFonts w:ascii="Calibri" w:hAnsi="Calibri" w:eastAsia="Calibri" w:cs="Calibri" w:hint="eastAsia"/>
+        </w:rPr>
+        <w:t xml:space="preserve"> </w:t>
+      </w:r>
+      <w:r>
+        <w:rPr>
+          <w:rFonts w:ascii="Calibri" w:hAnsi="Calibri" w:eastAsia="Calibri" w:cs="Calibri" w:hint="eastAsia"/>
+        </w:rPr>
+        <w:t xml:space="preserve">unchanged ref alone cannot distinguish initial live-read construction,</w:t>
+      </w:r>
+      <w:r>
+        <w:rPr>
+          <w:rFonts w:ascii="Calibri" w:hAnsi="Calibri" w:eastAsia="Calibri" w:cs="Calibri" w:hint="eastAsia"/>
+        </w:rPr>
+        <w:t xml:space="preserve"> </w:t>
+      </w:r>
+      <w:r>
+        <w:rPr>
+          <w:rFonts w:ascii="Calibri" w:hAnsi="Calibri" w:eastAsia="Calibri" w:cs="Calibri" w:hint="eastAsia"/>
+        </w:rPr>
+        <w:t xml:space="preserve">message-commit creation, or compare-and-swap failure. This uncertainty is a</w:t>
+      </w:r>
+      <w:r>
+        <w:rPr>
+          <w:rFonts w:ascii="Calibri" w:hAnsi="Calibri" w:eastAsia="Calibri" w:cs="Calibri" w:hint="eastAsia"/>
+        </w:rPr>
+        <w:t xml:space="preserve"> </w:t>
+      </w:r>
+      <w:r>
+        <w:rPr>
+          <w:rFonts w:ascii="Calibri" w:hAnsi="Calibri" w:eastAsia="Calibri" w:cs="Calibri" w:hint="eastAsia"/>
+        </w:rPr>
+        <w:t xml:space="preserve">control-plane limitation, not evidence about a maintenance strategy.</w:t>
+      </w:r>
+    </w:p>
     <w:bookmarkEnd w:id="45"/>
-    <w:bookmarkStart w:id="46" w:name="limitations"/>
+    <w:bookmarkEnd w:id="46"/>
+    <w:bookmarkStart w:id="47" w:name="limitations"/>
     <w:p>
       <w:pPr>
         <w:pStyle w:val="Heading1"/>
@@ -17089,9 +18667,69 @@
         </w:rPr>
         <w:t xml:space="preserve">changes, and selective reuse of qualification fragments are prohibited.</w:t>
       </w:r>
+      <w:r>
+        <w:rPr>
+          <w:rFonts w:ascii="Calibri" w:hAnsi="Calibri" w:eastAsia="Calibri" w:cs="Calibri" w:hint="eastAsia"/>
+        </w:rPr>
+        <w:t xml:space="preserve"> </w:t>
+      </w:r>
+      <w:r>
+        <w:rPr>
+          <w:rFonts w:ascii="Calibri" w:hAnsi="Calibri" w:eastAsia="Calibri" w:cs="Calibri" w:hint="eastAsia"/>
+        </w:rPr>
+        <w:t xml:space="preserve">The later follow-up also ended before repository or seed execution. It exposes a</w:t>
+      </w:r>
+      <w:r>
+        <w:rPr>
+          <w:rFonts w:ascii="Calibri" w:hAnsi="Calibri" w:eastAsia="Calibri" w:cs="Calibri" w:hint="eastAsia"/>
+        </w:rPr>
+        <w:t xml:space="preserve"> </w:t>
+      </w:r>
+      <w:r>
+        <w:rPr>
+          <w:rFonts w:ascii="Calibri" w:hAnsi="Calibri" w:eastAsia="Calibri" w:cs="Calibri" w:hint="eastAsia"/>
+        </w:rPr>
+        <w:t xml:space="preserve">watcher-admission observability defect because the nested provider exception was</w:t>
+      </w:r>
+      <w:r>
+        <w:rPr>
+          <w:rFonts w:ascii="Calibri" w:hAnsi="Calibri" w:eastAsia="Calibri" w:cs="Calibri" w:hint="eastAsia"/>
+        </w:rPr>
+        <w:t xml:space="preserve"> </w:t>
+      </w:r>
+      <w:r>
+        <w:rPr>
+          <w:rFonts w:ascii="Calibri" w:hAnsi="Calibri" w:eastAsia="Calibri" w:cs="Calibri" w:hint="eastAsia"/>
+        </w:rPr>
+        <w:t xml:space="preserve">not retained; it does not identify the failing substep, demonstrate a scientific</w:t>
+      </w:r>
+      <w:r>
+        <w:rPr>
+          <w:rFonts w:ascii="Calibri" w:hAnsi="Calibri" w:eastAsia="Calibri" w:cs="Calibri" w:hint="eastAsia"/>
+        </w:rPr>
+        <w:t xml:space="preserve"> </w:t>
+      </w:r>
+      <w:r>
+        <w:rPr>
+          <w:rFonts w:ascii="Calibri" w:hAnsi="Calibri" w:eastAsia="Calibri" w:cs="Calibri" w:hint="eastAsia"/>
+        </w:rPr>
+        <w:t xml:space="preserve">timeout, or justify another attempt. Future independent studies should exercise</w:t>
+      </w:r>
+      <w:r>
+        <w:rPr>
+          <w:rFonts w:ascii="Calibri" w:hAnsi="Calibri" w:eastAsia="Calibri" w:cs="Calibri" w:hint="eastAsia"/>
+        </w:rPr>
+        <w:t xml:space="preserve"> </w:t>
+      </w:r>
+      <w:r>
+        <w:rPr>
+          <w:rFonts w:ascii="Calibri" w:hAnsi="Calibri" w:eastAsia="Calibri" w:cs="Calibri" w:hint="eastAsia"/>
+        </w:rPr>
+        <w:t xml:space="preserve">and log that control-plane seam before consuming a one-shot capability.</w:t>
+      </w:r>
     </w:p>
-    <w:bookmarkEnd w:id="46"/>
-    <w:bookmarkStart w:id="47" w:name="conclusion"/>
+    <w:bookmarkEnd w:id="47"/>
+    <w:bookmarkStart w:id="48" w:name="conclusion"/>
     <w:p>
       <w:pPr>
         <w:pStyle w:val="Heading1"/>
@@ -17159,71 +18797,107 @@
         <w:rPr>
           <w:rFonts w:ascii="Calibri" w:hAnsi="Calibri" w:eastAsia="Calibri" w:cs="Calibri" w:hint="eastAsia"/>
         </w:rPr>
-        <w:t xml:space="preserve">mechanisms, and a fail-closed paired evaluation. The bounded attempt also shows</w:t>
-      </w:r>
-      <w:r>
-        <w:rPr>
-          <w:rFonts w:ascii="Calibri" w:hAnsi="Calibri" w:eastAsia="Calibri" w:cs="Calibri" w:hint="eastAsia"/>
-        </w:rPr>
-        <w:t xml:space="preserve"> </w:t>
-      </w:r>
-      <w:r>
-        <w:rPr>
-          <w:rFonts w:ascii="Calibri" w:hAnsi="Calibri" w:eastAsia="Calibri" w:cs="Calibri" w:hint="eastAsia"/>
-        </w:rPr>
-        <w:t xml:space="preserve">the consequence of treating feasibility gates as real falsifiers: when the sole</w:t>
-      </w:r>
-      <w:r>
-        <w:rPr>
-          <w:rFonts w:ascii="Calibri" w:hAnsi="Calibri" w:eastAsia="Calibri" w:cs="Calibri" w:hint="eastAsia"/>
-        </w:rPr>
-        <w:t xml:space="preserve"> </w:t>
-      </w:r>
-      <w:r>
-        <w:rPr>
-          <w:rFonts w:ascii="Calibri" w:hAnsi="Calibri" w:eastAsia="Calibri" w:cs="Calibri" w:hint="eastAsia"/>
-        </w:rPr>
-        <w:t xml:space="preserve">qualification did not reach its combined guard by the frozen deadline, the</w:t>
-      </w:r>
-      <w:r>
-        <w:rPr>
-          <w:rFonts w:ascii="Calibri" w:hAnsi="Calibri" w:eastAsia="Calibri" w:cs="Calibri" w:hint="eastAsia"/>
-        </w:rPr>
-        <w:t xml:space="preserve"> </w:t>
-      </w:r>
-      <w:r>
-        <w:rPr>
-          <w:rFonts w:ascii="Calibri" w:hAnsi="Calibri" w:eastAsia="Calibri" w:cs="Calibri" w:hint="eastAsia"/>
-        </w:rPr>
-        <w:t xml:space="preserve">system produced no authority and the formal campaign did not run. The resulting</w:t>
-      </w:r>
-      <w:r>
-        <w:rPr>
-          <w:rFonts w:ascii="Calibri" w:hAnsi="Calibri" w:eastAsia="Calibri" w:cs="Calibri" w:hint="eastAsia"/>
-        </w:rPr>
-        <w:t xml:space="preserve"> </w:t>
-      </w:r>
-      <w:r>
-        <w:rPr>
-          <w:rFonts w:ascii="Calibri" w:hAnsi="Calibri" w:eastAsia="Calibri" w:cs="Calibri" w:hint="eastAsia"/>
-        </w:rPr>
-        <w:t xml:space="preserve">Route C manuscript therefore makes protocol and evidence-boundary claims, not</w:t>
-      </w:r>
-      <w:r>
-        <w:rPr>
-          <w:rFonts w:ascii="Calibri" w:hAnsi="Calibri" w:eastAsia="Calibri" w:cs="Calibri" w:hint="eastAsia"/>
-        </w:rPr>
-        <w:t xml:space="preserve"> </w:t>
-      </w:r>
-      <w:r>
-        <w:rPr>
-          <w:rFonts w:ascii="Calibri" w:hAnsi="Calibri" w:eastAsia="Calibri" w:cs="Calibri" w:hint="eastAsia"/>
-        </w:rPr>
-        <w:t xml:space="preserve">comparative performance claims.</w:t>
+        <w:t xml:space="preserve">mechanisms, and a fail-closed paired evaluation. The primary bounded attempt</w:t>
+      </w:r>
+      <w:r>
+        <w:rPr>
+          <w:rFonts w:ascii="Calibri" w:hAnsi="Calibri" w:eastAsia="Calibri" w:cs="Calibri" w:hint="eastAsia"/>
+        </w:rPr>
+        <w:t xml:space="preserve"> </w:t>
+      </w:r>
+      <w:r>
+        <w:rPr>
+          <w:rFonts w:ascii="Calibri" w:hAnsi="Calibri" w:eastAsia="Calibri" w:cs="Calibri" w:hint="eastAsia"/>
+        </w:rPr>
+        <w:t xml:space="preserve">shows the consequence of treating feasibility gates as real falsifiers: when</w:t>
+      </w:r>
+      <w:r>
+        <w:rPr>
+          <w:rFonts w:ascii="Calibri" w:hAnsi="Calibri" w:eastAsia="Calibri" w:cs="Calibri" w:hint="eastAsia"/>
+        </w:rPr>
+        <w:t xml:space="preserve"> </w:t>
+      </w:r>
+      <w:r>
+        <w:rPr>
+          <w:rFonts w:ascii="Calibri" w:hAnsi="Calibri" w:eastAsia="Calibri" w:cs="Calibri" w:hint="eastAsia"/>
+        </w:rPr>
+        <w:t xml:space="preserve">the qualification did not reach its combined guard by the frozen deadline, the</w:t>
+      </w:r>
+      <w:r>
+        <w:rPr>
+          <w:rFonts w:ascii="Calibri" w:hAnsi="Calibri" w:eastAsia="Calibri" w:cs="Calibri" w:hint="eastAsia"/>
+        </w:rPr>
+        <w:t xml:space="preserve"> </w:t>
+      </w:r>
+      <w:r>
+        <w:rPr>
+          <w:rFonts w:ascii="Calibri" w:hAnsi="Calibri" w:eastAsia="Calibri" w:cs="Calibri" w:hint="eastAsia"/>
+        </w:rPr>
+        <w:t xml:space="preserve">system produced no authority and the formal campaign did not run. A separately</w:t>
+      </w:r>
+      <w:r>
+        <w:rPr>
+          <w:rFonts w:ascii="Calibri" w:hAnsi="Calibri" w:eastAsia="Calibri" w:cs="Calibri" w:hint="eastAsia"/>
+        </w:rPr>
+        <w:t xml:space="preserve"> </w:t>
+      </w:r>
+      <w:r>
+        <w:rPr>
+          <w:rFonts w:ascii="Calibri" w:hAnsi="Calibri" w:eastAsia="Calibri" w:cs="Calibri" w:hint="eastAsia"/>
+        </w:rPr>
+        <w:t xml:space="preserve">preregistered follow-up later passed its prerequisite controls but failed while</w:t>
+      </w:r>
+      <w:r>
+        <w:rPr>
+          <w:rFonts w:ascii="Calibri" w:hAnsi="Calibri" w:eastAsia="Calibri" w:cs="Calibri" w:hint="eastAsia"/>
+        </w:rPr>
+        <w:t xml:space="preserve"> </w:t>
+      </w:r>
+      <w:r>
+        <w:rPr>
+          <w:rFonts w:ascii="Calibri" w:hAnsi="Calibri" w:eastAsia="Calibri" w:cs="Calibri" w:hint="eastAsia"/>
+        </w:rPr>
+        <w:t xml:space="preserve">arming the one-shot watcher before scientific execution; its provider run and</w:t>
+      </w:r>
+      <w:r>
+        <w:rPr>
+          <w:rFonts w:ascii="Calibri" w:hAnsi="Calibri" w:eastAsia="Calibri" w:cs="Calibri" w:hint="eastAsia"/>
+        </w:rPr>
+        <w:t xml:space="preserve"> </w:t>
+      </w:r>
+      <w:r>
+        <w:rPr>
+          <w:rFonts w:ascii="Calibri" w:hAnsi="Calibri" w:eastAsia="Calibri" w:cs="Calibri" w:hint="eastAsia"/>
+        </w:rPr>
+        <w:t xml:space="preserve">zero-artifact record likewise terminated without formal authority. The</w:t>
+      </w:r>
+      <w:r>
+        <w:rPr>
+          <w:rFonts w:ascii="Calibri" w:hAnsi="Calibri" w:eastAsia="Calibri" w:cs="Calibri" w:hint="eastAsia"/>
+        </w:rPr>
+        <w:t xml:space="preserve"> </w:t>
+      </w:r>
+      <w:r>
+        <w:rPr>
+          <w:rFonts w:ascii="Calibri" w:hAnsi="Calibri" w:eastAsia="Calibri" w:cs="Calibri" w:hint="eastAsia"/>
+        </w:rPr>
+        <w:t xml:space="preserve">resulting Route C manuscript therefore makes protocol and evidence-boundary</w:t>
+      </w:r>
+      <w:r>
+        <w:rPr>
+          <w:rFonts w:ascii="Calibri" w:hAnsi="Calibri" w:eastAsia="Calibri" w:cs="Calibri" w:hint="eastAsia"/>
+        </w:rPr>
+        <w:t xml:space="preserve"> </w:t>
+      </w:r>
+      <w:r>
+        <w:rPr>
+          <w:rFonts w:ascii="Calibri" w:hAnsi="Calibri" w:eastAsia="Calibri" w:cs="Calibri" w:hint="eastAsia"/>
+        </w:rPr>
+        <w:t xml:space="preserve">claims, not comparative performance claims.</w:t>
       </w:r>
     </w:p>
-    <w:bookmarkEnd w:id="47"/>
-    <w:bookmarkStart w:id="48" w:name="data-and-code-availability"/>
+    <w:bookmarkEnd w:id="48"/>
+    <w:bookmarkStart w:id="49" w:name="data-and-code-availability"/>
     <w:p>
       <w:pPr>
         <w:pStyle w:val="Heading1"/>
@@ -17243,107 +18917,119 @@
         <w:rPr>
           <w:rFonts w:ascii="Calibri" w:hAnsi="Calibri" w:eastAsia="Calibri" w:cs="Calibri" w:hint="eastAsia"/>
         </w:rPr>
-        <w:t xml:space="preserve">The Route C package will identify exact S1 and S2; the closed Behavior Sets and</w:t>
-      </w:r>
-      <w:r>
-        <w:rPr>
-          <w:rFonts w:ascii="Calibri" w:hAnsi="Calibri" w:eastAsia="Calibri" w:cs="Calibri" w:hint="eastAsia"/>
-        </w:rPr>
-        <w:t xml:space="preserve"> </w:t>
-      </w:r>
-      <w:r>
-        <w:rPr>
-          <w:rFonts w:ascii="Calibri" w:hAnsi="Calibri" w:eastAsia="Calibri" w:cs="Calibri" w:hint="eastAsia"/>
-        </w:rPr>
-        <w:t xml:space="preserve">compatibility receipt; exact-head CI, PRE-S1, and descriptive-registration run</w:t>
-      </w:r>
-      <w:r>
-        <w:rPr>
-          <w:rFonts w:ascii="Calibri" w:hAnsi="Calibri" w:eastAsia="Calibri" w:cs="Calibri" w:hint="eastAsia"/>
-        </w:rPr>
-        <w:t xml:space="preserve"> </w:t>
-      </w:r>
-      <w:r>
-        <w:rPr>
-          <w:rFonts w:ascii="Calibri" w:hAnsi="Calibri" w:eastAsia="Calibri" w:cs="Calibri" w:hint="eastAsia"/>
-        </w:rPr>
-        <w:t xml:space="preserve">identities; the qualification workflow disposition; the frozen schemas,</w:t>
-      </w:r>
-      <w:r>
-        <w:rPr>
-          <w:rFonts w:ascii="Calibri" w:hAnsi="Calibri" w:eastAsia="Calibri" w:cs="Calibri" w:hint="eastAsia"/>
-        </w:rPr>
-        <w:t xml:space="preserve"> </w:t>
-      </w:r>
-      <w:r>
-        <w:rPr>
-          <w:rFonts w:ascii="Calibri" w:hAnsi="Calibri" w:eastAsia="Calibri" w:cs="Calibri" w:hint="eastAsia"/>
-        </w:rPr>
-        <w:t xml:space="preserve">functional propositions, source-conformance record, and verification code. It</w:t>
-      </w:r>
-      <w:r>
-        <w:rPr>
-          <w:rFonts w:ascii="Calibri" w:hAnsi="Calibri" w:eastAsia="Calibri" w:cs="Calibri" w:hint="eastAsia"/>
-        </w:rPr>
-        <w:t xml:space="preserve"> </w:t>
-      </w:r>
-      <w:r>
-        <w:rPr>
-          <w:rFonts w:ascii="Calibri" w:hAnsi="Calibri" w:eastAsia="Calibri" w:cs="Calibri" w:hint="eastAsia"/>
-        </w:rPr>
-        <w:t xml:space="preserve">will explicitly state that the one-day q1 handoff was non-evidence and that no</w:t>
-      </w:r>
-      <w:r>
-        <w:rPr>
-          <w:rFonts w:ascii="Calibri" w:hAnsi="Calibri" w:eastAsia="Calibri" w:cs="Calibri" w:hint="eastAsia"/>
-        </w:rPr>
-        <w:t xml:space="preserve"> </w:t>
-      </w:r>
-      <w:r>
-        <w:rPr>
-          <w:rFonts w:ascii="Calibri" w:hAnsi="Calibri" w:eastAsia="Calibri" w:cs="Calibri" w:hint="eastAsia"/>
-        </w:rPr>
-        <w:t xml:space="preserve">acquisition, formal, terminal, aggregate, or analysis artifact was created. No</w:t>
-      </w:r>
-      <w:r>
-        <w:rPr>
-          <w:rFonts w:ascii="Calibri" w:hAnsi="Calibri" w:eastAsia="Calibri" w:cs="Calibri" w:hint="eastAsia"/>
-        </w:rPr>
-        <w:t xml:space="preserve"> </w:t>
-      </w:r>
-      <w:r>
-        <w:rPr>
-          <w:rFonts w:ascii="Calibri" w:hAnsi="Calibri" w:eastAsia="Calibri" w:cs="Calibri" w:hint="eastAsia"/>
-        </w:rPr>
-        <w:t xml:space="preserve">empirical artifact or archival DOI is claimed by this working draft. This</w:t>
-      </w:r>
-      <w:r>
-        <w:rPr>
-          <w:rFonts w:ascii="Calibri" w:hAnsi="Calibri" w:eastAsia="Calibri" w:cs="Calibri" w:hint="eastAsia"/>
-        </w:rPr>
-        <w:t xml:space="preserve"> </w:t>
-      </w:r>
-      <w:r>
-        <w:rPr>
-          <w:rFonts w:ascii="Calibri" w:hAnsi="Calibri" w:eastAsia="Calibri" w:cs="Calibri" w:hint="eastAsia"/>
-        </w:rPr>
-        <w:t xml:space="preserve">section must be replaced with the accepted repository release and archival DOI</w:t>
-      </w:r>
-      <w:r>
-        <w:rPr>
-          <w:rFonts w:ascii="Calibri" w:hAnsi="Calibri" w:eastAsia="Calibri" w:cs="Calibri" w:hint="eastAsia"/>
-        </w:rPr>
-        <w:t xml:space="preserve"> </w:t>
-      </w:r>
-      <w:r>
-        <w:rPr>
-          <w:rFonts w:ascii="Calibri" w:hAnsi="Calibri" w:eastAsia="Calibri" w:cs="Calibri" w:hint="eastAsia"/>
-        </w:rPr>
-        <w:t xml:space="preserve">before submission.</w:t>
+        <w:t xml:space="preserve">The Route C package will identify the primary and follow-up S1/S2 pairs; their</w:t>
+      </w:r>
+      <w:r>
+        <w:rPr>
+          <w:rFonts w:ascii="Calibri" w:hAnsi="Calibri" w:eastAsia="Calibri" w:cs="Calibri" w:hint="eastAsia"/>
+        </w:rPr>
+        <w:t xml:space="preserve"> </w:t>
+      </w:r>
+      <w:r>
+        <w:rPr>
+          <w:rFonts w:ascii="Calibri" w:hAnsi="Calibri" w:eastAsia="Calibri" w:cs="Calibri" w:hint="eastAsia"/>
+        </w:rPr>
+        <w:t xml:space="preserve">closed Behavior Sets and compatibility receipts; exact-head CI, PRE-S1,</w:t>
+      </w:r>
+      <w:r>
+        <w:rPr>
+          <w:rFonts w:ascii="Calibri" w:hAnsi="Calibri" w:eastAsia="Calibri" w:cs="Calibri" w:hint="eastAsia"/>
+        </w:rPr>
+        <w:t xml:space="preserve"> </w:t>
+      </w:r>
+      <w:r>
+        <w:rPr>
+          <w:rFonts w:ascii="Calibri" w:hAnsi="Calibri" w:eastAsia="Calibri" w:cs="Calibri" w:hint="eastAsia"/>
+        </w:rPr>
+        <w:t xml:space="preserve">descriptive-registration, source-anchor, and independent-review identities; both</w:t>
+      </w:r>
+      <w:r>
+        <w:rPr>
+          <w:rFonts w:ascii="Calibri" w:hAnsi="Calibri" w:eastAsia="Calibri" w:cs="Calibri" w:hint="eastAsia"/>
+        </w:rPr>
+        <w:t xml:space="preserve"> </w:t>
+      </w:r>
+      <w:r>
+        <w:rPr>
+          <w:rFonts w:ascii="Calibri" w:hAnsi="Calibri" w:eastAsia="Calibri" w:cs="Calibri" w:hint="eastAsia"/>
+        </w:rPr>
+        <w:t xml:space="preserve">qualification dispositions; the frozen schemas, functional propositions,</w:t>
+      </w:r>
+      <w:r>
+        <w:rPr>
+          <w:rFonts w:ascii="Calibri" w:hAnsi="Calibri" w:eastAsia="Calibri" w:cs="Calibri" w:hint="eastAsia"/>
+        </w:rPr>
+        <w:t xml:space="preserve"> </w:t>
+      </w:r>
+      <w:r>
+        <w:rPr>
+          <w:rFonts w:ascii="Calibri" w:hAnsi="Calibri" w:eastAsia="Calibri" w:cs="Calibri" w:hint="eastAsia"/>
+        </w:rPr>
+        <w:t xml:space="preserve">source-conformance record, and verification code. It will explicitly state that</w:t>
+      </w:r>
+      <w:r>
+        <w:rPr>
+          <w:rFonts w:ascii="Calibri" w:hAnsi="Calibri" w:eastAsia="Calibri" w:cs="Calibri" w:hint="eastAsia"/>
+        </w:rPr>
+        <w:t xml:space="preserve"> </w:t>
+      </w:r>
+      <w:r>
+        <w:rPr>
+          <w:rFonts w:ascii="Calibri" w:hAnsi="Calibri" w:eastAsia="Calibri" w:cs="Calibri" w:hint="eastAsia"/>
+        </w:rPr>
+        <w:t xml:space="preserve">the primary one-day q1 handoff was non-evidence, the follow-up produced no</w:t>
+      </w:r>
+      <w:r>
+        <w:rPr>
+          <w:rFonts w:ascii="Calibri" w:hAnsi="Calibri" w:eastAsia="Calibri" w:cs="Calibri" w:hint="eastAsia"/>
+        </w:rPr>
+        <w:t xml:space="preserve"> </w:t>
+      </w:r>
+      <w:r>
+        <w:rPr>
+          <w:rFonts w:ascii="Calibri" w:hAnsi="Calibri" w:eastAsia="Calibri" w:cs="Calibri" w:hint="eastAsia"/>
+        </w:rPr>
+        <w:t xml:space="preserve">artifact at all, and no acquisition, formal, terminal, aggregate, or analysis</w:t>
+      </w:r>
+      <w:r>
+        <w:rPr>
+          <w:rFonts w:ascii="Calibri" w:hAnsi="Calibri" w:eastAsia="Calibri" w:cs="Calibri" w:hint="eastAsia"/>
+        </w:rPr>
+        <w:t xml:space="preserve"> </w:t>
+      </w:r>
+      <w:r>
+        <w:rPr>
+          <w:rFonts w:ascii="Calibri" w:hAnsi="Calibri" w:eastAsia="Calibri" w:cs="Calibri" w:hint="eastAsia"/>
+        </w:rPr>
+        <w:t xml:space="preserve">artifact was created. No empirical artifact or archival DOI is claimed by this</w:t>
+      </w:r>
+      <w:r>
+        <w:rPr>
+          <w:rFonts w:ascii="Calibri" w:hAnsi="Calibri" w:eastAsia="Calibri" w:cs="Calibri" w:hint="eastAsia"/>
+        </w:rPr>
+        <w:t xml:space="preserve"> </w:t>
+      </w:r>
+      <w:r>
+        <w:rPr>
+          <w:rFonts w:ascii="Calibri" w:hAnsi="Calibri" w:eastAsia="Calibri" w:cs="Calibri" w:hint="eastAsia"/>
+        </w:rPr>
+        <w:t xml:space="preserve">working draft. This section must be replaced with the accepted repository</w:t>
+      </w:r>
+      <w:r>
+        <w:rPr>
+          <w:rFonts w:ascii="Calibri" w:hAnsi="Calibri" w:eastAsia="Calibri" w:cs="Calibri" w:hint="eastAsia"/>
+        </w:rPr>
+        <w:t xml:space="preserve"> </w:t>
+      </w:r>
+      <w:r>
+        <w:rPr>
+          <w:rFonts w:ascii="Calibri" w:hAnsi="Calibri" w:eastAsia="Calibri" w:cs="Calibri" w:hint="eastAsia"/>
+        </w:rPr>
+        <w:t xml:space="preserve">release and archival DOI before submission.</w:t>
       </w:r>
     </w:p>
-    <w:bookmarkEnd w:id="48"/>
-    <w:bookmarkStart w:id="49" w:name="statements-and-declarations"/>
+    <w:bookmarkEnd w:id="49"/>
+    <w:bookmarkStart w:id="50" w:name="statements-and-declarations"/>
     <w:p>
       <w:pPr>
         <w:pStyle w:val="Heading1"/>
@@ -17551,8 +19237,8 @@
         <w:t xml:space="preserve">publisher policy at submission.</w:t>
       </w:r>
     </w:p>
-    <w:bookmarkEnd w:id="49"/>
-    <w:bookmarkStart w:id="104" w:name="references"/>
+    <w:bookmarkEnd w:id="50"/>
+    <w:bookmarkStart w:id="105" w:name="references"/>
     <w:p>
       <w:pPr>
         <w:pStyle w:val="Heading1"/>
@@ -17580,7 +19266,7 @@
         </w:rPr>
         <w:t xml:space="preserve"> </w:t>
       </w:r>
-      <w:hyperlink r:id="rId50">
+      <w:hyperlink r:id="rId51">
         <w:r>
           <w:rPr>
             <w:rStyle w:val="VerbatimChar"/>
@@ -17619,8 +19305,8 @@
         <w:t xml:space="preserve">submitted with citation keys left unresolved.</w:t>
       </w:r>
     </w:p>
-    <w:bookmarkStart w:id="103" w:name="refs"/>
-    <w:bookmarkStart w:id="52" w:name="ref-bell2008spmvcuda"/>
+    <w:bookmarkStart w:id="104" w:name="refs"/>
+    <w:bookmarkStart w:id="53" w:name="ref-bell2008spmvcuda"/>
     <w:p>
       <w:pPr>
         <w:pStyle w:val="Bibliography"/>
@@ -17657,7 +19343,7 @@
         </w:rPr>
         <w:t xml:space="preserve"> </w:t>
       </w:r>
-      <w:hyperlink r:id="rId51">
+      <w:hyperlink r:id="rId52">
         <w:r>
           <w:rPr>
             <w:rStyle w:val="Hyperlink"/>
@@ -17672,8 +19358,8 @@
         <w:t xml:space="preserve">.</w:t>
       </w:r>
     </w:p>
-    <w:bookmarkEnd w:id="52"/>
-    <w:bookmarkStart w:id="54" w:name="ref-bonawitz2017secureagg"/>
+    <w:bookmarkEnd w:id="53"/>
+    <w:bookmarkStart w:id="55" w:name="ref-bonawitz2017secureagg"/>
     <w:p>
       <w:pPr>
         <w:pStyle w:val="Bibliography"/>
@@ -17722,7 +19408,7 @@
         </w:rPr>
         <w:t xml:space="preserve"> </w:t>
       </w:r>
-      <w:hyperlink r:id="rId53">
+      <w:hyperlink r:id="rId54">
         <w:r>
           <w:rPr>
             <w:rStyle w:val="Hyperlink"/>
@@ -17737,8 +19423,8 @@
         <w:t xml:space="preserve">.</w:t>
       </w:r>
     </w:p>
-    <w:bookmarkEnd w:id="54"/>
-    <w:bookmarkStart w:id="56" w:name="ref-cash2014dynamic"/>
+    <w:bookmarkEnd w:id="55"/>
+    <w:bookmarkStart w:id="57" w:name="ref-cash2014dynamic"/>
     <w:p>
       <w:pPr>
         <w:pStyle w:val="Bibliography"/>
@@ -17787,7 +19473,7 @@
         </w:rPr>
         <w:t xml:space="preserve"> </w:t>
       </w:r>
-      <w:hyperlink r:id="rId55">
+      <w:hyperlink r:id="rId56">
         <w:r>
           <w:rPr>
             <w:rStyle w:val="Hyperlink"/>
@@ -17802,8 +19488,8 @@
         <w:t xml:space="preserve">.</w:t>
       </w:r>
     </w:p>
-    <w:bookmarkEnd w:id="56"/>
-    <w:bookmarkStart w:id="58" w:name="ref-chen2026ckksauthtree"/>
+    <w:bookmarkEnd w:id="57"/>
+    <w:bookmarkStart w:id="59" w:name="ref-chen2026ckksauthtree"/>
     <w:p>
       <w:pPr>
         <w:pStyle w:val="Bibliography"/>
@@ -17858,7 +19544,7 @@
         </w:rPr>
         <w:t xml:space="preserve"> </w:t>
       </w:r>
-      <w:hyperlink r:id="rId57">
+      <w:hyperlink r:id="rId58">
         <w:r>
           <w:rPr>
             <w:rStyle w:val="Hyperlink"/>
@@ -17873,8 +19559,8 @@
         <w:t xml:space="preserve">.</w:t>
       </w:r>
     </w:p>
-    <w:bookmarkEnd w:id="58"/>
-    <w:bookmarkStart w:id="60" w:name="ref-crooks2018obladi"/>
+    <w:bookmarkEnd w:id="59"/>
+    <w:bookmarkStart w:id="61" w:name="ref-crooks2018obladi"/>
     <w:p>
       <w:pPr>
         <w:pStyle w:val="Bibliography"/>
@@ -17923,7 +19609,7 @@
         </w:rPr>
         <w:t xml:space="preserve"> </w:t>
       </w:r>
-      <w:hyperlink r:id="rId59">
+      <w:hyperlink r:id="rId60">
         <w:r>
           <w:rPr>
             <w:rStyle w:val="Hyperlink"/>
@@ -17938,8 +19624,8 @@
         <w:t xml:space="preserve">.</w:t>
       </w:r>
     </w:p>
-    <w:bookmarkEnd w:id="60"/>
-    <w:bookmarkStart w:id="62" w:name="ref-dagata2026gpu"/>
+    <w:bookmarkEnd w:id="61"/>
+    <w:bookmarkStart w:id="63" w:name="ref-dagata2026gpu"/>
     <w:p>
       <w:pPr>
         <w:pStyle w:val="Bibliography"/>
@@ -18024,7 +19710,7 @@
         </w:rPr>
         <w:t xml:space="preserve"> </w:t>
       </w:r>
-      <w:hyperlink r:id="rId61">
+      <w:hyperlink r:id="rId62">
         <w:r>
           <w:rPr>
             <w:rStyle w:val="Hyperlink"/>
@@ -18039,8 +19725,8 @@
         <w:t xml:space="preserve">.</w:t>
       </w:r>
     </w:p>
-    <w:bookmarkEnd w:id="62"/>
-    <w:bookmarkStart w:id="64" w:name="ref-damie2025secure"/>
+    <w:bookmarkEnd w:id="63"/>
+    <w:bookmarkStart w:id="65" w:name="ref-damie2025secure"/>
     <w:p>
       <w:pPr>
         <w:pStyle w:val="Bibliography"/>
@@ -18077,7 +19763,7 @@
         </w:rPr>
         <w:t xml:space="preserve"> </w:t>
       </w:r>
-      <w:hyperlink r:id="rId63">
+      <w:hyperlink r:id="rId64">
         <w:r>
           <w:rPr>
             <w:rStyle w:val="Hyperlink"/>
@@ -18092,8 +19778,8 @@
         <w:t xml:space="preserve">.</w:t>
       </w:r>
     </w:p>
-    <w:bookmarkEnd w:id="64"/>
-    <w:bookmarkStart w:id="66" w:name="ref-fan2012somewhat"/>
+    <w:bookmarkEnd w:id="65"/>
+    <w:bookmarkStart w:id="67" w:name="ref-fan2012somewhat"/>
     <w:p>
       <w:pPr>
         <w:pStyle w:val="Bibliography"/>
@@ -18130,7 +19816,7 @@
         </w:rPr>
         <w:t xml:space="preserve"> </w:t>
       </w:r>
-      <w:hyperlink r:id="rId65">
+      <w:hyperlink r:id="rId66">
         <w:r>
           <w:rPr>
             <w:rStyle w:val="Hyperlink"/>
@@ -18145,8 +19831,8 @@
         <w:t xml:space="preserve">.</w:t>
       </w:r>
     </w:p>
-    <w:bookmarkEnd w:id="66"/>
-    <w:bookmarkStart w:id="68" w:name="ref-ferguson2025unstructured"/>
+    <w:bookmarkEnd w:id="67"/>
+    <w:bookmarkStart w:id="69" w:name="ref-ferguson2025unstructured"/>
     <w:p>
       <w:pPr>
         <w:pStyle w:val="Bibliography"/>
@@ -18195,7 +19881,7 @@
         </w:rPr>
         <w:t xml:space="preserve"> </w:t>
       </w:r>
-      <w:hyperlink r:id="rId67">
+      <w:hyperlink r:id="rId68">
         <w:r>
           <w:rPr>
             <w:rStyle w:val="Hyperlink"/>
@@ -18210,8 +19896,8 @@
         <w:t xml:space="preserve">.</w:t>
       </w:r>
     </w:p>
-    <w:bookmarkEnd w:id="68"/>
-    <w:bookmarkStart w:id="70" w:name="ref-gao2026cssc"/>
+    <w:bookmarkEnd w:id="69"/>
+    <w:bookmarkStart w:id="71" w:name="ref-gao2026cssc"/>
     <w:p>
       <w:pPr>
         <w:pStyle w:val="Bibliography"/>
@@ -18266,7 +19952,7 @@
         </w:rPr>
         <w:t xml:space="preserve"> </w:t>
       </w:r>
-      <w:hyperlink r:id="rId69">
+      <w:hyperlink r:id="rId70">
         <w:r>
           <w:rPr>
             <w:rStyle w:val="Hyperlink"/>
@@ -18281,8 +19967,8 @@
         <w:t xml:space="preserve">.</w:t>
       </w:r>
     </w:p>
-    <w:bookmarkEnd w:id="70"/>
-    <w:bookmarkStart w:id="72" w:name="ref-halevi2014algorithms"/>
+    <w:bookmarkEnd w:id="71"/>
+    <w:bookmarkStart w:id="73" w:name="ref-halevi2014algorithms"/>
     <w:p>
       <w:pPr>
         <w:pStyle w:val="Bibliography"/>
@@ -18393,7 +20079,7 @@
         </w:rPr>
         <w:t xml:space="preserve"> </w:t>
       </w:r>
-      <w:hyperlink r:id="rId71">
+      <w:hyperlink r:id="rId72">
         <w:r>
           <w:rPr>
             <w:rStyle w:val="Hyperlink"/>
@@ -18408,8 +20094,8 @@
         <w:t xml:space="preserve">.</w:t>
       </w:r>
     </w:p>
-    <w:bookmarkEnd w:id="72"/>
-    <w:bookmarkStart w:id="74" w:name="ref-he2024rhombus"/>
+    <w:bookmarkEnd w:id="73"/>
+    <w:bookmarkStart w:id="75" w:name="ref-he2024rhombus"/>
     <w:p>
       <w:pPr>
         <w:pStyle w:val="Bibliography"/>
@@ -18458,7 +20144,7 @@
         </w:rPr>
         <w:t xml:space="preserve"> </w:t>
       </w:r>
-      <w:hyperlink r:id="rId73">
+      <w:hyperlink r:id="rId74">
         <w:r>
           <w:rPr>
             <w:rStyle w:val="Hyperlink"/>
@@ -18473,8 +20159,8 @@
         <w:t xml:space="preserve">.</w:t>
       </w:r>
     </w:p>
-    <w:bookmarkEnd w:id="74"/>
-    <w:bookmarkStart w:id="76" w:name="ref-king2016dynamiccsr"/>
+    <w:bookmarkEnd w:id="75"/>
+    <w:bookmarkStart w:id="77" w:name="ref-king2016dynamiccsr"/>
     <w:p>
       <w:pPr>
         <w:pStyle w:val="Bibliography"/>
@@ -18541,7 +20227,7 @@
         </w:rPr>
         <w:t xml:space="preserve"> </w:t>
       </w:r>
-      <w:hyperlink r:id="rId75">
+      <w:hyperlink r:id="rId76">
         <w:r>
           <w:rPr>
             <w:rStyle w:val="Hyperlink"/>
@@ -18556,8 +20242,8 @@
         <w:t xml:space="preserve">.</w:t>
       </w:r>
     </w:p>
-    <w:bookmarkEnd w:id="76"/>
-    <w:bookmarkStart w:id="78" w:name="ref-kreutzer2014sellcsigma"/>
+    <w:bookmarkEnd w:id="77"/>
+    <w:bookmarkStart w:id="79" w:name="ref-kreutzer2014sellcsigma"/>
     <w:p>
       <w:pPr>
         <w:pStyle w:val="Bibliography"/>
@@ -18612,7 +20298,7 @@
         </w:rPr>
         <w:t xml:space="preserve"> </w:t>
       </w:r>
-      <w:hyperlink r:id="rId77">
+      <w:hyperlink r:id="rId78">
         <w:r>
           <w:rPr>
             <w:rStyle w:val="Hyperlink"/>
@@ -18627,8 +20313,8 @@
         <w:t xml:space="preserve">.</w:t>
       </w:r>
     </w:p>
-    <w:bookmarkEnd w:id="78"/>
-    <w:bookmarkStart w:id="80" w:name="ref-liu2024ddse"/>
+    <w:bookmarkEnd w:id="79"/>
+    <w:bookmarkStart w:id="81" w:name="ref-liu2024ddse"/>
     <w:p>
       <w:pPr>
         <w:pStyle w:val="Bibliography"/>
@@ -18689,7 +20375,7 @@
         </w:rPr>
         <w:t xml:space="preserve"> </w:t>
       </w:r>
-      <w:hyperlink r:id="rId79">
+      <w:hyperlink r:id="rId80">
         <w:r>
           <w:rPr>
             <w:rStyle w:val="Hyperlink"/>
@@ -18704,8 +20390,8 @@
         <w:t xml:space="preserve">.</w:t>
       </w:r>
     </w:p>
-    <w:bookmarkEnd w:id="80"/>
-    <w:bookmarkStart w:id="82" w:name="ref-mutluergil2026diagonal"/>
+    <w:bookmarkEnd w:id="81"/>
+    <w:bookmarkStart w:id="83" w:name="ref-mutluergil2026diagonal"/>
     <w:p>
       <w:pPr>
         <w:pStyle w:val="Bibliography"/>
@@ -18742,7 +20428,7 @@
         </w:rPr>
         <w:t xml:space="preserve"> </w:t>
       </w:r>
-      <w:hyperlink r:id="rId81">
+      <w:hyperlink r:id="rId82">
         <w:r>
           <w:rPr>
             <w:rStyle w:val="Hyperlink"/>
@@ -18757,8 +20443,8 @@
         <w:t xml:space="preserve">.</w:t>
       </w:r>
     </w:p>
-    <w:bookmarkEnd w:id="82"/>
-    <w:bookmarkStart w:id="84" w:name="ref-oneil1996lsm"/>
+    <w:bookmarkEnd w:id="83"/>
+    <w:bookmarkStart w:id="85" w:name="ref-oneil1996lsm"/>
     <w:p>
       <w:pPr>
         <w:pStyle w:val="Bibliography"/>
@@ -18813,7 +20499,7 @@
         </w:rPr>
         <w:t xml:space="preserve"> </w:t>
       </w:r>
-      <w:hyperlink r:id="rId83">
+      <w:hyperlink r:id="rId84">
         <w:r>
           <w:rPr>
             <w:rStyle w:val="Hyperlink"/>
@@ -18828,8 +20514,8 @@
         <w:t xml:space="preserve">.</w:t>
       </w:r>
     </w:p>
-    <w:bookmarkEnd w:id="84"/>
-    <w:bookmarkStart w:id="86" w:name="ref-openfhe151"/>
+    <w:bookmarkEnd w:id="85"/>
+    <w:bookmarkStart w:id="87" w:name="ref-openfhe151"/>
     <w:p>
       <w:pPr>
         <w:pStyle w:val="Bibliography"/>
@@ -18866,7 +20552,7 @@
         </w:rPr>
         <w:t xml:space="preserve"> </w:t>
       </w:r>
-      <w:hyperlink r:id="rId85">
+      <w:hyperlink r:id="rId86">
         <w:r>
           <w:rPr>
             <w:rStyle w:val="Hyperlink"/>
@@ -18881,8 +20567,8 @@
         <w:t xml:space="preserve">.</w:t>
       </w:r>
     </w:p>
-    <w:bookmarkEnd w:id="86"/>
-    <w:bookmarkStart w:id="88" w:name="X25cb68a9261baf26b64cc014026bbfce216a4f2"/>
+    <w:bookmarkEnd w:id="87"/>
+    <w:bookmarkStart w:id="89" w:name="X25cb68a9261baf26b64cc014026bbfce216a4f2"/>
     <w:p>
       <w:pPr>
         <w:pStyle w:val="Bibliography"/>
@@ -18931,7 +20617,7 @@
         </w:rPr>
         <w:t xml:space="preserve"> </w:t>
       </w:r>
-      <w:hyperlink r:id="rId87">
+      <w:hyperlink r:id="rId88">
         <w:r>
           <w:rPr>
             <w:rStyle w:val="Hyperlink"/>
@@ -18946,8 +20632,8 @@
         <w:t xml:space="preserve">.</w:t>
       </w:r>
     </w:p>
-    <w:bookmarkEnd w:id="88"/>
-    <w:bookmarkStart w:id="90" w:name="ref-parbat2023authorized"/>
+    <w:bookmarkEnd w:id="89"/>
+    <w:bookmarkStart w:id="91" w:name="ref-parbat2023authorized"/>
     <w:p>
       <w:pPr>
         <w:pStyle w:val="Bibliography"/>
@@ -19002,7 +20688,7 @@
         </w:rPr>
         <w:t xml:space="preserve"> </w:t>
       </w:r>
-      <w:hyperlink r:id="rId89">
+      <w:hyperlink r:id="rId90">
         <w:r>
           <w:rPr>
             <w:rStyle w:val="Hyperlink"/>
@@ -19017,8 +20703,8 @@
         <w:t xml:space="preserve">.</w:t>
       </w:r>
     </w:p>
-    <w:bookmarkEnd w:id="90"/>
-    <w:bookmarkStart w:id="92" w:name="ref-snap_stackoverflow_temporal_network"/>
+    <w:bookmarkEnd w:id="91"/>
+    <w:bookmarkStart w:id="93" w:name="ref-snap_stackoverflow_temporal_network"/>
     <w:p>
       <w:pPr>
         <w:pStyle w:val="Bibliography"/>
@@ -19055,7 +20741,7 @@
         </w:rPr>
         <w:t xml:space="preserve"> </w:t>
       </w:r>
-      <w:hyperlink r:id="rId91">
+      <w:hyperlink r:id="rId92">
         <w:r>
           <w:rPr>
             <w:rStyle w:val="Hyperlink"/>
@@ -19070,8 +20756,8 @@
         <w:t xml:space="preserve">.</w:t>
       </w:r>
     </w:p>
-    <w:bookmarkEnd w:id="92"/>
-    <w:bookmarkStart w:id="94" w:name="ref-stylianou2022morpheus"/>
+    <w:bookmarkEnd w:id="93"/>
+    <w:bookmarkStart w:id="95" w:name="ref-stylianou2022morpheus"/>
     <w:p>
       <w:pPr>
         <w:pStyle w:val="Bibliography"/>
@@ -19108,7 +20794,7 @@
         </w:rPr>
         <w:t xml:space="preserve"> </w:t>
       </w:r>
-      <w:hyperlink r:id="rId93">
+      <w:hyperlink r:id="rId94">
         <w:r>
           <w:rPr>
             <w:rStyle w:val="Hyperlink"/>
@@ -19123,8 +20809,8 @@
         <w:t xml:space="preserve">.</w:t>
       </w:r>
     </w:p>
-    <w:bookmarkEnd w:id="94"/>
-    <w:bookmarkStart w:id="96" w:name="ref-vo2021shielddb"/>
+    <w:bookmarkEnd w:id="95"/>
+    <w:bookmarkStart w:id="97" w:name="ref-vo2021shielddb"/>
     <w:p>
       <w:pPr>
         <w:pStyle w:val="Bibliography"/>
@@ -19179,7 +20865,7 @@
         </w:rPr>
         <w:t xml:space="preserve"> </w:t>
       </w:r>
-      <w:hyperlink r:id="rId95">
+      <w:hyperlink r:id="rId96">
         <w:r>
           <w:rPr>
             <w:rStyle w:val="Hyperlink"/>
@@ -19194,8 +20880,8 @@
         <w:t xml:space="preserve">.</w:t>
       </w:r>
     </w:p>
-    <w:bookmarkEnd w:id="96"/>
-    <w:bookmarkStart w:id="98" w:name="ref-wei2026sparsee"/>
+    <w:bookmarkEnd w:id="97"/>
+    <w:bookmarkStart w:id="99" w:name="ref-wei2026sparsee"/>
     <w:p>
       <w:pPr>
         <w:pStyle w:val="Bibliography"/>
@@ -19240,7 +20926,7 @@
         </w:rPr>
         <w:t xml:space="preserve"> </w:t>
       </w:r>
-      <w:hyperlink r:id="rId97">
+      <w:hyperlink r:id="rId98">
         <w:r>
           <w:rPr>
             <w:rStyle w:val="Hyperlink"/>
@@ -19255,8 +20941,8 @@
         <w:t xml:space="preserve">.</w:t>
       </w:r>
     </w:p>
-    <w:bookmarkEnd w:id="98"/>
-    <w:bookmarkStart w:id="100" w:name="ref-xiong2026cipherskip"/>
+    <w:bookmarkEnd w:id="99"/>
+    <w:bookmarkStart w:id="101" w:name="ref-xiong2026cipherskip"/>
     <w:p>
       <w:pPr>
         <w:pStyle w:val="Bibliography"/>
@@ -19335,7 +21021,7 @@
         </w:rPr>
         <w:t xml:space="preserve"> </w:t>
       </w:r>
-      <w:hyperlink r:id="rId99">
+      <w:hyperlink r:id="rId100">
         <w:r>
           <w:rPr>
             <w:rStyle w:val="Hyperlink"/>
@@ -19350,8 +21036,8 @@
         <w:t xml:space="preserve">.</w:t>
       </w:r>
     </w:p>
-    <w:bookmarkEnd w:id="100"/>
-    <w:bookmarkStart w:id="102" w:name="ref-yu2025lodia"/>
+    <w:bookmarkEnd w:id="101"/>
+    <w:bookmarkStart w:id="103" w:name="ref-yu2025lodia"/>
     <w:p>
       <w:pPr>
         <w:pStyle w:val="Bibliography"/>
@@ -19400,7 +21086,7 @@
         </w:rPr>
         <w:t xml:space="preserve"> </w:t>
       </w:r>
-      <w:hyperlink r:id="rId101">
+      <w:hyperlink r:id="rId102">
         <w:r>
           <w:rPr>
             <w:rStyle w:val="Hyperlink"/>
@@ -19415,10 +21101,10 @@
         <w:t xml:space="preserve">.</w:t>
       </w:r>
     </w:p>
-    <w:bookmarkEnd w:id="102"/>
     <w:bookmarkEnd w:id="103"/>
     <w:bookmarkEnd w:id="104"/>
     <w:bookmarkEnd w:id="105"/>
+    <w:bookmarkEnd w:id="106"/>
     <w:sectPr>
       <w:headerReference w:type="default" r:id="rId9"/>
       <w:headerReference w:type="first" r:id="rId10"/>

</xml_diff>

<commit_message>
publication: record current-source E4 result packet
</commit_message>
<xml_diff>
--- a/docs/paper/manuscript-draft.docx
+++ b/docs/paper/manuscript-draft.docx
@@ -2,7 +2,7 @@
 <file path=word/document.xml><?xml version="1.0" encoding="utf-8"?>
 <w:document xmlns:w="http://schemas.openxmlformats.org/wordprocessingml/2006/main" xmlns:m="http://schemas.openxmlformats.org/officeDocument/2006/math" xmlns:r="http://schemas.openxmlformats.org/officeDocument/2006/relationships" xmlns:o="urn:schemas-microsoft-com:office:office" xmlns:v="urn:schemas-microsoft-com:vml" xmlns:w10="urn:schemas-microsoft-com:office:word" xmlns:a="http://schemas.openxmlformats.org/drawingml/2006/main" xmlns:pic="http://schemas.openxmlformats.org/drawingml/2006/picture" xmlns:wp="http://schemas.openxmlformats.org/drawingml/2006/wordprocessingDrawing">
   <w:body>
-    <w:bookmarkStart w:id="106" w:name="X8c1a715672b91a2a57821cca8d271555e82f7d1"/>
+    <w:bookmarkStart w:id="108" w:name="X8c1a715672b91a2a57821cca8d271555e82f7d1"/>
     <w:p>
       <w:pPr>
         <w:pStyle w:val="RouteCKicker"/>
@@ -99,7 +99,31 @@
         <w:rPr>
           <w:rFonts w:ascii="Calibri" w:hAnsi="Calibri" w:eastAsia="Calibri" w:cs="Calibri" w:hint="eastAsia"/>
         </w:rPr>
-        <w:t xml:space="preserve">status last synchronized: 2026-08-31.</w:t>
+        <w:t xml:space="preserve">status last synchronized: 2026-08-31. A separately preregistered</w:t>
+      </w:r>
+      <w:r>
+        <w:rPr>
+          <w:rFonts w:ascii="Calibri" w:hAnsi="Calibri" w:eastAsia="Calibri" w:cs="Calibri" w:hint="eastAsia"/>
+        </w:rPr>
+        <w:t xml:space="preserve"> </w:t>
+      </w:r>
+      <w:r>
+        <w:rPr>
+          <w:rFonts w:ascii="Calibri" w:hAnsi="Calibri" w:eastAsia="Calibri" w:cs="Calibri" w:hint="eastAsia"/>
+        </w:rPr>
+        <w:t xml:space="preserve">current-source deterministic conformance replication passed for one exact</w:t>
+      </w:r>
+      <w:r>
+        <w:rPr>
+          <w:rFonts w:ascii="Calibri" w:hAnsi="Calibri" w:eastAsia="Calibri" w:cs="Calibri" w:hint="eastAsia"/>
+        </w:rPr>
+        <w:t xml:space="preserve"> </w:t>
+      </w:r>
+      <w:r>
+        <w:rPr>
+          <w:rFonts w:ascii="Calibri" w:hAnsi="Calibri" w:eastAsia="Calibri" w:cs="Calibri" w:hint="eastAsia"/>
+        </w:rPr>
+        <w:t xml:space="preserve">source and one fixed OpenFHE fixture; its scope is stated below.</w:t>
       </w:r>
     </w:p>
     <w:bookmarkStart w:id="9" w:name="abstract"/>
@@ -503,7 +527,67 @@
         <w:rPr>
           <w:rFonts w:ascii="Calibri" w:hAnsi="Calibri" w:eastAsia="Calibri" w:cs="Calibri" w:hint="eastAsia"/>
         </w:rPr>
-        <w:t xml:space="preserve">campaign were not started. We report the protocol, its definition-level</w:t>
+        <w:t xml:space="preserve">campaign were not started. Without reopening either performance lineage, a</w:t>
+      </w:r>
+      <w:r>
+        <w:rPr>
+          <w:rFonts w:ascii="Calibri" w:hAnsi="Calibri" w:eastAsia="Calibri" w:cs="Calibri" w:hint="eastAsia"/>
+        </w:rPr>
+        <w:t xml:space="preserve"> </w:t>
+      </w:r>
+      <w:r>
+        <w:rPr>
+          <w:rFonts w:ascii="Calibri" w:hAnsi="Calibri" w:eastAsia="Calibri" w:cs="Calibri" w:hint="eastAsia"/>
+        </w:rPr>
+        <w:t xml:space="preserve">separately preregistered current-source functional replication subsequently</w:t>
+      </w:r>
+      <w:r>
+        <w:rPr>
+          <w:rFonts w:ascii="Calibri" w:hAnsi="Calibri" w:eastAsia="Calibri" w:cs="Calibri" w:hint="eastAsia"/>
+        </w:rPr>
+        <w:t xml:space="preserve"> </w:t>
+      </w:r>
+      <w:r>
+        <w:rPr>
+          <w:rFonts w:ascii="Calibri" w:hAnsi="Calibri" w:eastAsia="Calibri" w:cs="Calibri" w:hint="eastAsia"/>
+        </w:rPr>
+        <w:t xml:space="preserve">passed its eight-case, 35-record deterministic contract and one fixed pinned-</w:t>
+      </w:r>
+      <w:r>
+        <w:rPr>
+          <w:rFonts w:ascii="Calibri" w:hAnsi="Calibri" w:eastAsia="Calibri" w:cs="Calibri" w:hint="eastAsia"/>
+        </w:rPr>
+        <w:t xml:space="preserve"> </w:t>
+      </w:r>
+      <w:r>
+        <w:rPr>
+          <w:rFonts w:ascii="Calibri" w:hAnsi="Calibri" w:eastAsia="Calibri" w:cs="Calibri" w:hint="eastAsia"/>
+        </w:rPr>
+        <w:t xml:space="preserve">OpenFHE whole-query witness. The witness decrypted to the prespecified sparse</w:t>
+      </w:r>
+      <w:r>
+        <w:rPr>
+          <w:rFonts w:ascii="Calibri" w:hAnsi="Calibri" w:eastAsia="Calibri" w:cs="Calibri" w:hint="eastAsia"/>
+        </w:rPr>
+        <w:t xml:space="preserve"> </w:t>
+      </w:r>
+      <w:r>
+        <w:rPr>
+          <w:rFonts w:ascii="Calibri" w:hAnsi="Calibri" w:eastAsia="Calibri" w:cs="Calibri" w:hint="eastAsia"/>
+        </w:rPr>
+        <w:t xml:space="preserve">vector and matched two independent plaintext oracles. We report the protocol,</w:t>
+      </w:r>
+      <w:r>
+        <w:rPr>
+          <w:rFonts w:ascii="Calibri" w:hAnsi="Calibri" w:eastAsia="Calibri" w:cs="Calibri" w:hint="eastAsia"/>
+        </w:rPr>
+        <w:t xml:space="preserve"> </w:t>
+      </w:r>
+      <w:r>
+        <w:rPr>
+          <w:rFonts w:ascii="Calibri" w:hAnsi="Calibri" w:eastAsia="Calibri" w:cs="Calibri" w:hint="eastAsia"/>
+        </w:rPr>
+        <w:t xml:space="preserve">its definition-level</w:t>
       </w:r>
       <w:r>
         <w:rPr>
@@ -527,19 +611,31 @@
         <w:rPr>
           <w:rFonts w:ascii="Calibri" w:hAnsi="Calibri" w:eastAsia="Calibri" w:cs="Calibri" w:hint="eastAsia"/>
         </w:rPr>
-        <w:t xml:space="preserve">evaluation boundaries. We do not convert partial qualification execution,</w:t>
-      </w:r>
-      <w:r>
-        <w:rPr>
-          <w:rFonts w:ascii="Calibri" w:hAnsi="Calibri" w:eastAsia="Calibri" w:cs="Calibri" w:hint="eastAsia"/>
-        </w:rPr>
-        <w:t xml:space="preserve"> </w:t>
-      </w:r>
-      <w:r>
-        <w:rPr>
-          <w:rFonts w:ascii="Calibri" w:hAnsi="Calibri" w:eastAsia="Calibri" w:cs="Calibri" w:hint="eastAsia"/>
-        </w:rPr>
-        <w:t xml:space="preserve">runner setup, or prerequisite controls into strategy-cost or native-OpenFHE</w:t>
+        <w:t xml:space="preserve">evaluation boundaries, plus that version-bound single-fixture result. We do</w:t>
+      </w:r>
+      <w:r>
+        <w:rPr>
+          <w:rFonts w:ascii="Calibri" w:hAnsi="Calibri" w:eastAsia="Calibri" w:cs="Calibri" w:hint="eastAsia"/>
+        </w:rPr>
+        <w:t xml:space="preserve"> </w:t>
+      </w:r>
+      <w:r>
+        <w:rPr>
+          <w:rFonts w:ascii="Calibri" w:hAnsi="Calibri" w:eastAsia="Calibri" w:cs="Calibri" w:hint="eastAsia"/>
+        </w:rPr>
+        <w:t xml:space="preserve">not convert partial qualification execution, runner setup, prerequisite</w:t>
+      </w:r>
+      <w:r>
+        <w:rPr>
+          <w:rFonts w:ascii="Calibri" w:hAnsi="Calibri" w:eastAsia="Calibri" w:cs="Calibri" w:hint="eastAsia"/>
+        </w:rPr>
+        <w:t xml:space="preserve"> </w:t>
+      </w:r>
+      <w:r>
+        <w:rPr>
+          <w:rFonts w:ascii="Calibri" w:hAnsi="Calibri" w:eastAsia="Calibri" w:cs="Calibri" w:hint="eastAsia"/>
+        </w:rPr>
+        <w:t xml:space="preserve">controls, or the conformance witness into strategy-cost or native-OpenFHE</w:t>
       </w:r>
       <w:r>
         <w:rPr>
@@ -1299,6 +1395,7 @@
     <w:p>
       <w:pPr>
         <w:pStyle w:val="FirstParagraph"/>
+        <w:jc w:val="left"/>
       </w:pPr>
       <w:r>
         <w:rPr>
@@ -10042,6 +10139,209 @@
     <w:p>
       <w:pPr>
         <w:pStyle w:val="BodyText"/>
+        <w:jc w:val="left"/>
+      </w:pPr>
+      <w:r>
+        <w:rPr>
+          <w:rFonts w:ascii="Calibri" w:hAnsi="Calibri" w:eastAsia="Calibri" w:cs="Calibri" w:hint="eastAsia"/>
+        </w:rPr>
+        <w:t xml:space="preserve">The separately preregistered current-source replication retained that exact</w:t>
+      </w:r>
+      <w:r>
+        <w:rPr>
+          <w:rFonts w:ascii="Calibri" w:hAnsi="Calibri" w:eastAsia="Calibri" w:cs="Calibri" w:hint="eastAsia"/>
+        </w:rPr>
+        <w:t xml:space="preserve"> </w:t>
+      </w:r>
+      <w:r>
+        <w:rPr>
+          <w:rFonts w:ascii="Calibri" w:hAnsi="Calibri" w:eastAsia="Calibri" w:cs="Calibri" w:hint="eastAsia"/>
+        </w:rPr>
+        <w:t xml:space="preserve">fixture, expected output, OpenFHE pin, and witness specification while binding</w:t>
+      </w:r>
+      <w:r>
+        <w:rPr>
+          <w:rFonts w:ascii="Calibri" w:hAnsi="Calibri" w:eastAsia="Calibri" w:cs="Calibri" w:hint="eastAsia"/>
+        </w:rPr>
+        <w:t xml:space="preserve"> </w:t>
+      </w:r>
+      <w:r>
+        <w:rPr>
+          <w:rFonts w:ascii="Calibri" w:hAnsi="Calibri" w:eastAsia="Calibri" w:cs="Calibri" w:hint="eastAsia"/>
+        </w:rPr>
+        <w:t xml:space="preserve">them to reviewed source</w:t>
+      </w:r>
+      <w:r>
+        <w:rPr>
+          <w:rFonts w:ascii="Calibri" w:hAnsi="Calibri" w:eastAsia="Calibri" w:cs="Calibri" w:hint="eastAsia"/>
+        </w:rPr>
+        <w:t xml:space="preserve"> </w:t>
+      </w:r>
+      <w:r>
+        <w:rPr>
+          <w:rStyle w:val="VerbatimChar"/>
+          <w:rFonts w:ascii="Calibri" w:hAnsi="Calibri" w:eastAsia="Calibri" w:cs="Calibri" w:hint="eastAsia"/>
+        </w:rPr>
+        <w:t xml:space="preserve">844fb062d78f5095f14599c6c71a27cb6034f001</w:t>
+      </w:r>
+      <w:r>
+        <w:rPr>
+          <w:rFonts w:ascii="Calibri" w:hAnsi="Calibri" w:eastAsia="Calibri" w:cs="Calibri" w:hint="eastAsia"/>
+        </w:rPr>
+        <w:t xml:space="preserve"> </w:t>
+      </w:r>
+      <w:r>
+        <w:rPr>
+          <w:rFonts w:ascii="Calibri" w:hAnsi="Calibri" w:eastAsia="Calibri" w:cs="Calibri" w:hint="eastAsia"/>
+        </w:rPr>
+        <w:t xml:space="preserve">through</w:t>
+      </w:r>
+      <w:r>
+        <w:rPr>
+          <w:rFonts w:ascii="Calibri" w:hAnsi="Calibri" w:eastAsia="Calibri" w:cs="Calibri" w:hint="eastAsia"/>
+        </w:rPr>
+        <w:t xml:space="preserve"> </w:t>
+      </w:r>
+      <w:r>
+        <w:rPr>
+          <w:rFonts w:ascii="Calibri" w:hAnsi="Calibri" w:eastAsia="Calibri" w:cs="Calibri" w:hint="eastAsia"/>
+        </w:rPr>
+        <w:t xml:space="preserve">lightweight tag</w:t>
+      </w:r>
+      <w:r>
+        <w:rPr>
+          <w:rFonts w:ascii="Calibri" w:hAnsi="Calibri" w:eastAsia="Calibri" w:cs="Calibri" w:hint="eastAsia"/>
+        </w:rPr>
+        <w:t xml:space="preserve"> </w:t>
+      </w:r>
+      <w:r>
+        <w:rPr>
+          <w:rStyle w:val="VerbatimChar"/>
+          <w:rFonts w:ascii="Calibri" w:hAnsi="Calibri" w:eastAsia="Calibri" w:cs="Calibri" w:hint="eastAsia"/>
+        </w:rPr>
+        <w:t xml:space="preserve">current-source-e4-conformance-20260831-v1</w:t>
+      </w:r>
+      <w:r>
+        <w:rPr>
+          <w:rFonts w:ascii="Calibri" w:hAnsi="Calibri" w:eastAsia="Calibri" w:cs="Calibri" w:hint="eastAsia"/>
+        </w:rPr>
+        <w:t xml:space="preserve">. Its only current-</w:t>
+      </w:r>
+      <w:r>
+        <w:rPr>
+          <w:rFonts w:ascii="Calibri" w:hAnsi="Calibri" w:eastAsia="Calibri" w:cs="Calibri" w:hint="eastAsia"/>
+        </w:rPr>
+        <w:t xml:space="preserve"> </w:t>
+      </w:r>
+      <w:r>
+        <w:rPr>
+          <w:rFonts w:ascii="Calibri" w:hAnsi="Calibri" w:eastAsia="Calibri" w:cs="Calibri" w:hint="eastAsia"/>
+        </w:rPr>
+        <w:t xml:space="preserve">source run,</w:t>
+      </w:r>
+      <w:r>
+        <w:rPr>
+          <w:rFonts w:ascii="Calibri" w:hAnsi="Calibri" w:eastAsia="Calibri" w:cs="Calibri" w:hint="eastAsia"/>
+        </w:rPr>
+        <w:t xml:space="preserve"> </w:t>
+      </w:r>
+      <w:r>
+        <w:rPr>
+          <w:rStyle w:val="VerbatimChar"/>
+          <w:rFonts w:ascii="Calibri" w:hAnsi="Calibri" w:eastAsia="Calibri" w:cs="Calibri" w:hint="eastAsia"/>
+        </w:rPr>
+        <w:t xml:space="preserve">33386130654</w:t>
+      </w:r>
+      <w:r>
+        <w:rPr>
+          <w:rFonts w:ascii="Calibri" w:hAnsi="Calibri" w:eastAsia="Calibri" w:cs="Calibri" w:hint="eastAsia"/>
+        </w:rPr>
+        <w:t xml:space="preserve">, completed successfully and produced artifact</w:t>
+      </w:r>
+      <w:r>
+        <w:rPr>
+          <w:rFonts w:ascii="Calibri" w:hAnsi="Calibri" w:eastAsia="Calibri" w:cs="Calibri" w:hint="eastAsia"/>
+        </w:rPr>
+        <w:t xml:space="preserve"> </w:t>
+      </w:r>
+      <w:r>
+        <w:rPr>
+          <w:rStyle w:val="VerbatimChar"/>
+          <w:rFonts w:ascii="Calibri" w:hAnsi="Calibri" w:eastAsia="Calibri" w:cs="Calibri" w:hint="eastAsia"/>
+        </w:rPr>
+        <w:t xml:space="preserve">9755741401</w:t>
+      </w:r>
+      <w:r>
+        <w:rPr>
+          <w:rFonts w:ascii="Calibri" w:hAnsi="Calibri" w:eastAsia="Calibri" w:cs="Calibri" w:hint="eastAsia"/>
+        </w:rPr>
+        <w:t xml:space="preserve">. A clean controller independently verified the raw provider ZIP,</w:t>
+      </w:r>
+      <w:r>
+        <w:rPr>
+          <w:rFonts w:ascii="Calibri" w:hAnsi="Calibri" w:eastAsia="Calibri" w:cs="Calibri" w:hint="eastAsia"/>
+        </w:rPr>
+        <w:t xml:space="preserve"> </w:t>
+      </w:r>
+      <w:r>
+        <w:rPr>
+          <w:rFonts w:ascii="Calibri" w:hAnsi="Calibri" w:eastAsia="Calibri" w:cs="Calibri" w:hint="eastAsia"/>
+        </w:rPr>
+        <w:t xml:space="preserve">the exact 19-file set, strict internal checksums, literal RFC 6901 pointer</w:t>
+      </w:r>
+      <w:r>
+        <w:rPr>
+          <w:rFonts w:ascii="Calibri" w:hAnsi="Calibri" w:eastAsia="Calibri" w:cs="Calibri" w:hint="eastAsia"/>
+        </w:rPr>
+        <w:t xml:space="preserve"> </w:t>
+      </w:r>
+      <w:r>
+        <w:rPr>
+          <w:rFonts w:ascii="Calibri" w:hAnsi="Calibri" w:eastAsia="Calibri" w:cs="Calibri" w:hint="eastAsia"/>
+        </w:rPr>
+        <w:t xml:space="preserve">expectations, and every source digest in</w:t>
+      </w:r>
+      <w:r>
+        <w:rPr>
+          <w:rFonts w:ascii="Calibri" w:hAnsi="Calibri" w:eastAsia="Calibri" w:cs="Calibri" w:hint="eastAsia"/>
+        </w:rPr>
+        <w:t xml:space="preserve"> </w:t>
+      </w:r>
+      <w:r>
+        <w:rPr>
+          <w:rStyle w:val="VerbatimChar"/>
+          <w:rFonts w:ascii="Calibri" w:hAnsi="Calibri" w:eastAsia="Calibri" w:cs="Calibri" w:hint="eastAsia"/>
+        </w:rPr>
+        <w:t xml:space="preserve">PROVENANCE.json</w:t>
+      </w:r>
+      <w:r>
+        <w:rPr>
+          <w:rFonts w:ascii="Calibri" w:hAnsi="Calibri" w:eastAsia="Calibri" w:cs="Calibri" w:hint="eastAsia"/>
+        </w:rPr>
+        <w:t xml:space="preserve"> </w:t>
+      </w:r>
+      <w:r>
+        <w:rPr>
+          <w:rFonts w:ascii="Calibri" w:hAnsi="Calibri" w:eastAsia="Calibri" w:cs="Calibri" w:hint="eastAsia"/>
+        </w:rPr>
+        <w:t xml:space="preserve">against a fresh</w:t>
+      </w:r>
+      <w:r>
+        <w:rPr>
+          <w:rFonts w:ascii="Calibri" w:hAnsi="Calibri" w:eastAsia="Calibri" w:cs="Calibri" w:hint="eastAsia"/>
+        </w:rPr>
+        <w:t xml:space="preserve"> </w:t>
+      </w:r>
+      <w:r>
+        <w:rPr>
+          <w:rFonts w:ascii="Calibri" w:hAnsi="Calibri" w:eastAsia="Calibri" w:cs="Calibri" w:hint="eastAsia"/>
+        </w:rPr>
+        <w:t xml:space="preserve">detached tag checkout. Section 7.6 states the bounded result and its exclusions.</w:t>
+      </w:r>
+    </w:p>
+    <w:p>
+      <w:pPr>
+        <w:pStyle w:val="BodyText"/>
       </w:pPr>
       <w:r>
         <w:rPr>
@@ -10903,6 +11203,7 @@
     <w:p>
       <w:pPr>
         <w:pStyle w:val="BodyText"/>
+        <w:jc w:val="left"/>
       </w:pPr>
       <w:r>
         <w:rPr>
@@ -11043,6 +11344,164 @@
           <w:rFonts w:ascii="Calibri" w:hAnsi="Calibri" w:eastAsia="Calibri" w:cs="Calibri" w:hint="eastAsia"/>
         </w:rPr>
         <w:t xml:space="preserve">evidence for a maintenance strategy.</w:t>
+      </w:r>
+    </w:p>
+    <w:p>
+      <w:pPr>
+        <w:pStyle w:val="BodyText"/>
+        <w:jc w:val="left"/>
+      </w:pPr>
+      <w:r>
+        <w:rPr>
+          <w:rFonts w:ascii="Calibri" w:hAnsi="Calibri" w:eastAsia="Calibri" w:cs="Calibri" w:hint="eastAsia"/>
+        </w:rPr>
+        <w:t xml:space="preserve">A later, separately preregistered follow-up repaired a pre-dispatch capability-</w:t>
+      </w:r>
+      <w:r>
+        <w:rPr>
+          <w:rFonts w:ascii="Calibri" w:hAnsi="Calibri" w:eastAsia="Calibri" w:cs="Calibri" w:hint="eastAsia"/>
+        </w:rPr>
+        <w:t xml:space="preserve"> </w:t>
+      </w:r>
+      <w:r>
+        <w:rPr>
+          <w:rFonts w:ascii="Calibri" w:hAnsi="Calibri" w:eastAsia="Calibri" w:cs="Calibri" w:hint="eastAsia"/>
+        </w:rPr>
+        <w:t xml:space="preserve">lease defect without changing the estimand, resource thresholds, or scientific</w:t>
+      </w:r>
+      <w:r>
+        <w:rPr>
+          <w:rFonts w:ascii="Calibri" w:hAnsi="Calibri" w:eastAsia="Calibri" w:cs="Calibri" w:hint="eastAsia"/>
+        </w:rPr>
+        <w:t xml:space="preserve"> </w:t>
+      </w:r>
+      <w:r>
+        <w:rPr>
+          <w:rFonts w:ascii="Calibri" w:hAnsi="Calibri" w:eastAsia="Calibri" w:cs="Calibri" w:hint="eastAsia"/>
+        </w:rPr>
+        <w:t xml:space="preserve">matrix. Its replacement experiment source S1 was</w:t>
+      </w:r>
+      <w:r>
+        <w:rPr>
+          <w:rFonts w:ascii="Calibri" w:hAnsi="Calibri" w:eastAsia="Calibri" w:cs="Calibri" w:hint="eastAsia"/>
+        </w:rPr>
+        <w:t xml:space="preserve"> </w:t>
+      </w:r>
+      <w:r>
+        <w:rPr>
+          <w:rStyle w:val="VerbatimChar"/>
+          <w:rFonts w:ascii="Calibri" w:hAnsi="Calibri" w:eastAsia="Calibri" w:cs="Calibri" w:hint="eastAsia"/>
+        </w:rPr>
+        <w:t xml:space="preserve">f8d89d6f98f289dc2e0c3414f7b4ed59b5d30f52</w:t>
+      </w:r>
+      <w:r>
+        <w:rPr>
+          <w:rFonts w:ascii="Calibri" w:hAnsi="Calibri" w:eastAsia="Calibri" w:cs="Calibri" w:hint="eastAsia"/>
+        </w:rPr>
+        <w:t xml:space="preserve">, and its direct-child, data-only S2</w:t>
+      </w:r>
+      <w:r>
+        <w:rPr>
+          <w:rFonts w:ascii="Calibri" w:hAnsi="Calibri" w:eastAsia="Calibri" w:cs="Calibri" w:hint="eastAsia"/>
+        </w:rPr>
+        <w:t xml:space="preserve"> </w:t>
+      </w:r>
+      <w:r>
+        <w:rPr>
+          <w:rFonts w:ascii="Calibri" w:hAnsi="Calibri" w:eastAsia="Calibri" w:cs="Calibri" w:hint="eastAsia"/>
+        </w:rPr>
+        <w:t xml:space="preserve">was</w:t>
+      </w:r>
+      <w:r>
+        <w:rPr>
+          <w:rFonts w:ascii="Calibri" w:hAnsi="Calibri" w:eastAsia="Calibri" w:cs="Calibri" w:hint="eastAsia"/>
+        </w:rPr>
+        <w:t xml:space="preserve"> </w:t>
+      </w:r>
+      <w:r>
+        <w:rPr>
+          <w:rStyle w:val="VerbatimChar"/>
+          <w:rFonts w:ascii="Calibri" w:hAnsi="Calibri" w:eastAsia="Calibri" w:cs="Calibri" w:hint="eastAsia"/>
+        </w:rPr>
+        <w:t xml:space="preserve">e1e488f177dc8a469c6132a29537b041fbf1430b</w:t>
+      </w:r>
+      <w:r>
+        <w:rPr>
+          <w:rFonts w:ascii="Calibri" w:hAnsi="Calibri" w:eastAsia="Calibri" w:cs="Calibri" w:hint="eastAsia"/>
+        </w:rPr>
+        <w:t xml:space="preserve">. Exact-head CI, PRE-S1,</w:t>
+      </w:r>
+      <w:r>
+        <w:rPr>
+          <w:rFonts w:ascii="Calibri" w:hAnsi="Calibri" w:eastAsia="Calibri" w:cs="Calibri" w:hint="eastAsia"/>
+        </w:rPr>
+        <w:t xml:space="preserve"> </w:t>
+      </w:r>
+      <w:r>
+        <w:rPr>
+          <w:rFonts w:ascii="Calibri" w:hAnsi="Calibri" w:eastAsia="Calibri" w:cs="Calibri" w:hint="eastAsia"/>
+        </w:rPr>
+        <w:t xml:space="preserve">descriptive registration, source-anchor, and independent-review controls all</w:t>
+      </w:r>
+      <w:r>
+        <w:rPr>
+          <w:rFonts w:ascii="Calibri" w:hAnsi="Calibri" w:eastAsia="Calibri" w:cs="Calibri" w:hint="eastAsia"/>
+        </w:rPr>
+        <w:t xml:space="preserve"> </w:t>
+      </w:r>
+      <w:r>
+        <w:rPr>
+          <w:rFonts w:ascii="Calibri" w:hAnsi="Calibri" w:eastAsia="Calibri" w:cs="Calibri" w:hint="eastAsia"/>
+        </w:rPr>
+        <w:t xml:space="preserve">passed at exact S2 with authority false. The sole subsequent qualification run</w:t>
+      </w:r>
+      <w:r>
+        <w:rPr>
+          <w:rFonts w:ascii="Calibri" w:hAnsi="Calibri" w:eastAsia="Calibri" w:cs="Calibri" w:hint="eastAsia"/>
+        </w:rPr>
+        <w:t xml:space="preserve"> </w:t>
+      </w:r>
+      <w:r>
+        <w:rPr>
+          <w:rFonts w:ascii="Calibri" w:hAnsi="Calibri" w:eastAsia="Calibri" w:cs="Calibri" w:hint="eastAsia"/>
+        </w:rPr>
+        <w:t xml:space="preserve">was cancelled before checkout or seed admission when the controller could not</w:t>
+      </w:r>
+      <w:r>
+        <w:rPr>
+          <w:rFonts w:ascii="Calibri" w:hAnsi="Calibri" w:eastAsia="Calibri" w:cs="Calibri" w:hint="eastAsia"/>
+        </w:rPr>
+        <w:t xml:space="preserve"> </w:t>
+      </w:r>
+      <w:r>
+        <w:rPr>
+          <w:rFonts w:ascii="Calibri" w:hAnsi="Calibri" w:eastAsia="Calibri" w:cs="Calibri" w:hint="eastAsia"/>
+        </w:rPr>
+        <w:t xml:space="preserve">install its watcher-admission binding. It produced zero artifacts and no</w:t>
+      </w:r>
+      <w:r>
+        <w:rPr>
+          <w:rFonts w:ascii="Calibri" w:hAnsi="Calibri" w:eastAsia="Calibri" w:cs="Calibri" w:hint="eastAsia"/>
+        </w:rPr>
+        <w:t xml:space="preserve"> </w:t>
+      </w:r>
+      <w:r>
+        <w:rPr>
+          <w:rFonts w:ascii="Calibri" w:hAnsi="Calibri" w:eastAsia="Calibri" w:cs="Calibri" w:hint="eastAsia"/>
+        </w:rPr>
+        <w:t xml:space="preserve">scientific observation. The frozen one-shot rule therefore closed the follow-up</w:t>
+      </w:r>
+      <w:r>
+        <w:rPr>
+          <w:rFonts w:ascii="Calibri" w:hAnsi="Calibri" w:eastAsia="Calibri" w:cs="Calibri" w:hint="eastAsia"/>
+        </w:rPr>
+        <w:t xml:space="preserve"> </w:t>
+      </w:r>
+      <w:r>
+        <w:rPr>
+          <w:rFonts w:ascii="Calibri" w:hAnsi="Calibri" w:eastAsia="Calibri" w:cs="Calibri" w:hint="eastAsia"/>
+        </w:rPr>
+        <w:t xml:space="preserve">as terminal NO-GO and barred a repaired-lineage rerun.</w:t>
       </w:r>
     </w:p>
     <w:p>
@@ -11053,163 +11512,6 @@
         <w:rPr>
           <w:rFonts w:ascii="Calibri" w:hAnsi="Calibri" w:eastAsia="Calibri" w:cs="Calibri" w:hint="eastAsia"/>
         </w:rPr>
-        <w:t xml:space="preserve">A later, separately preregistered follow-up repaired a pre-dispatch capability-</w:t>
-      </w:r>
-      <w:r>
-        <w:rPr>
-          <w:rFonts w:ascii="Calibri" w:hAnsi="Calibri" w:eastAsia="Calibri" w:cs="Calibri" w:hint="eastAsia"/>
-        </w:rPr>
-        <w:t xml:space="preserve"> </w:t>
-      </w:r>
-      <w:r>
-        <w:rPr>
-          <w:rFonts w:ascii="Calibri" w:hAnsi="Calibri" w:eastAsia="Calibri" w:cs="Calibri" w:hint="eastAsia"/>
-        </w:rPr>
-        <w:t xml:space="preserve">lease defect without changing the estimand, resource thresholds, or scientific</w:t>
-      </w:r>
-      <w:r>
-        <w:rPr>
-          <w:rFonts w:ascii="Calibri" w:hAnsi="Calibri" w:eastAsia="Calibri" w:cs="Calibri" w:hint="eastAsia"/>
-        </w:rPr>
-        <w:t xml:space="preserve"> </w:t>
-      </w:r>
-      <w:r>
-        <w:rPr>
-          <w:rFonts w:ascii="Calibri" w:hAnsi="Calibri" w:eastAsia="Calibri" w:cs="Calibri" w:hint="eastAsia"/>
-        </w:rPr>
-        <w:t xml:space="preserve">matrix. Its replacement experiment source S1 was</w:t>
-      </w:r>
-      <w:r>
-        <w:rPr>
-          <w:rFonts w:ascii="Calibri" w:hAnsi="Calibri" w:eastAsia="Calibri" w:cs="Calibri" w:hint="eastAsia"/>
-        </w:rPr>
-        <w:t xml:space="preserve"> </w:t>
-      </w:r>
-      <w:r>
-        <w:rPr>
-          <w:rStyle w:val="VerbatimChar"/>
-          <w:rFonts w:ascii="Calibri" w:hAnsi="Calibri" w:eastAsia="Calibri" w:cs="Calibri" w:hint="eastAsia"/>
-        </w:rPr>
-        <w:t xml:space="preserve">f8d89d6f98f289dc2e0c3414f7b4ed59b5d30f52</w:t>
-      </w:r>
-      <w:r>
-        <w:rPr>
-          <w:rFonts w:ascii="Calibri" w:hAnsi="Calibri" w:eastAsia="Calibri" w:cs="Calibri" w:hint="eastAsia"/>
-        </w:rPr>
-        <w:t xml:space="preserve">, and its direct-child, data-only S2</w:t>
-      </w:r>
-      <w:r>
-        <w:rPr>
-          <w:rFonts w:ascii="Calibri" w:hAnsi="Calibri" w:eastAsia="Calibri" w:cs="Calibri" w:hint="eastAsia"/>
-        </w:rPr>
-        <w:t xml:space="preserve"> </w:t>
-      </w:r>
-      <w:r>
-        <w:rPr>
-          <w:rFonts w:ascii="Calibri" w:hAnsi="Calibri" w:eastAsia="Calibri" w:cs="Calibri" w:hint="eastAsia"/>
-        </w:rPr>
-        <w:t xml:space="preserve">was</w:t>
-      </w:r>
-      <w:r>
-        <w:rPr>
-          <w:rFonts w:ascii="Calibri" w:hAnsi="Calibri" w:eastAsia="Calibri" w:cs="Calibri" w:hint="eastAsia"/>
-        </w:rPr>
-        <w:t xml:space="preserve"> </w:t>
-      </w:r>
-      <w:r>
-        <w:rPr>
-          <w:rStyle w:val="VerbatimChar"/>
-          <w:rFonts w:ascii="Calibri" w:hAnsi="Calibri" w:eastAsia="Calibri" w:cs="Calibri" w:hint="eastAsia"/>
-        </w:rPr>
-        <w:t xml:space="preserve">e1e488f177dc8a469c6132a29537b041fbf1430b</w:t>
-      </w:r>
-      <w:r>
-        <w:rPr>
-          <w:rFonts w:ascii="Calibri" w:hAnsi="Calibri" w:eastAsia="Calibri" w:cs="Calibri" w:hint="eastAsia"/>
-        </w:rPr>
-        <w:t xml:space="preserve">. Exact-head CI, PRE-S1,</w:t>
-      </w:r>
-      <w:r>
-        <w:rPr>
-          <w:rFonts w:ascii="Calibri" w:hAnsi="Calibri" w:eastAsia="Calibri" w:cs="Calibri" w:hint="eastAsia"/>
-        </w:rPr>
-        <w:t xml:space="preserve"> </w:t>
-      </w:r>
-      <w:r>
-        <w:rPr>
-          <w:rFonts w:ascii="Calibri" w:hAnsi="Calibri" w:eastAsia="Calibri" w:cs="Calibri" w:hint="eastAsia"/>
-        </w:rPr>
-        <w:t xml:space="preserve">descriptive registration, source-anchor, and independent-review controls all</w:t>
-      </w:r>
-      <w:r>
-        <w:rPr>
-          <w:rFonts w:ascii="Calibri" w:hAnsi="Calibri" w:eastAsia="Calibri" w:cs="Calibri" w:hint="eastAsia"/>
-        </w:rPr>
-        <w:t xml:space="preserve"> </w:t>
-      </w:r>
-      <w:r>
-        <w:rPr>
-          <w:rFonts w:ascii="Calibri" w:hAnsi="Calibri" w:eastAsia="Calibri" w:cs="Calibri" w:hint="eastAsia"/>
-        </w:rPr>
-        <w:t xml:space="preserve">passed at exact S2 with authority false. The sole subsequent qualification run</w:t>
-      </w:r>
-      <w:r>
-        <w:rPr>
-          <w:rFonts w:ascii="Calibri" w:hAnsi="Calibri" w:eastAsia="Calibri" w:cs="Calibri" w:hint="eastAsia"/>
-        </w:rPr>
-        <w:t xml:space="preserve"> </w:t>
-      </w:r>
-      <w:r>
-        <w:rPr>
-          <w:rFonts w:ascii="Calibri" w:hAnsi="Calibri" w:eastAsia="Calibri" w:cs="Calibri" w:hint="eastAsia"/>
-        </w:rPr>
-        <w:t xml:space="preserve">was cancelled before checkout or seed admission when the controller could not</w:t>
-      </w:r>
-      <w:r>
-        <w:rPr>
-          <w:rFonts w:ascii="Calibri" w:hAnsi="Calibri" w:eastAsia="Calibri" w:cs="Calibri" w:hint="eastAsia"/>
-        </w:rPr>
-        <w:t xml:space="preserve"> </w:t>
-      </w:r>
-      <w:r>
-        <w:rPr>
-          <w:rFonts w:ascii="Calibri" w:hAnsi="Calibri" w:eastAsia="Calibri" w:cs="Calibri" w:hint="eastAsia"/>
-        </w:rPr>
-        <w:t xml:space="preserve">install its watcher-admission binding. It produced zero artifacts and no</w:t>
-      </w:r>
-      <w:r>
-        <w:rPr>
-          <w:rFonts w:ascii="Calibri" w:hAnsi="Calibri" w:eastAsia="Calibri" w:cs="Calibri" w:hint="eastAsia"/>
-        </w:rPr>
-        <w:t xml:space="preserve"> </w:t>
-      </w:r>
-      <w:r>
-        <w:rPr>
-          <w:rFonts w:ascii="Calibri" w:hAnsi="Calibri" w:eastAsia="Calibri" w:cs="Calibri" w:hint="eastAsia"/>
-        </w:rPr>
-        <w:t xml:space="preserve">scientific observation. The frozen one-shot rule therefore closed the follow-up</w:t>
-      </w:r>
-      <w:r>
-        <w:rPr>
-          <w:rFonts w:ascii="Calibri" w:hAnsi="Calibri" w:eastAsia="Calibri" w:cs="Calibri" w:hint="eastAsia"/>
-        </w:rPr>
-        <w:t xml:space="preserve"> </w:t>
-      </w:r>
-      <w:r>
-        <w:rPr>
-          <w:rFonts w:ascii="Calibri" w:hAnsi="Calibri" w:eastAsia="Calibri" w:cs="Calibri" w:hint="eastAsia"/>
-        </w:rPr>
-        <w:t xml:space="preserve">as terminal NO-GO and barred a repaired-lineage rerun.</w:t>
-      </w:r>
-    </w:p>
-    <w:p>
-      <w:pPr>
-        <w:pStyle w:val="BodyText"/>
-      </w:pPr>
-      <w:r>
-        <w:rPr>
-          <w:rFonts w:ascii="Calibri" w:hAnsi="Calibri" w:eastAsia="Calibri" w:cs="Calibri" w:hint="eastAsia"/>
-        </w:rPr>
         <w:t xml:space="preserve">Generative-AI systems assisted literature discovery, code and test generation,</w:t>
       </w:r>
       <w:r>
@@ -11262,7 +11564,7 @@
       </w:r>
     </w:p>
     <w:bookmarkEnd w:id="30"/>
-    <w:bookmarkStart w:id="37" w:name="evaluation-methodology"/>
+    <w:bookmarkStart w:id="38" w:name="evaluation-methodology"/>
     <w:p>
       <w:pPr>
         <w:pStyle w:val="Heading1"/>
@@ -15119,8 +15421,326 @@
       </w:r>
     </w:p>
     <w:bookmarkEnd w:id="36"/>
+    <w:bookmarkStart w:id="37" w:name="Xee0aa4bfad8d8bc9216992ca3a5cd0a8fd20ca2"/>
+    <w:p>
+      <w:pPr>
+        <w:pStyle w:val="Heading2"/>
+      </w:pPr>
+      <w:r>
+        <w:rPr>
+          <w:rFonts w:ascii="Calibri" w:hAnsi="Calibri" w:eastAsia="Calibri" w:cs="Calibri" w:hint="eastAsia"/>
+        </w:rPr>
+        <w:t xml:space="preserve">6.7 Current-source deterministic conformance replication</w:t>
+      </w:r>
+    </w:p>
+    <w:p>
+      <w:pPr>
+        <w:pStyle w:val="FirstParagraph"/>
+        <w:jc w:val="left"/>
+      </w:pPr>
+      <w:r>
+        <w:rPr>
+          <w:rFonts w:ascii="Calibri" w:hAnsi="Calibri" w:eastAsia="Calibri" w:cs="Calibri" w:hint="eastAsia"/>
+        </w:rPr>
+        <w:t xml:space="preserve">After both performance lineages were terminal, a separate preregistration</w:t>
+      </w:r>
+      <w:r>
+        <w:rPr>
+          <w:rFonts w:ascii="Calibri" w:hAnsi="Calibri" w:eastAsia="Calibri" w:cs="Calibri" w:hint="eastAsia"/>
+        </w:rPr>
+        <w:t xml:space="preserve"> </w:t>
+      </w:r>
+      <w:r>
+        <w:rPr>
+          <w:rFonts w:ascii="Calibri" w:hAnsi="Calibri" w:eastAsia="Calibri" w:cs="Calibri" w:hint="eastAsia"/>
+        </w:rPr>
+        <w:t xml:space="preserve">froze a functional question that neither estimates nor rescues their performance</w:t>
+      </w:r>
+      <w:r>
+        <w:rPr>
+          <w:rFonts w:ascii="Calibri" w:hAnsi="Calibri" w:eastAsia="Calibri" w:cs="Calibri" w:hint="eastAsia"/>
+        </w:rPr>
+        <w:t xml:space="preserve"> </w:t>
+      </w:r>
+      <w:r>
+        <w:rPr>
+          <w:rFonts w:ascii="Calibri" w:hAnsi="Calibri" w:eastAsia="Calibri" w:cs="Calibri" w:hint="eastAsia"/>
+        </w:rPr>
+        <w:t xml:space="preserve">estimand. The immutable source was lightweight tag</w:t>
+      </w:r>
+      <w:r>
+        <w:rPr>
+          <w:rFonts w:ascii="Calibri" w:hAnsi="Calibri" w:eastAsia="Calibri" w:cs="Calibri" w:hint="eastAsia"/>
+        </w:rPr>
+        <w:t xml:space="preserve"> </w:t>
+      </w:r>
+      <w:r>
+        <w:rPr>
+          <w:rStyle w:val="VerbatimChar"/>
+          <w:rFonts w:ascii="Calibri" w:hAnsi="Calibri" w:eastAsia="Calibri" w:cs="Calibri" w:hint="eastAsia"/>
+        </w:rPr>
+        <w:t xml:space="preserve">current-source-e4-conformance-20260831-v1</w:t>
+      </w:r>
+      <w:r>
+        <w:rPr>
+          <w:rFonts w:ascii="Calibri" w:hAnsi="Calibri" w:eastAsia="Calibri" w:cs="Calibri" w:hint="eastAsia"/>
+        </w:rPr>
+        <w:t xml:space="preserve">, pointing directly to reviewed</w:t>
+      </w:r>
+      <w:r>
+        <w:rPr>
+          <w:rFonts w:ascii="Calibri" w:hAnsi="Calibri" w:eastAsia="Calibri" w:cs="Calibri" w:hint="eastAsia"/>
+        </w:rPr>
+        <w:t xml:space="preserve"> </w:t>
+      </w:r>
+      <w:r>
+        <w:rPr>
+          <w:rFonts w:ascii="Calibri" w:hAnsi="Calibri" w:eastAsia="Calibri" w:cs="Calibri" w:hint="eastAsia"/>
+        </w:rPr>
+        <w:t xml:space="preserve">commit</w:t>
+      </w:r>
+      <w:r>
+        <w:rPr>
+          <w:rFonts w:ascii="Calibri" w:hAnsi="Calibri" w:eastAsia="Calibri" w:cs="Calibri" w:hint="eastAsia"/>
+        </w:rPr>
+        <w:t xml:space="preserve"> </w:t>
+      </w:r>
+      <w:r>
+        <w:rPr>
+          <w:rStyle w:val="VerbatimChar"/>
+          <w:rFonts w:ascii="Calibri" w:hAnsi="Calibri" w:eastAsia="Calibri" w:cs="Calibri" w:hint="eastAsia"/>
+        </w:rPr>
+        <w:t xml:space="preserve">844fb062d78f5095f14599c6c71a27cb6034f001</w:t>
+      </w:r>
+      <w:r>
+        <w:rPr>
+          <w:rFonts w:ascii="Calibri" w:hAnsi="Calibri" w:eastAsia="Calibri" w:cs="Calibri" w:hint="eastAsia"/>
+        </w:rPr>
+        <w:t xml:space="preserve">. The single default dispatch</w:t>
+      </w:r>
+      <w:r>
+        <w:rPr>
+          <w:rFonts w:ascii="Calibri" w:hAnsi="Calibri" w:eastAsia="Calibri" w:cs="Calibri" w:hint="eastAsia"/>
+        </w:rPr>
+        <w:t xml:space="preserve"> </w:t>
+      </w:r>
+      <w:r>
+        <w:rPr>
+          <w:rFonts w:ascii="Calibri" w:hAnsi="Calibri" w:eastAsia="Calibri" w:cs="Calibri" w:hint="eastAsia"/>
+        </w:rPr>
+        <w:t xml:space="preserve">used</w:t>
+      </w:r>
+      <w:r>
+        <w:rPr>
+          <w:rFonts w:ascii="Calibri" w:hAnsi="Calibri" w:eastAsia="Calibri" w:cs="Calibri" w:hint="eastAsia"/>
+        </w:rPr>
+        <w:t xml:space="preserve"> </w:t>
+      </w:r>
+      <w:r>
+        <w:rPr>
+          <w:rStyle w:val="VerbatimChar"/>
+          <w:rFonts w:ascii="Calibri" w:hAnsi="Calibri" w:eastAsia="Calibri" w:cs="Calibri" w:hint="eastAsia"/>
+        </w:rPr>
+        <w:t xml:space="preserve">.github/workflows/strong-whole-query-witness.yml</w:t>
+      </w:r>
+      <w:r>
+        <w:rPr>
+          <w:rFonts w:ascii="Calibri" w:hAnsi="Calibri" w:eastAsia="Calibri" w:cs="Calibri" w:hint="eastAsia"/>
+        </w:rPr>
+        <w:t xml:space="preserve">, CPython 3.12, a</w:t>
+      </w:r>
+      <w:r>
+        <w:rPr>
+          <w:rFonts w:ascii="Calibri" w:hAnsi="Calibri" w:eastAsia="Calibri" w:cs="Calibri" w:hint="eastAsia"/>
+        </w:rPr>
+        <w:t xml:space="preserve"> </w:t>
+      </w:r>
+      <w:r>
+        <w:rPr>
+          <w:rFonts w:ascii="Calibri" w:hAnsi="Calibri" w:eastAsia="Calibri" w:cs="Calibri" w:hint="eastAsia"/>
+        </w:rPr>
+        <w:t xml:space="preserve">120-minute job timeout, two build threads, and OpenFHE 1.5.1 at commit</w:t>
+      </w:r>
+      <w:r>
+        <w:rPr>
+          <w:rFonts w:ascii="Calibri" w:hAnsi="Calibri" w:eastAsia="Calibri" w:cs="Calibri" w:hint="eastAsia"/>
+        </w:rPr>
+        <w:t xml:space="preserve"> </w:t>
+      </w:r>
+      <w:r>
+        <w:rPr>
+          <w:rStyle w:val="VerbatimChar"/>
+          <w:rFonts w:ascii="Calibri" w:hAnsi="Calibri" w:eastAsia="Calibri" w:cs="Calibri" w:hint="eastAsia"/>
+        </w:rPr>
+        <w:t xml:space="preserve">1306d14f8c26bb6150d3e6ad54f28dfe1007689e</w:t>
+      </w:r>
+      <w:r>
+        <w:rPr>
+          <w:rFonts w:ascii="Calibri" w:hAnsi="Calibri" w:eastAsia="Calibri" w:cs="Calibri" w:hint="eastAsia"/>
+        </w:rPr>
+        <w:t xml:space="preserve">.</w:t>
+      </w:r>
+    </w:p>
+    <w:p>
+      <w:pPr>
+        <w:pStyle w:val="BodyText"/>
+      </w:pPr>
+      <w:r>
+        <w:rPr>
+          <w:rFonts w:ascii="Calibri" w:hAnsi="Calibri" w:eastAsia="Calibri" w:cs="Calibri" w:hint="eastAsia"/>
+        </w:rPr>
+        <w:t xml:space="preserve">The deterministic property corpus froze seed</w:t>
+      </w:r>
+      <w:r>
+        <w:rPr>
+          <w:rFonts w:ascii="Calibri" w:hAnsi="Calibri" w:eastAsia="Calibri" w:cs="Calibri" w:hint="eastAsia"/>
+        </w:rPr>
+        <w:t xml:space="preserve"> </w:t>
+      </w:r>
+      <w:r>
+        <w:rPr>
+          <w:rStyle w:val="VerbatimChar"/>
+          <w:rFonts w:ascii="Calibri" w:hAnsi="Calibri" w:eastAsia="Calibri" w:cs="Calibri" w:hint="eastAsia"/>
+        </w:rPr>
+        <w:t xml:space="preserve">20260822</w:t>
+      </w:r>
+      <w:r>
+        <w:rPr>
+          <w:rFonts w:ascii="Calibri" w:hAnsi="Calibri" w:eastAsia="Calibri" w:cs="Calibri" w:hint="eastAsia"/>
+        </w:rPr>
+        <w:t xml:space="preserve">, eight input cases,</w:t>
+      </w:r>
+      <w:r>
+        <w:rPr>
+          <w:rFonts w:ascii="Calibri" w:hAnsi="Calibri" w:eastAsia="Calibri" w:cs="Calibri" w:hint="eastAsia"/>
+        </w:rPr>
+        <w:t xml:space="preserve"> </w:t>
+      </w:r>
+      <w:r>
+        <w:rPr>
+          <w:rFonts w:ascii="Calibri" w:hAnsi="Calibri" w:eastAsia="Calibri" w:cs="Calibri" w:hint="eastAsia"/>
+        </w:rPr>
+        <w:t xml:space="preserve">and 35 contract records. The encrypted witness froze one 4096-by-8193</w:t>
+      </w:r>
+      <w:r>
+        <w:rPr>
+          <w:rFonts w:ascii="Calibri" w:hAnsi="Calibri" w:eastAsia="Calibri" w:cs="Calibri" w:hint="eastAsia"/>
+        </w:rPr>
+        <w:t xml:space="preserve"> </w:t>
+      </w:r>
+      <w:r>
+        <w:rPr>
+          <w:rFonts w:ascii="Calibri" w:hAnsi="Calibri" w:eastAsia="Calibri" w:cs="Calibri" w:hint="eastAsia"/>
+        </w:rPr>
+        <w:t xml:space="preserve">CSSC-base-plus-strong-delta fixture, segment width 128, active payload 127,</w:t>
+      </w:r>
+      <w:r>
+        <w:rPr>
+          <w:rFonts w:ascii="Calibri" w:hAnsi="Calibri" w:eastAsia="Calibri" w:cs="Calibri" w:hint="eastAsia"/>
+        </w:rPr>
+        <w:t xml:space="preserve"> </w:t>
+      </w:r>
+      <w:r>
+        <w:rPr>
+          <w:rFonts w:ascii="Calibri" w:hAnsi="Calibri" w:eastAsia="Calibri" w:cs="Calibri" w:hint="eastAsia"/>
+        </w:rPr>
+        <w:t xml:space="preserve">padding offset 127, global column 8192, and sparse expected output</w:t>
+      </w:r>
+      <w:r>
+        <w:rPr>
+          <w:rFonts w:ascii="Calibri" w:hAnsi="Calibri" w:eastAsia="Calibri" w:cs="Calibri" w:hint="eastAsia"/>
+        </w:rPr>
+        <w:t xml:space="preserve"> </w:t>
+      </w:r>
+      <w:r>
+        <w:rPr>
+          <w:rStyle w:val="VerbatimChar"/>
+          <w:rFonts w:ascii="Calibri" w:hAnsi="Calibri" w:eastAsia="Calibri" w:cs="Calibri" w:hint="eastAsia"/>
+        </w:rPr>
+        <w:t xml:space="preserve">[(0, 128), (4095, 5)]</w:t>
+      </w:r>
+      <w:r>
+        <w:rPr>
+          <w:rFonts w:ascii="Calibri" w:hAnsi="Calibri" w:eastAsia="Calibri" w:cs="Calibri" w:hint="eastAsia"/>
+        </w:rPr>
+        <w:t xml:space="preserve">. PASS required exact run/ref/head/attempt identity,</w:t>
+      </w:r>
+      <w:r>
+        <w:rPr>
+          <w:rFonts w:ascii="Calibri" w:hAnsi="Calibri" w:eastAsia="Calibri" w:cs="Calibri" w:hint="eastAsia"/>
+        </w:rPr>
+        <w:t xml:space="preserve"> </w:t>
+      </w:r>
+      <w:r>
+        <w:rPr>
+          <w:rFonts w:ascii="Calibri" w:hAnsi="Calibri" w:eastAsia="Calibri" w:cs="Calibri" w:hint="eastAsia"/>
+        </w:rPr>
+        <w:t xml:space="preserve">success for every provider step, one success-named 30-day artifact, exactly 19</w:t>
+      </w:r>
+      <w:r>
+        <w:rPr>
+          <w:rFonts w:ascii="Calibri" w:hAnsi="Calibri" w:eastAsia="Calibri" w:cs="Calibri" w:hint="eastAsia"/>
+        </w:rPr>
+        <w:t xml:space="preserve"> </w:t>
+      </w:r>
+      <w:r>
+        <w:rPr>
+          <w:rFonts w:ascii="Calibri" w:hAnsi="Calibri" w:eastAsia="Calibri" w:cs="Calibri" w:hint="eastAsia"/>
+        </w:rPr>
+        <w:t xml:space="preserve">regular files, a raw ZIP digest equal to the provider digest, strict internal</w:t>
+      </w:r>
+      <w:r>
+        <w:rPr>
+          <w:rFonts w:ascii="Calibri" w:hAnsi="Calibri" w:eastAsia="Calibri" w:cs="Calibri" w:hint="eastAsia"/>
+        </w:rPr>
+        <w:t xml:space="preserve"> </w:t>
+      </w:r>
+      <w:r>
+        <w:rPr>
+          <w:rFonts w:ascii="Calibri" w:hAnsi="Calibri" w:eastAsia="Calibri" w:cs="Calibri" w:hint="eastAsia"/>
+        </w:rPr>
+        <w:t xml:space="preserve">checksums, literal RFC 6901 checks, and detached-source PROVENANCE rehashing.</w:t>
+      </w:r>
+      <w:r>
+        <w:rPr>
+          <w:rFonts w:ascii="Calibri" w:hAnsi="Calibri" w:eastAsia="Calibri" w:cs="Calibri" w:hint="eastAsia"/>
+        </w:rPr>
+        <w:t xml:space="preserve"> </w:t>
+      </w:r>
+      <w:r>
+        <w:rPr>
+          <w:rFonts w:ascii="Calibri" w:hAnsi="Calibri" w:eastAsia="Calibri" w:cs="Calibri" w:hint="eastAsia"/>
+        </w:rPr>
+        <w:t xml:space="preserve">The rerun button was forbidden; a replacement could exist only for a</w:t>
+      </w:r>
+      <w:r>
+        <w:rPr>
+          <w:rFonts w:ascii="Calibri" w:hAnsi="Calibri" w:eastAsia="Calibri" w:cs="Calibri" w:hint="eastAsia"/>
+        </w:rPr>
+        <w:t xml:space="preserve"> </w:t>
+      </w:r>
+      <w:r>
+        <w:rPr>
+          <w:rFonts w:ascii="Calibri" w:hAnsi="Calibri" w:eastAsia="Calibri" w:cs="Calibri" w:hint="eastAsia"/>
+        </w:rPr>
+        <w:t xml:space="preserve">provider-only null attempt proven to have executed no job step and produced no</w:t>
+      </w:r>
+      <w:r>
+        <w:rPr>
+          <w:rFonts w:ascii="Calibri" w:hAnsi="Calibri" w:eastAsia="Calibri" w:cs="Calibri" w:hint="eastAsia"/>
+        </w:rPr>
+        <w:t xml:space="preserve"> </w:t>
+      </w:r>
+      <w:r>
+        <w:rPr>
+          <w:rFonts w:ascii="Calibri" w:hAnsi="Calibri" w:eastAsia="Calibri" w:cs="Calibri" w:hint="eastAsia"/>
+        </w:rPr>
+        <w:t xml:space="preserve">artifact. No replacement was needed or dispatched.</w:t>
+      </w:r>
+    </w:p>
     <w:bookmarkEnd w:id="37"/>
-    <w:bookmarkStart w:id="46" w:name="evidence-outcome"/>
+    <w:bookmarkEnd w:id="38"/>
+    <w:bookmarkStart w:id="48" w:name="evidence-outcome"/>
     <w:p>
       <w:pPr>
         <w:pStyle w:val="Heading1"/>
@@ -15132,7 +15752,7 @@
         <w:t xml:space="preserve">7. Evidence Outcome</w:t>
       </w:r>
     </w:p>
-    <w:bookmarkStart w:id="41" w:name="evidence-status"/>
+    <w:bookmarkStart w:id="42" w:name="evidence-status"/>
     <w:p>
       <w:pPr>
         <w:pStyle w:val="Heading2"/>
@@ -15379,18 +15999,18 @@
           <wp:inline>
             <wp:extent cx="5334000" cy="2895599"/>
             <wp:effectExtent b="0" l="0" r="0" t="0"/>
-            <wp:docPr descr="Evidence lineage from S1 and S2 through the stopped qualification to the Route C boundary; the formal campaign was not dispatched." title="Figure 2" id="39" name="Picture"/>
+            <wp:docPr descr="Evidence lineage from S1 and S2 through the stopped qualification to the Route C boundary; the formal campaign was not dispatched." title="Figure 2" id="40" name="Picture"/>
             <a:graphic>
               <a:graphicData uri="http://schemas.openxmlformats.org/drawingml/2006/picture">
                 <pic:pic>
                   <pic:nvPicPr>
-                    <pic:cNvPr descr="assets/route-c-evidence-boundary.png" id="40" name="Picture"/>
+                    <pic:cNvPr descr="assets/route-c-evidence-boundary.png" id="41" name="Picture"/>
                     <pic:cNvPicPr>
                       <a:picLocks noChangeArrowheads="1" noChangeAspect="1"/>
                     </pic:cNvPicPr>
                   </pic:nvPicPr>
                   <pic:blipFill>
-                    <a:blip r:embed="rId38"/>
+                    <a:blip r:embed="rId39"/>
                     <a:stretch>
                       <a:fillRect/>
                     </a:stretch>
@@ -16205,6 +16825,115 @@
                 <w:rFonts w:ascii="Calibri" w:hAnsi="Calibri" w:eastAsia="Calibri" w:cs="Calibri" w:hint="eastAsia"/>
                 <w:sz w:val="18"/>
               </w:rPr>
+              <w:t xml:space="preserve">Current-source E4 conformance</w:t>
+            </w:r>
+          </w:p>
+        </w:tc>
+        <w:tc>
+          <w:tcPr>
+            <w:tcW w:w="2200" w:type="dxa"/>
+            <w:tcMar>
+              <w:top w:w="80" w:type="dxa"/>
+              <w:start w:w="120" w:type="dxa"/>
+              <w:bottom w:w="80" w:type="dxa"/>
+              <w:end w:w="120" w:type="dxa"/>
+            </w:tcMar>
+            <w:vAlign w:val="center"/>
+          </w:tcPr>
+          <w:p>
+            <w:pPr>
+              <w:pStyle w:val="Compact"/>
+              <w:spacing w:before="0" w:after="60" w:line="259" w:lineRule="auto"/>
+              <w:jc w:val="left"/>
+            </w:pPr>
+            <w:r>
+              <w:rPr>
+                <w:rFonts w:ascii="Calibri" w:hAnsi="Calibri" w:eastAsia="Calibri" w:cs="Calibri" w:hint="eastAsia"/>
+                <w:sz w:val="18"/>
+              </w:rPr>
+              <w:t xml:space="preserve">One exact tagged run and independently rehashed 19-file artifact passed</w:t>
+            </w:r>
+          </w:p>
+        </w:tc>
+        <w:tc>
+          <w:tcPr>
+            <w:tcW w:w="2800" w:type="dxa"/>
+            <w:tcMar>
+              <w:top w:w="80" w:type="dxa"/>
+              <w:start w:w="120" w:type="dxa"/>
+              <w:bottom w:w="80" w:type="dxa"/>
+              <w:end w:w="120" w:type="dxa"/>
+            </w:tcMar>
+            <w:vAlign w:val="center"/>
+          </w:tcPr>
+          <w:p>
+            <w:pPr>
+              <w:pStyle w:val="Compact"/>
+              <w:spacing w:before="0" w:after="60" w:line="259" w:lineRule="auto"/>
+              <w:jc w:val="left"/>
+            </w:pPr>
+            <w:r>
+              <w:rPr>
+                <w:rFonts w:ascii="Calibri" w:hAnsi="Calibri" w:eastAsia="Calibri" w:cs="Calibri" w:hint="eastAsia"/>
+                <w:sz w:val="18"/>
+              </w:rPr>
+              <w:t xml:space="preserve">Version-bound eight-case/35-record contract outcome and one fixed OpenFHE whole-query vector</w:t>
+            </w:r>
+          </w:p>
+        </w:tc>
+        <w:tc>
+          <w:tcPr>
+            <w:tcW w:w="2760" w:type="dxa"/>
+            <w:tcMar>
+              <w:top w:w="80" w:type="dxa"/>
+              <w:start w:w="120" w:type="dxa"/>
+              <w:bottom w:w="80" w:type="dxa"/>
+              <w:end w:w="120" w:type="dxa"/>
+            </w:tcMar>
+            <w:vAlign w:val="center"/>
+          </w:tcPr>
+          <w:p>
+            <w:pPr>
+              <w:pStyle w:val="Compact"/>
+              <w:spacing w:before="0" w:after="60" w:line="259" w:lineRule="auto"/>
+              <w:jc w:val="left"/>
+            </w:pPr>
+            <w:r>
+              <w:rPr>
+                <w:rFonts w:ascii="Calibri" w:hAnsi="Calibri" w:eastAsia="Calibri" w:cs="Calibri" w:hint="eastAsia"/>
+                <w:sz w:val="18"/>
+              </w:rPr>
+              <w:t xml:space="preserve">Candidate admission, complete-reference status, security, deployment, performance, speedup, or general correctness</w:t>
+            </w:r>
+          </w:p>
+        </w:tc>
+      </w:tr>
+      <w:tr>
+        <w:trPr>
+          <w:cantSplit w:val="1"/>
+        </w:trPr>
+        <w:tc>
+          <w:tcPr>
+            <w:tcW w:w="1600" w:type="dxa"/>
+            <w:tcMar>
+              <w:top w:w="80" w:type="dxa"/>
+              <w:start w:w="120" w:type="dxa"/>
+              <w:bottom w:w="80" w:type="dxa"/>
+              <w:end w:w="120" w:type="dxa"/>
+            </w:tcMar>
+            <w:vAlign w:val="center"/>
+          </w:tcPr>
+          <w:p>
+            <w:pPr>
+              <w:pStyle w:val="Compact"/>
+              <w:spacing w:before="0" w:after="60" w:line="259" w:lineRule="auto"/>
+              <w:jc w:val="left"/>
+            </w:pPr>
+            <w:r>
+              <w:rPr>
+                <w:rFonts w:ascii="Calibri" w:hAnsi="Calibri" w:eastAsia="Calibri" w:cs="Calibri" w:hint="eastAsia"/>
+                <w:sz w:val="18"/>
+              </w:rPr>
               <w:t xml:space="preserve">Formal campaign</w:t>
             </w:r>
           </w:p>
@@ -17877,8 +18606,8 @@
         <w:t xml:space="preserve">circulation packet rather than an alternative source of empirical results.</w:t>
       </w:r>
     </w:p>
-    <w:bookmarkEnd w:id="41"/>
-    <w:bookmarkStart w:id="42" w:name="synthetic-and-ordered-event-costs"/>
+    <w:bookmarkEnd w:id="42"/>
+    <w:bookmarkStart w:id="43" w:name="synthetic-and-ordered-event-costs"/>
     <w:p>
       <w:pPr>
         <w:pStyle w:val="Heading2"/>
@@ -17949,8 +18678,8 @@
         <w:t xml:space="preserve">measurement result.</w:t>
       </w:r>
     </w:p>
-    <w:bookmarkEnd w:id="42"/>
-    <w:bookmarkStart w:id="43" w:name="native-openfhe-execution"/>
+    <w:bookmarkEnd w:id="43"/>
+    <w:bookmarkStart w:id="44" w:name="native-openfhe-execution"/>
     <w:p>
       <w:pPr>
         <w:pStyle w:val="Heading2"/>
@@ -18009,8 +18738,8 @@
         <w:t xml:space="preserve">speedup, memory result, or serialized-package comparison is claimed.</w:t>
       </w:r>
     </w:p>
-    <w:bookmarkEnd w:id="43"/>
-    <w:bookmarkStart w:id="44" w:name="preregistered-route-c-disposition"/>
+    <w:bookmarkEnd w:id="44"/>
+    <w:bookmarkStart w:id="45" w:name="preregistered-route-c-disposition"/>
     <w:p>
       <w:pPr>
         <w:pStyle w:val="Heading2"/>
@@ -18161,8 +18890,8 @@
         <w:t xml:space="preserve">lineage, not as permission to modify S1 and repeat this one-shot attempt.</w:t>
       </w:r>
     </w:p>
-    <w:bookmarkEnd w:id="44"/>
-    <w:bookmarkStart w:id="45" w:name="X1500b0de950b79c26d1689b0b644a3b16b3a427"/>
+    <w:bookmarkEnd w:id="45"/>
+    <w:bookmarkStart w:id="46" w:name="X1500b0de950b79c26d1689b0b644a3b16b3a427"/>
     <w:p>
       <w:pPr>
         <w:pStyle w:val="Heading2"/>
@@ -18467,9 +19196,1044 @@
         <w:t xml:space="preserve">control-plane limitation, not evidence about a maintenance strategy.</w:t>
       </w:r>
     </w:p>
-    <w:bookmarkEnd w:id="45"/>
     <w:bookmarkEnd w:id="46"/>
-    <w:bookmarkStart w:id="47" w:name="limitations"/>
+    <w:bookmarkStart w:id="47" w:name="X8046ec0c2b48693c25e7d28948fa12e8caa2283"/>
+    <w:p>
+      <w:pPr>
+        <w:pStyle w:val="Heading2"/>
+      </w:pPr>
+      <w:r>
+        <w:rPr>
+          <w:rFonts w:ascii="Calibri" w:hAnsi="Calibri" w:eastAsia="Calibri" w:cs="Calibri" w:hint="eastAsia"/>
+        </w:rPr>
+        <w:t xml:space="preserve">7.6 Current-source deterministic conformance outcome</w:t>
+      </w:r>
+    </w:p>
+    <w:p>
+      <w:pPr>
+        <w:pStyle w:val="FirstParagraph"/>
+        <w:jc w:val="left"/>
+      </w:pPr>
+      <w:r>
+        <w:rPr>
+          <w:rFonts w:ascii="Calibri" w:hAnsi="Calibri" w:eastAsia="Calibri" w:cs="Calibri" w:hint="eastAsia"/>
+        </w:rPr>
+        <w:t xml:space="preserve">The independent controller audit accepted run</w:t>
+      </w:r>
+      <w:r>
+        <w:rPr>
+          <w:rFonts w:ascii="Calibri" w:hAnsi="Calibri" w:eastAsia="Calibri" w:cs="Calibri" w:hint="eastAsia"/>
+        </w:rPr>
+        <w:t xml:space="preserve"> </w:t>
+      </w:r>
+      <w:r>
+        <w:rPr>
+          <w:rStyle w:val="VerbatimChar"/>
+          <w:rFonts w:ascii="Calibri" w:hAnsi="Calibri" w:eastAsia="Calibri" w:cs="Calibri" w:hint="eastAsia"/>
+        </w:rPr>
+        <w:t xml:space="preserve">33386130654</w:t>
+      </w:r>
+      <w:r>
+        <w:rPr>
+          <w:rFonts w:ascii="Calibri" w:hAnsi="Calibri" w:eastAsia="Calibri" w:cs="Calibri" w:hint="eastAsia"/>
+        </w:rPr>
+        <w:t xml:space="preserve"> </w:t>
+      </w:r>
+      <w:r>
+        <w:rPr>
+          <w:rFonts w:ascii="Calibri" w:hAnsi="Calibri" w:eastAsia="Calibri" w:cs="Calibri" w:hint="eastAsia"/>
+        </w:rPr>
+        <w:t xml:space="preserve">at exact source</w:t>
+      </w:r>
+      <w:r>
+        <w:rPr>
+          <w:rFonts w:ascii="Calibri" w:hAnsi="Calibri" w:eastAsia="Calibri" w:cs="Calibri" w:hint="eastAsia"/>
+        </w:rPr>
+        <w:t xml:space="preserve"> </w:t>
+      </w:r>
+      <w:r>
+        <w:rPr>
+          <w:rStyle w:val="VerbatimChar"/>
+          <w:rFonts w:ascii="Calibri" w:hAnsi="Calibri" w:eastAsia="Calibri" w:cs="Calibri" w:hint="eastAsia"/>
+        </w:rPr>
+        <w:t xml:space="preserve">844fb062d78f5095f14599c6c71a27cb6034f001</w:t>
+      </w:r>
+      <w:r>
+        <w:rPr>
+          <w:rFonts w:ascii="Calibri" w:hAnsi="Calibri" w:eastAsia="Calibri" w:cs="Calibri" w:hint="eastAsia"/>
+        </w:rPr>
+        <w:t xml:space="preserve">, attempt 1. Every provider-visible</w:t>
+      </w:r>
+      <w:r>
+        <w:rPr>
+          <w:rFonts w:ascii="Calibri" w:hAnsi="Calibri" w:eastAsia="Calibri" w:cs="Calibri" w:hint="eastAsia"/>
+        </w:rPr>
+        <w:t xml:space="preserve"> </w:t>
+      </w:r>
+      <w:r>
+        <w:rPr>
+          <w:rFonts w:ascii="Calibri" w:hAnsi="Calibri" w:eastAsia="Calibri" w:cs="Calibri" w:hint="eastAsia"/>
+        </w:rPr>
+        <w:t xml:space="preserve">step succeeded. The only artifact was</w:t>
+      </w:r>
+      <w:r>
+        <w:rPr>
+          <w:rFonts w:ascii="Calibri" w:hAnsi="Calibri" w:eastAsia="Calibri" w:cs="Calibri" w:hint="eastAsia"/>
+        </w:rPr>
+        <w:t xml:space="preserve"> </w:t>
+      </w:r>
+      <w:r>
+        <w:rPr>
+          <w:rStyle w:val="VerbatimChar"/>
+          <w:rFonts w:ascii="Calibri" w:hAnsi="Calibri" w:eastAsia="Calibri" w:cs="Calibri" w:hint="eastAsia"/>
+        </w:rPr>
+        <w:t xml:space="preserve">9755741401</w:t>
+      </w:r>
+      <w:r>
+        <w:rPr>
+          <w:rFonts w:ascii="Calibri" w:hAnsi="Calibri" w:eastAsia="Calibri" w:cs="Calibri" w:hint="eastAsia"/>
+        </w:rPr>
+        <w:t xml:space="preserve">, named</w:t>
+      </w:r>
+      <w:r>
+        <w:rPr>
+          <w:rFonts w:ascii="Calibri" w:hAnsi="Calibri" w:eastAsia="Calibri" w:cs="Calibri" w:hint="eastAsia"/>
+        </w:rPr>
+        <w:t xml:space="preserve"> </w:t>
+      </w:r>
+      <w:r>
+        <w:rPr>
+          <w:rStyle w:val="VerbatimChar"/>
+          <w:rFonts w:ascii="Calibri" w:hAnsi="Calibri" w:eastAsia="Calibri" w:cs="Calibri" w:hint="eastAsia"/>
+        </w:rPr>
+        <w:t xml:space="preserve">strong-whole-query-witness-success-844fb062d78f5095f14599c6c71a27cb6034f001</w:t>
+      </w:r>
+      <w:r>
+        <w:rPr>
+          <w:rFonts w:ascii="Calibri" w:hAnsi="Calibri" w:eastAsia="Calibri" w:cs="Calibri" w:hint="eastAsia"/>
+        </w:rPr>
+        <w:t xml:space="preserve">,</w:t>
+      </w:r>
+      <w:r>
+        <w:rPr>
+          <w:rFonts w:ascii="Calibri" w:hAnsi="Calibri" w:eastAsia="Calibri" w:cs="Calibri" w:hint="eastAsia"/>
+        </w:rPr>
+        <w:t xml:space="preserve"> </w:t>
+      </w:r>
+      <w:r>
+        <w:rPr>
+          <w:rFonts w:ascii="Calibri" w:hAnsi="Calibri" w:eastAsia="Calibri" w:cs="Calibri" w:hint="eastAsia"/>
+        </w:rPr>
+        <w:t xml:space="preserve">with raw provider digest</w:t>
+      </w:r>
+      <w:r>
+        <w:rPr>
+          <w:rFonts w:ascii="Calibri" w:hAnsi="Calibri" w:eastAsia="Calibri" w:cs="Calibri" w:hint="eastAsia"/>
+        </w:rPr>
+        <w:t xml:space="preserve"> </w:t>
+      </w:r>
+      <w:r>
+        <w:rPr>
+          <w:rStyle w:val="VerbatimChar"/>
+          <w:rFonts w:ascii="Calibri" w:hAnsi="Calibri" w:eastAsia="Calibri" w:cs="Calibri" w:hint="eastAsia"/>
+        </w:rPr>
+        <w:t xml:space="preserve">sha256:5978b7d9f75048939c9761243e224abb588ed82c2abc64e051523a7a598a1383</w:t>
+      </w:r>
+      <w:r>
+        <w:rPr>
+          <w:rFonts w:ascii="Calibri" w:hAnsi="Calibri" w:eastAsia="Calibri" w:cs="Calibri" w:hint="eastAsia"/>
+        </w:rPr>
+        <w:t xml:space="preserve">.</w:t>
+      </w:r>
+      <w:r>
+        <w:rPr>
+          <w:rFonts w:ascii="Calibri" w:hAnsi="Calibri" w:eastAsia="Calibri" w:cs="Calibri" w:hint="eastAsia"/>
+        </w:rPr>
+        <w:t xml:space="preserve"> </w:t>
+      </w:r>
+      <w:r>
+        <w:rPr>
+          <w:rFonts w:ascii="Calibri" w:hAnsi="Calibri" w:eastAsia="Calibri" w:cs="Calibri" w:hint="eastAsia"/>
+        </w:rPr>
+        <w:t xml:space="preserve">The downloaded ZIP independently reproduced that digest, contained exactly the</w:t>
+      </w:r>
+      <w:r>
+        <w:rPr>
+          <w:rFonts w:ascii="Calibri" w:hAnsi="Calibri" w:eastAsia="Calibri" w:cs="Calibri" w:hint="eastAsia"/>
+        </w:rPr>
+        <w:t xml:space="preserve"> </w:t>
+      </w:r>
+      <w:r>
+        <w:rPr>
+          <w:rFonts w:ascii="Calibri" w:hAnsi="Calibri" w:eastAsia="Calibri" w:cs="Calibri" w:hint="eastAsia"/>
+        </w:rPr>
+        <w:t xml:space="preserve">19 prespecified files, passed all strict checksums and JSON-pointer checks, and</w:t>
+      </w:r>
+      <w:r>
+        <w:rPr>
+          <w:rFonts w:ascii="Calibri" w:hAnsi="Calibri" w:eastAsia="Calibri" w:cs="Calibri" w:hint="eastAsia"/>
+        </w:rPr>
+        <w:t xml:space="preserve"> </w:t>
+      </w:r>
+      <w:r>
+        <w:rPr>
+          <w:rFonts w:ascii="Calibri" w:hAnsi="Calibri" w:eastAsia="Calibri" w:cs="Calibri" w:hint="eastAsia"/>
+        </w:rPr>
+        <w:t xml:space="preserve">rehashed every provenance-listed source against a fresh detached checkout of</w:t>
+      </w:r>
+      <w:r>
+        <w:rPr>
+          <w:rFonts w:ascii="Calibri" w:hAnsi="Calibri" w:eastAsia="Calibri" w:cs="Calibri" w:hint="eastAsia"/>
+        </w:rPr>
+        <w:t xml:space="preserve"> </w:t>
+      </w:r>
+      <w:r>
+        <w:rPr>
+          <w:rFonts w:ascii="Calibri" w:hAnsi="Calibri" w:eastAsia="Calibri" w:cs="Calibri" w:hint="eastAsia"/>
+        </w:rPr>
+        <w:t xml:space="preserve">the immutable tag.</w:t>
+      </w:r>
+    </w:p>
+    <w:p>
+      <w:pPr>
+        <w:pStyle w:val="BodyText"/>
+      </w:pPr>
+      <w:r>
+        <w:rPr>
+          <w:rFonts w:ascii="Calibri" w:hAnsi="Calibri" w:eastAsia="Calibri" w:cs="Calibri" w:hint="eastAsia"/>
+        </w:rPr>
+        <w:t xml:space="preserve">At that exact source, the prespecified OpenFHE 1.5.1 whole-query witness for one</w:t>
+      </w:r>
+      <w:r>
+        <w:rPr>
+          <w:rFonts w:ascii="Calibri" w:hAnsi="Calibri" w:eastAsia="Calibri" w:cs="Calibri" w:hint="eastAsia"/>
+        </w:rPr>
+        <w:t xml:space="preserve"> </w:t>
+      </w:r>
+      <w:r>
+        <w:rPr>
+          <w:rFonts w:ascii="Calibri" w:hAnsi="Calibri" w:eastAsia="Calibri" w:cs="Calibri" w:hint="eastAsia"/>
+        </w:rPr>
+        <w:t xml:space="preserve">fixed 4096-by-8193 CSSC-base-plus-strong-delta fixture decrypted to the</w:t>
+      </w:r>
+      <w:r>
+        <w:rPr>
+          <w:rFonts w:ascii="Calibri" w:hAnsi="Calibri" w:eastAsia="Calibri" w:cs="Calibri" w:hint="eastAsia"/>
+        </w:rPr>
+        <w:t xml:space="preserve"> </w:t>
+      </w:r>
+      <w:r>
+        <w:rPr>
+          <w:rFonts w:ascii="Calibri" w:hAnsi="Calibri" w:eastAsia="Calibri" w:cs="Calibri" w:hint="eastAsia"/>
+        </w:rPr>
+        <w:t xml:space="preserve">prespecified sparse vector</w:t>
+      </w:r>
+      <w:r>
+        <w:rPr>
+          <w:rFonts w:ascii="Calibri" w:hAnsi="Calibri" w:eastAsia="Calibri" w:cs="Calibri" w:hint="eastAsia"/>
+        </w:rPr>
+        <w:t xml:space="preserve"> </w:t>
+      </w:r>
+      <w:r>
+        <w:rPr>
+          <w:rStyle w:val="VerbatimChar"/>
+          <w:rFonts w:ascii="Calibri" w:hAnsi="Calibri" w:eastAsia="Calibri" w:cs="Calibri" w:hint="eastAsia"/>
+        </w:rPr>
+        <w:t xml:space="preserve">[(0, 128), (4095, 5)]</w:t>
+      </w:r>
+      <w:r>
+        <w:rPr>
+          <w:rFonts w:ascii="Calibri" w:hAnsi="Calibri" w:eastAsia="Calibri" w:cs="Calibri" w:hint="eastAsia"/>
+        </w:rPr>
+        <w:t xml:space="preserve"> </w:t>
+      </w:r>
+      <w:r>
+        <w:rPr>
+          <w:rFonts w:ascii="Calibri" w:hAnsi="Calibri" w:eastAsia="Calibri" w:cs="Calibri" w:hint="eastAsia"/>
+        </w:rPr>
+        <w:t xml:space="preserve">and matched both independent</w:t>
+      </w:r>
+      <w:r>
+        <w:rPr>
+          <w:rFonts w:ascii="Calibri" w:hAnsi="Calibri" w:eastAsia="Calibri" w:cs="Calibri" w:hint="eastAsia"/>
+        </w:rPr>
+        <w:t xml:space="preserve"> </w:t>
+      </w:r>
+      <w:r>
+        <w:rPr>
+          <w:rFonts w:ascii="Calibri" w:hAnsi="Calibri" w:eastAsia="Calibri" w:cs="Calibri" w:hint="eastAsia"/>
+        </w:rPr>
+        <w:t xml:space="preserve">plaintext oracles; all 35 records in the eight-case deterministic contract</w:t>
+      </w:r>
+      <w:r>
+        <w:rPr>
+          <w:rFonts w:ascii="Calibri" w:hAnsi="Calibri" w:eastAsia="Calibri" w:cs="Calibri" w:hint="eastAsia"/>
+        </w:rPr>
+        <w:t xml:space="preserve"> </w:t>
+      </w:r>
+      <w:r>
+        <w:rPr>
+          <w:rFonts w:ascii="Calibri" w:hAnsi="Calibri" w:eastAsia="Calibri" w:cs="Calibri" w:hint="eastAsia"/>
+        </w:rPr>
+        <w:t xml:space="preserve">corpus passed. This is a single-source, single-fixture, version-bound functional</w:t>
+      </w:r>
+      <w:r>
+        <w:rPr>
+          <w:rFonts w:ascii="Calibri" w:hAnsi="Calibri" w:eastAsia="Calibri" w:cs="Calibri" w:hint="eastAsia"/>
+        </w:rPr>
+        <w:t xml:space="preserve"> </w:t>
+      </w:r>
+      <w:r>
+        <w:rPr>
+          <w:rFonts w:ascii="Calibri" w:hAnsi="Calibri" w:eastAsia="Calibri" w:cs="Calibri" w:hint="eastAsia"/>
+        </w:rPr>
+        <w:t xml:space="preserve">observation. It is not candidate admission, a complete-reference claim,</w:t>
+      </w:r>
+      <w:r>
+        <w:rPr>
+          <w:rFonts w:ascii="Calibri" w:hAnsi="Calibri" w:eastAsia="Calibri" w:cs="Calibri" w:hint="eastAsia"/>
+        </w:rPr>
+        <w:t xml:space="preserve"> </w:t>
+      </w:r>
+      <w:r>
+        <w:rPr>
+          <w:rFonts w:ascii="Calibri" w:hAnsi="Calibri" w:eastAsia="Calibri" w:cs="Calibri" w:hint="eastAsia"/>
+        </w:rPr>
+        <w:t xml:space="preserve">mixed-circuit safety, a security result, a deployment result, a performance</w:t>
+      </w:r>
+      <w:r>
+        <w:rPr>
+          <w:rFonts w:ascii="Calibri" w:hAnsi="Calibri" w:eastAsia="Calibri" w:cs="Calibri" w:hint="eastAsia"/>
+        </w:rPr>
+        <w:t xml:space="preserve"> </w:t>
+      </w:r>
+      <w:r>
+        <w:rPr>
+          <w:rFonts w:ascii="Calibri" w:hAnsi="Calibri" w:eastAsia="Calibri" w:cs="Calibri" w:hint="eastAsia"/>
+        </w:rPr>
+        <w:t xml:space="preserve">measurement, or evidence that the stopped strategy comparison would have</w:t>
+      </w:r>
+      <w:r>
+        <w:rPr>
+          <w:rFonts w:ascii="Calibri" w:hAnsi="Calibri" w:eastAsia="Calibri" w:cs="Calibri" w:hint="eastAsia"/>
+        </w:rPr>
+        <w:t xml:space="preserve"> </w:t>
+      </w:r>
+      <w:r>
+        <w:rPr>
+          <w:rFonts w:ascii="Calibri" w:hAnsi="Calibri" w:eastAsia="Calibri" w:cs="Calibri" w:hint="eastAsia"/>
+        </w:rPr>
+        <w:t xml:space="preserve">succeeded.</w:t>
+      </w:r>
+    </w:p>
+    <w:p>
+      <w:pPr>
+        <w:pStyle w:val="BodyText"/>
+      </w:pPr>
+      <w:r>
+        <w:rPr>
+          <w:rFonts w:ascii="Calibri" w:hAnsi="Calibri" w:eastAsia="Calibri" w:cs="Calibri" w:hint="eastAsia"/>
+          <w:b/>
+          <w:bCs/>
+        </w:rPr>
+        <w:t xml:space="preserve">Table 6. Current-source E4 conformance provenance.</w:t>
+      </w:r>
+    </w:p>
+    <w:tbl>
+      <w:tblPr>
+        <w:tblStyle w:val="Table"/>
+        <w:tblW w:type="dxa" w:w="9360"/>
+        <w:jc w:val="left"/>
+        <w:tblLayout w:type="fixed"/>
+        <w:tblLook w:firstRow="1" w:lastRow="0" w:firstColumn="0" w:lastColumn="0" w:noHBand="0" w:noVBand="0" w:val="0020"/>
+        <w:tblInd w:w="120" w:type="dxa"/>
+        <w:tblBorders>
+          <w:top w:val="single" w:sz="4" w:space="0" w:color="CBD3DC"/>
+          <w:left w:val="single" w:sz="4" w:space="0" w:color="CBD3DC"/>
+          <w:bottom w:val="single" w:sz="4" w:space="0" w:color="CBD3DC"/>
+          <w:right w:val="single" w:sz="4" w:space="0" w:color="CBD3DC"/>
+          <w:insideH w:val="single" w:sz="4" w:space="0" w:color="CBD3DC"/>
+          <w:insideV w:val="single" w:sz="4" w:space="0" w:color="CBD3DC"/>
+        </w:tblBorders>
+      </w:tblPr>
+      <w:tblGrid>
+        <w:gridCol w:w="2050"/>
+        <w:gridCol w:w="3110"/>
+        <w:gridCol w:w="4200"/>
+      </w:tblGrid>
+      <w:tr>
+        <w:trPr>
+          <w:tblHeader w:val="1"/>
+          <w:cantSplit w:val="1"/>
+        </w:trPr>
+        <w:tc>
+          <w:tcPr>
+            <w:tcW w:w="2050" w:type="dxa"/>
+            <w:tcMar>
+              <w:top w:w="80" w:type="dxa"/>
+              <w:start w:w="120" w:type="dxa"/>
+              <w:bottom w:w="80" w:type="dxa"/>
+              <w:end w:w="120" w:type="dxa"/>
+            </w:tcMar>
+            <w:vAlign w:val="center"/>
+            <w:shd w:fill="F4F6F9"/>
+          </w:tcPr>
+          <w:p>
+            <w:pPr>
+              <w:pStyle w:val="Compact"/>
+              <w:spacing w:before="0" w:after="60" w:line="259" w:lineRule="auto"/>
+              <w:jc w:val="left"/>
+            </w:pPr>
+            <w:r>
+              <w:rPr>
+                <w:rFonts w:ascii="Calibri" w:hAnsi="Calibri" w:eastAsia="Calibri" w:cs="Calibri" w:hint="eastAsia"/>
+                <w:b/>
+                <w:sz w:val="18"/>
+              </w:rPr>
+              <w:t xml:space="preserve">Object</w:t>
+            </w:r>
+          </w:p>
+        </w:tc>
+        <w:tc>
+          <w:tcPr>
+            <w:tcW w:w="3110" w:type="dxa"/>
+            <w:tcMar>
+              <w:top w:w="80" w:type="dxa"/>
+              <w:start w:w="120" w:type="dxa"/>
+              <w:bottom w:w="80" w:type="dxa"/>
+              <w:end w:w="120" w:type="dxa"/>
+            </w:tcMar>
+            <w:vAlign w:val="center"/>
+            <w:shd w:fill="F4F6F9"/>
+          </w:tcPr>
+          <w:p>
+            <w:pPr>
+              <w:pStyle w:val="Compact"/>
+              <w:spacing w:before="0" w:after="60" w:line="259" w:lineRule="auto"/>
+              <w:jc w:val="left"/>
+            </w:pPr>
+            <w:r>
+              <w:rPr>
+                <w:rFonts w:ascii="Calibri" w:hAnsi="Calibri" w:eastAsia="Calibri" w:cs="Calibri" w:hint="eastAsia"/>
+                <w:b/>
+                <w:sz w:val="18"/>
+              </w:rPr>
+              <w:t xml:space="preserve">Exact identity</w:t>
+            </w:r>
+          </w:p>
+        </w:tc>
+        <w:tc>
+          <w:tcPr>
+            <w:tcW w:w="4200" w:type="dxa"/>
+            <w:tcMar>
+              <w:top w:w="80" w:type="dxa"/>
+              <w:start w:w="120" w:type="dxa"/>
+              <w:bottom w:w="80" w:type="dxa"/>
+              <w:end w:w="120" w:type="dxa"/>
+            </w:tcMar>
+            <w:vAlign w:val="center"/>
+            <w:shd w:fill="F4F6F9"/>
+          </w:tcPr>
+          <w:p>
+            <w:pPr>
+              <w:pStyle w:val="Compact"/>
+              <w:spacing w:before="0" w:after="60" w:line="259" w:lineRule="auto"/>
+              <w:jc w:val="left"/>
+            </w:pPr>
+            <w:r>
+              <w:rPr>
+                <w:rFonts w:ascii="Calibri" w:hAnsi="Calibri" w:eastAsia="Calibri" w:cs="Calibri" w:hint="eastAsia"/>
+                <w:b/>
+                <w:sz w:val="18"/>
+              </w:rPr>
+              <w:t xml:space="preserve">Accepted observation</w:t>
+            </w:r>
+          </w:p>
+        </w:tc>
+      </w:tr>
+      <w:tr>
+        <w:trPr>
+          <w:cantSplit w:val="1"/>
+        </w:trPr>
+        <w:tc>
+          <w:tcPr>
+            <w:tcW w:w="2050" w:type="dxa"/>
+            <w:tcMar>
+              <w:top w:w="80" w:type="dxa"/>
+              <w:start w:w="120" w:type="dxa"/>
+              <w:bottom w:w="80" w:type="dxa"/>
+              <w:end w:w="120" w:type="dxa"/>
+            </w:tcMar>
+            <w:vAlign w:val="center"/>
+          </w:tcPr>
+          <w:p>
+            <w:pPr>
+              <w:pStyle w:val="Compact"/>
+              <w:spacing w:before="0" w:after="60" w:line="259" w:lineRule="auto"/>
+              <w:jc w:val="left"/>
+            </w:pPr>
+            <w:r>
+              <w:rPr>
+                <w:rFonts w:ascii="Calibri" w:hAnsi="Calibri" w:eastAsia="Calibri" w:cs="Calibri" w:hint="eastAsia"/>
+                <w:sz w:val="18"/>
+              </w:rPr>
+              <w:t xml:space="preserve">Immutable source</w:t>
+            </w:r>
+          </w:p>
+        </w:tc>
+        <w:tc>
+          <w:tcPr>
+            <w:tcW w:w="3110" w:type="dxa"/>
+            <w:tcMar>
+              <w:top w:w="80" w:type="dxa"/>
+              <w:start w:w="120" w:type="dxa"/>
+              <w:bottom w:w="80" w:type="dxa"/>
+              <w:end w:w="120" w:type="dxa"/>
+            </w:tcMar>
+            <w:vAlign w:val="center"/>
+          </w:tcPr>
+          <w:p>
+            <w:pPr>
+              <w:pStyle w:val="Compact"/>
+              <w:spacing w:before="0" w:after="60" w:line="259" w:lineRule="auto"/>
+              <w:jc w:val="left"/>
+            </w:pPr>
+            <w:r>
+              <w:rPr>
+                <w:rFonts w:ascii="Calibri" w:hAnsi="Calibri" w:eastAsia="Calibri" w:cs="Calibri" w:hint="eastAsia"/>
+                <w:sz w:val="18"/>
+              </w:rPr>
+              <w:t xml:space="preserve">Tag</w:t>
+            </w:r>
+            <w:r>
+              <w:rPr>
+                <w:rFonts w:ascii="Calibri" w:hAnsi="Calibri" w:eastAsia="Calibri" w:cs="Calibri" w:hint="eastAsia"/>
+                <w:sz w:val="18"/>
+              </w:rPr>
+              <w:t xml:space="preserve"> </w:t>
+            </w:r>
+            <w:r>
+              <w:rPr>
+                <w:rStyle w:val="VerbatimChar"/>
+                <w:rFonts w:ascii="Calibri" w:hAnsi="Calibri" w:eastAsia="Calibri" w:cs="Calibri" w:hint="eastAsia"/>
+                <w:sz w:val="18"/>
+              </w:rPr>
+              <w:t xml:space="preserve">current-source-e4-conformance-20260831-v1</w:t>
+            </w:r>
+            <w:r>
+              <w:rPr>
+                <w:rFonts w:ascii="Calibri" w:hAnsi="Calibri" w:eastAsia="Calibri" w:cs="Calibri" w:hint="eastAsia"/>
+                <w:sz w:val="18"/>
+              </w:rPr>
+              <w:t xml:space="preserve">; commit</w:t>
+            </w:r>
+            <w:r>
+              <w:rPr>
+                <w:rFonts w:ascii="Calibri" w:hAnsi="Calibri" w:eastAsia="Calibri" w:cs="Calibri" w:hint="eastAsia"/>
+                <w:sz w:val="18"/>
+              </w:rPr>
+              <w:t xml:space="preserve"> </w:t>
+            </w:r>
+            <w:r>
+              <w:rPr>
+                <w:rStyle w:val="VerbatimChar"/>
+                <w:rFonts w:ascii="Calibri" w:hAnsi="Calibri" w:eastAsia="Calibri" w:cs="Calibri" w:hint="eastAsia"/>
+                <w:sz w:val="18"/>
+              </w:rPr>
+              <w:t xml:space="preserve">844fb062d78f5095f14599c6c71a27cb6034f001</w:t>
+            </w:r>
+          </w:p>
+        </w:tc>
+        <w:tc>
+          <w:tcPr>
+            <w:tcW w:w="4200" w:type="dxa"/>
+            <w:tcMar>
+              <w:top w:w="80" w:type="dxa"/>
+              <w:start w:w="120" w:type="dxa"/>
+              <w:bottom w:w="80" w:type="dxa"/>
+              <w:end w:w="120" w:type="dxa"/>
+            </w:tcMar>
+            <w:vAlign w:val="center"/>
+          </w:tcPr>
+          <w:p>
+            <w:pPr>
+              <w:pStyle w:val="Compact"/>
+              <w:spacing w:before="0" w:after="60" w:line="259" w:lineRule="auto"/>
+              <w:jc w:val="left"/>
+            </w:pPr>
+            <w:r>
+              <w:rPr>
+                <w:rFonts w:ascii="Calibri" w:hAnsi="Calibri" w:eastAsia="Calibri" w:cs="Calibri" w:hint="eastAsia"/>
+                <w:sz w:val="18"/>
+              </w:rPr>
+              <w:t xml:space="preserve">Direct and peeled tag refs matched before dispatch and after completion</w:t>
+            </w:r>
+          </w:p>
+        </w:tc>
+      </w:tr>
+      <w:tr>
+        <w:trPr>
+          <w:cantSplit w:val="1"/>
+        </w:trPr>
+        <w:tc>
+          <w:tcPr>
+            <w:tcW w:w="2050" w:type="dxa"/>
+            <w:tcMar>
+              <w:top w:w="80" w:type="dxa"/>
+              <w:start w:w="120" w:type="dxa"/>
+              <w:bottom w:w="80" w:type="dxa"/>
+              <w:end w:w="120" w:type="dxa"/>
+            </w:tcMar>
+            <w:vAlign w:val="center"/>
+          </w:tcPr>
+          <w:p>
+            <w:pPr>
+              <w:pStyle w:val="Compact"/>
+              <w:spacing w:before="0" w:after="60" w:line="259" w:lineRule="auto"/>
+              <w:jc w:val="left"/>
+            </w:pPr>
+            <w:r>
+              <w:rPr>
+                <w:rFonts w:ascii="Calibri" w:hAnsi="Calibri" w:eastAsia="Calibri" w:cs="Calibri" w:hint="eastAsia"/>
+                <w:sz w:val="18"/>
+              </w:rPr>
+              <w:t xml:space="preserve">Provider run</w:t>
+            </w:r>
+          </w:p>
+        </w:tc>
+        <w:tc>
+          <w:tcPr>
+            <w:tcW w:w="3110" w:type="dxa"/>
+            <w:tcMar>
+              <w:top w:w="80" w:type="dxa"/>
+              <w:start w:w="120" w:type="dxa"/>
+              <w:bottom w:w="80" w:type="dxa"/>
+              <w:end w:w="120" w:type="dxa"/>
+            </w:tcMar>
+            <w:vAlign w:val="center"/>
+          </w:tcPr>
+          <w:p>
+            <w:pPr>
+              <w:pStyle w:val="Compact"/>
+              <w:spacing w:before="0" w:after="60" w:line="259" w:lineRule="auto"/>
+              <w:jc w:val="left"/>
+            </w:pPr>
+            <w:r>
+              <w:rPr>
+                <w:rStyle w:val="VerbatimChar"/>
+                <w:rFonts w:ascii="Calibri" w:hAnsi="Calibri" w:eastAsia="Calibri" w:cs="Calibri" w:hint="eastAsia"/>
+                <w:sz w:val="18"/>
+              </w:rPr>
+              <w:t xml:space="preserve">33386130654</w:t>
+            </w:r>
+            <w:r>
+              <w:rPr>
+                <w:rFonts w:ascii="Calibri" w:hAnsi="Calibri" w:eastAsia="Calibri" w:cs="Calibri" w:hint="eastAsia"/>
+                <w:sz w:val="18"/>
+              </w:rPr>
+              <w:t xml:space="preserve">; job</w:t>
+            </w:r>
+            <w:r>
+              <w:rPr>
+                <w:rFonts w:ascii="Calibri" w:hAnsi="Calibri" w:eastAsia="Calibri" w:cs="Calibri" w:hint="eastAsia"/>
+                <w:sz w:val="18"/>
+              </w:rPr>
+              <w:t xml:space="preserve"> </w:t>
+            </w:r>
+            <w:r>
+              <w:rPr>
+                <w:rStyle w:val="VerbatimChar"/>
+                <w:rFonts w:ascii="Calibri" w:hAnsi="Calibri" w:eastAsia="Calibri" w:cs="Calibri" w:hint="eastAsia"/>
+                <w:sz w:val="18"/>
+              </w:rPr>
+              <w:t xml:space="preserve">99469043424</w:t>
+            </w:r>
+            <w:r>
+              <w:rPr>
+                <w:rFonts w:ascii="Calibri" w:hAnsi="Calibri" w:eastAsia="Calibri" w:cs="Calibri" w:hint="eastAsia"/>
+                <w:sz w:val="18"/>
+              </w:rPr>
+              <w:t xml:space="preserve">; attempt 1</w:t>
+            </w:r>
+          </w:p>
+        </w:tc>
+        <w:tc>
+          <w:tcPr>
+            <w:tcW w:w="4200" w:type="dxa"/>
+            <w:tcMar>
+              <w:top w:w="80" w:type="dxa"/>
+              <w:start w:w="120" w:type="dxa"/>
+              <w:bottom w:w="80" w:type="dxa"/>
+              <w:end w:w="120" w:type="dxa"/>
+            </w:tcMar>
+            <w:vAlign w:val="center"/>
+          </w:tcPr>
+          <w:p>
+            <w:pPr>
+              <w:pStyle w:val="Compact"/>
+              <w:spacing w:before="0" w:after="60" w:line="259" w:lineRule="auto"/>
+              <w:jc w:val="left"/>
+            </w:pPr>
+            <w:r>
+              <w:rPr>
+                <w:rStyle w:val="VerbatimChar"/>
+                <w:rFonts w:ascii="Calibri" w:hAnsi="Calibri" w:eastAsia="Calibri" w:cs="Calibri" w:hint="eastAsia"/>
+                <w:sz w:val="18"/>
+              </w:rPr>
+              <w:t xml:space="preserve">completed/success</w:t>
+            </w:r>
+            <w:r>
+              <w:rPr>
+                <w:rFonts w:ascii="Calibri" w:hAnsi="Calibri" w:eastAsia="Calibri" w:cs="Calibri" w:hint="eastAsia"/>
+                <w:sz w:val="18"/>
+              </w:rPr>
+              <w:t xml:space="preserve">; all 15 visible steps succeeded</w:t>
+            </w:r>
+          </w:p>
+        </w:tc>
+      </w:tr>
+      <w:tr>
+        <w:trPr>
+          <w:cantSplit w:val="1"/>
+        </w:trPr>
+        <w:tc>
+          <w:tcPr>
+            <w:tcW w:w="2050" w:type="dxa"/>
+            <w:tcMar>
+              <w:top w:w="80" w:type="dxa"/>
+              <w:start w:w="120" w:type="dxa"/>
+              <w:bottom w:w="80" w:type="dxa"/>
+              <w:end w:w="120" w:type="dxa"/>
+            </w:tcMar>
+            <w:vAlign w:val="center"/>
+          </w:tcPr>
+          <w:p>
+            <w:pPr>
+              <w:pStyle w:val="Compact"/>
+              <w:spacing w:before="0" w:after="60" w:line="259" w:lineRule="auto"/>
+              <w:jc w:val="left"/>
+            </w:pPr>
+            <w:r>
+              <w:rPr>
+                <w:rFonts w:ascii="Calibri" w:hAnsi="Calibri" w:eastAsia="Calibri" w:cs="Calibri" w:hint="eastAsia"/>
+                <w:sz w:val="18"/>
+              </w:rPr>
+              <w:t xml:space="preserve">Provider artifact</w:t>
+            </w:r>
+          </w:p>
+        </w:tc>
+        <w:tc>
+          <w:tcPr>
+            <w:tcW w:w="3110" w:type="dxa"/>
+            <w:tcMar>
+              <w:top w:w="80" w:type="dxa"/>
+              <w:start w:w="120" w:type="dxa"/>
+              <w:bottom w:w="80" w:type="dxa"/>
+              <w:end w:w="120" w:type="dxa"/>
+            </w:tcMar>
+            <w:vAlign w:val="center"/>
+          </w:tcPr>
+          <w:p>
+            <w:pPr>
+              <w:pStyle w:val="Compact"/>
+              <w:spacing w:before="0" w:after="60" w:line="259" w:lineRule="auto"/>
+              <w:jc w:val="left"/>
+            </w:pPr>
+            <w:r>
+              <w:rPr>
+                <w:rStyle w:val="VerbatimChar"/>
+                <w:rFonts w:ascii="Calibri" w:hAnsi="Calibri" w:eastAsia="Calibri" w:cs="Calibri" w:hint="eastAsia"/>
+                <w:sz w:val="18"/>
+              </w:rPr>
+              <w:t xml:space="preserve">9755741401</w:t>
+            </w:r>
+            <w:r>
+              <w:rPr>
+                <w:rFonts w:ascii="Calibri" w:hAnsi="Calibri" w:eastAsia="Calibri" w:cs="Calibri" w:hint="eastAsia"/>
+                <w:sz w:val="18"/>
+              </w:rPr>
+              <w:t xml:space="preserve">; 32,598 bytes; raw digest</w:t>
+            </w:r>
+            <w:r>
+              <w:rPr>
+                <w:rFonts w:ascii="Calibri" w:hAnsi="Calibri" w:eastAsia="Calibri" w:cs="Calibri" w:hint="eastAsia"/>
+                <w:sz w:val="18"/>
+              </w:rPr>
+              <w:t xml:space="preserve"> </w:t>
+            </w:r>
+            <w:r>
+              <w:rPr>
+                <w:rStyle w:val="VerbatimChar"/>
+                <w:rFonts w:ascii="Calibri" w:hAnsi="Calibri" w:eastAsia="Calibri" w:cs="Calibri" w:hint="eastAsia"/>
+                <w:sz w:val="18"/>
+              </w:rPr>
+              <w:t xml:space="preserve">sha256:5978b7d9…a1383</w:t>
+            </w:r>
+          </w:p>
+        </w:tc>
+        <w:tc>
+          <w:tcPr>
+            <w:tcW w:w="4200" w:type="dxa"/>
+            <w:tcMar>
+              <w:top w:w="80" w:type="dxa"/>
+              <w:start w:w="120" w:type="dxa"/>
+              <w:bottom w:w="80" w:type="dxa"/>
+              <w:end w:w="120" w:type="dxa"/>
+            </w:tcMar>
+            <w:vAlign w:val="center"/>
+          </w:tcPr>
+          <w:p>
+            <w:pPr>
+              <w:pStyle w:val="Compact"/>
+              <w:spacing w:before="0" w:after="60" w:line="259" w:lineRule="auto"/>
+              <w:jc w:val="left"/>
+            </w:pPr>
+            <w:r>
+              <w:rPr>
+                <w:rFonts w:ascii="Calibri" w:hAnsi="Calibri" w:eastAsia="Calibri" w:cs="Calibri" w:hint="eastAsia"/>
+                <w:sz w:val="18"/>
+              </w:rPr>
+              <w:t xml:space="preserve">One 30-day artifact; exact run/ref/head binding; 19/19 files and strict checksums passed</w:t>
+            </w:r>
+          </w:p>
+        </w:tc>
+      </w:tr>
+      <w:tr>
+        <w:trPr>
+          <w:cantSplit w:val="1"/>
+        </w:trPr>
+        <w:tc>
+          <w:tcPr>
+            <w:tcW w:w="2050" w:type="dxa"/>
+            <w:tcMar>
+              <w:top w:w="80" w:type="dxa"/>
+              <w:start w:w="120" w:type="dxa"/>
+              <w:bottom w:w="80" w:type="dxa"/>
+              <w:end w:w="120" w:type="dxa"/>
+            </w:tcMar>
+            <w:vAlign w:val="center"/>
+          </w:tcPr>
+          <w:p>
+            <w:pPr>
+              <w:pStyle w:val="Compact"/>
+              <w:spacing w:before="0" w:after="60" w:line="259" w:lineRule="auto"/>
+              <w:jc w:val="left"/>
+            </w:pPr>
+            <w:r>
+              <w:rPr>
+                <w:rFonts w:ascii="Calibri" w:hAnsi="Calibri" w:eastAsia="Calibri" w:cs="Calibri" w:hint="eastAsia"/>
+                <w:sz w:val="18"/>
+              </w:rPr>
+              <w:t xml:space="preserve">Property contract</w:t>
+            </w:r>
+          </w:p>
+        </w:tc>
+        <w:tc>
+          <w:tcPr>
+            <w:tcW w:w="3110" w:type="dxa"/>
+            <w:tcMar>
+              <w:top w:w="80" w:type="dxa"/>
+              <w:start w:w="120" w:type="dxa"/>
+              <w:bottom w:w="80" w:type="dxa"/>
+              <w:end w:w="120" w:type="dxa"/>
+            </w:tcMar>
+            <w:vAlign w:val="center"/>
+          </w:tcPr>
+          <w:p>
+            <w:pPr>
+              <w:pStyle w:val="Compact"/>
+              <w:spacing w:before="0" w:after="60" w:line="259" w:lineRule="auto"/>
+              <w:jc w:val="left"/>
+            </w:pPr>
+            <w:r>
+              <w:rPr>
+                <w:rFonts w:ascii="Calibri" w:hAnsi="Calibri" w:eastAsia="Calibri" w:cs="Calibri" w:hint="eastAsia"/>
+                <w:sz w:val="18"/>
+              </w:rPr>
+              <w:t xml:space="preserve">Seed</w:t>
+            </w:r>
+            <w:r>
+              <w:rPr>
+                <w:rFonts w:ascii="Calibri" w:hAnsi="Calibri" w:eastAsia="Calibri" w:cs="Calibri" w:hint="eastAsia"/>
+                <w:sz w:val="18"/>
+              </w:rPr>
+              <w:t xml:space="preserve"> </w:t>
+            </w:r>
+            <w:r>
+              <w:rPr>
+                <w:rStyle w:val="VerbatimChar"/>
+                <w:rFonts w:ascii="Calibri" w:hAnsi="Calibri" w:eastAsia="Calibri" w:cs="Calibri" w:hint="eastAsia"/>
+                <w:sz w:val="18"/>
+              </w:rPr>
+              <w:t xml:space="preserve">20260822</w:t>
+            </w:r>
+            <w:r>
+              <w:rPr>
+                <w:rFonts w:ascii="Calibri" w:hAnsi="Calibri" w:eastAsia="Calibri" w:cs="Calibri" w:hint="eastAsia"/>
+                <w:sz w:val="18"/>
+              </w:rPr>
+              <w:t xml:space="preserve">; eight input cases; 35 records</w:t>
+            </w:r>
+          </w:p>
+        </w:tc>
+        <w:tc>
+          <w:tcPr>
+            <w:tcW w:w="4200" w:type="dxa"/>
+            <w:tcMar>
+              <w:top w:w="80" w:type="dxa"/>
+              <w:start w:w="120" w:type="dxa"/>
+              <w:bottom w:w="80" w:type="dxa"/>
+              <w:end w:w="120" w:type="dxa"/>
+            </w:tcMar>
+            <w:vAlign w:val="center"/>
+          </w:tcPr>
+          <w:p>
+            <w:pPr>
+              <w:pStyle w:val="Compact"/>
+              <w:spacing w:before="0" w:after="60" w:line="259" w:lineRule="auto"/>
+              <w:jc w:val="left"/>
+            </w:pPr>
+            <w:r>
+              <w:rPr>
+                <w:rFonts w:ascii="Calibri" w:hAnsi="Calibri" w:eastAsia="Calibri" w:cs="Calibri" w:hint="eastAsia"/>
+                <w:sz w:val="18"/>
+              </w:rPr>
+              <w:t xml:space="preserve">35 passed, zero failed; all authority flags remained false</w:t>
+            </w:r>
+          </w:p>
+        </w:tc>
+      </w:tr>
+      <w:tr>
+        <w:trPr>
+          <w:cantSplit w:val="1"/>
+        </w:trPr>
+        <w:tc>
+          <w:tcPr>
+            <w:tcW w:w="2050" w:type="dxa"/>
+            <w:tcMar>
+              <w:top w:w="80" w:type="dxa"/>
+              <w:start w:w="120" w:type="dxa"/>
+              <w:bottom w:w="80" w:type="dxa"/>
+              <w:end w:w="120" w:type="dxa"/>
+            </w:tcMar>
+            <w:vAlign w:val="center"/>
+          </w:tcPr>
+          <w:p>
+            <w:pPr>
+              <w:pStyle w:val="Compact"/>
+              <w:spacing w:before="0" w:after="60" w:line="259" w:lineRule="auto"/>
+              <w:jc w:val="left"/>
+            </w:pPr>
+            <w:r>
+              <w:rPr>
+                <w:rFonts w:ascii="Calibri" w:hAnsi="Calibri" w:eastAsia="Calibri" w:cs="Calibri" w:hint="eastAsia"/>
+                <w:sz w:val="18"/>
+              </w:rPr>
+              <w:t xml:space="preserve">OpenFHE witness</w:t>
+            </w:r>
+          </w:p>
+        </w:tc>
+        <w:tc>
+          <w:tcPr>
+            <w:tcW w:w="3110" w:type="dxa"/>
+            <w:tcMar>
+              <w:top w:w="80" w:type="dxa"/>
+              <w:start w:w="120" w:type="dxa"/>
+              <w:bottom w:w="80" w:type="dxa"/>
+              <w:end w:w="120" w:type="dxa"/>
+            </w:tcMar>
+            <w:vAlign w:val="center"/>
+          </w:tcPr>
+          <w:p>
+            <w:pPr>
+              <w:pStyle w:val="Compact"/>
+              <w:spacing w:before="0" w:after="60" w:line="259" w:lineRule="auto"/>
+              <w:jc w:val="left"/>
+            </w:pPr>
+            <w:r>
+              <w:rPr>
+                <w:rFonts w:ascii="Calibri" w:hAnsi="Calibri" w:eastAsia="Calibri" w:cs="Calibri" w:hint="eastAsia"/>
+                <w:sz w:val="18"/>
+              </w:rPr>
+              <w:t xml:space="preserve">1.5.1 at</w:t>
+            </w:r>
+            <w:r>
+              <w:rPr>
+                <w:rFonts w:ascii="Calibri" w:hAnsi="Calibri" w:eastAsia="Calibri" w:cs="Calibri" w:hint="eastAsia"/>
+                <w:sz w:val="18"/>
+              </w:rPr>
+              <w:t xml:space="preserve"> </w:t>
+            </w:r>
+            <w:r>
+              <w:rPr>
+                <w:rStyle w:val="VerbatimChar"/>
+                <w:rFonts w:ascii="Calibri" w:hAnsi="Calibri" w:eastAsia="Calibri" w:cs="Calibri" w:hint="eastAsia"/>
+                <w:sz w:val="18"/>
+              </w:rPr>
+              <w:t xml:space="preserve">1306d14f…</w:t>
+            </w:r>
+            <w:r>
+              <w:rPr>
+                <w:rFonts w:ascii="Calibri" w:hAnsi="Calibri" w:eastAsia="Calibri" w:cs="Calibri" w:hint="eastAsia"/>
+                <w:sz w:val="18"/>
+              </w:rPr>
+              <w:t xml:space="preserve">; fixed 4096-by-8193 fixture</w:t>
+            </w:r>
+          </w:p>
+        </w:tc>
+        <w:tc>
+          <w:tcPr>
+            <w:tcW w:w="4200" w:type="dxa"/>
+            <w:tcMar>
+              <w:top w:w="80" w:type="dxa"/>
+              <w:start w:w="120" w:type="dxa"/>
+              <w:bottom w:w="80" w:type="dxa"/>
+              <w:end w:w="120" w:type="dxa"/>
+            </w:tcMar>
+            <w:vAlign w:val="center"/>
+          </w:tcPr>
+          <w:p>
+            <w:pPr>
+              <w:pStyle w:val="Compact"/>
+              <w:spacing w:before="0" w:after="60" w:line="259" w:lineRule="auto"/>
+              <w:jc w:val="left"/>
+            </w:pPr>
+            <w:r>
+              <w:rPr>
+                <w:rFonts w:ascii="Calibri" w:hAnsi="Calibri" w:eastAsia="Calibri" w:cs="Calibri" w:hint="eastAsia"/>
+                <w:sz w:val="18"/>
+              </w:rPr>
+              <w:t xml:space="preserve">Valid decryptions;</w:t>
+            </w:r>
+            <w:r>
+              <w:rPr>
+                <w:rFonts w:ascii="Calibri" w:hAnsi="Calibri" w:eastAsia="Calibri" w:cs="Calibri" w:hint="eastAsia"/>
+                <w:sz w:val="18"/>
+              </w:rPr>
+              <w:t xml:space="preserve"> </w:t>
+            </w:r>
+            <w:r>
+              <w:rPr>
+                <w:rStyle w:val="VerbatimChar"/>
+                <w:rFonts w:ascii="Calibri" w:hAnsi="Calibri" w:eastAsia="Calibri" w:cs="Calibri" w:hint="eastAsia"/>
+                <w:sz w:val="18"/>
+              </w:rPr>
+              <w:t xml:space="preserve">[(0, 128), (4095, 5)]</w:t>
+            </w:r>
+            <w:r>
+              <w:rPr>
+                <w:rFonts w:ascii="Calibri" w:hAnsi="Calibri" w:eastAsia="Calibri" w:cs="Calibri" w:hint="eastAsia"/>
+                <w:sz w:val="18"/>
+              </w:rPr>
+              <w:t xml:space="preserve">; typed and direct oracle matches true</w:t>
+            </w:r>
+          </w:p>
+        </w:tc>
+      </w:tr>
+    </w:tbl>
+    <w:bookmarkEnd w:id="47"/>
+    <w:bookmarkEnd w:id="48"/>
+    <w:bookmarkStart w:id="49" w:name="limitations"/>
     <w:p>
       <w:pPr>
         <w:pStyle w:val="Heading1"/>
@@ -18727,9 +20491,57 @@
         </w:rPr>
         <w:t xml:space="preserve">and log that control-plane seam before consuming a one-shot capability.</w:t>
       </w:r>
+      <w:r>
+        <w:rPr>
+          <w:rFonts w:ascii="Calibri" w:hAnsi="Calibri" w:eastAsia="Calibri" w:cs="Calibri" w:hint="eastAsia"/>
+        </w:rPr>
+        <w:t xml:space="preserve"> </w:t>
+      </w:r>
+      <w:r>
+        <w:rPr>
+          <w:rFonts w:ascii="Calibri" w:hAnsi="Calibri" w:eastAsia="Calibri" w:cs="Calibri" w:hint="eastAsia"/>
+        </w:rPr>
+        <w:t xml:space="preserve">The separate current-source conformance result covers only one reviewed source,</w:t>
+      </w:r>
+      <w:r>
+        <w:rPr>
+          <w:rFonts w:ascii="Calibri" w:hAnsi="Calibri" w:eastAsia="Calibri" w:cs="Calibri" w:hint="eastAsia"/>
+        </w:rPr>
+        <w:t xml:space="preserve"> </w:t>
+      </w:r>
+      <w:r>
+        <w:rPr>
+          <w:rFonts w:ascii="Calibri" w:hAnsi="Calibri" w:eastAsia="Calibri" w:cs="Calibri" w:hint="eastAsia"/>
+        </w:rPr>
+        <w:t xml:space="preserve">one fixed fixture, one segment width, and a deterministic eight-case corpus. It</w:t>
+      </w:r>
+      <w:r>
+        <w:rPr>
+          <w:rFonts w:ascii="Calibri" w:hAnsi="Calibri" w:eastAsia="Calibri" w:cs="Calibri" w:hint="eastAsia"/>
+        </w:rPr>
+        <w:t xml:space="preserve"> </w:t>
+      </w:r>
+      <w:r>
+        <w:rPr>
+          <w:rFonts w:ascii="Calibri" w:hAnsi="Calibri" w:eastAsia="Calibri" w:cs="Calibri" w:hint="eastAsia"/>
+        </w:rPr>
+        <w:t xml:space="preserve">does not generalize across matrices, parameters, implementations, workloads, or</w:t>
+      </w:r>
+      <w:r>
+        <w:rPr>
+          <w:rFonts w:ascii="Calibri" w:hAnsi="Calibri" w:eastAsia="Calibri" w:cs="Calibri" w:hint="eastAsia"/>
+        </w:rPr>
+        <w:t xml:space="preserve"> </w:t>
+      </w:r>
+      <w:r>
+        <w:rPr>
+          <w:rFonts w:ascii="Calibri" w:hAnsi="Calibri" w:eastAsia="Calibri" w:cs="Calibri" w:hint="eastAsia"/>
+        </w:rPr>
+        <w:t xml:space="preserve">security adversaries, and its provider timestamps are not performance data.</w:t>
+      </w:r>
     </w:p>
-    <w:bookmarkEnd w:id="47"/>
-    <w:bookmarkStart w:id="48" w:name="conclusion"/>
+    <w:bookmarkEnd w:id="49"/>
+    <w:bookmarkStart w:id="50" w:name="conclusion"/>
     <w:p>
       <w:pPr>
         <w:pStyle w:val="Heading1"/>
@@ -18869,35 +20681,71 @@
         <w:rPr>
           <w:rFonts w:ascii="Calibri" w:hAnsi="Calibri" w:eastAsia="Calibri" w:cs="Calibri" w:hint="eastAsia"/>
         </w:rPr>
-        <w:t xml:space="preserve">zero-artifact record likewise terminated without formal authority. The</w:t>
-      </w:r>
-      <w:r>
-        <w:rPr>
-          <w:rFonts w:ascii="Calibri" w:hAnsi="Calibri" w:eastAsia="Calibri" w:cs="Calibri" w:hint="eastAsia"/>
-        </w:rPr>
-        <w:t xml:space="preserve"> </w:t>
-      </w:r>
-      <w:r>
-        <w:rPr>
-          <w:rFonts w:ascii="Calibri" w:hAnsi="Calibri" w:eastAsia="Calibri" w:cs="Calibri" w:hint="eastAsia"/>
-        </w:rPr>
-        <w:t xml:space="preserve">resulting Route C manuscript therefore makes protocol and evidence-boundary</w:t>
-      </w:r>
-      <w:r>
-        <w:rPr>
-          <w:rFonts w:ascii="Calibri" w:hAnsi="Calibri" w:eastAsia="Calibri" w:cs="Calibri" w:hint="eastAsia"/>
-        </w:rPr>
-        <w:t xml:space="preserve"> </w:t>
-      </w:r>
-      <w:r>
-        <w:rPr>
-          <w:rFonts w:ascii="Calibri" w:hAnsi="Calibri" w:eastAsia="Calibri" w:cs="Calibri" w:hint="eastAsia"/>
-        </w:rPr>
-        <w:t xml:space="preserve">claims, not comparative performance claims.</w:t>
+        <w:t xml:space="preserve">zero-artifact record likewise terminated without formal authority. A distinct,</w:t>
+      </w:r>
+      <w:r>
+        <w:rPr>
+          <w:rFonts w:ascii="Calibri" w:hAnsi="Calibri" w:eastAsia="Calibri" w:cs="Calibri" w:hint="eastAsia"/>
+        </w:rPr>
+        <w:t xml:space="preserve"> </w:t>
+      </w:r>
+      <w:r>
+        <w:rPr>
+          <w:rFonts w:ascii="Calibri" w:hAnsi="Calibri" w:eastAsia="Calibri" w:cs="Calibri" w:hint="eastAsia"/>
+        </w:rPr>
+        <w:t xml:space="preserve">preregistered current-source conformance replication did pass one fixed</w:t>
+      </w:r>
+      <w:r>
+        <w:rPr>
+          <w:rFonts w:ascii="Calibri" w:hAnsi="Calibri" w:eastAsia="Calibri" w:cs="Calibri" w:hint="eastAsia"/>
+        </w:rPr>
+        <w:t xml:space="preserve"> </w:t>
+      </w:r>
+      <w:r>
+        <w:rPr>
+          <w:rFonts w:ascii="Calibri" w:hAnsi="Calibri" w:eastAsia="Calibri" w:cs="Calibri" w:hint="eastAsia"/>
+        </w:rPr>
+        <w:t xml:space="preserve">OpenFHE whole-query fixture and its eight-case deterministic contract at an</w:t>
+      </w:r>
+      <w:r>
+        <w:rPr>
+          <w:rFonts w:ascii="Calibri" w:hAnsi="Calibri" w:eastAsia="Calibri" w:cs="Calibri" w:hint="eastAsia"/>
+        </w:rPr>
+        <w:t xml:space="preserve"> </w:t>
+      </w:r>
+      <w:r>
+        <w:rPr>
+          <w:rFonts w:ascii="Calibri" w:hAnsi="Calibri" w:eastAsia="Calibri" w:cs="Calibri" w:hint="eastAsia"/>
+        </w:rPr>
+        <w:t xml:space="preserve">exact source identity. The resulting Route C manuscript therefore makes</w:t>
+      </w:r>
+      <w:r>
+        <w:rPr>
+          <w:rFonts w:ascii="Calibri" w:hAnsi="Calibri" w:eastAsia="Calibri" w:cs="Calibri" w:hint="eastAsia"/>
+        </w:rPr>
+        <w:t xml:space="preserve"> </w:t>
+      </w:r>
+      <w:r>
+        <w:rPr>
+          <w:rFonts w:ascii="Calibri" w:hAnsi="Calibri" w:eastAsia="Calibri" w:cs="Calibri" w:hint="eastAsia"/>
+        </w:rPr>
+        <w:t xml:space="preserve">protocol, evidence-boundary, and narrowly version-bound functional claims, not</w:t>
+      </w:r>
+      <w:r>
+        <w:rPr>
+          <w:rFonts w:ascii="Calibri" w:hAnsi="Calibri" w:eastAsia="Calibri" w:cs="Calibri" w:hint="eastAsia"/>
+        </w:rPr>
+        <w:t xml:space="preserve"> </w:t>
+      </w:r>
+      <w:r>
+        <w:rPr>
+          <w:rFonts w:ascii="Calibri" w:hAnsi="Calibri" w:eastAsia="Calibri" w:cs="Calibri" w:hint="eastAsia"/>
+        </w:rPr>
+        <w:t xml:space="preserve">comparative performance claims.</w:t>
       </w:r>
     </w:p>
-    <w:bookmarkEnd w:id="48"/>
-    <w:bookmarkStart w:id="49" w:name="data-and-code-availability"/>
+    <w:bookmarkEnd w:id="50"/>
+    <w:bookmarkStart w:id="51" w:name="data-and-code-availability"/>
     <w:p>
       <w:pPr>
         <w:pStyle w:val="Heading1"/>
@@ -18907,6 +20755,220 @@
           <w:rFonts w:ascii="Calibri" w:hAnsi="Calibri" w:eastAsia="Calibri" w:cs="Calibri" w:hint="eastAsia"/>
         </w:rPr>
         <w:t xml:space="preserve">Data and code availability</w:t>
+      </w:r>
+    </w:p>
+    <w:p>
+      <w:pPr>
+        <w:pStyle w:val="FirstParagraph"/>
+        <w:jc w:val="left"/>
+      </w:pPr>
+      <w:r>
+        <w:rPr>
+          <w:rFonts w:ascii="Calibri" w:hAnsi="Calibri" w:eastAsia="Calibri" w:cs="Calibri" w:hint="eastAsia"/>
+        </w:rPr>
+        <w:t xml:space="preserve">The Route C package will identify the primary and follow-up S1/S2 pairs; their</w:t>
+      </w:r>
+      <w:r>
+        <w:rPr>
+          <w:rFonts w:ascii="Calibri" w:hAnsi="Calibri" w:eastAsia="Calibri" w:cs="Calibri" w:hint="eastAsia"/>
+        </w:rPr>
+        <w:t xml:space="preserve"> </w:t>
+      </w:r>
+      <w:r>
+        <w:rPr>
+          <w:rFonts w:ascii="Calibri" w:hAnsi="Calibri" w:eastAsia="Calibri" w:cs="Calibri" w:hint="eastAsia"/>
+        </w:rPr>
+        <w:t xml:space="preserve">closed Behavior Sets and compatibility receipts; exact-head CI, PRE-S1,</w:t>
+      </w:r>
+      <w:r>
+        <w:rPr>
+          <w:rFonts w:ascii="Calibri" w:hAnsi="Calibri" w:eastAsia="Calibri" w:cs="Calibri" w:hint="eastAsia"/>
+        </w:rPr>
+        <w:t xml:space="preserve"> </w:t>
+      </w:r>
+      <w:r>
+        <w:rPr>
+          <w:rFonts w:ascii="Calibri" w:hAnsi="Calibri" w:eastAsia="Calibri" w:cs="Calibri" w:hint="eastAsia"/>
+        </w:rPr>
+        <w:t xml:space="preserve">descriptive-registration, source-anchor, and independent-review identities; both</w:t>
+      </w:r>
+      <w:r>
+        <w:rPr>
+          <w:rFonts w:ascii="Calibri" w:hAnsi="Calibri" w:eastAsia="Calibri" w:cs="Calibri" w:hint="eastAsia"/>
+        </w:rPr>
+        <w:t xml:space="preserve"> </w:t>
+      </w:r>
+      <w:r>
+        <w:rPr>
+          <w:rFonts w:ascii="Calibri" w:hAnsi="Calibri" w:eastAsia="Calibri" w:cs="Calibri" w:hint="eastAsia"/>
+        </w:rPr>
+        <w:t xml:space="preserve">qualification dispositions; the frozen schemas, functional propositions,</w:t>
+      </w:r>
+      <w:r>
+        <w:rPr>
+          <w:rFonts w:ascii="Calibri" w:hAnsi="Calibri" w:eastAsia="Calibri" w:cs="Calibri" w:hint="eastAsia"/>
+        </w:rPr>
+        <w:t xml:space="preserve"> </w:t>
+      </w:r>
+      <w:r>
+        <w:rPr>
+          <w:rFonts w:ascii="Calibri" w:hAnsi="Calibri" w:eastAsia="Calibri" w:cs="Calibri" w:hint="eastAsia"/>
+        </w:rPr>
+        <w:t xml:space="preserve">source-conformance record, current-source E4 run</w:t>
+      </w:r>
+      <w:r>
+        <w:rPr>
+          <w:rFonts w:ascii="Calibri" w:hAnsi="Calibri" w:eastAsia="Calibri" w:cs="Calibri" w:hint="eastAsia"/>
+        </w:rPr>
+        <w:t xml:space="preserve"> </w:t>
+      </w:r>
+      <w:r>
+        <w:rPr>
+          <w:rStyle w:val="VerbatimChar"/>
+          <w:rFonts w:ascii="Calibri" w:hAnsi="Calibri" w:eastAsia="Calibri" w:cs="Calibri" w:hint="eastAsia"/>
+        </w:rPr>
+        <w:t xml:space="preserve">33386130654</w:t>
+      </w:r>
+      <w:r>
+        <w:rPr>
+          <w:rFonts w:ascii="Calibri" w:hAnsi="Calibri" w:eastAsia="Calibri" w:cs="Calibri" w:hint="eastAsia"/>
+        </w:rPr>
+        <w:t xml:space="preserve">, artifact</w:t>
+      </w:r>
+      <w:r>
+        <w:rPr>
+          <w:rFonts w:ascii="Calibri" w:hAnsi="Calibri" w:eastAsia="Calibri" w:cs="Calibri" w:hint="eastAsia"/>
+        </w:rPr>
+        <w:t xml:space="preserve"> </w:t>
+      </w:r>
+      <w:r>
+        <w:rPr>
+          <w:rStyle w:val="VerbatimChar"/>
+          <w:rFonts w:ascii="Calibri" w:hAnsi="Calibri" w:eastAsia="Calibri" w:cs="Calibri" w:hint="eastAsia"/>
+        </w:rPr>
+        <w:t xml:space="preserve">9755741401</w:t>
+      </w:r>
+      <w:r>
+        <w:rPr>
+          <w:rFonts w:ascii="Calibri" w:hAnsi="Calibri" w:eastAsia="Calibri" w:cs="Calibri" w:hint="eastAsia"/>
+        </w:rPr>
+        <w:t xml:space="preserve">, raw digest</w:t>
+      </w:r>
+      <w:r>
+        <w:rPr>
+          <w:rFonts w:ascii="Calibri" w:hAnsi="Calibri" w:eastAsia="Calibri" w:cs="Calibri" w:hint="eastAsia"/>
+        </w:rPr>
+        <w:t xml:space="preserve"> </w:t>
+      </w:r>
+      <w:r>
+        <w:rPr>
+          <w:rStyle w:val="VerbatimChar"/>
+          <w:rFonts w:ascii="Calibri" w:hAnsi="Calibri" w:eastAsia="Calibri" w:cs="Calibri" w:hint="eastAsia"/>
+        </w:rPr>
+        <w:t xml:space="preserve">sha256:5978b7d9f75048939c9761243e224abb588ed82c2abc64e051523a7a598a1383</w:t>
+      </w:r>
+      <w:r>
+        <w:rPr>
+          <w:rFonts w:ascii="Calibri" w:hAnsi="Calibri" w:eastAsia="Calibri" w:cs="Calibri" w:hint="eastAsia"/>
+        </w:rPr>
+        <w:t xml:space="preserve">,</w:t>
+      </w:r>
+      <w:r>
+        <w:rPr>
+          <w:rFonts w:ascii="Calibri" w:hAnsi="Calibri" w:eastAsia="Calibri" w:cs="Calibri" w:hint="eastAsia"/>
+        </w:rPr>
+        <w:t xml:space="preserve"> </w:t>
+      </w:r>
+      <w:r>
+        <w:rPr>
+          <w:rFonts w:ascii="Calibri" w:hAnsi="Calibri" w:eastAsia="Calibri" w:cs="Calibri" w:hint="eastAsia"/>
+        </w:rPr>
+        <w:t xml:space="preserve">and verification code. It will explicitly state that</w:t>
+      </w:r>
+      <w:r>
+        <w:rPr>
+          <w:rFonts w:ascii="Calibri" w:hAnsi="Calibri" w:eastAsia="Calibri" w:cs="Calibri" w:hint="eastAsia"/>
+        </w:rPr>
+        <w:t xml:space="preserve"> </w:t>
+      </w:r>
+      <w:r>
+        <w:rPr>
+          <w:rFonts w:ascii="Calibri" w:hAnsi="Calibri" w:eastAsia="Calibri" w:cs="Calibri" w:hint="eastAsia"/>
+        </w:rPr>
+        <w:t xml:space="preserve">the primary one-day q1 handoff was non-evidence, the follow-up produced no</w:t>
+      </w:r>
+      <w:r>
+        <w:rPr>
+          <w:rFonts w:ascii="Calibri" w:hAnsi="Calibri" w:eastAsia="Calibri" w:cs="Calibri" w:hint="eastAsia"/>
+        </w:rPr>
+        <w:t xml:space="preserve"> </w:t>
+      </w:r>
+      <w:r>
+        <w:rPr>
+          <w:rFonts w:ascii="Calibri" w:hAnsi="Calibri" w:eastAsia="Calibri" w:cs="Calibri" w:hint="eastAsia"/>
+        </w:rPr>
+        <w:t xml:space="preserve">artifact at all, and no acquisition, formal, terminal, aggregate, or analysis</w:t>
+      </w:r>
+      <w:r>
+        <w:rPr>
+          <w:rFonts w:ascii="Calibri" w:hAnsi="Calibri" w:eastAsia="Calibri" w:cs="Calibri" w:hint="eastAsia"/>
+        </w:rPr>
+        <w:t xml:space="preserve"> </w:t>
+      </w:r>
+      <w:r>
+        <w:rPr>
+          <w:rFonts w:ascii="Calibri" w:hAnsi="Calibri" w:eastAsia="Calibri" w:cs="Calibri" w:hint="eastAsia"/>
+        </w:rPr>
+        <w:t xml:space="preserve">artifact was created. The E4 artifact is functional conformance evidence, not a</w:t>
+      </w:r>
+      <w:r>
+        <w:rPr>
+          <w:rFonts w:ascii="Calibri" w:hAnsi="Calibri" w:eastAsia="Calibri" w:cs="Calibri" w:hint="eastAsia"/>
+        </w:rPr>
+        <w:t xml:space="preserve"> </w:t>
+      </w:r>
+      <w:r>
+        <w:rPr>
+          <w:rFonts w:ascii="Calibri" w:hAnsi="Calibri" w:eastAsia="Calibri" w:cs="Calibri" w:hint="eastAsia"/>
+        </w:rPr>
+        <w:t xml:space="preserve">performance artifact. No archival DOI is claimed by this working draft. This</w:t>
+      </w:r>
+      <w:r>
+        <w:rPr>
+          <w:rFonts w:ascii="Calibri" w:hAnsi="Calibri" w:eastAsia="Calibri" w:cs="Calibri" w:hint="eastAsia"/>
+        </w:rPr>
+        <w:t xml:space="preserve"> </w:t>
+      </w:r>
+      <w:r>
+        <w:rPr>
+          <w:rFonts w:ascii="Calibri" w:hAnsi="Calibri" w:eastAsia="Calibri" w:cs="Calibri" w:hint="eastAsia"/>
+        </w:rPr>
+        <w:t xml:space="preserve">section must be replaced with the accepted repository release and archival DOI</w:t>
+      </w:r>
+      <w:r>
+        <w:rPr>
+          <w:rFonts w:ascii="Calibri" w:hAnsi="Calibri" w:eastAsia="Calibri" w:cs="Calibri" w:hint="eastAsia"/>
+        </w:rPr>
+        <w:t xml:space="preserve"> </w:t>
+      </w:r>
+      <w:r>
+        <w:rPr>
+          <w:rFonts w:ascii="Calibri" w:hAnsi="Calibri" w:eastAsia="Calibri" w:cs="Calibri" w:hint="eastAsia"/>
+        </w:rPr>
+        <w:t xml:space="preserve">before submission.</w:t>
+      </w:r>
+    </w:p>
+    <w:bookmarkEnd w:id="51"/>
+    <w:bookmarkStart w:id="52" w:name="statements-and-declarations"/>
+    <w:p>
+      <w:pPr>
+        <w:pStyle w:val="Heading1"/>
+      </w:pPr>
+      <w:r>
+        <w:rPr>
+          <w:rFonts w:ascii="Calibri" w:hAnsi="Calibri" w:eastAsia="Calibri" w:cs="Calibri" w:hint="eastAsia"/>
+        </w:rPr>
+        <w:t xml:space="preserve">Statements and declarations</w:t>
       </w:r>
     </w:p>
     <w:p>
@@ -18916,120 +20978,197 @@
       <w:r>
         <w:rPr>
           <w:rFonts w:ascii="Calibri" w:hAnsi="Calibri" w:eastAsia="Calibri" w:cs="Calibri" w:hint="eastAsia"/>
-        </w:rPr>
-        <w:t xml:space="preserve">The Route C package will identify the primary and follow-up S1/S2 pairs; their</w:t>
-      </w:r>
-      <w:r>
-        <w:rPr>
-          <w:rFonts w:ascii="Calibri" w:hAnsi="Calibri" w:eastAsia="Calibri" w:cs="Calibri" w:hint="eastAsia"/>
-        </w:rPr>
-        <w:t xml:space="preserve"> </w:t>
-      </w:r>
-      <w:r>
-        <w:rPr>
-          <w:rFonts w:ascii="Calibri" w:hAnsi="Calibri" w:eastAsia="Calibri" w:cs="Calibri" w:hint="eastAsia"/>
-        </w:rPr>
-        <w:t xml:space="preserve">closed Behavior Sets and compatibility receipts; exact-head CI, PRE-S1,</w:t>
-      </w:r>
-      <w:r>
-        <w:rPr>
-          <w:rFonts w:ascii="Calibri" w:hAnsi="Calibri" w:eastAsia="Calibri" w:cs="Calibri" w:hint="eastAsia"/>
-        </w:rPr>
-        <w:t xml:space="preserve"> </w:t>
-      </w:r>
-      <w:r>
-        <w:rPr>
-          <w:rFonts w:ascii="Calibri" w:hAnsi="Calibri" w:eastAsia="Calibri" w:cs="Calibri" w:hint="eastAsia"/>
-        </w:rPr>
-        <w:t xml:space="preserve">descriptive-registration, source-anchor, and independent-review identities; both</w:t>
-      </w:r>
-      <w:r>
-        <w:rPr>
-          <w:rFonts w:ascii="Calibri" w:hAnsi="Calibri" w:eastAsia="Calibri" w:cs="Calibri" w:hint="eastAsia"/>
-        </w:rPr>
-        <w:t xml:space="preserve"> </w:t>
-      </w:r>
-      <w:r>
-        <w:rPr>
-          <w:rFonts w:ascii="Calibri" w:hAnsi="Calibri" w:eastAsia="Calibri" w:cs="Calibri" w:hint="eastAsia"/>
-        </w:rPr>
-        <w:t xml:space="preserve">qualification dispositions; the frozen schemas, functional propositions,</w:t>
-      </w:r>
-      <w:r>
-        <w:rPr>
-          <w:rFonts w:ascii="Calibri" w:hAnsi="Calibri" w:eastAsia="Calibri" w:cs="Calibri" w:hint="eastAsia"/>
-        </w:rPr>
-        <w:t xml:space="preserve"> </w:t>
-      </w:r>
-      <w:r>
-        <w:rPr>
-          <w:rFonts w:ascii="Calibri" w:hAnsi="Calibri" w:eastAsia="Calibri" w:cs="Calibri" w:hint="eastAsia"/>
-        </w:rPr>
-        <w:t xml:space="preserve">source-conformance record, and verification code. It will explicitly state that</w:t>
-      </w:r>
-      <w:r>
-        <w:rPr>
-          <w:rFonts w:ascii="Calibri" w:hAnsi="Calibri" w:eastAsia="Calibri" w:cs="Calibri" w:hint="eastAsia"/>
-        </w:rPr>
-        <w:t xml:space="preserve"> </w:t>
-      </w:r>
-      <w:r>
-        <w:rPr>
-          <w:rFonts w:ascii="Calibri" w:hAnsi="Calibri" w:eastAsia="Calibri" w:cs="Calibri" w:hint="eastAsia"/>
-        </w:rPr>
-        <w:t xml:space="preserve">the primary one-day q1 handoff was non-evidence, the follow-up produced no</w:t>
-      </w:r>
-      <w:r>
-        <w:rPr>
-          <w:rFonts w:ascii="Calibri" w:hAnsi="Calibri" w:eastAsia="Calibri" w:cs="Calibri" w:hint="eastAsia"/>
-        </w:rPr>
-        <w:t xml:space="preserve"> </w:t>
-      </w:r>
-      <w:r>
-        <w:rPr>
-          <w:rFonts w:ascii="Calibri" w:hAnsi="Calibri" w:eastAsia="Calibri" w:cs="Calibri" w:hint="eastAsia"/>
-        </w:rPr>
-        <w:t xml:space="preserve">artifact at all, and no acquisition, formal, terminal, aggregate, or analysis</w:t>
-      </w:r>
-      <w:r>
-        <w:rPr>
-          <w:rFonts w:ascii="Calibri" w:hAnsi="Calibri" w:eastAsia="Calibri" w:cs="Calibri" w:hint="eastAsia"/>
-        </w:rPr>
-        <w:t xml:space="preserve"> </w:t>
-      </w:r>
-      <w:r>
-        <w:rPr>
-          <w:rFonts w:ascii="Calibri" w:hAnsi="Calibri" w:eastAsia="Calibri" w:cs="Calibri" w:hint="eastAsia"/>
-        </w:rPr>
-        <w:t xml:space="preserve">artifact was created. No empirical artifact or archival DOI is claimed by this</w:t>
-      </w:r>
-      <w:r>
-        <w:rPr>
-          <w:rFonts w:ascii="Calibri" w:hAnsi="Calibri" w:eastAsia="Calibri" w:cs="Calibri" w:hint="eastAsia"/>
-        </w:rPr>
-        <w:t xml:space="preserve"> </w:t>
-      </w:r>
-      <w:r>
-        <w:rPr>
-          <w:rFonts w:ascii="Calibri" w:hAnsi="Calibri" w:eastAsia="Calibri" w:cs="Calibri" w:hint="eastAsia"/>
-        </w:rPr>
-        <w:t xml:space="preserve">working draft. This section must be replaced with the accepted repository</w:t>
-      </w:r>
-      <w:r>
-        <w:rPr>
-          <w:rFonts w:ascii="Calibri" w:hAnsi="Calibri" w:eastAsia="Calibri" w:cs="Calibri" w:hint="eastAsia"/>
-        </w:rPr>
-        <w:t xml:space="preserve"> </w:t>
-      </w:r>
-      <w:r>
-        <w:rPr>
-          <w:rFonts w:ascii="Calibri" w:hAnsi="Calibri" w:eastAsia="Calibri" w:cs="Calibri" w:hint="eastAsia"/>
-        </w:rPr>
-        <w:t xml:space="preserve">release and archival DOI before submission.</w:t>
+          <w:b/>
+          <w:bCs/>
+        </w:rPr>
+        <w:t xml:space="preserve">Funding.</w:t>
+      </w:r>
+      <w:r>
+        <w:rPr>
+          <w:rFonts w:ascii="Calibri" w:hAnsi="Calibri" w:eastAsia="Calibri" w:cs="Calibri" w:hint="eastAsia"/>
+        </w:rPr>
+        <w:t xml:space="preserve"> </w:t>
+      </w:r>
+      <w:r>
+        <w:rPr>
+          <w:rFonts w:ascii="Calibri" w:hAnsi="Calibri" w:eastAsia="Calibri" w:cs="Calibri" w:hint="eastAsia"/>
+        </w:rPr>
+        <w:t xml:space="preserve">[The human author or authors must supply the applicable funding</w:t>
+      </w:r>
+      <w:r>
+        <w:rPr>
+          <w:rFonts w:ascii="Calibri" w:hAnsi="Calibri" w:eastAsia="Calibri" w:cs="Calibri" w:hint="eastAsia"/>
+        </w:rPr>
+        <w:t xml:space="preserve"> </w:t>
+      </w:r>
+      <w:r>
+        <w:rPr>
+          <w:rFonts w:ascii="Calibri" w:hAnsi="Calibri" w:eastAsia="Calibri" w:cs="Calibri" w:hint="eastAsia"/>
+        </w:rPr>
+        <w:t xml:space="preserve">statement before submission.]</w:t>
       </w:r>
     </w:p>
-    <w:bookmarkEnd w:id="49"/>
-    <w:bookmarkStart w:id="50" w:name="statements-and-declarations"/>
+    <w:p>
+      <w:pPr>
+        <w:pStyle w:val="BodyText"/>
+      </w:pPr>
+      <w:r>
+        <w:rPr>
+          <w:rFonts w:ascii="Calibri" w:hAnsi="Calibri" w:eastAsia="Calibri" w:cs="Calibri" w:hint="eastAsia"/>
+          <w:b/>
+          <w:bCs/>
+        </w:rPr>
+        <w:t xml:space="preserve">Competing interests.</w:t>
+      </w:r>
+      <w:r>
+        <w:rPr>
+          <w:rFonts w:ascii="Calibri" w:hAnsi="Calibri" w:eastAsia="Calibri" w:cs="Calibri" w:hint="eastAsia"/>
+        </w:rPr>
+        <w:t xml:space="preserve"> </w:t>
+      </w:r>
+      <w:r>
+        <w:rPr>
+          <w:rFonts w:ascii="Calibri" w:hAnsi="Calibri" w:eastAsia="Calibri" w:cs="Calibri" w:hint="eastAsia"/>
+        </w:rPr>
+        <w:t xml:space="preserve">[The human author or authors must confirm and supply</w:t>
+      </w:r>
+      <w:r>
+        <w:rPr>
+          <w:rFonts w:ascii="Calibri" w:hAnsi="Calibri" w:eastAsia="Calibri" w:cs="Calibri" w:hint="eastAsia"/>
+        </w:rPr>
+        <w:t xml:space="preserve"> </w:t>
+      </w:r>
+      <w:r>
+        <w:rPr>
+          <w:rFonts w:ascii="Calibri" w:hAnsi="Calibri" w:eastAsia="Calibri" w:cs="Calibri" w:hint="eastAsia"/>
+        </w:rPr>
+        <w:t xml:space="preserve">the competing-interest declaration before submission.]</w:t>
+      </w:r>
+    </w:p>
+    <w:p>
+      <w:pPr>
+        <w:pStyle w:val="BodyText"/>
+      </w:pPr>
+      <w:r>
+        <w:rPr>
+          <w:rFonts w:ascii="Calibri" w:hAnsi="Calibri" w:eastAsia="Calibri" w:cs="Calibri" w:hint="eastAsia"/>
+          <w:b/>
+          <w:bCs/>
+        </w:rPr>
+        <w:t xml:space="preserve">Author contributions.</w:t>
+      </w:r>
+      <w:r>
+        <w:rPr>
+          <w:rFonts w:ascii="Calibri" w:hAnsi="Calibri" w:eastAsia="Calibri" w:cs="Calibri" w:hint="eastAsia"/>
+        </w:rPr>
+        <w:t xml:space="preserve"> </w:t>
+      </w:r>
+      <w:r>
+        <w:rPr>
+          <w:rFonts w:ascii="Calibri" w:hAnsi="Calibri" w:eastAsia="Calibri" w:cs="Calibri" w:hint="eastAsia"/>
+        </w:rPr>
+        <w:t xml:space="preserve">[Insert the verified CRediT roles and author names;</w:t>
+      </w:r>
+      <w:r>
+        <w:rPr>
+          <w:rFonts w:ascii="Calibri" w:hAnsi="Calibri" w:eastAsia="Calibri" w:cs="Calibri" w:hint="eastAsia"/>
+        </w:rPr>
+        <w:t xml:space="preserve"> </w:t>
+      </w:r>
+      <w:r>
+        <w:rPr>
+          <w:rFonts w:ascii="Calibri" w:hAnsi="Calibri" w:eastAsia="Calibri" w:cs="Calibri" w:hint="eastAsia"/>
+        </w:rPr>
+        <w:t xml:space="preserve">an AI system must not be listed as an author.]</w:t>
+      </w:r>
+    </w:p>
+    <w:p>
+      <w:pPr>
+        <w:pStyle w:val="BodyText"/>
+      </w:pPr>
+      <w:r>
+        <w:rPr>
+          <w:rFonts w:ascii="Calibri" w:hAnsi="Calibri" w:eastAsia="Calibri" w:cs="Calibri" w:hint="eastAsia"/>
+          <w:b/>
+          <w:bCs/>
+        </w:rPr>
+        <w:t xml:space="preserve">Use of generative AI.</w:t>
+      </w:r>
+      <w:r>
+        <w:rPr>
+          <w:rFonts w:ascii="Calibri" w:hAnsi="Calibri" w:eastAsia="Calibri" w:cs="Calibri" w:hint="eastAsia"/>
+        </w:rPr>
+        <w:t xml:space="preserve"> </w:t>
+      </w:r>
+      <w:r>
+        <w:rPr>
+          <w:rFonts w:ascii="Calibri" w:hAnsi="Calibri" w:eastAsia="Calibri" w:cs="Calibri" w:hint="eastAsia"/>
+        </w:rPr>
+        <w:t xml:space="preserve">Generative-AI systems assisted literature discovery,</w:t>
+      </w:r>
+      <w:r>
+        <w:rPr>
+          <w:rFonts w:ascii="Calibri" w:hAnsi="Calibri" w:eastAsia="Calibri" w:cs="Calibri" w:hint="eastAsia"/>
+        </w:rPr>
+        <w:t xml:space="preserve"> </w:t>
+      </w:r>
+      <w:r>
+        <w:rPr>
+          <w:rFonts w:ascii="Calibri" w:hAnsi="Calibri" w:eastAsia="Calibri" w:cs="Calibri" w:hint="eastAsia"/>
+        </w:rPr>
+        <w:t xml:space="preserve">implementation and test generation, adversarial review, and manuscript</w:t>
+      </w:r>
+      <w:r>
+        <w:rPr>
+          <w:rFonts w:ascii="Calibri" w:hAnsi="Calibri" w:eastAsia="Calibri" w:cs="Calibri" w:hint="eastAsia"/>
+        </w:rPr>
+        <w:t xml:space="preserve"> </w:t>
+      </w:r>
+      <w:r>
+        <w:rPr>
+          <w:rFonts w:ascii="Calibri" w:hAnsi="Calibri" w:eastAsia="Calibri" w:cs="Calibri" w:hint="eastAsia"/>
+        </w:rPr>
+        <w:t xml:space="preserve">drafting. Human authors must independently verify every source, inspect and run</w:t>
+      </w:r>
+      <w:r>
+        <w:rPr>
+          <w:rFonts w:ascii="Calibri" w:hAnsi="Calibri" w:eastAsia="Calibri" w:cs="Calibri" w:hint="eastAsia"/>
+        </w:rPr>
+        <w:t xml:space="preserve"> </w:t>
+      </w:r>
+      <w:r>
+        <w:rPr>
+          <w:rFonts w:ascii="Calibri" w:hAnsi="Calibri" w:eastAsia="Calibri" w:cs="Calibri" w:hint="eastAsia"/>
+        </w:rPr>
+        <w:t xml:space="preserve">the released code and experiments, approve the final wording, and accept full</w:t>
+      </w:r>
+      <w:r>
+        <w:rPr>
+          <w:rFonts w:ascii="Calibri" w:hAnsi="Calibri" w:eastAsia="Calibri" w:cs="Calibri" w:hint="eastAsia"/>
+        </w:rPr>
+        <w:t xml:space="preserve"> </w:t>
+      </w:r>
+      <w:r>
+        <w:rPr>
+          <w:rFonts w:ascii="Calibri" w:hAnsi="Calibri" w:eastAsia="Calibri" w:cs="Calibri" w:hint="eastAsia"/>
+        </w:rPr>
+        <w:t xml:space="preserve">accountability for the work. The exact disclosure will be rechecked against the</w:t>
+      </w:r>
+      <w:r>
+        <w:rPr>
+          <w:rFonts w:ascii="Calibri" w:hAnsi="Calibri" w:eastAsia="Calibri" w:cs="Calibri" w:hint="eastAsia"/>
+        </w:rPr>
+        <w:t xml:space="preserve"> </w:t>
+      </w:r>
+      <w:r>
+        <w:rPr>
+          <w:rFonts w:ascii="Calibri" w:hAnsi="Calibri" w:eastAsia="Calibri" w:cs="Calibri" w:hint="eastAsia"/>
+        </w:rPr>
+        <w:t xml:space="preserve">publisher policy at submission.</w:t>
+      </w:r>
+    </w:p>
+    <w:bookmarkEnd w:id="52"/>
+    <w:bookmarkStart w:id="107" w:name="references"/>
     <w:p>
       <w:pPr>
         <w:pStyle w:val="Heading1"/>
@@ -19038,7 +21177,7 @@
         <w:rPr>
           <w:rFonts w:ascii="Calibri" w:hAnsi="Calibri" w:eastAsia="Calibri" w:cs="Calibri" w:hint="eastAsia"/>
         </w:rPr>
-        <w:t xml:space="preserve">Statements and declarations</w:t>
+        <w:t xml:space="preserve">References</w:t>
       </w:r>
     </w:p>
     <w:p>
@@ -19048,215 +21187,6 @@
       <w:r>
         <w:rPr>
           <w:rFonts w:ascii="Calibri" w:hAnsi="Calibri" w:eastAsia="Calibri" w:cs="Calibri" w:hint="eastAsia"/>
-          <w:b/>
-          <w:bCs/>
-        </w:rPr>
-        <w:t xml:space="preserve">Funding.</w:t>
-      </w:r>
-      <w:r>
-        <w:rPr>
-          <w:rFonts w:ascii="Calibri" w:hAnsi="Calibri" w:eastAsia="Calibri" w:cs="Calibri" w:hint="eastAsia"/>
-        </w:rPr>
-        <w:t xml:space="preserve"> </w:t>
-      </w:r>
-      <w:r>
-        <w:rPr>
-          <w:rFonts w:ascii="Calibri" w:hAnsi="Calibri" w:eastAsia="Calibri" w:cs="Calibri" w:hint="eastAsia"/>
-        </w:rPr>
-        <w:t xml:space="preserve">[The human author or authors must supply the applicable funding</w:t>
-      </w:r>
-      <w:r>
-        <w:rPr>
-          <w:rFonts w:ascii="Calibri" w:hAnsi="Calibri" w:eastAsia="Calibri" w:cs="Calibri" w:hint="eastAsia"/>
-        </w:rPr>
-        <w:t xml:space="preserve"> </w:t>
-      </w:r>
-      <w:r>
-        <w:rPr>
-          <w:rFonts w:ascii="Calibri" w:hAnsi="Calibri" w:eastAsia="Calibri" w:cs="Calibri" w:hint="eastAsia"/>
-        </w:rPr>
-        <w:t xml:space="preserve">statement before submission.]</w:t>
-      </w:r>
-    </w:p>
-    <w:p>
-      <w:pPr>
-        <w:pStyle w:val="BodyText"/>
-      </w:pPr>
-      <w:r>
-        <w:rPr>
-          <w:rFonts w:ascii="Calibri" w:hAnsi="Calibri" w:eastAsia="Calibri" w:cs="Calibri" w:hint="eastAsia"/>
-          <w:b/>
-          <w:bCs/>
-        </w:rPr>
-        <w:t xml:space="preserve">Competing interests.</w:t>
-      </w:r>
-      <w:r>
-        <w:rPr>
-          <w:rFonts w:ascii="Calibri" w:hAnsi="Calibri" w:eastAsia="Calibri" w:cs="Calibri" w:hint="eastAsia"/>
-        </w:rPr>
-        <w:t xml:space="preserve"> </w:t>
-      </w:r>
-      <w:r>
-        <w:rPr>
-          <w:rFonts w:ascii="Calibri" w:hAnsi="Calibri" w:eastAsia="Calibri" w:cs="Calibri" w:hint="eastAsia"/>
-        </w:rPr>
-        <w:t xml:space="preserve">[The human author or authors must confirm and supply</w:t>
-      </w:r>
-      <w:r>
-        <w:rPr>
-          <w:rFonts w:ascii="Calibri" w:hAnsi="Calibri" w:eastAsia="Calibri" w:cs="Calibri" w:hint="eastAsia"/>
-        </w:rPr>
-        <w:t xml:space="preserve"> </w:t>
-      </w:r>
-      <w:r>
-        <w:rPr>
-          <w:rFonts w:ascii="Calibri" w:hAnsi="Calibri" w:eastAsia="Calibri" w:cs="Calibri" w:hint="eastAsia"/>
-        </w:rPr>
-        <w:t xml:space="preserve">the competing-interest declaration before submission.]</w:t>
-      </w:r>
-    </w:p>
-    <w:p>
-      <w:pPr>
-        <w:pStyle w:val="BodyText"/>
-      </w:pPr>
-      <w:r>
-        <w:rPr>
-          <w:rFonts w:ascii="Calibri" w:hAnsi="Calibri" w:eastAsia="Calibri" w:cs="Calibri" w:hint="eastAsia"/>
-          <w:b/>
-          <w:bCs/>
-        </w:rPr>
-        <w:t xml:space="preserve">Author contributions.</w:t>
-      </w:r>
-      <w:r>
-        <w:rPr>
-          <w:rFonts w:ascii="Calibri" w:hAnsi="Calibri" w:eastAsia="Calibri" w:cs="Calibri" w:hint="eastAsia"/>
-        </w:rPr>
-        <w:t xml:space="preserve"> </w:t>
-      </w:r>
-      <w:r>
-        <w:rPr>
-          <w:rFonts w:ascii="Calibri" w:hAnsi="Calibri" w:eastAsia="Calibri" w:cs="Calibri" w:hint="eastAsia"/>
-        </w:rPr>
-        <w:t xml:space="preserve">[Insert the verified CRediT roles and author names;</w:t>
-      </w:r>
-      <w:r>
-        <w:rPr>
-          <w:rFonts w:ascii="Calibri" w:hAnsi="Calibri" w:eastAsia="Calibri" w:cs="Calibri" w:hint="eastAsia"/>
-        </w:rPr>
-        <w:t xml:space="preserve"> </w:t>
-      </w:r>
-      <w:r>
-        <w:rPr>
-          <w:rFonts w:ascii="Calibri" w:hAnsi="Calibri" w:eastAsia="Calibri" w:cs="Calibri" w:hint="eastAsia"/>
-        </w:rPr>
-        <w:t xml:space="preserve">an AI system must not be listed as an author.]</w:t>
-      </w:r>
-    </w:p>
-    <w:p>
-      <w:pPr>
-        <w:pStyle w:val="BodyText"/>
-      </w:pPr>
-      <w:r>
-        <w:rPr>
-          <w:rFonts w:ascii="Calibri" w:hAnsi="Calibri" w:eastAsia="Calibri" w:cs="Calibri" w:hint="eastAsia"/>
-          <w:b/>
-          <w:bCs/>
-        </w:rPr>
-        <w:t xml:space="preserve">Use of generative AI.</w:t>
-      </w:r>
-      <w:r>
-        <w:rPr>
-          <w:rFonts w:ascii="Calibri" w:hAnsi="Calibri" w:eastAsia="Calibri" w:cs="Calibri" w:hint="eastAsia"/>
-        </w:rPr>
-        <w:t xml:space="preserve"> </w:t>
-      </w:r>
-      <w:r>
-        <w:rPr>
-          <w:rFonts w:ascii="Calibri" w:hAnsi="Calibri" w:eastAsia="Calibri" w:cs="Calibri" w:hint="eastAsia"/>
-        </w:rPr>
-        <w:t xml:space="preserve">Generative-AI systems assisted literature discovery,</w:t>
-      </w:r>
-      <w:r>
-        <w:rPr>
-          <w:rFonts w:ascii="Calibri" w:hAnsi="Calibri" w:eastAsia="Calibri" w:cs="Calibri" w:hint="eastAsia"/>
-        </w:rPr>
-        <w:t xml:space="preserve"> </w:t>
-      </w:r>
-      <w:r>
-        <w:rPr>
-          <w:rFonts w:ascii="Calibri" w:hAnsi="Calibri" w:eastAsia="Calibri" w:cs="Calibri" w:hint="eastAsia"/>
-        </w:rPr>
-        <w:t xml:space="preserve">implementation and test generation, adversarial review, and manuscript</w:t>
-      </w:r>
-      <w:r>
-        <w:rPr>
-          <w:rFonts w:ascii="Calibri" w:hAnsi="Calibri" w:eastAsia="Calibri" w:cs="Calibri" w:hint="eastAsia"/>
-        </w:rPr>
-        <w:t xml:space="preserve"> </w:t>
-      </w:r>
-      <w:r>
-        <w:rPr>
-          <w:rFonts w:ascii="Calibri" w:hAnsi="Calibri" w:eastAsia="Calibri" w:cs="Calibri" w:hint="eastAsia"/>
-        </w:rPr>
-        <w:t xml:space="preserve">drafting. Human authors must independently verify every source, inspect and run</w:t>
-      </w:r>
-      <w:r>
-        <w:rPr>
-          <w:rFonts w:ascii="Calibri" w:hAnsi="Calibri" w:eastAsia="Calibri" w:cs="Calibri" w:hint="eastAsia"/>
-        </w:rPr>
-        <w:t xml:space="preserve"> </w:t>
-      </w:r>
-      <w:r>
-        <w:rPr>
-          <w:rFonts w:ascii="Calibri" w:hAnsi="Calibri" w:eastAsia="Calibri" w:cs="Calibri" w:hint="eastAsia"/>
-        </w:rPr>
-        <w:t xml:space="preserve">the released code and experiments, approve the final wording, and accept full</w:t>
-      </w:r>
-      <w:r>
-        <w:rPr>
-          <w:rFonts w:ascii="Calibri" w:hAnsi="Calibri" w:eastAsia="Calibri" w:cs="Calibri" w:hint="eastAsia"/>
-        </w:rPr>
-        <w:t xml:space="preserve"> </w:t>
-      </w:r>
-      <w:r>
-        <w:rPr>
-          <w:rFonts w:ascii="Calibri" w:hAnsi="Calibri" w:eastAsia="Calibri" w:cs="Calibri" w:hint="eastAsia"/>
-        </w:rPr>
-        <w:t xml:space="preserve">accountability for the work. The exact disclosure will be rechecked against the</w:t>
-      </w:r>
-      <w:r>
-        <w:rPr>
-          <w:rFonts w:ascii="Calibri" w:hAnsi="Calibri" w:eastAsia="Calibri" w:cs="Calibri" w:hint="eastAsia"/>
-        </w:rPr>
-        <w:t xml:space="preserve"> </w:t>
-      </w:r>
-      <w:r>
-        <w:rPr>
-          <w:rFonts w:ascii="Calibri" w:hAnsi="Calibri" w:eastAsia="Calibri" w:cs="Calibri" w:hint="eastAsia"/>
-        </w:rPr>
-        <w:t xml:space="preserve">publisher policy at submission.</w:t>
-      </w:r>
-    </w:p>
-    <w:bookmarkEnd w:id="50"/>
-    <w:bookmarkStart w:id="105" w:name="references"/>
-    <w:p>
-      <w:pPr>
-        <w:pStyle w:val="Heading1"/>
-      </w:pPr>
-      <w:r>
-        <w:rPr>
-          <w:rFonts w:ascii="Calibri" w:hAnsi="Calibri" w:eastAsia="Calibri" w:cs="Calibri" w:hint="eastAsia"/>
-        </w:rPr>
-        <w:t xml:space="preserve">References</w:t>
-      </w:r>
-    </w:p>
-    <w:p>
-      <w:pPr>
-        <w:pStyle w:val="FirstParagraph"/>
-      </w:pPr>
-      <w:r>
-        <w:rPr>
-          <w:rFonts w:ascii="Calibri" w:hAnsi="Calibri" w:eastAsia="Calibri" w:cs="Calibri" w:hint="eastAsia"/>
         </w:rPr>
         <w:t xml:space="preserve">The citation database for this working manuscript is</w:t>
       </w:r>
@@ -19266,7 +21196,7 @@
         </w:rPr>
         <w:t xml:space="preserve"> </w:t>
       </w:r>
-      <w:hyperlink r:id="rId51">
+      <w:hyperlink r:id="rId53">
         <w:r>
           <w:rPr>
             <w:rStyle w:val="VerbatimChar"/>
@@ -19305,8 +21235,8 @@
         <w:t xml:space="preserve">submitted with citation keys left unresolved.</w:t>
       </w:r>
     </w:p>
-    <w:bookmarkStart w:id="104" w:name="refs"/>
-    <w:bookmarkStart w:id="53" w:name="ref-bell2008spmvcuda"/>
+    <w:bookmarkStart w:id="106" w:name="refs"/>
+    <w:bookmarkStart w:id="55" w:name="ref-bell2008spmvcuda"/>
     <w:p>
       <w:pPr>
         <w:pStyle w:val="Bibliography"/>
@@ -19343,7 +21273,7 @@
         </w:rPr>
         <w:t xml:space="preserve"> </w:t>
       </w:r>
-      <w:hyperlink r:id="rId52">
+      <w:hyperlink r:id="rId54">
         <w:r>
           <w:rPr>
             <w:rStyle w:val="Hyperlink"/>
@@ -19358,8 +21288,8 @@
         <w:t xml:space="preserve">.</w:t>
       </w:r>
     </w:p>
-    <w:bookmarkEnd w:id="53"/>
-    <w:bookmarkStart w:id="55" w:name="ref-bonawitz2017secureagg"/>
+    <w:bookmarkEnd w:id="55"/>
+    <w:bookmarkStart w:id="57" w:name="ref-bonawitz2017secureagg"/>
     <w:p>
       <w:pPr>
         <w:pStyle w:val="Bibliography"/>
@@ -19408,7 +21338,7 @@
         </w:rPr>
         <w:t xml:space="preserve"> </w:t>
       </w:r>
-      <w:hyperlink r:id="rId54">
+      <w:hyperlink r:id="rId56">
         <w:r>
           <w:rPr>
             <w:rStyle w:val="Hyperlink"/>
@@ -19423,8 +21353,8 @@
         <w:t xml:space="preserve">.</w:t>
       </w:r>
     </w:p>
-    <w:bookmarkEnd w:id="55"/>
-    <w:bookmarkStart w:id="57" w:name="ref-cash2014dynamic"/>
+    <w:bookmarkEnd w:id="57"/>
+    <w:bookmarkStart w:id="59" w:name="ref-cash2014dynamic"/>
     <w:p>
       <w:pPr>
         <w:pStyle w:val="Bibliography"/>
@@ -19473,7 +21403,7 @@
         </w:rPr>
         <w:t xml:space="preserve"> </w:t>
       </w:r>
-      <w:hyperlink r:id="rId56">
+      <w:hyperlink r:id="rId58">
         <w:r>
           <w:rPr>
             <w:rStyle w:val="Hyperlink"/>
@@ -19488,8 +21418,8 @@
         <w:t xml:space="preserve">.</w:t>
       </w:r>
     </w:p>
-    <w:bookmarkEnd w:id="57"/>
-    <w:bookmarkStart w:id="59" w:name="ref-chen2026ckksauthtree"/>
+    <w:bookmarkEnd w:id="59"/>
+    <w:bookmarkStart w:id="61" w:name="ref-chen2026ckksauthtree"/>
     <w:p>
       <w:pPr>
         <w:pStyle w:val="Bibliography"/>
@@ -19544,7 +21474,7 @@
         </w:rPr>
         <w:t xml:space="preserve"> </w:t>
       </w:r>
-      <w:hyperlink r:id="rId58">
+      <w:hyperlink r:id="rId60">
         <w:r>
           <w:rPr>
             <w:rStyle w:val="Hyperlink"/>
@@ -19559,8 +21489,8 @@
         <w:t xml:space="preserve">.</w:t>
       </w:r>
     </w:p>
-    <w:bookmarkEnd w:id="59"/>
-    <w:bookmarkStart w:id="61" w:name="ref-crooks2018obladi"/>
+    <w:bookmarkEnd w:id="61"/>
+    <w:bookmarkStart w:id="63" w:name="ref-crooks2018obladi"/>
     <w:p>
       <w:pPr>
         <w:pStyle w:val="Bibliography"/>
@@ -19609,7 +21539,7 @@
         </w:rPr>
         <w:t xml:space="preserve"> </w:t>
       </w:r>
-      <w:hyperlink r:id="rId60">
+      <w:hyperlink r:id="rId62">
         <w:r>
           <w:rPr>
             <w:rStyle w:val="Hyperlink"/>
@@ -19624,8 +21554,8 @@
         <w:t xml:space="preserve">.</w:t>
       </w:r>
     </w:p>
-    <w:bookmarkEnd w:id="61"/>
-    <w:bookmarkStart w:id="63" w:name="ref-dagata2026gpu"/>
+    <w:bookmarkEnd w:id="63"/>
+    <w:bookmarkStart w:id="65" w:name="ref-dagata2026gpu"/>
     <w:p>
       <w:pPr>
         <w:pStyle w:val="Bibliography"/>
@@ -19710,7 +21640,7 @@
         </w:rPr>
         <w:t xml:space="preserve"> </w:t>
       </w:r>
-      <w:hyperlink r:id="rId62">
+      <w:hyperlink r:id="rId64">
         <w:r>
           <w:rPr>
             <w:rStyle w:val="Hyperlink"/>
@@ -19725,8 +21655,8 @@
         <w:t xml:space="preserve">.</w:t>
       </w:r>
     </w:p>
-    <w:bookmarkEnd w:id="63"/>
-    <w:bookmarkStart w:id="65" w:name="ref-damie2025secure"/>
+    <w:bookmarkEnd w:id="65"/>
+    <w:bookmarkStart w:id="67" w:name="ref-damie2025secure"/>
     <w:p>
       <w:pPr>
         <w:pStyle w:val="Bibliography"/>
@@ -19763,7 +21693,7 @@
         </w:rPr>
         <w:t xml:space="preserve"> </w:t>
       </w:r>
-      <w:hyperlink r:id="rId64">
+      <w:hyperlink r:id="rId66">
         <w:r>
           <w:rPr>
             <w:rStyle w:val="Hyperlink"/>
@@ -19778,8 +21708,8 @@
         <w:t xml:space="preserve">.</w:t>
       </w:r>
     </w:p>
-    <w:bookmarkEnd w:id="65"/>
-    <w:bookmarkStart w:id="67" w:name="ref-fan2012somewhat"/>
+    <w:bookmarkEnd w:id="67"/>
+    <w:bookmarkStart w:id="69" w:name="ref-fan2012somewhat"/>
     <w:p>
       <w:pPr>
         <w:pStyle w:val="Bibliography"/>
@@ -19816,7 +21746,7 @@
         </w:rPr>
         <w:t xml:space="preserve"> </w:t>
       </w:r>
-      <w:hyperlink r:id="rId66">
+      <w:hyperlink r:id="rId68">
         <w:r>
           <w:rPr>
             <w:rStyle w:val="Hyperlink"/>
@@ -19831,8 +21761,8 @@
         <w:t xml:space="preserve">.</w:t>
       </w:r>
     </w:p>
-    <w:bookmarkEnd w:id="67"/>
-    <w:bookmarkStart w:id="69" w:name="ref-ferguson2025unstructured"/>
+    <w:bookmarkEnd w:id="69"/>
+    <w:bookmarkStart w:id="71" w:name="ref-ferguson2025unstructured"/>
     <w:p>
       <w:pPr>
         <w:pStyle w:val="Bibliography"/>
@@ -19881,7 +21811,7 @@
         </w:rPr>
         <w:t xml:space="preserve"> </w:t>
       </w:r>
-      <w:hyperlink r:id="rId68">
+      <w:hyperlink r:id="rId70">
         <w:r>
           <w:rPr>
             <w:rStyle w:val="Hyperlink"/>
@@ -19896,8 +21826,8 @@
         <w:t xml:space="preserve">.</w:t>
       </w:r>
     </w:p>
-    <w:bookmarkEnd w:id="69"/>
-    <w:bookmarkStart w:id="71" w:name="ref-gao2026cssc"/>
+    <w:bookmarkEnd w:id="71"/>
+    <w:bookmarkStart w:id="73" w:name="ref-gao2026cssc"/>
     <w:p>
       <w:pPr>
         <w:pStyle w:val="Bibliography"/>
@@ -19952,7 +21882,7 @@
         </w:rPr>
         <w:t xml:space="preserve"> </w:t>
       </w:r>
-      <w:hyperlink r:id="rId70">
+      <w:hyperlink r:id="rId72">
         <w:r>
           <w:rPr>
             <w:rStyle w:val="Hyperlink"/>
@@ -19967,8 +21897,8 @@
         <w:t xml:space="preserve">.</w:t>
       </w:r>
     </w:p>
-    <w:bookmarkEnd w:id="71"/>
-    <w:bookmarkStart w:id="73" w:name="ref-halevi2014algorithms"/>
+    <w:bookmarkEnd w:id="73"/>
+    <w:bookmarkStart w:id="75" w:name="ref-halevi2014algorithms"/>
     <w:p>
       <w:pPr>
         <w:pStyle w:val="Bibliography"/>
@@ -20079,7 +22009,7 @@
         </w:rPr>
         <w:t xml:space="preserve"> </w:t>
       </w:r>
-      <w:hyperlink r:id="rId72">
+      <w:hyperlink r:id="rId74">
         <w:r>
           <w:rPr>
             <w:rStyle w:val="Hyperlink"/>
@@ -20094,8 +22024,8 @@
         <w:t xml:space="preserve">.</w:t>
       </w:r>
     </w:p>
-    <w:bookmarkEnd w:id="73"/>
-    <w:bookmarkStart w:id="75" w:name="ref-he2024rhombus"/>
+    <w:bookmarkEnd w:id="75"/>
+    <w:bookmarkStart w:id="77" w:name="ref-he2024rhombus"/>
     <w:p>
       <w:pPr>
         <w:pStyle w:val="Bibliography"/>
@@ -20144,7 +22074,7 @@
         </w:rPr>
         <w:t xml:space="preserve"> </w:t>
       </w:r>
-      <w:hyperlink r:id="rId74">
+      <w:hyperlink r:id="rId76">
         <w:r>
           <w:rPr>
             <w:rStyle w:val="Hyperlink"/>
@@ -20159,8 +22089,8 @@
         <w:t xml:space="preserve">.</w:t>
       </w:r>
     </w:p>
-    <w:bookmarkEnd w:id="75"/>
-    <w:bookmarkStart w:id="77" w:name="ref-king2016dynamiccsr"/>
+    <w:bookmarkEnd w:id="77"/>
+    <w:bookmarkStart w:id="79" w:name="ref-king2016dynamiccsr"/>
     <w:p>
       <w:pPr>
         <w:pStyle w:val="Bibliography"/>
@@ -20227,7 +22157,7 @@
         </w:rPr>
         <w:t xml:space="preserve"> </w:t>
       </w:r>
-      <w:hyperlink r:id="rId76">
+      <w:hyperlink r:id="rId78">
         <w:r>
           <w:rPr>
             <w:rStyle w:val="Hyperlink"/>
@@ -20242,8 +22172,8 @@
         <w:t xml:space="preserve">.</w:t>
       </w:r>
     </w:p>
-    <w:bookmarkEnd w:id="77"/>
-    <w:bookmarkStart w:id="79" w:name="ref-kreutzer2014sellcsigma"/>
+    <w:bookmarkEnd w:id="79"/>
+    <w:bookmarkStart w:id="81" w:name="ref-kreutzer2014sellcsigma"/>
     <w:p>
       <w:pPr>
         <w:pStyle w:val="Bibliography"/>
@@ -20298,7 +22228,7 @@
         </w:rPr>
         <w:t xml:space="preserve"> </w:t>
       </w:r>
-      <w:hyperlink r:id="rId78">
+      <w:hyperlink r:id="rId80">
         <w:r>
           <w:rPr>
             <w:rStyle w:val="Hyperlink"/>
@@ -20313,8 +22243,8 @@
         <w:t xml:space="preserve">.</w:t>
       </w:r>
     </w:p>
-    <w:bookmarkEnd w:id="79"/>
-    <w:bookmarkStart w:id="81" w:name="ref-liu2024ddse"/>
+    <w:bookmarkEnd w:id="81"/>
+    <w:bookmarkStart w:id="83" w:name="ref-liu2024ddse"/>
     <w:p>
       <w:pPr>
         <w:pStyle w:val="Bibliography"/>
@@ -20375,7 +22305,7 @@
         </w:rPr>
         <w:t xml:space="preserve"> </w:t>
       </w:r>
-      <w:hyperlink r:id="rId80">
+      <w:hyperlink r:id="rId82">
         <w:r>
           <w:rPr>
             <w:rStyle w:val="Hyperlink"/>
@@ -20390,8 +22320,8 @@
         <w:t xml:space="preserve">.</w:t>
       </w:r>
     </w:p>
-    <w:bookmarkEnd w:id="81"/>
-    <w:bookmarkStart w:id="83" w:name="ref-mutluergil2026diagonal"/>
+    <w:bookmarkEnd w:id="83"/>
+    <w:bookmarkStart w:id="85" w:name="ref-mutluergil2026diagonal"/>
     <w:p>
       <w:pPr>
         <w:pStyle w:val="Bibliography"/>
@@ -20428,7 +22358,7 @@
         </w:rPr>
         <w:t xml:space="preserve"> </w:t>
       </w:r>
-      <w:hyperlink r:id="rId82">
+      <w:hyperlink r:id="rId84">
         <w:r>
           <w:rPr>
             <w:rStyle w:val="Hyperlink"/>
@@ -20443,8 +22373,8 @@
         <w:t xml:space="preserve">.</w:t>
       </w:r>
     </w:p>
-    <w:bookmarkEnd w:id="83"/>
-    <w:bookmarkStart w:id="85" w:name="ref-oneil1996lsm"/>
+    <w:bookmarkEnd w:id="85"/>
+    <w:bookmarkStart w:id="87" w:name="ref-oneil1996lsm"/>
     <w:p>
       <w:pPr>
         <w:pStyle w:val="Bibliography"/>
@@ -20499,7 +22429,7 @@
         </w:rPr>
         <w:t xml:space="preserve"> </w:t>
       </w:r>
-      <w:hyperlink r:id="rId84">
+      <w:hyperlink r:id="rId86">
         <w:r>
           <w:rPr>
             <w:rStyle w:val="Hyperlink"/>
@@ -20514,8 +22444,8 @@
         <w:t xml:space="preserve">.</w:t>
       </w:r>
     </w:p>
-    <w:bookmarkEnd w:id="85"/>
-    <w:bookmarkStart w:id="87" w:name="ref-openfhe151"/>
+    <w:bookmarkEnd w:id="87"/>
+    <w:bookmarkStart w:id="89" w:name="ref-openfhe151"/>
     <w:p>
       <w:pPr>
         <w:pStyle w:val="Bibliography"/>
@@ -20552,7 +22482,7 @@
         </w:rPr>
         <w:t xml:space="preserve"> </w:t>
       </w:r>
-      <w:hyperlink r:id="rId86">
+      <w:hyperlink r:id="rId88">
         <w:r>
           <w:rPr>
             <w:rStyle w:val="Hyperlink"/>
@@ -20567,8 +22497,8 @@
         <w:t xml:space="preserve">.</w:t>
       </w:r>
     </w:p>
-    <w:bookmarkEnd w:id="87"/>
-    <w:bookmarkStart w:id="89" w:name="X25cb68a9261baf26b64cc014026bbfce216a4f2"/>
+    <w:bookmarkEnd w:id="89"/>
+    <w:bookmarkStart w:id="91" w:name="X25cb68a9261baf26b64cc014026bbfce216a4f2"/>
     <w:p>
       <w:pPr>
         <w:pStyle w:val="Bibliography"/>
@@ -20617,7 +22547,7 @@
         </w:rPr>
         <w:t xml:space="preserve"> </w:t>
       </w:r>
-      <w:hyperlink r:id="rId88">
+      <w:hyperlink r:id="rId90">
         <w:r>
           <w:rPr>
             <w:rStyle w:val="Hyperlink"/>
@@ -20632,8 +22562,8 @@
         <w:t xml:space="preserve">.</w:t>
       </w:r>
     </w:p>
-    <w:bookmarkEnd w:id="89"/>
-    <w:bookmarkStart w:id="91" w:name="ref-parbat2023authorized"/>
+    <w:bookmarkEnd w:id="91"/>
+    <w:bookmarkStart w:id="93" w:name="ref-parbat2023authorized"/>
     <w:p>
       <w:pPr>
         <w:pStyle w:val="Bibliography"/>
@@ -20688,7 +22618,7 @@
         </w:rPr>
         <w:t xml:space="preserve"> </w:t>
       </w:r>
-      <w:hyperlink r:id="rId90">
+      <w:hyperlink r:id="rId92">
         <w:r>
           <w:rPr>
             <w:rStyle w:val="Hyperlink"/>
@@ -20703,8 +22633,8 @@
         <w:t xml:space="preserve">.</w:t>
       </w:r>
     </w:p>
-    <w:bookmarkEnd w:id="91"/>
-    <w:bookmarkStart w:id="93" w:name="ref-snap_stackoverflow_temporal_network"/>
+    <w:bookmarkEnd w:id="93"/>
+    <w:bookmarkStart w:id="95" w:name="ref-snap_stackoverflow_temporal_network"/>
     <w:p>
       <w:pPr>
         <w:pStyle w:val="Bibliography"/>
@@ -20741,7 +22671,7 @@
         </w:rPr>
         <w:t xml:space="preserve"> </w:t>
       </w:r>
-      <w:hyperlink r:id="rId92">
+      <w:hyperlink r:id="rId94">
         <w:r>
           <w:rPr>
             <w:rStyle w:val="Hyperlink"/>
@@ -20756,8 +22686,8 @@
         <w:t xml:space="preserve">.</w:t>
       </w:r>
     </w:p>
-    <w:bookmarkEnd w:id="93"/>
-    <w:bookmarkStart w:id="95" w:name="ref-stylianou2022morpheus"/>
+    <w:bookmarkEnd w:id="95"/>
+    <w:bookmarkStart w:id="97" w:name="ref-stylianou2022morpheus"/>
     <w:p>
       <w:pPr>
         <w:pStyle w:val="Bibliography"/>
@@ -20794,7 +22724,7 @@
         </w:rPr>
         <w:t xml:space="preserve"> </w:t>
       </w:r>
-      <w:hyperlink r:id="rId94">
+      <w:hyperlink r:id="rId96">
         <w:r>
           <w:rPr>
             <w:rStyle w:val="Hyperlink"/>
@@ -20809,8 +22739,8 @@
         <w:t xml:space="preserve">.</w:t>
       </w:r>
     </w:p>
-    <w:bookmarkEnd w:id="95"/>
-    <w:bookmarkStart w:id="97" w:name="ref-vo2021shielddb"/>
+    <w:bookmarkEnd w:id="97"/>
+    <w:bookmarkStart w:id="99" w:name="ref-vo2021shielddb"/>
     <w:p>
       <w:pPr>
         <w:pStyle w:val="Bibliography"/>
@@ -20865,7 +22795,7 @@
         </w:rPr>
         <w:t xml:space="preserve"> </w:t>
       </w:r>
-      <w:hyperlink r:id="rId96">
+      <w:hyperlink r:id="rId98">
         <w:r>
           <w:rPr>
             <w:rStyle w:val="Hyperlink"/>
@@ -20880,8 +22810,8 @@
         <w:t xml:space="preserve">.</w:t>
       </w:r>
     </w:p>
-    <w:bookmarkEnd w:id="97"/>
-    <w:bookmarkStart w:id="99" w:name="ref-wei2026sparsee"/>
+    <w:bookmarkEnd w:id="99"/>
+    <w:bookmarkStart w:id="101" w:name="ref-wei2026sparsee"/>
     <w:p>
       <w:pPr>
         <w:pStyle w:val="Bibliography"/>
@@ -20926,7 +22856,7 @@
         </w:rPr>
         <w:t xml:space="preserve"> </w:t>
       </w:r>
-      <w:hyperlink r:id="rId98">
+      <w:hyperlink r:id="rId100">
         <w:r>
           <w:rPr>
             <w:rStyle w:val="Hyperlink"/>
@@ -20941,8 +22871,8 @@
         <w:t xml:space="preserve">.</w:t>
       </w:r>
     </w:p>
-    <w:bookmarkEnd w:id="99"/>
-    <w:bookmarkStart w:id="101" w:name="ref-xiong2026cipherskip"/>
+    <w:bookmarkEnd w:id="101"/>
+    <w:bookmarkStart w:id="103" w:name="ref-xiong2026cipherskip"/>
     <w:p>
       <w:pPr>
         <w:pStyle w:val="Bibliography"/>
@@ -21021,7 +22951,7 @@
         </w:rPr>
         <w:t xml:space="preserve"> </w:t>
       </w:r>
-      <w:hyperlink r:id="rId100">
+      <w:hyperlink r:id="rId102">
         <w:r>
           <w:rPr>
             <w:rStyle w:val="Hyperlink"/>
@@ -21036,8 +22966,8 @@
         <w:t xml:space="preserve">.</w:t>
       </w:r>
     </w:p>
-    <w:bookmarkEnd w:id="101"/>
-    <w:bookmarkStart w:id="103" w:name="ref-yu2025lodia"/>
+    <w:bookmarkEnd w:id="103"/>
+    <w:bookmarkStart w:id="105" w:name="ref-yu2025lodia"/>
     <w:p>
       <w:pPr>
         <w:pStyle w:val="Bibliography"/>
@@ -21086,7 +23016,7 @@
         </w:rPr>
         <w:t xml:space="preserve"> </w:t>
       </w:r>
-      <w:hyperlink r:id="rId102">
+      <w:hyperlink r:id="rId104">
         <w:r>
           <w:rPr>
             <w:rStyle w:val="Hyperlink"/>
@@ -21101,10 +23031,10 @@
         <w:t xml:space="preserve">.</w:t>
       </w:r>
     </w:p>
-    <w:bookmarkEnd w:id="103"/>
-    <w:bookmarkEnd w:id="104"/>
     <w:bookmarkEnd w:id="105"/>
     <w:bookmarkEnd w:id="106"/>
+    <w:bookmarkEnd w:id="107"/>
+    <w:bookmarkEnd w:id="108"/>
     <w:sectPr>
       <w:headerReference w:type="default" r:id="rId9"/>
       <w:headerReference w:type="first" r:id="rId10"/>

</xml_diff>